<commit_message>
docs: add project documentation and update README
- Add converted markdown docs: Elección del Problema, Project Charter, Requerimientos + Épicas
- Update docs/Docx with latest requirements version
- Update README.md
</commit_message>
<xml_diff>
--- a/docs/Docx/P. Requerimientos (F + NF) y Épicas.docx
+++ b/docs/Docx/P. Requerimientos (F + NF) y Épicas.docx
@@ -2043,6 +2043,3356 @@
         </w:rPr>
         <w:t xml:space="preserve"> Pro) una vez se confirme la escalabilidad futura.</w:t>
       </w:r>
+    </w:p>
+    <w:p>
+      <w:pPr>
+        <w:rPr>
+          <w:highlight w:val="yellow"/>
+        </w:rPr>
+      </w:pPr>
+      <w:r>
+        <w:rPr>
+          <w:highlight w:val="yellow"/>
+        </w:rPr>
+        <w:br w:type="page"/>
+      </w:r>
+    </w:p>
+    <w:p>
+      <w:pPr>
+        <w:pStyle w:val="ListParagraph"/>
+        <w:numPr>
+          <w:ilvl w:val="0"/>
+          <w:numId w:val="4"/>
+        </w:numPr>
+        <w:spacing w:before="240" w:line="360" w:lineRule="auto"/>
+        <w:rPr>
+          <w:b/>
+          <w:bCs/>
+        </w:rPr>
+      </w:pPr>
+      <w:r>
+        <w:rPr>
+          <w:b/>
+          <w:bCs/>
+        </w:rPr>
+        <w:lastRenderedPageBreak/>
+        <w:t>EP-00: Arquitectura Base y Flujos del Sistema</w:t>
+      </w:r>
+    </w:p>
+    <w:p>
+      <w:pPr>
+        <w:pStyle w:val="ListParagraph"/>
+        <w:numPr>
+          <w:ilvl w:val="1"/>
+          <w:numId w:val="4"/>
+        </w:numPr>
+        <w:spacing w:before="240" w:line="360" w:lineRule="auto"/>
+      </w:pPr>
+      <w:r>
+        <w:rPr>
+          <w:b/>
+          <w:bCs/>
+        </w:rPr>
+        <w:t xml:space="preserve">HU 0.1: Inicialización del </w:t>
+      </w:r>
+      <w:proofErr w:type="spellStart"/>
+      <w:r>
+        <w:rPr>
+          <w:b/>
+          <w:bCs/>
+        </w:rPr>
+        <w:t>monorepo</w:t>
+      </w:r>
+      <w:proofErr w:type="spellEnd"/>
+      <w:r>
+        <w:rPr>
+          <w:b/>
+          <w:bCs/>
+        </w:rPr>
+        <w:t xml:space="preserve"> y configuración del pipeline CI/CD.</w:t>
+      </w:r>
+    </w:p>
+    <w:p>
+      <w:pPr>
+        <w:spacing w:before="240" w:line="360" w:lineRule="auto"/>
+        <w:ind w:left="1080"/>
+      </w:pPr>
+      <w:r>
+        <w:rPr>
+          <w:b/>
+          <w:bCs/>
+        </w:rPr>
+        <w:t>Descripción:</w:t>
+      </w:r>
+      <w:r>
+        <w:t xml:space="preserve"> Como Desarrollador, quiero tener un </w:t>
+      </w:r>
+      <w:proofErr w:type="spellStart"/>
+      <w:r>
+        <w:t>monorepo</w:t>
+      </w:r>
+      <w:proofErr w:type="spellEnd"/>
+      <w:r>
+        <w:t xml:space="preserve"> configurado con Next.js y </w:t>
+      </w:r>
+      <w:proofErr w:type="spellStart"/>
+      <w:r>
+        <w:t>FastAPI</w:t>
+      </w:r>
+      <w:proofErr w:type="spellEnd"/>
+      <w:r>
+        <w:t>, integrado con un pipeline de CI/CD, para poder desplegar cambios automáticamente y sin errores en los entornos de nube gratuitos.</w:t>
+      </w:r>
+    </w:p>
+    <w:p>
+      <w:pPr>
+        <w:spacing w:before="240" w:line="360" w:lineRule="auto"/>
+        <w:ind w:left="1080"/>
+      </w:pPr>
+      <w:r>
+        <w:rPr>
+          <w:b/>
+          <w:bCs/>
+        </w:rPr>
+        <w:t>Criterios de Aceptación:</w:t>
+      </w:r>
+    </w:p>
+    <w:p>
+      <w:pPr>
+        <w:pStyle w:val="ListParagraph"/>
+        <w:numPr>
+          <w:ilvl w:val="2"/>
+          <w:numId w:val="4"/>
+        </w:numPr>
+        <w:spacing w:before="240" w:line="360" w:lineRule="auto"/>
+      </w:pPr>
+      <w:r>
+        <w:t>Estructura de carpetas /</w:t>
+      </w:r>
+      <w:proofErr w:type="spellStart"/>
+      <w:r>
+        <w:t>frontend</w:t>
+      </w:r>
+      <w:proofErr w:type="spellEnd"/>
+      <w:r>
+        <w:t xml:space="preserve"> y /</w:t>
+      </w:r>
+      <w:proofErr w:type="spellStart"/>
+      <w:r>
+        <w:t>backend</w:t>
+      </w:r>
+      <w:proofErr w:type="spellEnd"/>
+      <w:r>
+        <w:t xml:space="preserve"> creada.</w:t>
+      </w:r>
+    </w:p>
+    <w:p>
+      <w:pPr>
+        <w:pStyle w:val="ListParagraph"/>
+        <w:numPr>
+          <w:ilvl w:val="2"/>
+          <w:numId w:val="4"/>
+        </w:numPr>
+        <w:spacing w:before="240" w:line="360" w:lineRule="auto"/>
+      </w:pPr>
+      <w:r>
+        <w:t xml:space="preserve">GitHub </w:t>
+      </w:r>
+      <w:proofErr w:type="spellStart"/>
+      <w:r>
+        <w:t>Actions</w:t>
+      </w:r>
+      <w:proofErr w:type="spellEnd"/>
+      <w:r>
+        <w:t xml:space="preserve"> configurado (</w:t>
+      </w:r>
+      <w:proofErr w:type="spellStart"/>
+      <w:r>
+        <w:t>deploy.yml</w:t>
+      </w:r>
+      <w:proofErr w:type="spellEnd"/>
+      <w:r>
+        <w:t>).</w:t>
+      </w:r>
+    </w:p>
+    <w:p>
+      <w:pPr>
+        <w:pStyle w:val="ListParagraph"/>
+        <w:numPr>
+          <w:ilvl w:val="2"/>
+          <w:numId w:val="4"/>
+        </w:numPr>
+        <w:spacing w:before="240" w:line="360" w:lineRule="auto"/>
+      </w:pPr>
+      <w:r>
+        <w:t xml:space="preserve">Un </w:t>
+      </w:r>
+      <w:proofErr w:type="spellStart"/>
+      <w:r>
+        <w:rPr>
+          <w:i/>
+          <w:iCs/>
+        </w:rPr>
+        <w:t>push</w:t>
+      </w:r>
+      <w:proofErr w:type="spellEnd"/>
+      <w:r>
+        <w:t xml:space="preserve"> a la rama </w:t>
+      </w:r>
+      <w:proofErr w:type="spellStart"/>
+      <w:r>
+        <w:t>main</w:t>
+      </w:r>
+      <w:proofErr w:type="spellEnd"/>
+      <w:r>
+        <w:t xml:space="preserve"> dispara automáticamente el </w:t>
+      </w:r>
+      <w:proofErr w:type="spellStart"/>
+      <w:r>
+        <w:rPr>
+          <w:i/>
+          <w:iCs/>
+        </w:rPr>
+        <w:t>linting</w:t>
+      </w:r>
+      <w:proofErr w:type="spellEnd"/>
+      <w:r>
+        <w:t xml:space="preserve"> y el despliegue en </w:t>
+      </w:r>
+      <w:proofErr w:type="spellStart"/>
+      <w:r>
+        <w:t>Vercel</w:t>
+      </w:r>
+      <w:proofErr w:type="spellEnd"/>
+      <w:r>
+        <w:t xml:space="preserve"> (</w:t>
+      </w:r>
+      <w:proofErr w:type="spellStart"/>
+      <w:r>
+        <w:t>Frontend</w:t>
+      </w:r>
+      <w:proofErr w:type="spellEnd"/>
+      <w:r>
+        <w:t>) y Render.com (</w:t>
+      </w:r>
+      <w:proofErr w:type="spellStart"/>
+      <w:r>
+        <w:t>Backend</w:t>
+      </w:r>
+      <w:proofErr w:type="spellEnd"/>
+      <w:r>
+        <w:t>).</w:t>
+      </w:r>
+    </w:p>
+    <w:p>
+      <w:pPr>
+        <w:pStyle w:val="ListParagraph"/>
+        <w:spacing w:before="240" w:line="360" w:lineRule="auto"/>
+        <w:ind w:left="2160"/>
+      </w:pPr>
+    </w:p>
+    <w:p>
+      <w:pPr>
+        <w:pStyle w:val="ListParagraph"/>
+        <w:numPr>
+          <w:ilvl w:val="1"/>
+          <w:numId w:val="4"/>
+        </w:numPr>
+        <w:spacing w:before="240" w:line="360" w:lineRule="auto"/>
+      </w:pPr>
+      <w:r>
+        <w:rPr>
+          <w:b/>
+          <w:bCs/>
+        </w:rPr>
+        <w:t>HU 0.2: Modelado y despliegue del esquema de base de datos relacional con soporte espacial (</w:t>
+      </w:r>
+      <w:proofErr w:type="spellStart"/>
+      <w:r>
+        <w:rPr>
+          <w:b/>
+          <w:bCs/>
+        </w:rPr>
+        <w:t>PostGIS</w:t>
+      </w:r>
+      <w:proofErr w:type="spellEnd"/>
+      <w:r>
+        <w:rPr>
+          <w:b/>
+          <w:bCs/>
+        </w:rPr>
+        <w:t>).</w:t>
+      </w:r>
+    </w:p>
+    <w:p>
+      <w:pPr>
+        <w:spacing w:before="240" w:line="360" w:lineRule="auto"/>
+        <w:ind w:left="1080"/>
+      </w:pPr>
+      <w:r>
+        <w:rPr>
+          <w:b/>
+          <w:bCs/>
+        </w:rPr>
+        <w:t>Descripción:</w:t>
+      </w:r>
+      <w:r>
+        <w:t xml:space="preserve"> Como Arquitecto de Datos, quiero desplegar el esquema en PostgreSQL habilitando </w:t>
+      </w:r>
+      <w:proofErr w:type="spellStart"/>
+      <w:r>
+        <w:t>PostGIS</w:t>
+      </w:r>
+      <w:proofErr w:type="spellEnd"/>
+      <w:r>
+        <w:t>, para almacenar usuarios, productos y coordenadas geográficas de forma segura.</w:t>
+      </w:r>
+    </w:p>
+    <w:p>
+      <w:pPr>
+        <w:spacing w:before="240" w:line="360" w:lineRule="auto"/>
+        <w:ind w:left="1080"/>
+      </w:pPr>
+      <w:r>
+        <w:rPr>
+          <w:b/>
+          <w:bCs/>
+        </w:rPr>
+        <w:t>Criterios de Aceptación:</w:t>
+      </w:r>
+    </w:p>
+    <w:p>
+      <w:pPr>
+        <w:pStyle w:val="ListParagraph"/>
+        <w:numPr>
+          <w:ilvl w:val="2"/>
+          <w:numId w:val="4"/>
+        </w:numPr>
+        <w:spacing w:before="240" w:line="360" w:lineRule="auto"/>
+      </w:pPr>
+      <w:r>
+        <w:t>Instancia creada en capa gratuita (</w:t>
+      </w:r>
+      <w:proofErr w:type="spellStart"/>
+      <w:r>
+        <w:t>Supabase</w:t>
+      </w:r>
+      <w:proofErr w:type="spellEnd"/>
+      <w:r>
+        <w:t>/Neon).</w:t>
+      </w:r>
+    </w:p>
+    <w:p>
+      <w:pPr>
+        <w:pStyle w:val="ListParagraph"/>
+        <w:numPr>
+          <w:ilvl w:val="2"/>
+          <w:numId w:val="4"/>
+        </w:numPr>
+        <w:spacing w:before="240" w:line="360" w:lineRule="auto"/>
+      </w:pPr>
+      <w:r>
+        <w:t xml:space="preserve">Extensión </w:t>
+      </w:r>
+      <w:proofErr w:type="spellStart"/>
+      <w:r>
+        <w:t>PostGIS</w:t>
+      </w:r>
+      <w:proofErr w:type="spellEnd"/>
+      <w:r>
+        <w:t xml:space="preserve"> activada.</w:t>
+      </w:r>
+    </w:p>
+    <w:p>
+      <w:pPr>
+        <w:pStyle w:val="ListParagraph"/>
+        <w:numPr>
+          <w:ilvl w:val="2"/>
+          <w:numId w:val="4"/>
+        </w:numPr>
+        <w:spacing w:before="240" w:line="360" w:lineRule="auto"/>
+      </w:pPr>
+      <w:r>
+        <w:t xml:space="preserve">Políticas </w:t>
+      </w:r>
+      <w:r>
+        <w:rPr>
+          <w:i/>
+          <w:iCs/>
+        </w:rPr>
+        <w:t>Row-Level Security (RLS)</w:t>
+      </w:r>
+      <w:r>
+        <w:t xml:space="preserve"> habilitadas en todas las tablas por cumplimiento de la Ley 1581.</w:t>
+      </w:r>
+    </w:p>
+    <w:p>
+      <w:pPr>
+        <w:rPr>
+          <w:b/>
+          <w:bCs/>
+        </w:rPr>
+      </w:pPr>
+      <w:r>
+        <w:rPr>
+          <w:b/>
+          <w:bCs/>
+        </w:rPr>
+        <w:br w:type="page"/>
+      </w:r>
+    </w:p>
+    <w:p>
+      <w:pPr>
+        <w:pStyle w:val="ListParagraph"/>
+        <w:numPr>
+          <w:ilvl w:val="1"/>
+          <w:numId w:val="4"/>
+        </w:numPr>
+        <w:spacing w:before="240" w:line="360" w:lineRule="auto"/>
+      </w:pPr>
+      <w:r>
+        <w:rPr>
+          <w:b/>
+          <w:bCs/>
+        </w:rPr>
+        <w:lastRenderedPageBreak/>
+        <w:t>HU 0.3: Configuración de dominios, certificados SSL y entornos.</w:t>
+      </w:r>
+    </w:p>
+    <w:p>
+      <w:pPr>
+        <w:spacing w:before="240" w:line="360" w:lineRule="auto"/>
+        <w:ind w:left="1080"/>
+      </w:pPr>
+      <w:r>
+        <w:rPr>
+          <w:b/>
+          <w:bCs/>
+        </w:rPr>
+        <w:t>Descripción:</w:t>
+      </w:r>
+      <w:r>
+        <w:t xml:space="preserve"> Como DevOps, quiero configurar los dominios y el SSL, para garantizar que toda la transferencia de datos (especialmente la geolocalización de la PWA) </w:t>
+      </w:r>
+      <w:proofErr w:type="gramStart"/>
+      <w:r>
+        <w:t>viaje cifrada</w:t>
+      </w:r>
+      <w:proofErr w:type="gramEnd"/>
+      <w:r>
+        <w:t>.</w:t>
+      </w:r>
+    </w:p>
+    <w:p>
+      <w:pPr>
+        <w:pStyle w:val="ListParagraph"/>
+        <w:numPr>
+          <w:ilvl w:val="2"/>
+          <w:numId w:val="4"/>
+        </w:numPr>
+        <w:spacing w:before="240" w:line="360" w:lineRule="auto"/>
+      </w:pPr>
+      <w:r>
+        <w:rPr>
+          <w:b/>
+          <w:bCs/>
+        </w:rPr>
+        <w:t>Criterios de Aceptación:</w:t>
+      </w:r>
+    </w:p>
+    <w:p>
+      <w:pPr>
+        <w:pStyle w:val="ListParagraph"/>
+        <w:numPr>
+          <w:ilvl w:val="2"/>
+          <w:numId w:val="4"/>
+        </w:numPr>
+        <w:spacing w:before="240" w:line="360" w:lineRule="auto"/>
+      </w:pPr>
+      <w:r>
+        <w:t xml:space="preserve">Dominio </w:t>
+      </w:r>
+      <w:proofErr w:type="spellStart"/>
+      <w:r>
+        <w:t>veramarket.app</w:t>
+      </w:r>
+      <w:proofErr w:type="spellEnd"/>
+      <w:r>
+        <w:t xml:space="preserve"> configurado en </w:t>
+      </w:r>
+      <w:proofErr w:type="spellStart"/>
+      <w:r>
+        <w:t>Cloudflare</w:t>
+      </w:r>
+      <w:proofErr w:type="spellEnd"/>
+      <w:r>
+        <w:t>.</w:t>
+      </w:r>
+    </w:p>
+    <w:p>
+      <w:pPr>
+        <w:pStyle w:val="ListParagraph"/>
+        <w:numPr>
+          <w:ilvl w:val="2"/>
+          <w:numId w:val="4"/>
+        </w:numPr>
+        <w:spacing w:before="240" w:line="360" w:lineRule="auto"/>
+      </w:pPr>
+      <w:r>
+        <w:t>Tráfico HTTP forzado a HTTPS.</w:t>
+      </w:r>
+    </w:p>
+    <w:p>
+      <w:pPr>
+        <w:pStyle w:val="ListParagraph"/>
+        <w:numPr>
+          <w:ilvl w:val="2"/>
+          <w:numId w:val="4"/>
+        </w:numPr>
+        <w:spacing w:before="240" w:line="360" w:lineRule="auto"/>
+      </w:pPr>
+      <w:proofErr w:type="gramStart"/>
+      <w:r>
+        <w:t>Archivos .</w:t>
+      </w:r>
+      <w:proofErr w:type="spellStart"/>
+      <w:r>
+        <w:t>env</w:t>
+      </w:r>
+      <w:proofErr w:type="spellEnd"/>
+      <w:proofErr w:type="gramEnd"/>
+      <w:r>
+        <w:t xml:space="preserve"> segregados (Local, </w:t>
+      </w:r>
+      <w:proofErr w:type="spellStart"/>
+      <w:r>
+        <w:t>Staging</w:t>
+      </w:r>
+      <w:proofErr w:type="spellEnd"/>
+      <w:r>
+        <w:t>, Producción) sin subir secretos al repositorio.</w:t>
+      </w:r>
+    </w:p>
+    <w:p>
+      <w:pPr>
+        <w:pStyle w:val="ListParagraph"/>
+        <w:numPr>
+          <w:ilvl w:val="0"/>
+          <w:numId w:val="4"/>
+        </w:numPr>
+        <w:spacing w:before="240" w:line="360" w:lineRule="auto"/>
+        <w:rPr>
+          <w:b/>
+          <w:bCs/>
+        </w:rPr>
+      </w:pPr>
+      <w:r>
+        <w:rPr>
+          <w:b/>
+          <w:bCs/>
+        </w:rPr>
+        <w:t>EP-01: Autenticación Segura y Perfilamiento (</w:t>
+      </w:r>
+      <w:proofErr w:type="spellStart"/>
+      <w:r>
+        <w:rPr>
+          <w:b/>
+          <w:bCs/>
+        </w:rPr>
+        <w:t>Privacy</w:t>
+      </w:r>
+      <w:proofErr w:type="spellEnd"/>
+      <w:r>
+        <w:rPr>
+          <w:b/>
+          <w:bCs/>
+        </w:rPr>
+        <w:t>-First)</w:t>
+      </w:r>
+    </w:p>
+    <w:p>
+      <w:pPr>
+        <w:pStyle w:val="ListParagraph"/>
+        <w:numPr>
+          <w:ilvl w:val="1"/>
+          <w:numId w:val="4"/>
+        </w:numPr>
+        <w:spacing w:before="240" w:line="360" w:lineRule="auto"/>
+      </w:pPr>
+      <w:r>
+        <w:rPr>
+          <w:b/>
+          <w:bCs/>
+        </w:rPr>
+        <w:t>HU 1.1: Inicio de sesión con código de un solo uso (OTP).</w:t>
+      </w:r>
+    </w:p>
+    <w:p>
+      <w:pPr>
+        <w:pStyle w:val="ListParagraph"/>
+        <w:spacing w:before="240" w:line="360" w:lineRule="auto"/>
+      </w:pPr>
+      <w:r>
+        <w:rPr>
+          <w:b/>
+          <w:bCs/>
+        </w:rPr>
+        <w:t>Descripción:</w:t>
+      </w:r>
+      <w:r>
+        <w:t xml:space="preserve"> Como Usuario, quiero ingresar con mi </w:t>
+      </w:r>
+      <w:proofErr w:type="gramStart"/>
+      <w:r>
+        <w:t xml:space="preserve">correo </w:t>
+      </w:r>
+      <w:r>
+        <w:t xml:space="preserve"> y</w:t>
+      </w:r>
+      <w:proofErr w:type="gramEnd"/>
+      <w:r>
+        <w:t xml:space="preserve"> recibir un código temporal, para acceder a la </w:t>
+      </w:r>
+      <w:proofErr w:type="gramStart"/>
+      <w:r>
+        <w:t>app</w:t>
+      </w:r>
+      <w:proofErr w:type="gramEnd"/>
+      <w:r>
+        <w:t xml:space="preserve"> sin tener que memorizar otra contraseña.</w:t>
+      </w:r>
+    </w:p>
+    <w:p>
+      <w:pPr>
+        <w:pStyle w:val="ListParagraph"/>
+        <w:spacing w:before="240" w:line="360" w:lineRule="auto"/>
+      </w:pPr>
+      <w:r>
+        <w:rPr>
+          <w:b/>
+          <w:bCs/>
+        </w:rPr>
+        <w:t>Criterios de Aceptación:</w:t>
+      </w:r>
+    </w:p>
+    <w:p>
+      <w:pPr>
+        <w:pStyle w:val="ListParagraph"/>
+        <w:numPr>
+          <w:ilvl w:val="2"/>
+          <w:numId w:val="4"/>
+        </w:numPr>
+        <w:spacing w:before="240" w:line="360" w:lineRule="auto"/>
+      </w:pPr>
+      <w:r>
+        <w:t xml:space="preserve">El sistema solo acepta </w:t>
+      </w:r>
+      <w:proofErr w:type="gramStart"/>
+      <w:r>
+        <w:t>correos concordante</w:t>
+      </w:r>
+      <w:proofErr w:type="gramEnd"/>
+      <w:r>
+        <w:t xml:space="preserve"> a los registros dados por sinapsis</w:t>
+      </w:r>
+    </w:p>
+    <w:p>
+      <w:pPr>
+        <w:pStyle w:val="ListParagraph"/>
+        <w:numPr>
+          <w:ilvl w:val="2"/>
+          <w:numId w:val="4"/>
+        </w:numPr>
+        <w:spacing w:before="240" w:line="360" w:lineRule="auto"/>
+      </w:pPr>
+      <w:r>
+        <w:t>El correo llega en menos de 30 segundos.</w:t>
+      </w:r>
+    </w:p>
+    <w:p>
+      <w:pPr>
+        <w:pStyle w:val="ListParagraph"/>
+        <w:numPr>
+          <w:ilvl w:val="2"/>
+          <w:numId w:val="4"/>
+        </w:numPr>
+        <w:spacing w:before="240" w:line="360" w:lineRule="auto"/>
+      </w:pPr>
+      <w:r>
+        <w:t>Se genera un token JWT seguro tras la validación exitosa.</w:t>
+      </w:r>
+    </w:p>
+    <w:p>
+      <w:pPr>
+        <w:pStyle w:val="ListParagraph"/>
+        <w:numPr>
+          <w:ilvl w:val="1"/>
+          <w:numId w:val="4"/>
+        </w:numPr>
+        <w:spacing w:before="240" w:line="360" w:lineRule="auto"/>
+      </w:pPr>
+      <w:r>
+        <w:rPr>
+          <w:b/>
+          <w:bCs/>
+        </w:rPr>
+        <w:t>HU 1.2: Creación de perfil de usuario (por defecto: Rol Comprador).</w:t>
+      </w:r>
+    </w:p>
+    <w:p>
+      <w:pPr>
+        <w:pStyle w:val="ListParagraph"/>
+        <w:spacing w:before="240" w:line="360" w:lineRule="auto"/>
+      </w:pPr>
+      <w:r>
+        <w:rPr>
+          <w:b/>
+          <w:bCs/>
+        </w:rPr>
+        <w:t>Descripción:</w:t>
+      </w:r>
+      <w:r>
+        <w:t xml:space="preserve"> Como Sistema, quiero registrar automáticamente al nuevo usuario con el rol de "Comprador", para delimitar sus permisos iniciales.</w:t>
+      </w:r>
+    </w:p>
+    <w:p>
+      <w:pPr>
+        <w:pStyle w:val="ListParagraph"/>
+        <w:spacing w:before="240" w:line="360" w:lineRule="auto"/>
+      </w:pPr>
+      <w:r>
+        <w:rPr>
+          <w:b/>
+          <w:bCs/>
+        </w:rPr>
+        <w:t>Criterios de Aceptación:</w:t>
+      </w:r>
+    </w:p>
+    <w:p>
+      <w:pPr>
+        <w:pStyle w:val="ListParagraph"/>
+        <w:numPr>
+          <w:ilvl w:val="2"/>
+          <w:numId w:val="4"/>
+        </w:numPr>
+        <w:spacing w:before="240" w:line="360" w:lineRule="auto"/>
+      </w:pPr>
+      <w:r>
+        <w:t xml:space="preserve">Se crea el registro en la tabla </w:t>
+      </w:r>
+      <w:proofErr w:type="spellStart"/>
+      <w:r>
+        <w:t>users</w:t>
+      </w:r>
+      <w:proofErr w:type="spellEnd"/>
+      <w:r>
+        <w:t xml:space="preserve"> al validar el primer OTP.</w:t>
+      </w:r>
+    </w:p>
+    <w:p>
+      <w:pPr>
+        <w:pStyle w:val="ListParagraph"/>
+        <w:numPr>
+          <w:ilvl w:val="2"/>
+          <w:numId w:val="4"/>
+        </w:numPr>
+        <w:spacing w:before="240" w:line="360" w:lineRule="auto"/>
+      </w:pPr>
+      <w:r>
+        <w:t>Solo se capturan datos mínimos (ID institucional, rol base).</w:t>
+      </w:r>
+    </w:p>
+    <w:p>
+      <w:pPr>
+        <w:pStyle w:val="ListParagraph"/>
+        <w:numPr>
+          <w:ilvl w:val="1"/>
+          <w:numId w:val="4"/>
+        </w:numPr>
+        <w:spacing w:before="240" w:line="360" w:lineRule="auto"/>
+      </w:pPr>
+      <w:r>
+        <w:rPr>
+          <w:b/>
+          <w:bCs/>
+        </w:rPr>
+        <w:t>HU 1.3: Configuración de privacidad (Ocultar contacto).</w:t>
+      </w:r>
+    </w:p>
+    <w:p>
+      <w:pPr>
+        <w:pStyle w:val="ListParagraph"/>
+        <w:spacing w:before="240" w:line="360" w:lineRule="auto"/>
+      </w:pPr>
+      <w:r>
+        <w:rPr>
+          <w:b/>
+          <w:bCs/>
+        </w:rPr>
+        <w:t>Descripción:</w:t>
+      </w:r>
+      <w:r>
+        <w:t xml:space="preserve"> Como Usuario, quiero un interruptor en mi perfil para ocultar mi número de teléfono, para proteger mi privacidad hasta que decida compartirlo.</w:t>
+      </w:r>
+    </w:p>
+    <w:p>
+      <w:pPr>
+        <w:pStyle w:val="ListParagraph"/>
+        <w:spacing w:before="240" w:line="360" w:lineRule="auto"/>
+      </w:pPr>
+      <w:r>
+        <w:rPr>
+          <w:b/>
+          <w:bCs/>
+        </w:rPr>
+        <w:t>Criterios de Aceptación:</w:t>
+      </w:r>
+    </w:p>
+    <w:p>
+      <w:pPr>
+        <w:pStyle w:val="ListParagraph"/>
+        <w:numPr>
+          <w:ilvl w:val="2"/>
+          <w:numId w:val="4"/>
+        </w:numPr>
+        <w:spacing w:before="240" w:line="360" w:lineRule="auto"/>
+      </w:pPr>
+      <w:r>
+        <w:lastRenderedPageBreak/>
+        <w:t xml:space="preserve">El </w:t>
+      </w:r>
+      <w:proofErr w:type="spellStart"/>
+      <w:r>
+        <w:t>toggle</w:t>
+      </w:r>
+      <w:proofErr w:type="spellEnd"/>
+      <w:r>
+        <w:t xml:space="preserve"> por defecto está en Oculto (</w:t>
+      </w:r>
+      <w:proofErr w:type="spellStart"/>
+      <w:r>
+        <w:t>Privacy</w:t>
+      </w:r>
+      <w:proofErr w:type="spellEnd"/>
+      <w:r>
+        <w:t xml:space="preserve"> </w:t>
+      </w:r>
+      <w:proofErr w:type="spellStart"/>
+      <w:r>
+        <w:t>by</w:t>
+      </w:r>
+      <w:proofErr w:type="spellEnd"/>
+      <w:r>
+        <w:t xml:space="preserve"> </w:t>
+      </w:r>
+      <w:proofErr w:type="spellStart"/>
+      <w:r>
+        <w:t>Design</w:t>
+      </w:r>
+      <w:proofErr w:type="spellEnd"/>
+      <w:r>
+        <w:t>).</w:t>
+      </w:r>
+    </w:p>
+    <w:p>
+      <w:pPr>
+        <w:pStyle w:val="ListParagraph"/>
+        <w:numPr>
+          <w:ilvl w:val="2"/>
+          <w:numId w:val="4"/>
+        </w:numPr>
+        <w:spacing w:before="240" w:line="360" w:lineRule="auto"/>
+      </w:pPr>
+      <w:r>
+        <w:t xml:space="preserve">Si está oculto, el </w:t>
+      </w:r>
+      <w:proofErr w:type="spellStart"/>
+      <w:r>
+        <w:t>backend</w:t>
+      </w:r>
+      <w:proofErr w:type="spellEnd"/>
+      <w:r>
+        <w:t xml:space="preserve"> enmascara o elimina el campo de contacto en la respuesta JSON pública.</w:t>
+      </w:r>
+    </w:p>
+    <w:p>
+      <w:pPr>
+        <w:pStyle w:val="ListParagraph"/>
+        <w:numPr>
+          <w:ilvl w:val="0"/>
+          <w:numId w:val="4"/>
+        </w:numPr>
+        <w:spacing w:before="240" w:line="360" w:lineRule="auto"/>
+      </w:pPr>
+      <w:r>
+        <w:rPr>
+          <w:b/>
+          <w:bCs/>
+        </w:rPr>
+        <w:t>HU 1.4: Solicitud de Rol Vendedor con código de Sinapsis.</w:t>
+      </w:r>
+    </w:p>
+    <w:p>
+      <w:pPr>
+        <w:pStyle w:val="ListParagraph"/>
+        <w:numPr>
+          <w:ilvl w:val="0"/>
+          <w:numId w:val="4"/>
+        </w:numPr>
+        <w:spacing w:before="240" w:line="360" w:lineRule="auto"/>
+      </w:pPr>
+      <w:r>
+        <w:rPr>
+          <w:b/>
+          <w:bCs/>
+        </w:rPr>
+        <w:t>Descripción:</w:t>
+      </w:r>
+      <w:r>
+        <w:t xml:space="preserve"> Como Comprador, quiero ingresar mi código de emprendedor de Sinapsis, para solicitar permisos de publicación en el </w:t>
+      </w:r>
+      <w:proofErr w:type="spellStart"/>
+      <w:r>
+        <w:t>marketplace</w:t>
+      </w:r>
+      <w:proofErr w:type="spellEnd"/>
+      <w:r>
+        <w:t>.</w:t>
+      </w:r>
+    </w:p>
+    <w:p>
+      <w:pPr>
+        <w:pStyle w:val="ListParagraph"/>
+        <w:numPr>
+          <w:ilvl w:val="0"/>
+          <w:numId w:val="4"/>
+        </w:numPr>
+        <w:spacing w:before="240" w:line="360" w:lineRule="auto"/>
+      </w:pPr>
+      <w:r>
+        <w:rPr>
+          <w:b/>
+          <w:bCs/>
+        </w:rPr>
+        <w:t>Criterios de Aceptación:</w:t>
+      </w:r>
+    </w:p>
+    <w:p>
+      <w:pPr>
+        <w:pStyle w:val="ListParagraph"/>
+        <w:numPr>
+          <w:ilvl w:val="0"/>
+          <w:numId w:val="4"/>
+        </w:numPr>
+        <w:spacing w:before="240" w:line="360" w:lineRule="auto"/>
+      </w:pPr>
+      <w:r>
+        <w:t>Formulario simple de 1 campo en el perfil del usuario.</w:t>
+      </w:r>
+    </w:p>
+    <w:p>
+      <w:pPr>
+        <w:pStyle w:val="ListParagraph"/>
+        <w:numPr>
+          <w:ilvl w:val="0"/>
+          <w:numId w:val="4"/>
+        </w:numPr>
+        <w:spacing w:before="240" w:line="360" w:lineRule="auto"/>
+      </w:pPr>
+      <w:r>
+        <w:t>El estado de la solicitud queda marcado en la BD como "Pendiente".</w:t>
+      </w:r>
+    </w:p>
+    <w:p>
+      <w:pPr>
+        <w:pStyle w:val="ListParagraph"/>
+        <w:numPr>
+          <w:ilvl w:val="0"/>
+          <w:numId w:val="4"/>
+        </w:numPr>
+        <w:spacing w:before="240" w:line="360" w:lineRule="auto"/>
+      </w:pPr>
+      <w:r>
+        <w:rPr>
+          <w:b/>
+          <w:bCs/>
+        </w:rPr>
+        <w:t>HU 1.5: Validación Sinapsis (</w:t>
+      </w:r>
+      <w:proofErr w:type="spellStart"/>
+      <w:r>
+        <w:rPr>
+          <w:b/>
+          <w:bCs/>
+        </w:rPr>
+        <w:t>Whitelist</w:t>
+      </w:r>
+      <w:proofErr w:type="spellEnd"/>
+      <w:r>
+        <w:rPr>
+          <w:b/>
+          <w:bCs/>
+        </w:rPr>
+        <w:t>).</w:t>
+      </w:r>
+    </w:p>
+    <w:p>
+      <w:pPr>
+        <w:pStyle w:val="ListParagraph"/>
+        <w:numPr>
+          <w:ilvl w:val="0"/>
+          <w:numId w:val="4"/>
+        </w:numPr>
+        <w:spacing w:before="240" w:line="360" w:lineRule="auto"/>
+      </w:pPr>
+      <w:r>
+        <w:rPr>
+          <w:b/>
+          <w:bCs/>
+        </w:rPr>
+        <w:t>Descripción:</w:t>
+      </w:r>
+      <w:r>
+        <w:t xml:space="preserve"> Como Sistema, quiero cruzar el código ingresado con la base de datos de Sinapsis, para aprobar el rol de Vendedor automáticamente sin intervención humana.</w:t>
+      </w:r>
+    </w:p>
+    <w:p>
+      <w:pPr>
+        <w:pStyle w:val="ListParagraph"/>
+        <w:numPr>
+          <w:ilvl w:val="0"/>
+          <w:numId w:val="4"/>
+        </w:numPr>
+        <w:spacing w:before="240" w:line="360" w:lineRule="auto"/>
+      </w:pPr>
+      <w:r>
+        <w:rPr>
+          <w:b/>
+          <w:bCs/>
+        </w:rPr>
+        <w:t>Criterios de Aceptación:</w:t>
+      </w:r>
+    </w:p>
+    <w:p>
+      <w:pPr>
+        <w:pStyle w:val="ListParagraph"/>
+        <w:numPr>
+          <w:ilvl w:val="0"/>
+          <w:numId w:val="4"/>
+        </w:numPr>
+        <w:spacing w:before="240" w:line="360" w:lineRule="auto"/>
+      </w:pPr>
+      <w:r>
+        <w:t>Lectura exitosa del CSV/</w:t>
+      </w:r>
+      <w:proofErr w:type="spellStart"/>
+      <w:r>
+        <w:t>Endpoint</w:t>
+      </w:r>
+      <w:proofErr w:type="spellEnd"/>
+      <w:r>
+        <w:t xml:space="preserve"> de validación.</w:t>
+      </w:r>
+    </w:p>
+    <w:p>
+      <w:pPr>
+        <w:pStyle w:val="ListParagraph"/>
+        <w:numPr>
+          <w:ilvl w:val="0"/>
+          <w:numId w:val="4"/>
+        </w:numPr>
+        <w:spacing w:before="240" w:line="360" w:lineRule="auto"/>
+      </w:pPr>
+      <w:r>
+        <w:t>Si hay coincidencia, el rol cambia a "Vendedor" inmediatamente.</w:t>
+      </w:r>
+    </w:p>
+    <w:p>
+      <w:pPr>
+        <w:pStyle w:val="ListParagraph"/>
+        <w:numPr>
+          <w:ilvl w:val="0"/>
+          <w:numId w:val="4"/>
+        </w:numPr>
+        <w:spacing w:before="240" w:line="360" w:lineRule="auto"/>
+      </w:pPr>
+      <w:r>
+        <w:pict w14:anchorId="37C703DB">
+          <v:rect id="_x0000_i1025" style="width:0;height:1.5pt" o:hralign="center" o:hrstd="t" o:hr="t" fillcolor="#a0a0a0" stroked="f"/>
+        </w:pict>
+      </w:r>
+    </w:p>
+    <w:p>
+      <w:pPr>
+        <w:pStyle w:val="ListParagraph"/>
+        <w:numPr>
+          <w:ilvl w:val="0"/>
+          <w:numId w:val="4"/>
+        </w:numPr>
+        <w:spacing w:before="240" w:line="360" w:lineRule="auto"/>
+        <w:rPr>
+          <w:b/>
+          <w:bCs/>
+        </w:rPr>
+      </w:pPr>
+      <w:r>
+        <w:rPr>
+          <w:rFonts w:ascii="Segoe UI Emoji" w:hAnsi="Segoe UI Emoji" w:cs="Segoe UI Emoji"/>
+          <w:b/>
+          <w:bCs/>
+        </w:rPr>
+        <w:t>📱</w:t>
+      </w:r>
+      <w:r>
+        <w:rPr>
+          <w:b/>
+          <w:bCs/>
+        </w:rPr>
+        <w:t xml:space="preserve"> EP-02: Core PWA y Experiencia de Usuario Móvil</w:t>
+      </w:r>
+    </w:p>
+    <w:p>
+      <w:pPr>
+        <w:pStyle w:val="ListParagraph"/>
+        <w:numPr>
+          <w:ilvl w:val="0"/>
+          <w:numId w:val="4"/>
+        </w:numPr>
+        <w:spacing w:before="240" w:line="360" w:lineRule="auto"/>
+      </w:pPr>
+      <w:r>
+        <w:rPr>
+          <w:b/>
+          <w:bCs/>
+        </w:rPr>
+        <w:t>HU 2.1: Instalación de la aplicación en la pantalla de inicio.</w:t>
+      </w:r>
+    </w:p>
+    <w:p>
+      <w:pPr>
+        <w:pStyle w:val="ListParagraph"/>
+        <w:numPr>
+          <w:ilvl w:val="0"/>
+          <w:numId w:val="4"/>
+        </w:numPr>
+        <w:spacing w:before="240" w:line="360" w:lineRule="auto"/>
+      </w:pPr>
+      <w:r>
+        <w:rPr>
+          <w:b/>
+          <w:bCs/>
+        </w:rPr>
+        <w:t>Descripción:</w:t>
+      </w:r>
+      <w:r>
+        <w:t xml:space="preserve"> Como Usuario móvil, quiero ver un botón para agregar </w:t>
+      </w:r>
+      <w:proofErr w:type="spellStart"/>
+      <w:r>
+        <w:t>VeraMarket</w:t>
+      </w:r>
+      <w:proofErr w:type="spellEnd"/>
+      <w:r>
+        <w:t xml:space="preserve"> a mi pantalla de inicio, para usarla como una </w:t>
+      </w:r>
+      <w:proofErr w:type="gramStart"/>
+      <w:r>
+        <w:t>app</w:t>
+      </w:r>
+      <w:proofErr w:type="gramEnd"/>
+      <w:r>
+        <w:t xml:space="preserve"> nativa sin consumir espacio de almacenamiento.</w:t>
+      </w:r>
+    </w:p>
+    <w:p>
+      <w:pPr>
+        <w:pStyle w:val="ListParagraph"/>
+        <w:numPr>
+          <w:ilvl w:val="0"/>
+          <w:numId w:val="4"/>
+        </w:numPr>
+        <w:spacing w:before="240" w:line="360" w:lineRule="auto"/>
+      </w:pPr>
+      <w:r>
+        <w:rPr>
+          <w:b/>
+          <w:bCs/>
+        </w:rPr>
+        <w:t>Criterios de Aceptación:</w:t>
+      </w:r>
+    </w:p>
+    <w:p>
+      <w:pPr>
+        <w:pStyle w:val="ListParagraph"/>
+        <w:numPr>
+          <w:ilvl w:val="0"/>
+          <w:numId w:val="4"/>
+        </w:numPr>
+        <w:spacing w:before="240" w:line="360" w:lineRule="auto"/>
+      </w:pPr>
+      <w:proofErr w:type="spellStart"/>
+      <w:proofErr w:type="gramStart"/>
+      <w:r>
+        <w:t>manifest.json</w:t>
+      </w:r>
+      <w:proofErr w:type="spellEnd"/>
+      <w:proofErr w:type="gramEnd"/>
+      <w:r>
+        <w:t xml:space="preserve"> configurado correctamente (iconos, colores de tema).</w:t>
+      </w:r>
+    </w:p>
+    <w:p>
+      <w:pPr>
+        <w:pStyle w:val="ListParagraph"/>
+        <w:numPr>
+          <w:ilvl w:val="0"/>
+          <w:numId w:val="4"/>
+        </w:numPr>
+        <w:spacing w:before="240" w:line="360" w:lineRule="auto"/>
+      </w:pPr>
+      <w:r>
+        <w:t xml:space="preserve">El navegador dispara el </w:t>
+      </w:r>
+      <w:proofErr w:type="spellStart"/>
+      <w:r>
+        <w:rPr>
+          <w:i/>
+          <w:iCs/>
+        </w:rPr>
+        <w:t>prompt</w:t>
+      </w:r>
+      <w:proofErr w:type="spellEnd"/>
+      <w:r>
+        <w:t xml:space="preserve"> nativo de "Añadir a pantalla de inicio".</w:t>
+      </w:r>
+    </w:p>
+    <w:p>
+      <w:pPr>
+        <w:pStyle w:val="ListParagraph"/>
+        <w:numPr>
+          <w:ilvl w:val="0"/>
+          <w:numId w:val="4"/>
+        </w:numPr>
+        <w:spacing w:before="240" w:line="360" w:lineRule="auto"/>
+      </w:pPr>
+      <w:r>
+        <w:rPr>
+          <w:b/>
+          <w:bCs/>
+        </w:rPr>
+        <w:t xml:space="preserve">HU 2.2: </w:t>
+      </w:r>
+      <w:proofErr w:type="spellStart"/>
+      <w:r>
+        <w:rPr>
+          <w:b/>
+          <w:bCs/>
+        </w:rPr>
+        <w:t>Skeleton</w:t>
+      </w:r>
+      <w:proofErr w:type="spellEnd"/>
+      <w:r>
+        <w:rPr>
+          <w:b/>
+          <w:bCs/>
+        </w:rPr>
+        <w:t xml:space="preserve"> </w:t>
+      </w:r>
+      <w:proofErr w:type="spellStart"/>
+      <w:r>
+        <w:rPr>
+          <w:b/>
+          <w:bCs/>
+        </w:rPr>
+        <w:t>loaders</w:t>
+      </w:r>
+      <w:proofErr w:type="spellEnd"/>
+      <w:r>
+        <w:rPr>
+          <w:b/>
+          <w:bCs/>
+        </w:rPr>
+        <w:t xml:space="preserve"> y manejo de errores sin red.</w:t>
+      </w:r>
+    </w:p>
+    <w:p>
+      <w:pPr>
+        <w:pStyle w:val="ListParagraph"/>
+        <w:numPr>
+          <w:ilvl w:val="0"/>
+          <w:numId w:val="4"/>
+        </w:numPr>
+        <w:spacing w:before="240" w:line="360" w:lineRule="auto"/>
+      </w:pPr>
+      <w:r>
+        <w:rPr>
+          <w:b/>
+          <w:bCs/>
+        </w:rPr>
+        <w:t>Descripción:</w:t>
+      </w:r>
+      <w:r>
+        <w:t xml:space="preserve"> Como Usuario en un campus con mala señal, quiero ver una pantalla de carga esquelética o un mensaje amigable si pierdo conexión, para no ver una pantalla rota o en blanco.</w:t>
+      </w:r>
+    </w:p>
+    <w:p>
+      <w:pPr>
+        <w:pStyle w:val="ListParagraph"/>
+        <w:numPr>
+          <w:ilvl w:val="0"/>
+          <w:numId w:val="4"/>
+        </w:numPr>
+        <w:spacing w:before="240" w:line="360" w:lineRule="auto"/>
+      </w:pPr>
+      <w:r>
+        <w:rPr>
+          <w:b/>
+          <w:bCs/>
+        </w:rPr>
+        <w:lastRenderedPageBreak/>
+        <w:t>Criterios de Aceptación:</w:t>
+      </w:r>
+    </w:p>
+    <w:p>
+      <w:pPr>
+        <w:pStyle w:val="ListParagraph"/>
+        <w:numPr>
+          <w:ilvl w:val="0"/>
+          <w:numId w:val="4"/>
+        </w:numPr>
+        <w:spacing w:before="240" w:line="360" w:lineRule="auto"/>
+      </w:pPr>
+      <w:r>
+        <w:t>Los componentes de Next.js muestran animaciones "</w:t>
+      </w:r>
+      <w:proofErr w:type="spellStart"/>
+      <w:r>
+        <w:t>Skeleton</w:t>
+      </w:r>
+      <w:proofErr w:type="spellEnd"/>
+      <w:r>
+        <w:t>" mientras el Fetch de datos resuelve.</w:t>
+      </w:r>
+    </w:p>
+    <w:p>
+      <w:pPr>
+        <w:pStyle w:val="ListParagraph"/>
+        <w:numPr>
+          <w:ilvl w:val="0"/>
+          <w:numId w:val="4"/>
+        </w:numPr>
+        <w:spacing w:before="240" w:line="360" w:lineRule="auto"/>
+      </w:pPr>
+      <w:r>
+        <w:t xml:space="preserve">Si la API da </w:t>
+      </w:r>
+      <w:proofErr w:type="spellStart"/>
+      <w:r>
+        <w:rPr>
+          <w:i/>
+          <w:iCs/>
+        </w:rPr>
+        <w:t>timeout</w:t>
+      </w:r>
+      <w:proofErr w:type="spellEnd"/>
+      <w:r>
+        <w:t xml:space="preserve"> o no hay internet, se muestra un banner de "Sin conexión a internet" interceptado por el Service Worker.</w:t>
+      </w:r>
+    </w:p>
+    <w:p>
+      <w:pPr>
+        <w:pStyle w:val="ListParagraph"/>
+        <w:numPr>
+          <w:ilvl w:val="0"/>
+          <w:numId w:val="4"/>
+        </w:numPr>
+        <w:spacing w:before="240" w:line="360" w:lineRule="auto"/>
+      </w:pPr>
+      <w:r>
+        <w:rPr>
+          <w:b/>
+          <w:bCs/>
+        </w:rPr>
+        <w:t xml:space="preserve">HU 2.3: Configuración de notificaciones </w:t>
+      </w:r>
+      <w:proofErr w:type="spellStart"/>
+      <w:r>
+        <w:rPr>
+          <w:b/>
+          <w:bCs/>
+        </w:rPr>
+        <w:t>push</w:t>
+      </w:r>
+      <w:proofErr w:type="spellEnd"/>
+      <w:r>
+        <w:rPr>
+          <w:b/>
+          <w:bCs/>
+        </w:rPr>
+        <w:t xml:space="preserve"> web.</w:t>
+      </w:r>
+    </w:p>
+    <w:p>
+      <w:pPr>
+        <w:pStyle w:val="ListParagraph"/>
+        <w:numPr>
+          <w:ilvl w:val="0"/>
+          <w:numId w:val="4"/>
+        </w:numPr>
+        <w:spacing w:before="240" w:line="360" w:lineRule="auto"/>
+      </w:pPr>
+      <w:r>
+        <w:rPr>
+          <w:b/>
+          <w:bCs/>
+        </w:rPr>
+        <w:t>Descripción:</w:t>
+      </w:r>
+      <w:r>
+        <w:t xml:space="preserve"> Como Vendedor, quiero recibir notificaciones </w:t>
+      </w:r>
+      <w:proofErr w:type="spellStart"/>
+      <w:r>
+        <w:t>push</w:t>
+      </w:r>
+      <w:proofErr w:type="spellEnd"/>
+      <w:r>
+        <w:t xml:space="preserve"> en mi celular cuando alguien me escriba, para no perder oportunidades de venta.</w:t>
+      </w:r>
+    </w:p>
+    <w:p>
+      <w:pPr>
+        <w:pStyle w:val="ListParagraph"/>
+        <w:numPr>
+          <w:ilvl w:val="0"/>
+          <w:numId w:val="4"/>
+        </w:numPr>
+        <w:spacing w:before="240" w:line="360" w:lineRule="auto"/>
+      </w:pPr>
+      <w:r>
+        <w:rPr>
+          <w:b/>
+          <w:bCs/>
+        </w:rPr>
+        <w:t>Criterios de Aceptación:</w:t>
+      </w:r>
+    </w:p>
+    <w:p>
+      <w:pPr>
+        <w:pStyle w:val="ListParagraph"/>
+        <w:numPr>
+          <w:ilvl w:val="0"/>
+          <w:numId w:val="4"/>
+        </w:numPr>
+        <w:spacing w:before="240" w:line="360" w:lineRule="auto"/>
+      </w:pPr>
+      <w:r>
+        <w:t>Solicitud de permisos de notificación al usuario.</w:t>
+      </w:r>
+    </w:p>
+    <w:p>
+      <w:pPr>
+        <w:pStyle w:val="ListParagraph"/>
+        <w:numPr>
+          <w:ilvl w:val="0"/>
+          <w:numId w:val="4"/>
+        </w:numPr>
+        <w:spacing w:before="240" w:line="360" w:lineRule="auto"/>
+      </w:pPr>
+      <w:r>
+        <w:t xml:space="preserve">El Service Worker es capaz de recibir y renderizar una alerta </w:t>
+      </w:r>
+      <w:proofErr w:type="spellStart"/>
+      <w:r>
+        <w:t>push</w:t>
+      </w:r>
+      <w:proofErr w:type="spellEnd"/>
+      <w:r>
+        <w:t xml:space="preserve"> en el dispositivo.</w:t>
+      </w:r>
+    </w:p>
+    <w:p>
+      <w:pPr>
+        <w:pStyle w:val="ListParagraph"/>
+        <w:numPr>
+          <w:ilvl w:val="0"/>
+          <w:numId w:val="4"/>
+        </w:numPr>
+        <w:spacing w:before="240" w:line="360" w:lineRule="auto"/>
+      </w:pPr>
+      <w:r>
+        <w:pict w14:anchorId="68EBBCC7">
+          <v:rect id="_x0000_i1026" style="width:0;height:1.5pt" o:hralign="center" o:hrstd="t" o:hr="t" fillcolor="#a0a0a0" stroked="f"/>
+        </w:pict>
+      </w:r>
+    </w:p>
+    <w:p>
+      <w:pPr>
+        <w:pStyle w:val="ListParagraph"/>
+        <w:numPr>
+          <w:ilvl w:val="0"/>
+          <w:numId w:val="4"/>
+        </w:numPr>
+        <w:spacing w:before="240" w:line="360" w:lineRule="auto"/>
+        <w:rPr>
+          <w:b/>
+          <w:bCs/>
+        </w:rPr>
+      </w:pPr>
+      <w:r>
+        <w:rPr>
+          <w:rFonts w:ascii="Segoe UI Emoji" w:hAnsi="Segoe UI Emoji" w:cs="Segoe UI Emoji"/>
+          <w:b/>
+          <w:bCs/>
+        </w:rPr>
+        <w:t>🛍️</w:t>
+      </w:r>
+      <w:r>
+        <w:rPr>
+          <w:b/>
+          <w:bCs/>
+        </w:rPr>
+        <w:t xml:space="preserve"> EP-03: Gestión del Catálogo P2P</w:t>
+      </w:r>
+    </w:p>
+    <w:p>
+      <w:pPr>
+        <w:pStyle w:val="ListParagraph"/>
+        <w:numPr>
+          <w:ilvl w:val="0"/>
+          <w:numId w:val="4"/>
+        </w:numPr>
+        <w:spacing w:before="240" w:line="360" w:lineRule="auto"/>
+      </w:pPr>
+      <w:r>
+        <w:rPr>
+          <w:b/>
+          <w:bCs/>
+        </w:rPr>
+        <w:t>HU 3.1: Creación de publicaciones (imágenes, categoría y precio en COP).</w:t>
+      </w:r>
+    </w:p>
+    <w:p>
+      <w:pPr>
+        <w:pStyle w:val="ListParagraph"/>
+        <w:numPr>
+          <w:ilvl w:val="0"/>
+          <w:numId w:val="4"/>
+        </w:numPr>
+        <w:spacing w:before="240" w:line="360" w:lineRule="auto"/>
+      </w:pPr>
+      <w:r>
+        <w:rPr>
+          <w:b/>
+          <w:bCs/>
+        </w:rPr>
+        <w:t>Descripción:</w:t>
+      </w:r>
+      <w:r>
+        <w:t xml:space="preserve"> Como Vendedor, quiero subir un producto con foto, descripción y precio, para que los compradores lo vean en el catálogo.</w:t>
+      </w:r>
+    </w:p>
+    <w:p>
+      <w:pPr>
+        <w:pStyle w:val="ListParagraph"/>
+        <w:numPr>
+          <w:ilvl w:val="0"/>
+          <w:numId w:val="4"/>
+        </w:numPr>
+        <w:spacing w:before="240" w:line="360" w:lineRule="auto"/>
+      </w:pPr>
+      <w:r>
+        <w:rPr>
+          <w:b/>
+          <w:bCs/>
+        </w:rPr>
+        <w:t>Criterios de Aceptación:</w:t>
+      </w:r>
+    </w:p>
+    <w:p>
+      <w:pPr>
+        <w:pStyle w:val="ListParagraph"/>
+        <w:numPr>
+          <w:ilvl w:val="0"/>
+          <w:numId w:val="4"/>
+        </w:numPr>
+        <w:spacing w:before="240" w:line="360" w:lineRule="auto"/>
+      </w:pPr>
+      <w:r>
+        <w:t>El precio solo permite formato numérico y asume moneda local (COP).</w:t>
+      </w:r>
+    </w:p>
+    <w:p>
+      <w:pPr>
+        <w:pStyle w:val="ListParagraph"/>
+        <w:numPr>
+          <w:ilvl w:val="0"/>
+          <w:numId w:val="4"/>
+        </w:numPr>
+        <w:spacing w:before="240" w:line="360" w:lineRule="auto"/>
+      </w:pPr>
+      <w:r>
+        <w:t xml:space="preserve">La imagen se optimiza y sube a un </w:t>
+      </w:r>
+      <w:proofErr w:type="spellStart"/>
+      <w:r>
+        <w:t>bucket</w:t>
+      </w:r>
+      <w:proofErr w:type="spellEnd"/>
+      <w:r>
+        <w:t xml:space="preserve"> (ej. </w:t>
+      </w:r>
+      <w:proofErr w:type="spellStart"/>
+      <w:r>
+        <w:t>Supabase</w:t>
+      </w:r>
+      <w:proofErr w:type="spellEnd"/>
+      <w:r>
+        <w:t xml:space="preserve"> Storage) con límite de peso (ej. 2MB).</w:t>
+      </w:r>
+    </w:p>
+    <w:p>
+      <w:pPr>
+        <w:pStyle w:val="ListParagraph"/>
+        <w:numPr>
+          <w:ilvl w:val="0"/>
+          <w:numId w:val="4"/>
+        </w:numPr>
+        <w:spacing w:before="240" w:line="360" w:lineRule="auto"/>
+      </w:pPr>
+      <w:r>
+        <w:rPr>
+          <w:b/>
+          <w:bCs/>
+        </w:rPr>
+        <w:t>HU 3.2: Edición y actualización de inventario.</w:t>
+      </w:r>
+    </w:p>
+    <w:p>
+      <w:pPr>
+        <w:pStyle w:val="ListParagraph"/>
+        <w:numPr>
+          <w:ilvl w:val="0"/>
+          <w:numId w:val="4"/>
+        </w:numPr>
+        <w:spacing w:before="240" w:line="360" w:lineRule="auto"/>
+      </w:pPr>
+      <w:r>
+        <w:rPr>
+          <w:b/>
+          <w:bCs/>
+        </w:rPr>
+        <w:t>Descripción:</w:t>
+      </w:r>
+      <w:r>
+        <w:t xml:space="preserve"> Como Vendedor, quiero cambiar el estado de mi producto a "Agotado", para que los usuarios no me contacten si ya no me quedan empanadas o cupos.</w:t>
+      </w:r>
+    </w:p>
+    <w:p>
+      <w:pPr>
+        <w:pStyle w:val="ListParagraph"/>
+        <w:numPr>
+          <w:ilvl w:val="0"/>
+          <w:numId w:val="4"/>
+        </w:numPr>
+        <w:spacing w:before="240" w:line="360" w:lineRule="auto"/>
+      </w:pPr>
+      <w:r>
+        <w:rPr>
+          <w:b/>
+          <w:bCs/>
+        </w:rPr>
+        <w:t>Criterios de Aceptación:</w:t>
+      </w:r>
+    </w:p>
+    <w:p>
+      <w:pPr>
+        <w:pStyle w:val="ListParagraph"/>
+        <w:numPr>
+          <w:ilvl w:val="0"/>
+          <w:numId w:val="4"/>
+        </w:numPr>
+        <w:spacing w:before="240" w:line="360" w:lineRule="auto"/>
+      </w:pPr>
+      <w:r>
+        <w:t>Botón de cambio de estado rápido (Disponible / Agotado).</w:t>
+      </w:r>
+    </w:p>
+    <w:p>
+      <w:pPr>
+        <w:pStyle w:val="ListParagraph"/>
+        <w:numPr>
+          <w:ilvl w:val="0"/>
+          <w:numId w:val="4"/>
+        </w:numPr>
+        <w:spacing w:before="240" w:line="360" w:lineRule="auto"/>
+      </w:pPr>
+      <w:r>
+        <w:t>Solo el dueño del producto (validado por JWT) puede editarlo.</w:t>
+      </w:r>
+    </w:p>
+    <w:p>
+      <w:pPr>
+        <w:pStyle w:val="ListParagraph"/>
+        <w:numPr>
+          <w:ilvl w:val="0"/>
+          <w:numId w:val="4"/>
+        </w:numPr>
+        <w:spacing w:before="240" w:line="360" w:lineRule="auto"/>
+      </w:pPr>
+      <w:r>
+        <w:rPr>
+          <w:b/>
+          <w:bCs/>
+        </w:rPr>
+        <w:t>HU 3.3: Eliminación o pausa temporal de publicaciones.</w:t>
+      </w:r>
+    </w:p>
+    <w:p>
+      <w:pPr>
+        <w:pStyle w:val="ListParagraph"/>
+        <w:numPr>
+          <w:ilvl w:val="0"/>
+          <w:numId w:val="4"/>
+        </w:numPr>
+        <w:spacing w:before="240" w:line="360" w:lineRule="auto"/>
+      </w:pPr>
+      <w:r>
+        <w:rPr>
+          <w:b/>
+          <w:bCs/>
+        </w:rPr>
+        <w:lastRenderedPageBreak/>
+        <w:t>Descripción:</w:t>
+      </w:r>
+      <w:r>
+        <w:t xml:space="preserve"> Como Vendedor, quiero ocultar o eliminar un producto de la vitrina sin borrar mi historial de ventas.</w:t>
+      </w:r>
+    </w:p>
+    <w:p>
+      <w:pPr>
+        <w:pStyle w:val="ListParagraph"/>
+        <w:numPr>
+          <w:ilvl w:val="0"/>
+          <w:numId w:val="4"/>
+        </w:numPr>
+        <w:spacing w:before="240" w:line="360" w:lineRule="auto"/>
+      </w:pPr>
+      <w:r>
+        <w:rPr>
+          <w:b/>
+          <w:bCs/>
+        </w:rPr>
+        <w:t>Criterios de Aceptación:</w:t>
+      </w:r>
+    </w:p>
+    <w:p>
+      <w:pPr>
+        <w:pStyle w:val="ListParagraph"/>
+        <w:numPr>
+          <w:ilvl w:val="0"/>
+          <w:numId w:val="4"/>
+        </w:numPr>
+        <w:spacing w:before="240" w:line="360" w:lineRule="auto"/>
+      </w:pPr>
+      <w:r>
+        <w:t xml:space="preserve">Se implementa un </w:t>
+      </w:r>
+      <w:proofErr w:type="spellStart"/>
+      <w:r>
+        <w:rPr>
+          <w:i/>
+          <w:iCs/>
+        </w:rPr>
+        <w:t>Soft</w:t>
+      </w:r>
+      <w:proofErr w:type="spellEnd"/>
+      <w:r>
+        <w:rPr>
+          <w:i/>
+          <w:iCs/>
+        </w:rPr>
+        <w:t>-Delete</w:t>
+      </w:r>
+      <w:r>
+        <w:t xml:space="preserve"> (ej. campo </w:t>
+      </w:r>
+      <w:proofErr w:type="spellStart"/>
+      <w:r>
+        <w:t>is_active</w:t>
+      </w:r>
+      <w:proofErr w:type="spellEnd"/>
+      <w:r>
+        <w:t xml:space="preserve"> = false en la BD) en lugar de un DELETE real.</w:t>
+      </w:r>
+    </w:p>
+    <w:p>
+      <w:pPr>
+        <w:pStyle w:val="ListParagraph"/>
+        <w:numPr>
+          <w:ilvl w:val="0"/>
+          <w:numId w:val="4"/>
+        </w:numPr>
+        <w:spacing w:before="240" w:line="360" w:lineRule="auto"/>
+      </w:pPr>
+      <w:r>
+        <w:t>El producto desaparece instantáneamente del catálogo público.</w:t>
+      </w:r>
+    </w:p>
+    <w:p>
+      <w:pPr>
+        <w:pStyle w:val="ListParagraph"/>
+        <w:numPr>
+          <w:ilvl w:val="0"/>
+          <w:numId w:val="4"/>
+        </w:numPr>
+        <w:spacing w:before="240" w:line="360" w:lineRule="auto"/>
+      </w:pPr>
+      <w:r>
+        <w:pict w14:anchorId="36B5FE6D">
+          <v:rect id="_x0000_i1027" style="width:0;height:1.5pt" o:hralign="center" o:hrstd="t" o:hr="t" fillcolor="#a0a0a0" stroked="f"/>
+        </w:pict>
+      </w:r>
+    </w:p>
+    <w:p>
+      <w:pPr>
+        <w:pStyle w:val="ListParagraph"/>
+        <w:numPr>
+          <w:ilvl w:val="0"/>
+          <w:numId w:val="4"/>
+        </w:numPr>
+        <w:spacing w:before="240" w:line="360" w:lineRule="auto"/>
+        <w:rPr>
+          <w:b/>
+          <w:bCs/>
+        </w:rPr>
+      </w:pPr>
+      <w:r>
+        <w:rPr>
+          <w:rFonts w:ascii="Segoe UI Emoji" w:hAnsi="Segoe UI Emoji" w:cs="Segoe UI Emoji"/>
+          <w:b/>
+          <w:bCs/>
+        </w:rPr>
+        <w:t>🧠</w:t>
+      </w:r>
+      <w:r>
+        <w:rPr>
+          <w:b/>
+          <w:bCs/>
+        </w:rPr>
+        <w:t xml:space="preserve"> EP-04: Búsqueda Inteligente (MVP - Motor Open </w:t>
+      </w:r>
+      <w:proofErr w:type="spellStart"/>
+      <w:r>
+        <w:rPr>
+          <w:b/>
+          <w:bCs/>
+        </w:rPr>
+        <w:t>Source</w:t>
+      </w:r>
+      <w:proofErr w:type="spellEnd"/>
+      <w:r>
+        <w:rPr>
+          <w:b/>
+          <w:bCs/>
+        </w:rPr>
+        <w:t xml:space="preserve"> / </w:t>
+      </w:r>
+      <w:proofErr w:type="spellStart"/>
+      <w:r>
+        <w:rPr>
+          <w:b/>
+          <w:bCs/>
+        </w:rPr>
+        <w:t>Fallback</w:t>
+      </w:r>
+      <w:proofErr w:type="spellEnd"/>
+      <w:r>
+        <w:rPr>
+          <w:b/>
+          <w:bCs/>
+        </w:rPr>
+        <w:t>)</w:t>
+      </w:r>
+    </w:p>
+    <w:p>
+      <w:pPr>
+        <w:pStyle w:val="ListParagraph"/>
+        <w:numPr>
+          <w:ilvl w:val="0"/>
+          <w:numId w:val="4"/>
+        </w:numPr>
+        <w:spacing w:before="240" w:line="360" w:lineRule="auto"/>
+      </w:pPr>
+      <w:r>
+        <w:rPr>
+          <w:b/>
+          <w:bCs/>
+        </w:rPr>
+        <w:t>HU 4.1: Búsqueda tradicional y filtros.</w:t>
+      </w:r>
+    </w:p>
+    <w:p>
+      <w:pPr>
+        <w:pStyle w:val="ListParagraph"/>
+        <w:numPr>
+          <w:ilvl w:val="0"/>
+          <w:numId w:val="4"/>
+        </w:numPr>
+        <w:spacing w:before="240" w:line="360" w:lineRule="auto"/>
+      </w:pPr>
+      <w:r>
+        <w:rPr>
+          <w:b/>
+          <w:bCs/>
+        </w:rPr>
+        <w:t>Descripción:</w:t>
+      </w:r>
+      <w:r>
+        <w:t xml:space="preserve"> Como Comprador, quiero usar una barra de búsqueda para buscar productos exactos o filtrar por categorías, para encontrar lo que quiero rápido.</w:t>
+      </w:r>
+    </w:p>
+    <w:p>
+      <w:pPr>
+        <w:pStyle w:val="ListParagraph"/>
+        <w:numPr>
+          <w:ilvl w:val="0"/>
+          <w:numId w:val="4"/>
+        </w:numPr>
+        <w:spacing w:before="240" w:line="360" w:lineRule="auto"/>
+      </w:pPr>
+      <w:r>
+        <w:rPr>
+          <w:b/>
+          <w:bCs/>
+        </w:rPr>
+        <w:t>Criterios de Aceptación:</w:t>
+      </w:r>
+    </w:p>
+    <w:p>
+      <w:pPr>
+        <w:pStyle w:val="ListParagraph"/>
+        <w:numPr>
+          <w:ilvl w:val="0"/>
+          <w:numId w:val="4"/>
+        </w:numPr>
+        <w:spacing w:before="240" w:line="360" w:lineRule="auto"/>
+      </w:pPr>
+      <w:r>
+        <w:t xml:space="preserve">Implementación de </w:t>
+      </w:r>
+      <w:r>
+        <w:rPr>
+          <w:i/>
+          <w:iCs/>
+        </w:rPr>
+        <w:t>Full-Text Search</w:t>
+      </w:r>
+      <w:r>
+        <w:t xml:space="preserve"> usando </w:t>
+      </w:r>
+      <w:proofErr w:type="spellStart"/>
+      <w:r>
+        <w:t>tsvector</w:t>
+      </w:r>
+      <w:proofErr w:type="spellEnd"/>
+      <w:r>
+        <w:t xml:space="preserve"> en PostgreSQL.</w:t>
+      </w:r>
+    </w:p>
+    <w:p>
+      <w:pPr>
+        <w:pStyle w:val="ListParagraph"/>
+        <w:numPr>
+          <w:ilvl w:val="0"/>
+          <w:numId w:val="4"/>
+        </w:numPr>
+        <w:spacing w:before="240" w:line="360" w:lineRule="auto"/>
+      </w:pPr>
+      <w:r>
+        <w:t>Latencia de respuesta menor a 1 segundo.</w:t>
+      </w:r>
+    </w:p>
+    <w:p>
+      <w:pPr>
+        <w:pStyle w:val="ListParagraph"/>
+        <w:numPr>
+          <w:ilvl w:val="0"/>
+          <w:numId w:val="4"/>
+        </w:numPr>
+        <w:spacing w:before="240" w:line="360" w:lineRule="auto"/>
+      </w:pPr>
+      <w:r>
+        <w:rPr>
+          <w:b/>
+          <w:bCs/>
+        </w:rPr>
+        <w:t>HU 4.2: Búsqueda semántica usando el motor IA.</w:t>
+      </w:r>
+    </w:p>
+    <w:p>
+      <w:pPr>
+        <w:pStyle w:val="ListParagraph"/>
+        <w:numPr>
+          <w:ilvl w:val="0"/>
+          <w:numId w:val="4"/>
+        </w:numPr>
+        <w:spacing w:before="240" w:line="360" w:lineRule="auto"/>
+      </w:pPr>
+      <w:r>
+        <w:rPr>
+          <w:b/>
+          <w:bCs/>
+        </w:rPr>
+        <w:t>Descripción:</w:t>
+      </w:r>
+      <w:r>
+        <w:t xml:space="preserve"> Como Comprador, quiero buscar con lenguaje natural o modismos caleños (ej. "algo </w:t>
+      </w:r>
+      <w:proofErr w:type="spellStart"/>
+      <w:r>
+        <w:t>pa</w:t>
+      </w:r>
+      <w:proofErr w:type="spellEnd"/>
+      <w:r>
+        <w:t xml:space="preserve"> picar", "mecato"), para que la IA me sugiera productos </w:t>
+      </w:r>
+      <w:proofErr w:type="gramStart"/>
+      <w:r>
+        <w:t>relevantes</w:t>
+      </w:r>
+      <w:proofErr w:type="gramEnd"/>
+      <w:r>
+        <w:t xml:space="preserve"> aunque no tengan esa palabra exacta en el título.</w:t>
+      </w:r>
+    </w:p>
+    <w:p>
+      <w:pPr>
+        <w:pStyle w:val="ListParagraph"/>
+        <w:numPr>
+          <w:ilvl w:val="0"/>
+          <w:numId w:val="4"/>
+        </w:numPr>
+        <w:spacing w:before="240" w:line="360" w:lineRule="auto"/>
+      </w:pPr>
+      <w:r>
+        <w:rPr>
+          <w:b/>
+          <w:bCs/>
+        </w:rPr>
+        <w:t>Criterios de Aceptación:</w:t>
+      </w:r>
+    </w:p>
+    <w:p>
+      <w:pPr>
+        <w:pStyle w:val="ListParagraph"/>
+        <w:numPr>
+          <w:ilvl w:val="0"/>
+          <w:numId w:val="4"/>
+        </w:numPr>
+        <w:spacing w:before="240" w:line="360" w:lineRule="auto"/>
+      </w:pPr>
+      <w:r>
+        <w:t xml:space="preserve">Se envía la consulta a la API de </w:t>
+      </w:r>
+      <w:proofErr w:type="spellStart"/>
+      <w:r>
+        <w:t>OpenAI</w:t>
+      </w:r>
+      <w:proofErr w:type="spellEnd"/>
+      <w:r>
+        <w:t xml:space="preserve"> (GPT-4o-mini).</w:t>
+      </w:r>
+    </w:p>
+    <w:p>
+      <w:pPr>
+        <w:pStyle w:val="ListParagraph"/>
+        <w:numPr>
+          <w:ilvl w:val="0"/>
+          <w:numId w:val="4"/>
+        </w:numPr>
+        <w:spacing w:before="240" w:line="360" w:lineRule="auto"/>
+      </w:pPr>
+      <w:r>
+        <w:rPr>
+          <w:i/>
+          <w:iCs/>
+        </w:rPr>
+        <w:t>Arquitectura:</w:t>
+      </w:r>
+      <w:r>
+        <w:t xml:space="preserve"> Si la API de </w:t>
+      </w:r>
+      <w:proofErr w:type="spellStart"/>
+      <w:r>
+        <w:t>OpenAI</w:t>
+      </w:r>
+      <w:proofErr w:type="spellEnd"/>
+      <w:r>
+        <w:t xml:space="preserve"> falla o hay límite de uso, el sistema hace un </w:t>
+      </w:r>
+      <w:proofErr w:type="spellStart"/>
+      <w:r>
+        <w:rPr>
+          <w:i/>
+          <w:iCs/>
+        </w:rPr>
+        <w:t>fallback</w:t>
+      </w:r>
+      <w:proofErr w:type="spellEnd"/>
+      <w:r>
+        <w:t xml:space="preserve"> automático a la búsqueda tradicional de la HU 4.1.</w:t>
+      </w:r>
+    </w:p>
+    <w:p>
+      <w:pPr>
+        <w:pStyle w:val="ListParagraph"/>
+        <w:numPr>
+          <w:ilvl w:val="0"/>
+          <w:numId w:val="4"/>
+        </w:numPr>
+        <w:spacing w:before="240" w:line="360" w:lineRule="auto"/>
+      </w:pPr>
+      <w:r>
+        <w:rPr>
+          <w:b/>
+          <w:bCs/>
+        </w:rPr>
+        <w:t>HU 4.3: Visualización de recomendaciones ("</w:t>
+      </w:r>
+      <w:proofErr w:type="spellStart"/>
+      <w:r>
+        <w:rPr>
+          <w:b/>
+          <w:bCs/>
+        </w:rPr>
+        <w:t>VeraMatch</w:t>
+      </w:r>
+      <w:proofErr w:type="spellEnd"/>
+      <w:r>
+        <w:rPr>
+          <w:b/>
+          <w:bCs/>
+        </w:rPr>
+        <w:t>").</w:t>
+      </w:r>
+    </w:p>
+    <w:p>
+      <w:pPr>
+        <w:pStyle w:val="ListParagraph"/>
+        <w:numPr>
+          <w:ilvl w:val="0"/>
+          <w:numId w:val="4"/>
+        </w:numPr>
+        <w:spacing w:before="240" w:line="360" w:lineRule="auto"/>
+      </w:pPr>
+      <w:r>
+        <w:rPr>
+          <w:b/>
+          <w:bCs/>
+        </w:rPr>
+        <w:t>Descripción:</w:t>
+      </w:r>
+      <w:r>
+        <w:t xml:space="preserve"> Como Comprador, quiero ver productos similares al final del detalle de un producto, para descubrir otras opciones de emprendedores.</w:t>
+      </w:r>
+    </w:p>
+    <w:p>
+      <w:pPr>
+        <w:pStyle w:val="ListParagraph"/>
+        <w:numPr>
+          <w:ilvl w:val="0"/>
+          <w:numId w:val="4"/>
+        </w:numPr>
+        <w:spacing w:before="240" w:line="360" w:lineRule="auto"/>
+      </w:pPr>
+      <w:r>
+        <w:rPr>
+          <w:b/>
+          <w:bCs/>
+        </w:rPr>
+        <w:t>Criterios de Aceptación:</w:t>
+      </w:r>
+    </w:p>
+    <w:p>
+      <w:pPr>
+        <w:pStyle w:val="ListParagraph"/>
+        <w:numPr>
+          <w:ilvl w:val="0"/>
+          <w:numId w:val="4"/>
+        </w:numPr>
+        <w:spacing w:before="240" w:line="360" w:lineRule="auto"/>
+      </w:pPr>
+      <w:r>
+        <w:t>Se muestran de 3 a 5 productos sugeridos basados en la misma categoría o etiquetas del producto actual.</w:t>
+      </w:r>
+    </w:p>
+    <w:p>
+      <w:pPr>
+        <w:pStyle w:val="ListParagraph"/>
+        <w:numPr>
+          <w:ilvl w:val="0"/>
+          <w:numId w:val="4"/>
+        </w:numPr>
+        <w:spacing w:before="240" w:line="360" w:lineRule="auto"/>
+      </w:pPr>
+      <w:r>
+        <w:pict w14:anchorId="7EEE7728">
+          <v:rect id="_x0000_i1028" style="width:0;height:1.5pt" o:hralign="center" o:hrstd="t" o:hr="t" fillcolor="#a0a0a0" stroked="f"/>
+        </w:pict>
+      </w:r>
+    </w:p>
+    <w:p>
+      <w:pPr>
+        <w:pStyle w:val="ListParagraph"/>
+        <w:numPr>
+          <w:ilvl w:val="0"/>
+          <w:numId w:val="4"/>
+        </w:numPr>
+        <w:spacing w:before="240" w:line="360" w:lineRule="auto"/>
+        <w:rPr>
+          <w:b/>
+          <w:bCs/>
+        </w:rPr>
+      </w:pPr>
+      <w:r>
+        <w:rPr>
+          <w:rFonts w:ascii="Segoe UI Emoji" w:hAnsi="Segoe UI Emoji" w:cs="Segoe UI Emoji"/>
+          <w:b/>
+          <w:bCs/>
+        </w:rPr>
+        <w:lastRenderedPageBreak/>
+        <w:t>📍</w:t>
+      </w:r>
+      <w:r>
+        <w:rPr>
+          <w:b/>
+          <w:bCs/>
+        </w:rPr>
+        <w:t xml:space="preserve"> EP-05: Geolocalización Hiper-Local (Campus UAO)</w:t>
+      </w:r>
+    </w:p>
+    <w:p>
+      <w:pPr>
+        <w:pStyle w:val="ListParagraph"/>
+        <w:numPr>
+          <w:ilvl w:val="0"/>
+          <w:numId w:val="4"/>
+        </w:numPr>
+        <w:spacing w:before="240" w:line="360" w:lineRule="auto"/>
+      </w:pPr>
+      <w:r>
+        <w:rPr>
+          <w:b/>
+          <w:bCs/>
+        </w:rPr>
+        <w:t>HU 5.1: Visualización del mapa interactivo (</w:t>
+      </w:r>
+      <w:proofErr w:type="spellStart"/>
+      <w:r>
+        <w:rPr>
+          <w:b/>
+          <w:bCs/>
+        </w:rPr>
+        <w:t>OpenStreetMap</w:t>
+      </w:r>
+      <w:proofErr w:type="spellEnd"/>
+      <w:r>
+        <w:rPr>
+          <w:b/>
+          <w:bCs/>
+        </w:rPr>
+        <w:t>).</w:t>
+      </w:r>
+    </w:p>
+    <w:p>
+      <w:pPr>
+        <w:pStyle w:val="ListParagraph"/>
+        <w:numPr>
+          <w:ilvl w:val="0"/>
+          <w:numId w:val="4"/>
+        </w:numPr>
+        <w:spacing w:before="240" w:line="360" w:lineRule="auto"/>
+      </w:pPr>
+      <w:r>
+        <w:rPr>
+          <w:b/>
+          <w:bCs/>
+        </w:rPr>
+        <w:t>Descripción:</w:t>
+      </w:r>
+      <w:r>
+        <w:t xml:space="preserve"> Como Usuario, quiero ver un mapa del campus con pines marcando dónde están los vendedores, para encontrarlos fácilmente.</w:t>
+      </w:r>
+    </w:p>
+    <w:p>
+      <w:pPr>
+        <w:pStyle w:val="ListParagraph"/>
+        <w:numPr>
+          <w:ilvl w:val="0"/>
+          <w:numId w:val="4"/>
+        </w:numPr>
+        <w:spacing w:before="240" w:line="360" w:lineRule="auto"/>
+      </w:pPr>
+      <w:r>
+        <w:rPr>
+          <w:b/>
+          <w:bCs/>
+        </w:rPr>
+        <w:t>Criterios de Aceptación:</w:t>
+      </w:r>
+    </w:p>
+    <w:p>
+      <w:pPr>
+        <w:pStyle w:val="ListParagraph"/>
+        <w:numPr>
+          <w:ilvl w:val="0"/>
+          <w:numId w:val="4"/>
+        </w:numPr>
+        <w:spacing w:before="240" w:line="360" w:lineRule="auto"/>
+      </w:pPr>
+      <w:r>
+        <w:t xml:space="preserve">Librería tipo </w:t>
+      </w:r>
+      <w:proofErr w:type="spellStart"/>
+      <w:r>
+        <w:rPr>
+          <w:i/>
+          <w:iCs/>
+        </w:rPr>
+        <w:t>Leaflet</w:t>
+      </w:r>
+      <w:proofErr w:type="spellEnd"/>
+      <w:r>
+        <w:rPr>
+          <w:i/>
+          <w:iCs/>
+        </w:rPr>
+        <w:t>/</w:t>
+      </w:r>
+      <w:proofErr w:type="spellStart"/>
+      <w:r>
+        <w:rPr>
+          <w:i/>
+          <w:iCs/>
+        </w:rPr>
+        <w:t>Mapbox</w:t>
+      </w:r>
+      <w:proofErr w:type="spellEnd"/>
+      <w:r>
+        <w:t xml:space="preserve"> integrada con tiles de </w:t>
+      </w:r>
+      <w:proofErr w:type="spellStart"/>
+      <w:r>
+        <w:t>OpenStreetMap</w:t>
+      </w:r>
+      <w:proofErr w:type="spellEnd"/>
+      <w:r>
+        <w:t xml:space="preserve"> (costo $0).</w:t>
+      </w:r>
+    </w:p>
+    <w:p>
+      <w:pPr>
+        <w:pStyle w:val="ListParagraph"/>
+        <w:numPr>
+          <w:ilvl w:val="0"/>
+          <w:numId w:val="4"/>
+        </w:numPr>
+        <w:spacing w:before="240" w:line="360" w:lineRule="auto"/>
+      </w:pPr>
+      <w:r>
+        <w:t xml:space="preserve">Renderizado de pines leyendo coordenadas desde el </w:t>
+      </w:r>
+      <w:proofErr w:type="spellStart"/>
+      <w:r>
+        <w:t>backend</w:t>
+      </w:r>
+      <w:proofErr w:type="spellEnd"/>
+      <w:r>
+        <w:t>.</w:t>
+      </w:r>
+    </w:p>
+    <w:p>
+      <w:pPr>
+        <w:pStyle w:val="ListParagraph"/>
+        <w:numPr>
+          <w:ilvl w:val="0"/>
+          <w:numId w:val="4"/>
+        </w:numPr>
+        <w:spacing w:before="240" w:line="360" w:lineRule="auto"/>
+      </w:pPr>
+      <w:r>
+        <w:rPr>
+          <w:b/>
+          <w:bCs/>
+        </w:rPr>
+        <w:t>HU 5.2: Asignación de ubicación física a una publicación.</w:t>
+      </w:r>
+    </w:p>
+    <w:p>
+      <w:pPr>
+        <w:pStyle w:val="ListParagraph"/>
+        <w:numPr>
+          <w:ilvl w:val="0"/>
+          <w:numId w:val="4"/>
+        </w:numPr>
+        <w:spacing w:before="240" w:line="360" w:lineRule="auto"/>
+      </w:pPr>
+      <w:r>
+        <w:rPr>
+          <w:b/>
+          <w:bCs/>
+        </w:rPr>
+        <w:t>Descripción:</w:t>
+      </w:r>
+      <w:r>
+        <w:t xml:space="preserve"> Como Vendedor, quiero pinchar en el mapa el lugar del campus donde me encuentro, para que los compradores puedan caminar hacia mí.</w:t>
+      </w:r>
+    </w:p>
+    <w:p>
+      <w:pPr>
+        <w:pStyle w:val="ListParagraph"/>
+        <w:numPr>
+          <w:ilvl w:val="0"/>
+          <w:numId w:val="4"/>
+        </w:numPr>
+        <w:spacing w:before="240" w:line="360" w:lineRule="auto"/>
+      </w:pPr>
+      <w:r>
+        <w:rPr>
+          <w:b/>
+          <w:bCs/>
+        </w:rPr>
+        <w:t>Criterios de Aceptación:</w:t>
+      </w:r>
+    </w:p>
+    <w:p>
+      <w:pPr>
+        <w:pStyle w:val="ListParagraph"/>
+        <w:numPr>
+          <w:ilvl w:val="0"/>
+          <w:numId w:val="4"/>
+        </w:numPr>
+        <w:spacing w:before="240" w:line="360" w:lineRule="auto"/>
+      </w:pPr>
+      <w:r>
+        <w:t xml:space="preserve">Guardado de la latitud y longitud en formato GEOMETRY(Point) en </w:t>
+      </w:r>
+      <w:proofErr w:type="spellStart"/>
+      <w:r>
+        <w:t>PostGIS</w:t>
+      </w:r>
+      <w:proofErr w:type="spellEnd"/>
+      <w:r>
+        <w:t>.</w:t>
+      </w:r>
+    </w:p>
+    <w:p>
+      <w:pPr>
+        <w:pStyle w:val="ListParagraph"/>
+        <w:numPr>
+          <w:ilvl w:val="0"/>
+          <w:numId w:val="4"/>
+        </w:numPr>
+        <w:spacing w:before="240" w:line="360" w:lineRule="auto"/>
+      </w:pPr>
+      <w:r>
+        <w:rPr>
+          <w:b/>
+          <w:bCs/>
+        </w:rPr>
+        <w:t>HU 5.3: Filtrado del catálogo por radio de cercanía.</w:t>
+      </w:r>
+    </w:p>
+    <w:p>
+      <w:pPr>
+        <w:pStyle w:val="ListParagraph"/>
+        <w:numPr>
+          <w:ilvl w:val="0"/>
+          <w:numId w:val="4"/>
+        </w:numPr>
+        <w:spacing w:before="240" w:line="360" w:lineRule="auto"/>
+      </w:pPr>
+      <w:r>
+        <w:rPr>
+          <w:b/>
+          <w:bCs/>
+        </w:rPr>
+        <w:t>Descripción:</w:t>
+      </w:r>
+      <w:r>
+        <w:t xml:space="preserve"> Como Comprador con hambre, quiero filtrar para ver solo los vendedores que estén a menos de 100 metros de mi edificio.</w:t>
+      </w:r>
+    </w:p>
+    <w:p>
+      <w:pPr>
+        <w:pStyle w:val="ListParagraph"/>
+        <w:numPr>
+          <w:ilvl w:val="0"/>
+          <w:numId w:val="4"/>
+        </w:numPr>
+        <w:spacing w:before="240" w:line="360" w:lineRule="auto"/>
+      </w:pPr>
+      <w:r>
+        <w:rPr>
+          <w:b/>
+          <w:bCs/>
+        </w:rPr>
+        <w:t>Criterios de Aceptación:</w:t>
+      </w:r>
+    </w:p>
+    <w:p>
+      <w:pPr>
+        <w:pStyle w:val="ListParagraph"/>
+        <w:numPr>
+          <w:ilvl w:val="0"/>
+          <w:numId w:val="4"/>
+        </w:numPr>
+        <w:spacing w:before="240" w:line="360" w:lineRule="auto"/>
+      </w:pPr>
+      <w:r>
+        <w:t xml:space="preserve">Query espacial utilizando la función </w:t>
+      </w:r>
+      <w:proofErr w:type="spellStart"/>
+      <w:r>
+        <w:t>ST_DWithin</w:t>
+      </w:r>
+      <w:proofErr w:type="spellEnd"/>
+      <w:r>
+        <w:t xml:space="preserve"> de </w:t>
+      </w:r>
+      <w:proofErr w:type="spellStart"/>
+      <w:r>
+        <w:t>PostGIS</w:t>
+      </w:r>
+      <w:proofErr w:type="spellEnd"/>
+      <w:r>
+        <w:t xml:space="preserve"> para devolver resultados por radio en metros.</w:t>
+      </w:r>
+    </w:p>
+    <w:p>
+      <w:pPr>
+        <w:pStyle w:val="ListParagraph"/>
+        <w:numPr>
+          <w:ilvl w:val="0"/>
+          <w:numId w:val="4"/>
+        </w:numPr>
+        <w:spacing w:before="240" w:line="360" w:lineRule="auto"/>
+      </w:pPr>
+      <w:r>
+        <w:pict w14:anchorId="1D5E3863">
+          <v:rect id="_x0000_i1029" style="width:0;height:1.5pt" o:hralign="center" o:hrstd="t" o:hr="t" fillcolor="#a0a0a0" stroked="f"/>
+        </w:pict>
+      </w:r>
+    </w:p>
+    <w:p>
+      <w:pPr>
+        <w:pStyle w:val="ListParagraph"/>
+        <w:numPr>
+          <w:ilvl w:val="0"/>
+          <w:numId w:val="4"/>
+        </w:numPr>
+        <w:spacing w:before="240" w:line="360" w:lineRule="auto"/>
+        <w:rPr>
+          <w:b/>
+          <w:bCs/>
+        </w:rPr>
+      </w:pPr>
+      <w:r>
+        <w:rPr>
+          <w:rFonts w:ascii="Segoe UI Emoji" w:hAnsi="Segoe UI Emoji" w:cs="Segoe UI Emoji"/>
+          <w:b/>
+          <w:bCs/>
+        </w:rPr>
+        <w:t>🤝</w:t>
+      </w:r>
+      <w:r>
+        <w:rPr>
+          <w:b/>
+          <w:bCs/>
+        </w:rPr>
+        <w:t xml:space="preserve"> EP-06: Negociación y Cierre P2P (</w:t>
+      </w:r>
+      <w:proofErr w:type="spellStart"/>
+      <w:r>
+        <w:rPr>
+          <w:b/>
+          <w:bCs/>
+        </w:rPr>
+        <w:t>Frictionless</w:t>
+      </w:r>
+      <w:proofErr w:type="spellEnd"/>
+      <w:r>
+        <w:rPr>
+          <w:b/>
+          <w:bCs/>
+        </w:rPr>
+        <w:t>)</w:t>
+      </w:r>
+    </w:p>
+    <w:p>
+      <w:pPr>
+        <w:pStyle w:val="ListParagraph"/>
+        <w:numPr>
+          <w:ilvl w:val="0"/>
+          <w:numId w:val="4"/>
+        </w:numPr>
+        <w:spacing w:before="240" w:line="360" w:lineRule="auto"/>
+      </w:pPr>
+      <w:r>
+        <w:rPr>
+          <w:b/>
+          <w:bCs/>
+        </w:rPr>
+        <w:t>HU 6.1: Chat interno en tiempo real.</w:t>
+      </w:r>
+    </w:p>
+    <w:p>
+      <w:pPr>
+        <w:pStyle w:val="ListParagraph"/>
+        <w:numPr>
+          <w:ilvl w:val="0"/>
+          <w:numId w:val="4"/>
+        </w:numPr>
+        <w:spacing w:before="240" w:line="360" w:lineRule="auto"/>
+      </w:pPr>
+      <w:r>
+        <w:rPr>
+          <w:b/>
+          <w:bCs/>
+        </w:rPr>
+        <w:t>Descripción:</w:t>
+      </w:r>
+      <w:r>
+        <w:t xml:space="preserve"> Como Usuario, quiero chatear con el vendedor dentro de la </w:t>
+      </w:r>
+      <w:proofErr w:type="gramStart"/>
+      <w:r>
+        <w:t>app</w:t>
+      </w:r>
+      <w:proofErr w:type="gramEnd"/>
+      <w:r>
+        <w:t>, para negociar sin tener que darle mi número de WhatsApp.</w:t>
+      </w:r>
+    </w:p>
+    <w:p>
+      <w:pPr>
+        <w:pStyle w:val="ListParagraph"/>
+        <w:numPr>
+          <w:ilvl w:val="0"/>
+          <w:numId w:val="4"/>
+        </w:numPr>
+        <w:spacing w:before="240" w:line="360" w:lineRule="auto"/>
+      </w:pPr>
+      <w:r>
+        <w:rPr>
+          <w:b/>
+          <w:bCs/>
+        </w:rPr>
+        <w:t>Criterios de Aceptación:</w:t>
+      </w:r>
+    </w:p>
+    <w:p>
+      <w:pPr>
+        <w:pStyle w:val="ListParagraph"/>
+        <w:numPr>
+          <w:ilvl w:val="0"/>
+          <w:numId w:val="4"/>
+        </w:numPr>
+        <w:spacing w:before="240" w:line="360" w:lineRule="auto"/>
+      </w:pPr>
+      <w:r>
+        <w:t xml:space="preserve">Implementación usando </w:t>
+      </w:r>
+      <w:proofErr w:type="spellStart"/>
+      <w:r>
+        <w:t>WebSockets</w:t>
+      </w:r>
+      <w:proofErr w:type="spellEnd"/>
+      <w:r>
+        <w:t xml:space="preserve"> (</w:t>
+      </w:r>
+      <w:proofErr w:type="spellStart"/>
+      <w:r>
+        <w:t>FastAPI</w:t>
+      </w:r>
+      <w:proofErr w:type="spellEnd"/>
+      <w:r>
+        <w:t xml:space="preserve"> </w:t>
+      </w:r>
+      <w:proofErr w:type="spellStart"/>
+      <w:r>
+        <w:t>websockets</w:t>
+      </w:r>
+      <w:proofErr w:type="spellEnd"/>
+      <w:r>
+        <w:t xml:space="preserve"> / Socket.io).</w:t>
+      </w:r>
+    </w:p>
+    <w:p>
+      <w:pPr>
+        <w:pStyle w:val="ListParagraph"/>
+        <w:numPr>
+          <w:ilvl w:val="0"/>
+          <w:numId w:val="4"/>
+        </w:numPr>
+        <w:spacing w:before="240" w:line="360" w:lineRule="auto"/>
+      </w:pPr>
+      <w:r>
+        <w:t>Los mensajes se persisten en la base de datos para historial de auditoría.</w:t>
+      </w:r>
+    </w:p>
+    <w:p>
+      <w:pPr>
+        <w:pStyle w:val="ListParagraph"/>
+        <w:numPr>
+          <w:ilvl w:val="0"/>
+          <w:numId w:val="4"/>
+        </w:numPr>
+        <w:spacing w:before="240" w:line="360" w:lineRule="auto"/>
+      </w:pPr>
+      <w:r>
+        <w:rPr>
+          <w:b/>
+          <w:bCs/>
+        </w:rPr>
+        <w:t xml:space="preserve">HU 6.2 y 6.3: Integración de Deep </w:t>
+      </w:r>
+      <w:proofErr w:type="gramStart"/>
+      <w:r>
+        <w:rPr>
+          <w:b/>
+          <w:bCs/>
+        </w:rPr>
+        <w:t>Link</w:t>
+      </w:r>
+      <w:proofErr w:type="gramEnd"/>
+      <w:r>
+        <w:rPr>
+          <w:b/>
+          <w:bCs/>
+        </w:rPr>
+        <w:t xml:space="preserve"> para </w:t>
+      </w:r>
+      <w:proofErr w:type="spellStart"/>
+      <w:r>
+        <w:rPr>
+          <w:b/>
+          <w:bCs/>
+        </w:rPr>
+        <w:t>Nequi</w:t>
+      </w:r>
+      <w:proofErr w:type="spellEnd"/>
+      <w:r>
+        <w:rPr>
+          <w:b/>
+          <w:bCs/>
+        </w:rPr>
+        <w:t xml:space="preserve"> / </w:t>
+      </w:r>
+      <w:proofErr w:type="spellStart"/>
+      <w:r>
+        <w:rPr>
+          <w:b/>
+          <w:bCs/>
+        </w:rPr>
+        <w:t>DaviPlata</w:t>
+      </w:r>
+      <w:proofErr w:type="spellEnd"/>
+      <w:r>
+        <w:rPr>
+          <w:b/>
+          <w:bCs/>
+        </w:rPr>
+        <w:t>.</w:t>
+      </w:r>
+    </w:p>
+    <w:p>
+      <w:pPr>
+        <w:pStyle w:val="ListParagraph"/>
+        <w:numPr>
+          <w:ilvl w:val="0"/>
+          <w:numId w:val="4"/>
+        </w:numPr>
+        <w:spacing w:before="240" w:line="360" w:lineRule="auto"/>
+      </w:pPr>
+      <w:r>
+        <w:rPr>
+          <w:b/>
+          <w:bCs/>
+        </w:rPr>
+        <w:lastRenderedPageBreak/>
+        <w:t>Descripción:</w:t>
+      </w:r>
+      <w:r>
+        <w:t xml:space="preserve"> Como Comprador, quiero un botón que me abra directamente mi </w:t>
+      </w:r>
+      <w:proofErr w:type="gramStart"/>
+      <w:r>
+        <w:t>app</w:t>
+      </w:r>
+      <w:proofErr w:type="gramEnd"/>
+      <w:r>
+        <w:t xml:space="preserve"> de </w:t>
+      </w:r>
+      <w:proofErr w:type="spellStart"/>
+      <w:r>
+        <w:t>Nequi</w:t>
+      </w:r>
+      <w:proofErr w:type="spellEnd"/>
+      <w:r>
+        <w:t xml:space="preserve"> o </w:t>
+      </w:r>
+      <w:proofErr w:type="spellStart"/>
+      <w:r>
+        <w:t>DaviPlata</w:t>
+      </w:r>
+      <w:proofErr w:type="spellEnd"/>
+      <w:r>
+        <w:t xml:space="preserve"> con el número del vendedor, para pagar rápido sin digitar.</w:t>
+      </w:r>
+    </w:p>
+    <w:p>
+      <w:pPr>
+        <w:pStyle w:val="ListParagraph"/>
+        <w:numPr>
+          <w:ilvl w:val="0"/>
+          <w:numId w:val="4"/>
+        </w:numPr>
+        <w:spacing w:before="240" w:line="360" w:lineRule="auto"/>
+      </w:pPr>
+      <w:r>
+        <w:rPr>
+          <w:b/>
+          <w:bCs/>
+        </w:rPr>
+        <w:t>Criterios de Aceptación:</w:t>
+      </w:r>
+    </w:p>
+    <w:p>
+      <w:pPr>
+        <w:pStyle w:val="ListParagraph"/>
+        <w:numPr>
+          <w:ilvl w:val="0"/>
+          <w:numId w:val="4"/>
+        </w:numPr>
+        <w:spacing w:before="240" w:line="360" w:lineRule="auto"/>
+      </w:pPr>
+      <w:r>
+        <w:rPr>
+          <w:b/>
+          <w:bCs/>
+        </w:rPr>
+        <w:t>Restricción de Arquitectura:</w:t>
+      </w:r>
+      <w:r>
+        <w:t xml:space="preserve"> NO hay integración con </w:t>
+      </w:r>
+      <w:proofErr w:type="spellStart"/>
+      <w:r>
+        <w:t>APIs</w:t>
+      </w:r>
+      <w:proofErr w:type="spellEnd"/>
+      <w:r>
+        <w:t xml:space="preserve"> bancarias (está fuera del alcance del MVP). Solo se genera un </w:t>
+      </w:r>
+      <w:r>
+        <w:rPr>
+          <w:i/>
+          <w:iCs/>
+        </w:rPr>
+        <w:t xml:space="preserve">Deep </w:t>
+      </w:r>
+      <w:proofErr w:type="gramStart"/>
+      <w:r>
+        <w:rPr>
+          <w:i/>
+          <w:iCs/>
+        </w:rPr>
+        <w:t>Link</w:t>
+      </w:r>
+      <w:proofErr w:type="gramEnd"/>
+      <w:r>
+        <w:t xml:space="preserve"> o </w:t>
+      </w:r>
+      <w:r>
+        <w:rPr>
+          <w:i/>
+          <w:iCs/>
+        </w:rPr>
+        <w:t xml:space="preserve">URI </w:t>
+      </w:r>
+      <w:proofErr w:type="spellStart"/>
+      <w:r>
+        <w:rPr>
+          <w:i/>
+          <w:iCs/>
+        </w:rPr>
+        <w:t>Scheme</w:t>
+      </w:r>
+      <w:proofErr w:type="spellEnd"/>
+      <w:r>
+        <w:t xml:space="preserve"> (ej. </w:t>
+      </w:r>
+      <w:proofErr w:type="spellStart"/>
+      <w:r>
+        <w:t>nequi</w:t>
+      </w:r>
+      <w:proofErr w:type="spellEnd"/>
+      <w:r>
+        <w:t xml:space="preserve">://... o enlace web) que intenta abrir la </w:t>
+      </w:r>
+      <w:proofErr w:type="gramStart"/>
+      <w:r>
+        <w:t>app</w:t>
+      </w:r>
+      <w:proofErr w:type="gramEnd"/>
+      <w:r>
+        <w:t xml:space="preserve"> en el teléfono del usuario destino si el vendedor habilitó su número.</w:t>
+      </w:r>
+    </w:p>
+    <w:p>
+      <w:pPr>
+        <w:pStyle w:val="ListParagraph"/>
+        <w:numPr>
+          <w:ilvl w:val="0"/>
+          <w:numId w:val="4"/>
+        </w:numPr>
+        <w:spacing w:before="240" w:line="360" w:lineRule="auto"/>
+      </w:pPr>
+      <w:r>
+        <w:rPr>
+          <w:b/>
+          <w:bCs/>
+        </w:rPr>
+        <w:t>HU 6.4: Marcado manual de "Transacción Completada".</w:t>
+      </w:r>
+    </w:p>
+    <w:p>
+      <w:pPr>
+        <w:pStyle w:val="ListParagraph"/>
+        <w:numPr>
+          <w:ilvl w:val="0"/>
+          <w:numId w:val="4"/>
+        </w:numPr>
+        <w:spacing w:before="240" w:line="360" w:lineRule="auto"/>
+      </w:pPr>
+      <w:r>
+        <w:rPr>
+          <w:b/>
+          <w:bCs/>
+        </w:rPr>
+        <w:t>Descripción:</w:t>
+      </w:r>
+      <w:r>
+        <w:t xml:space="preserve"> Como Vendedor y Comprador, quiero un botón en el chat para confirmar que el producto fue entregado.</w:t>
+      </w:r>
+    </w:p>
+    <w:p>
+      <w:pPr>
+        <w:pStyle w:val="ListParagraph"/>
+        <w:numPr>
+          <w:ilvl w:val="0"/>
+          <w:numId w:val="4"/>
+        </w:numPr>
+        <w:spacing w:before="240" w:line="360" w:lineRule="auto"/>
+      </w:pPr>
+      <w:r>
+        <w:rPr>
+          <w:b/>
+          <w:bCs/>
+        </w:rPr>
+        <w:t>Criterios de Aceptación:</w:t>
+      </w:r>
+    </w:p>
+    <w:p>
+      <w:pPr>
+        <w:pStyle w:val="ListParagraph"/>
+        <w:numPr>
+          <w:ilvl w:val="0"/>
+          <w:numId w:val="4"/>
+        </w:numPr>
+        <w:spacing w:before="240" w:line="360" w:lineRule="auto"/>
+      </w:pPr>
+      <w:r>
+        <w:t>Ambos usuarios deben confirmar.</w:t>
+      </w:r>
+    </w:p>
+    <w:p>
+      <w:pPr>
+        <w:pStyle w:val="ListParagraph"/>
+        <w:numPr>
+          <w:ilvl w:val="0"/>
+          <w:numId w:val="4"/>
+        </w:numPr>
+        <w:spacing w:before="240" w:line="360" w:lineRule="auto"/>
+      </w:pPr>
+      <w:r>
+        <w:t>El chat se cierra o cambia de estado visual a "Completado".</w:t>
+      </w:r>
+    </w:p>
+    <w:p>
+      <w:pPr>
+        <w:pStyle w:val="ListParagraph"/>
+        <w:numPr>
+          <w:ilvl w:val="0"/>
+          <w:numId w:val="4"/>
+        </w:numPr>
+        <w:spacing w:before="240" w:line="360" w:lineRule="auto"/>
+      </w:pPr>
+      <w:r>
+        <w:rPr>
+          <w:b/>
+          <w:bCs/>
+        </w:rPr>
+        <w:t>HU 6.5: Registro automático del valor (GMV).</w:t>
+      </w:r>
+    </w:p>
+    <w:p>
+      <w:pPr>
+        <w:pStyle w:val="ListParagraph"/>
+        <w:numPr>
+          <w:ilvl w:val="0"/>
+          <w:numId w:val="4"/>
+        </w:numPr>
+        <w:spacing w:before="240" w:line="360" w:lineRule="auto"/>
+      </w:pPr>
+      <w:r>
+        <w:rPr>
+          <w:b/>
+          <w:bCs/>
+        </w:rPr>
+        <w:t>Descripción:</w:t>
+      </w:r>
+      <w:r>
+        <w:t xml:space="preserve"> Como Analista de Negocio, quiero que al confirmarse la transacción (HU 6.4), el sistema guarde el valor de la venta, para poder calcular métricas financieras (GMV) sin cobrar comisiones.</w:t>
+      </w:r>
+    </w:p>
+    <w:p>
+      <w:pPr>
+        <w:pStyle w:val="ListParagraph"/>
+        <w:numPr>
+          <w:ilvl w:val="0"/>
+          <w:numId w:val="4"/>
+        </w:numPr>
+        <w:spacing w:before="240" w:line="360" w:lineRule="auto"/>
+      </w:pPr>
+      <w:r>
+        <w:rPr>
+          <w:b/>
+          <w:bCs/>
+        </w:rPr>
+        <w:t>Criterios de Aceptación:</w:t>
+      </w:r>
+    </w:p>
+    <w:p>
+      <w:pPr>
+        <w:pStyle w:val="ListParagraph"/>
+        <w:numPr>
+          <w:ilvl w:val="0"/>
+          <w:numId w:val="4"/>
+        </w:numPr>
+        <w:spacing w:before="240" w:line="360" w:lineRule="auto"/>
+      </w:pPr>
+      <w:r>
+        <w:t xml:space="preserve">Un </w:t>
+      </w:r>
+      <w:proofErr w:type="spellStart"/>
+      <w:r>
+        <w:rPr>
+          <w:i/>
+          <w:iCs/>
+        </w:rPr>
+        <w:t>trigger</w:t>
+      </w:r>
+      <w:proofErr w:type="spellEnd"/>
+      <w:r>
+        <w:t xml:space="preserve"> o función </w:t>
+      </w:r>
+      <w:proofErr w:type="spellStart"/>
+      <w:r>
+        <w:t>backend</w:t>
+      </w:r>
+      <w:proofErr w:type="spellEnd"/>
+      <w:r>
+        <w:t xml:space="preserve"> inserta el valor transaccional en COP en una tabla de métricas en el momento en que el estado cambia a "Completado".</w:t>
+      </w:r>
+    </w:p>
+    <w:p>
+      <w:pPr>
+        <w:pStyle w:val="ListParagraph"/>
+        <w:numPr>
+          <w:ilvl w:val="0"/>
+          <w:numId w:val="4"/>
+        </w:numPr>
+        <w:spacing w:before="240" w:line="360" w:lineRule="auto"/>
+      </w:pPr>
+      <w:r>
+        <w:pict w14:anchorId="42A5F55F">
+          <v:rect id="_x0000_i1030" style="width:0;height:1.5pt" o:hralign="center" o:hrstd="t" o:hr="t" fillcolor="#a0a0a0" stroked="f"/>
+        </w:pict>
+      </w:r>
+    </w:p>
+    <w:p>
+      <w:pPr>
+        <w:pStyle w:val="ListParagraph"/>
+        <w:numPr>
+          <w:ilvl w:val="0"/>
+          <w:numId w:val="4"/>
+        </w:numPr>
+        <w:spacing w:before="240" w:line="360" w:lineRule="auto"/>
+        <w:rPr>
+          <w:b/>
+          <w:bCs/>
+        </w:rPr>
+      </w:pPr>
+      <w:r>
+        <w:rPr>
+          <w:rFonts w:ascii="Segoe UI Emoji" w:hAnsi="Segoe UI Emoji" w:cs="Segoe UI Emoji"/>
+          <w:b/>
+          <w:bCs/>
+        </w:rPr>
+        <w:t>⚖️</w:t>
+      </w:r>
+      <w:r>
+        <w:rPr>
+          <w:b/>
+          <w:bCs/>
+        </w:rPr>
+        <w:t xml:space="preserve"> EP-07: Moderación y Reputación Comunitaria</w:t>
+      </w:r>
+    </w:p>
+    <w:p>
+      <w:pPr>
+        <w:pStyle w:val="ListParagraph"/>
+        <w:numPr>
+          <w:ilvl w:val="0"/>
+          <w:numId w:val="4"/>
+        </w:numPr>
+        <w:spacing w:before="240" w:line="360" w:lineRule="auto"/>
+      </w:pPr>
+      <w:r>
+        <w:rPr>
+          <w:b/>
+          <w:bCs/>
+        </w:rPr>
+        <w:t>HU 7.1: Calificación de transacciones (1 a 5 estrellas).</w:t>
+      </w:r>
+    </w:p>
+    <w:p>
+      <w:pPr>
+        <w:pStyle w:val="ListParagraph"/>
+        <w:numPr>
+          <w:ilvl w:val="0"/>
+          <w:numId w:val="4"/>
+        </w:numPr>
+        <w:spacing w:before="240" w:line="360" w:lineRule="auto"/>
+      </w:pPr>
+      <w:r>
+        <w:rPr>
+          <w:b/>
+          <w:bCs/>
+        </w:rPr>
+        <w:t>Descripción:</w:t>
+      </w:r>
+      <w:r>
+        <w:t xml:space="preserve"> Como Comprador, quiero calificar al vendedor después de la entrega, para premiar el buen servicio.</w:t>
+      </w:r>
+    </w:p>
+    <w:p>
+      <w:pPr>
+        <w:pStyle w:val="ListParagraph"/>
+        <w:numPr>
+          <w:ilvl w:val="0"/>
+          <w:numId w:val="4"/>
+        </w:numPr>
+        <w:spacing w:before="240" w:line="360" w:lineRule="auto"/>
+      </w:pPr>
+      <w:r>
+        <w:rPr>
+          <w:b/>
+          <w:bCs/>
+        </w:rPr>
+        <w:t>Criterios de Aceptación:</w:t>
+      </w:r>
+    </w:p>
+    <w:p>
+      <w:pPr>
+        <w:pStyle w:val="ListParagraph"/>
+        <w:numPr>
+          <w:ilvl w:val="0"/>
+          <w:numId w:val="4"/>
+        </w:numPr>
+        <w:spacing w:before="240" w:line="360" w:lineRule="auto"/>
+      </w:pPr>
+      <w:r>
+        <w:t>Se habilita un modal de calificación única y exclusivamente después de que la transacción se marque como completada (HU 6.4).</w:t>
+      </w:r>
+    </w:p>
+    <w:p>
+      <w:pPr>
+        <w:pStyle w:val="ListParagraph"/>
+        <w:numPr>
+          <w:ilvl w:val="0"/>
+          <w:numId w:val="4"/>
+        </w:numPr>
+        <w:spacing w:before="240" w:line="360" w:lineRule="auto"/>
+      </w:pPr>
+      <w:r>
+        <w:rPr>
+          <w:b/>
+          <w:bCs/>
+        </w:rPr>
+        <w:t>HU 7.2: Visualización de reputación en el perfil.</w:t>
+      </w:r>
+    </w:p>
+    <w:p>
+      <w:pPr>
+        <w:pStyle w:val="ListParagraph"/>
+        <w:numPr>
+          <w:ilvl w:val="0"/>
+          <w:numId w:val="4"/>
+        </w:numPr>
+        <w:spacing w:before="240" w:line="360" w:lineRule="auto"/>
+      </w:pPr>
+      <w:r>
+        <w:rPr>
+          <w:b/>
+          <w:bCs/>
+        </w:rPr>
+        <w:lastRenderedPageBreak/>
+        <w:t>Descripción:</w:t>
+      </w:r>
+      <w:r>
+        <w:t xml:space="preserve"> Como Usuario, quiero ver el promedio de estrellas de un vendedor antes de comprarle, para generar confianza.</w:t>
+      </w:r>
+    </w:p>
+    <w:p>
+      <w:pPr>
+        <w:pStyle w:val="ListParagraph"/>
+        <w:numPr>
+          <w:ilvl w:val="0"/>
+          <w:numId w:val="4"/>
+        </w:numPr>
+        <w:spacing w:before="240" w:line="360" w:lineRule="auto"/>
+      </w:pPr>
+      <w:r>
+        <w:rPr>
+          <w:b/>
+          <w:bCs/>
+        </w:rPr>
+        <w:t>Criterios de Aceptación:</w:t>
+      </w:r>
+    </w:p>
+    <w:p>
+      <w:pPr>
+        <w:pStyle w:val="ListParagraph"/>
+        <w:numPr>
+          <w:ilvl w:val="0"/>
+          <w:numId w:val="4"/>
+        </w:numPr>
+        <w:spacing w:before="240" w:line="360" w:lineRule="auto"/>
+      </w:pPr>
+      <w:r>
+        <w:t>El promedio se recalcula (o actualiza de manera asíncrona) y se muestra en la tarjeta del vendedor (ej. 4.8 / 5.0).</w:t>
+      </w:r>
+    </w:p>
+    <w:p>
+      <w:pPr>
+        <w:pStyle w:val="ListParagraph"/>
+        <w:numPr>
+          <w:ilvl w:val="0"/>
+          <w:numId w:val="4"/>
+        </w:numPr>
+        <w:spacing w:before="240" w:line="360" w:lineRule="auto"/>
+      </w:pPr>
+      <w:r>
+        <w:rPr>
+          <w:b/>
+          <w:bCs/>
+        </w:rPr>
+        <w:t>HU 7.3: Sistema de reporte por comportamiento indebido.</w:t>
+      </w:r>
+    </w:p>
+    <w:p>
+      <w:pPr>
+        <w:pStyle w:val="ListParagraph"/>
+        <w:numPr>
+          <w:ilvl w:val="0"/>
+          <w:numId w:val="4"/>
+        </w:numPr>
+        <w:spacing w:before="240" w:line="360" w:lineRule="auto"/>
+      </w:pPr>
+      <w:r>
+        <w:rPr>
+          <w:b/>
+          <w:bCs/>
+        </w:rPr>
+        <w:t>Descripción:</w:t>
+      </w:r>
+      <w:r>
+        <w:t xml:space="preserve"> Como Usuario, quiero un botón para denunciar un producto o perfil que incumpla las normas, para mantener seguro el campus digital.</w:t>
+      </w:r>
+    </w:p>
+    <w:p>
+      <w:pPr>
+        <w:pStyle w:val="ListParagraph"/>
+        <w:numPr>
+          <w:ilvl w:val="0"/>
+          <w:numId w:val="4"/>
+        </w:numPr>
+        <w:spacing w:before="240" w:line="360" w:lineRule="auto"/>
+      </w:pPr>
+      <w:r>
+        <w:rPr>
+          <w:b/>
+          <w:bCs/>
+        </w:rPr>
+        <w:t>Criterios de Aceptación:</w:t>
+      </w:r>
+    </w:p>
+    <w:p>
+      <w:pPr>
+        <w:pStyle w:val="ListParagraph"/>
+        <w:numPr>
+          <w:ilvl w:val="0"/>
+          <w:numId w:val="4"/>
+        </w:numPr>
+        <w:spacing w:before="240" w:line="360" w:lineRule="auto"/>
+      </w:pPr>
+      <w:r>
+        <w:t>Botón "Reportar" con lista desplegable de razones (Spam, Ofensivo, Fraude).</w:t>
+      </w:r>
+    </w:p>
+    <w:p>
+      <w:pPr>
+        <w:pStyle w:val="ListParagraph"/>
+        <w:numPr>
+          <w:ilvl w:val="0"/>
+          <w:numId w:val="4"/>
+        </w:numPr>
+        <w:spacing w:before="240" w:line="360" w:lineRule="auto"/>
+      </w:pPr>
+      <w:r>
+        <w:t xml:space="preserve">Si un producto recibe X número de reportes (ej. 3), el sistema lo oculta automáticamente (cambia </w:t>
+      </w:r>
+      <w:proofErr w:type="spellStart"/>
+      <w:r>
+        <w:t>is_active</w:t>
+      </w:r>
+      <w:proofErr w:type="spellEnd"/>
+      <w:r>
+        <w:t>=false) hasta que un administrador lo revise.</w:t>
+      </w:r>
+    </w:p>
+    <w:p>
+      <w:pPr>
+        <w:pStyle w:val="ListParagraph"/>
+        <w:spacing w:before="240" w:line="360" w:lineRule="auto"/>
+        <w:rPr>
+          <w:highlight w:val="yellow"/>
+        </w:rPr>
+      </w:pPr>
     </w:p>
     <w:sectPr>
       <w:pgSz w:w="12240" w:h="15840"/>
@@ -2057,6 +5407,304 @@
 <file path=word/numbering.xml><?xml version="1.0" encoding="utf-8"?>
 <w:numbering xmlns:wpc="http://schemas.microsoft.com/office/word/2010/wordprocessingCanvas" xmlns:cx="http://schemas.microsoft.com/office/drawing/2014/chartex" xmlns:cx1="http://schemas.microsoft.com/office/drawing/2015/9/8/chartex" xmlns:cx2="http://schemas.microsoft.com/office/drawing/2015/10/21/chartex" xmlns:cx3="http://schemas.microsoft.com/office/drawing/2016/5/9/chartex" xmlns:cx4="http://schemas.microsoft.com/office/drawing/2016/5/10/chartex" xmlns:cx5="http://schemas.microsoft.com/office/drawing/2016/5/11/chartex" xmlns:cx6="http://schemas.microsoft.com/office/drawing/2016/5/12/chartex" xmlns:cx7="http://schemas.microsoft.com/office/drawing/2016/5/13/chartex" xmlns:cx8="http://schemas.microsoft.com/office/drawing/2016/5/14/chartex" xmlns:mc="http://schemas.openxmlformats.org/markup-compatibility/2006" xmlns:aink="http://schemas.microsoft.com/office/drawing/2016/ink" xmlns:am3d="http://schemas.microsoft.com/office/drawing/2017/model3d" xmlns:o="urn:schemas-microsoft-com:office:office" xmlns:oel="http://schemas.microsoft.com/office/2019/extlst" xmlns:r="http://schemas.openxmlformats.org/officeDocument/2006/relationships" xmlns:m="http://schemas.openxmlformats.org/officeDocument/2006/math" xmlns:v="urn:schemas-microsoft-com:vml" xmlns:wp14="http://schemas.microsoft.com/office/word/2010/wordprocessingDrawing" xmlns:wp="http://schemas.openxmlformats.org/drawingml/2006/wordprocessingDrawing" xmlns:w10="urn:schemas-microsoft-com:office:word" xmlns:w="http://schemas.openxmlformats.org/wordprocessingml/2006/main" xmlns:w14="http://schemas.microsoft.com/office/word/2010/wordml" xmlns:w15="http://schemas.microsoft.com/office/word/2012/wordml" xmlns:w16cex="http://schemas.microsoft.com/office/word/2018/wordml/cex" xmlns:w16cid="http://schemas.microsoft.com/office/word/2016/wordml/cid" xmlns:w16="http://schemas.microsoft.com/office/word/2018/wordml" xmlns:w16du="http://schemas.microsoft.com/office/word/2023/wordml/word16du" xmlns:w16sdtdh="http://schemas.microsoft.com/office/word/2020/wordml/sdtdatahash" xmlns:w16sdtfl="http://schemas.microsoft.com/office/word/2024/wordml/sdtformatlock" xmlns:w16se="http://schemas.microsoft.com/office/word/2015/wordml/symex" xmlns:wpg="http://schemas.microsoft.com/office/word/2010/wordprocessingGroup" xmlns:wpi="http://schemas.microsoft.com/office/word/2010/wordprocessingInk" xmlns:wne="http://schemas.microsoft.com/office/word/2006/wordml" xmlns:wps="http://schemas.microsoft.com/office/word/2010/wordprocessingShape" mc:Ignorable="w14 w15 w16se w16cid w16 w16cex w16sdtdh w16sdtfl w16du wp14">
   <w:abstractNum w:abstractNumId="0" w15:restartNumberingAfterBreak="0">
+    <w:nsid w:val="0705768D"/>
+    <w:multiLevelType w:val="multilevel"/>
+    <w:tmpl w:val="C4E29610"/>
+    <w:lvl w:ilvl="0">
+      <w:start w:val="1"/>
+      <w:numFmt w:val="bullet"/>
+      <w:lvlText w:val=""/>
+      <w:lvlJc w:val="left"/>
+      <w:pPr>
+        <w:tabs>
+          <w:tab w:val="num" w:pos="720"/>
+        </w:tabs>
+        <w:ind w:left="720" w:hanging="360"/>
+      </w:pPr>
+      <w:rPr>
+        <w:rFonts w:ascii="Symbol" w:hAnsi="Symbol" w:hint="default"/>
+        <w:sz w:val="20"/>
+      </w:rPr>
+    </w:lvl>
+    <w:lvl w:ilvl="1">
+      <w:start w:val="1"/>
+      <w:numFmt w:val="bullet"/>
+      <w:lvlText w:val="o"/>
+      <w:lvlJc w:val="left"/>
+      <w:pPr>
+        <w:tabs>
+          <w:tab w:val="num" w:pos="1440"/>
+        </w:tabs>
+        <w:ind w:left="1440" w:hanging="360"/>
+      </w:pPr>
+      <w:rPr>
+        <w:rFonts w:ascii="Courier New" w:hAnsi="Courier New" w:hint="default"/>
+        <w:sz w:val="20"/>
+      </w:rPr>
+    </w:lvl>
+    <w:lvl w:ilvl="2">
+      <w:start w:val="1"/>
+      <w:numFmt w:val="bullet"/>
+      <w:lvlText w:val=""/>
+      <w:lvlJc w:val="left"/>
+      <w:pPr>
+        <w:tabs>
+          <w:tab w:val="num" w:pos="2160"/>
+        </w:tabs>
+        <w:ind w:left="2160" w:hanging="360"/>
+      </w:pPr>
+      <w:rPr>
+        <w:rFonts w:ascii="Wingdings" w:hAnsi="Wingdings" w:hint="default"/>
+        <w:sz w:val="20"/>
+      </w:rPr>
+    </w:lvl>
+    <w:lvl w:ilvl="3" w:tentative="1">
+      <w:start w:val="1"/>
+      <w:numFmt w:val="bullet"/>
+      <w:lvlText w:val=""/>
+      <w:lvlJc w:val="left"/>
+      <w:pPr>
+        <w:tabs>
+          <w:tab w:val="num" w:pos="2880"/>
+        </w:tabs>
+        <w:ind w:left="2880" w:hanging="360"/>
+      </w:pPr>
+      <w:rPr>
+        <w:rFonts w:ascii="Wingdings" w:hAnsi="Wingdings" w:hint="default"/>
+        <w:sz w:val="20"/>
+      </w:rPr>
+    </w:lvl>
+    <w:lvl w:ilvl="4" w:tentative="1">
+      <w:start w:val="1"/>
+      <w:numFmt w:val="bullet"/>
+      <w:lvlText w:val=""/>
+      <w:lvlJc w:val="left"/>
+      <w:pPr>
+        <w:tabs>
+          <w:tab w:val="num" w:pos="3600"/>
+        </w:tabs>
+        <w:ind w:left="3600" w:hanging="360"/>
+      </w:pPr>
+      <w:rPr>
+        <w:rFonts w:ascii="Wingdings" w:hAnsi="Wingdings" w:hint="default"/>
+        <w:sz w:val="20"/>
+      </w:rPr>
+    </w:lvl>
+    <w:lvl w:ilvl="5" w:tentative="1">
+      <w:start w:val="1"/>
+      <w:numFmt w:val="bullet"/>
+      <w:lvlText w:val=""/>
+      <w:lvlJc w:val="left"/>
+      <w:pPr>
+        <w:tabs>
+          <w:tab w:val="num" w:pos="4320"/>
+        </w:tabs>
+        <w:ind w:left="4320" w:hanging="360"/>
+      </w:pPr>
+      <w:rPr>
+        <w:rFonts w:ascii="Wingdings" w:hAnsi="Wingdings" w:hint="default"/>
+        <w:sz w:val="20"/>
+      </w:rPr>
+    </w:lvl>
+    <w:lvl w:ilvl="6" w:tentative="1">
+      <w:start w:val="1"/>
+      <w:numFmt w:val="bullet"/>
+      <w:lvlText w:val=""/>
+      <w:lvlJc w:val="left"/>
+      <w:pPr>
+        <w:tabs>
+          <w:tab w:val="num" w:pos="5040"/>
+        </w:tabs>
+        <w:ind w:left="5040" w:hanging="360"/>
+      </w:pPr>
+      <w:rPr>
+        <w:rFonts w:ascii="Wingdings" w:hAnsi="Wingdings" w:hint="default"/>
+        <w:sz w:val="20"/>
+      </w:rPr>
+    </w:lvl>
+    <w:lvl w:ilvl="7" w:tentative="1">
+      <w:start w:val="1"/>
+      <w:numFmt w:val="bullet"/>
+      <w:lvlText w:val=""/>
+      <w:lvlJc w:val="left"/>
+      <w:pPr>
+        <w:tabs>
+          <w:tab w:val="num" w:pos="5760"/>
+        </w:tabs>
+        <w:ind w:left="5760" w:hanging="360"/>
+      </w:pPr>
+      <w:rPr>
+        <w:rFonts w:ascii="Wingdings" w:hAnsi="Wingdings" w:hint="default"/>
+        <w:sz w:val="20"/>
+      </w:rPr>
+    </w:lvl>
+    <w:lvl w:ilvl="8" w:tentative="1">
+      <w:start w:val="1"/>
+      <w:numFmt w:val="bullet"/>
+      <w:lvlText w:val=""/>
+      <w:lvlJc w:val="left"/>
+      <w:pPr>
+        <w:tabs>
+          <w:tab w:val="num" w:pos="6480"/>
+        </w:tabs>
+        <w:ind w:left="6480" w:hanging="360"/>
+      </w:pPr>
+      <w:rPr>
+        <w:rFonts w:ascii="Wingdings" w:hAnsi="Wingdings" w:hint="default"/>
+        <w:sz w:val="20"/>
+      </w:rPr>
+    </w:lvl>
+  </w:abstractNum>
+  <w:abstractNum w:abstractNumId="1" w15:restartNumberingAfterBreak="0">
+    <w:nsid w:val="162B18CF"/>
+    <w:multiLevelType w:val="multilevel"/>
+    <w:tmpl w:val="FD9CCC92"/>
+    <w:lvl w:ilvl="0">
+      <w:start w:val="1"/>
+      <w:numFmt w:val="bullet"/>
+      <w:lvlText w:val=""/>
+      <w:lvlJc w:val="left"/>
+      <w:pPr>
+        <w:tabs>
+          <w:tab w:val="num" w:pos="720"/>
+        </w:tabs>
+        <w:ind w:left="720" w:hanging="360"/>
+      </w:pPr>
+      <w:rPr>
+        <w:rFonts w:ascii="Symbol" w:hAnsi="Symbol" w:hint="default"/>
+        <w:sz w:val="20"/>
+      </w:rPr>
+    </w:lvl>
+    <w:lvl w:ilvl="1">
+      <w:start w:val="1"/>
+      <w:numFmt w:val="bullet"/>
+      <w:lvlText w:val="o"/>
+      <w:lvlJc w:val="left"/>
+      <w:pPr>
+        <w:tabs>
+          <w:tab w:val="num" w:pos="1440"/>
+        </w:tabs>
+        <w:ind w:left="1440" w:hanging="360"/>
+      </w:pPr>
+      <w:rPr>
+        <w:rFonts w:ascii="Courier New" w:hAnsi="Courier New" w:hint="default"/>
+        <w:sz w:val="20"/>
+      </w:rPr>
+    </w:lvl>
+    <w:lvl w:ilvl="2">
+      <w:start w:val="1"/>
+      <w:numFmt w:val="bullet"/>
+      <w:lvlText w:val=""/>
+      <w:lvlJc w:val="left"/>
+      <w:pPr>
+        <w:tabs>
+          <w:tab w:val="num" w:pos="2160"/>
+        </w:tabs>
+        <w:ind w:left="2160" w:hanging="360"/>
+      </w:pPr>
+      <w:rPr>
+        <w:rFonts w:ascii="Wingdings" w:hAnsi="Wingdings" w:hint="default"/>
+        <w:sz w:val="20"/>
+      </w:rPr>
+    </w:lvl>
+    <w:lvl w:ilvl="3" w:tentative="1">
+      <w:start w:val="1"/>
+      <w:numFmt w:val="bullet"/>
+      <w:lvlText w:val=""/>
+      <w:lvlJc w:val="left"/>
+      <w:pPr>
+        <w:tabs>
+          <w:tab w:val="num" w:pos="2880"/>
+        </w:tabs>
+        <w:ind w:left="2880" w:hanging="360"/>
+      </w:pPr>
+      <w:rPr>
+        <w:rFonts w:ascii="Wingdings" w:hAnsi="Wingdings" w:hint="default"/>
+        <w:sz w:val="20"/>
+      </w:rPr>
+    </w:lvl>
+    <w:lvl w:ilvl="4" w:tentative="1">
+      <w:start w:val="1"/>
+      <w:numFmt w:val="bullet"/>
+      <w:lvlText w:val=""/>
+      <w:lvlJc w:val="left"/>
+      <w:pPr>
+        <w:tabs>
+          <w:tab w:val="num" w:pos="3600"/>
+        </w:tabs>
+        <w:ind w:left="3600" w:hanging="360"/>
+      </w:pPr>
+      <w:rPr>
+        <w:rFonts w:ascii="Wingdings" w:hAnsi="Wingdings" w:hint="default"/>
+        <w:sz w:val="20"/>
+      </w:rPr>
+    </w:lvl>
+    <w:lvl w:ilvl="5" w:tentative="1">
+      <w:start w:val="1"/>
+      <w:numFmt w:val="bullet"/>
+      <w:lvlText w:val=""/>
+      <w:lvlJc w:val="left"/>
+      <w:pPr>
+        <w:tabs>
+          <w:tab w:val="num" w:pos="4320"/>
+        </w:tabs>
+        <w:ind w:left="4320" w:hanging="360"/>
+      </w:pPr>
+      <w:rPr>
+        <w:rFonts w:ascii="Wingdings" w:hAnsi="Wingdings" w:hint="default"/>
+        <w:sz w:val="20"/>
+      </w:rPr>
+    </w:lvl>
+    <w:lvl w:ilvl="6" w:tentative="1">
+      <w:start w:val="1"/>
+      <w:numFmt w:val="bullet"/>
+      <w:lvlText w:val=""/>
+      <w:lvlJc w:val="left"/>
+      <w:pPr>
+        <w:tabs>
+          <w:tab w:val="num" w:pos="5040"/>
+        </w:tabs>
+        <w:ind w:left="5040" w:hanging="360"/>
+      </w:pPr>
+      <w:rPr>
+        <w:rFonts w:ascii="Wingdings" w:hAnsi="Wingdings" w:hint="default"/>
+        <w:sz w:val="20"/>
+      </w:rPr>
+    </w:lvl>
+    <w:lvl w:ilvl="7" w:tentative="1">
+      <w:start w:val="1"/>
+      <w:numFmt w:val="bullet"/>
+      <w:lvlText w:val=""/>
+      <w:lvlJc w:val="left"/>
+      <w:pPr>
+        <w:tabs>
+          <w:tab w:val="num" w:pos="5760"/>
+        </w:tabs>
+        <w:ind w:left="5760" w:hanging="360"/>
+      </w:pPr>
+      <w:rPr>
+        <w:rFonts w:ascii="Wingdings" w:hAnsi="Wingdings" w:hint="default"/>
+        <w:sz w:val="20"/>
+      </w:rPr>
+    </w:lvl>
+    <w:lvl w:ilvl="8" w:tentative="1">
+      <w:start w:val="1"/>
+      <w:numFmt w:val="bullet"/>
+      <w:lvlText w:val=""/>
+      <w:lvlJc w:val="left"/>
+      <w:pPr>
+        <w:tabs>
+          <w:tab w:val="num" w:pos="6480"/>
+        </w:tabs>
+        <w:ind w:left="6480" w:hanging="360"/>
+      </w:pPr>
+      <w:rPr>
+        <w:rFonts w:ascii="Wingdings" w:hAnsi="Wingdings" w:hint="default"/>
+        <w:sz w:val="20"/>
+      </w:rPr>
+    </w:lvl>
+  </w:abstractNum>
+  <w:abstractNum w:abstractNumId="2" w15:restartNumberingAfterBreak="0">
     <w:nsid w:val="171D74D7"/>
     <w:multiLevelType w:val="multilevel"/>
     <w:tmpl w:val="5AF03EF6"/>
@@ -2205,7 +5853,7 @@
       </w:rPr>
     </w:lvl>
   </w:abstractNum>
-  <w:abstractNum w:abstractNumId="1" w15:restartNumberingAfterBreak="0">
+  <w:abstractNum w:abstractNumId="3" w15:restartNumberingAfterBreak="0">
     <w:nsid w:val="21FE522E"/>
     <w:multiLevelType w:val="multilevel"/>
     <w:tmpl w:val="EE20E3E0"/>
@@ -2354,7 +6002,7 @@
       </w:rPr>
     </w:lvl>
   </w:abstractNum>
-  <w:abstractNum w:abstractNumId="2" w15:restartNumberingAfterBreak="0">
+  <w:abstractNum w:abstractNumId="4" w15:restartNumberingAfterBreak="0">
     <w:nsid w:val="23507934"/>
     <w:multiLevelType w:val="multilevel"/>
     <w:tmpl w:val="120CD87A"/>
@@ -2493,7 +6141,7 @@
       </w:rPr>
     </w:lvl>
   </w:abstractNum>
-  <w:abstractNum w:abstractNumId="3" w15:restartNumberingAfterBreak="0">
+  <w:abstractNum w:abstractNumId="5" w15:restartNumberingAfterBreak="0">
     <w:nsid w:val="27510A55"/>
     <w:multiLevelType w:val="hybridMultilevel"/>
     <w:tmpl w:val="0194F724"/>
@@ -2606,7 +6254,7 @@
       </w:rPr>
     </w:lvl>
   </w:abstractNum>
-  <w:abstractNum w:abstractNumId="4" w15:restartNumberingAfterBreak="0">
+  <w:abstractNum w:abstractNumId="6" w15:restartNumberingAfterBreak="0">
     <w:nsid w:val="2DF96A43"/>
     <w:multiLevelType w:val="hybridMultilevel"/>
     <w:tmpl w:val="AFB41D9C"/>
@@ -2719,7 +6367,454 @@
       </w:rPr>
     </w:lvl>
   </w:abstractNum>
-  <w:abstractNum w:abstractNumId="5" w15:restartNumberingAfterBreak="0">
+  <w:abstractNum w:abstractNumId="7" w15:restartNumberingAfterBreak="0">
+    <w:nsid w:val="35210360"/>
+    <w:multiLevelType w:val="multilevel"/>
+    <w:tmpl w:val="6E0EABDE"/>
+    <w:lvl w:ilvl="0">
+      <w:start w:val="1"/>
+      <w:numFmt w:val="bullet"/>
+      <w:lvlText w:val=""/>
+      <w:lvlJc w:val="left"/>
+      <w:pPr>
+        <w:tabs>
+          <w:tab w:val="num" w:pos="720"/>
+        </w:tabs>
+        <w:ind w:left="720" w:hanging="360"/>
+      </w:pPr>
+      <w:rPr>
+        <w:rFonts w:ascii="Symbol" w:hAnsi="Symbol" w:hint="default"/>
+        <w:sz w:val="20"/>
+      </w:rPr>
+    </w:lvl>
+    <w:lvl w:ilvl="1">
+      <w:start w:val="1"/>
+      <w:numFmt w:val="bullet"/>
+      <w:lvlText w:val="o"/>
+      <w:lvlJc w:val="left"/>
+      <w:pPr>
+        <w:tabs>
+          <w:tab w:val="num" w:pos="1440"/>
+        </w:tabs>
+        <w:ind w:left="1440" w:hanging="360"/>
+      </w:pPr>
+      <w:rPr>
+        <w:rFonts w:ascii="Courier New" w:hAnsi="Courier New" w:hint="default"/>
+        <w:sz w:val="20"/>
+      </w:rPr>
+    </w:lvl>
+    <w:lvl w:ilvl="2">
+      <w:start w:val="1"/>
+      <w:numFmt w:val="bullet"/>
+      <w:lvlText w:val=""/>
+      <w:lvlJc w:val="left"/>
+      <w:pPr>
+        <w:tabs>
+          <w:tab w:val="num" w:pos="2160"/>
+        </w:tabs>
+        <w:ind w:left="2160" w:hanging="360"/>
+      </w:pPr>
+      <w:rPr>
+        <w:rFonts w:ascii="Wingdings" w:hAnsi="Wingdings" w:hint="default"/>
+        <w:sz w:val="20"/>
+      </w:rPr>
+    </w:lvl>
+    <w:lvl w:ilvl="3" w:tentative="1">
+      <w:start w:val="1"/>
+      <w:numFmt w:val="bullet"/>
+      <w:lvlText w:val=""/>
+      <w:lvlJc w:val="left"/>
+      <w:pPr>
+        <w:tabs>
+          <w:tab w:val="num" w:pos="2880"/>
+        </w:tabs>
+        <w:ind w:left="2880" w:hanging="360"/>
+      </w:pPr>
+      <w:rPr>
+        <w:rFonts w:ascii="Wingdings" w:hAnsi="Wingdings" w:hint="default"/>
+        <w:sz w:val="20"/>
+      </w:rPr>
+    </w:lvl>
+    <w:lvl w:ilvl="4" w:tentative="1">
+      <w:start w:val="1"/>
+      <w:numFmt w:val="bullet"/>
+      <w:lvlText w:val=""/>
+      <w:lvlJc w:val="left"/>
+      <w:pPr>
+        <w:tabs>
+          <w:tab w:val="num" w:pos="3600"/>
+        </w:tabs>
+        <w:ind w:left="3600" w:hanging="360"/>
+      </w:pPr>
+      <w:rPr>
+        <w:rFonts w:ascii="Wingdings" w:hAnsi="Wingdings" w:hint="default"/>
+        <w:sz w:val="20"/>
+      </w:rPr>
+    </w:lvl>
+    <w:lvl w:ilvl="5" w:tentative="1">
+      <w:start w:val="1"/>
+      <w:numFmt w:val="bullet"/>
+      <w:lvlText w:val=""/>
+      <w:lvlJc w:val="left"/>
+      <w:pPr>
+        <w:tabs>
+          <w:tab w:val="num" w:pos="4320"/>
+        </w:tabs>
+        <w:ind w:left="4320" w:hanging="360"/>
+      </w:pPr>
+      <w:rPr>
+        <w:rFonts w:ascii="Wingdings" w:hAnsi="Wingdings" w:hint="default"/>
+        <w:sz w:val="20"/>
+      </w:rPr>
+    </w:lvl>
+    <w:lvl w:ilvl="6" w:tentative="1">
+      <w:start w:val="1"/>
+      <w:numFmt w:val="bullet"/>
+      <w:lvlText w:val=""/>
+      <w:lvlJc w:val="left"/>
+      <w:pPr>
+        <w:tabs>
+          <w:tab w:val="num" w:pos="5040"/>
+        </w:tabs>
+        <w:ind w:left="5040" w:hanging="360"/>
+      </w:pPr>
+      <w:rPr>
+        <w:rFonts w:ascii="Wingdings" w:hAnsi="Wingdings" w:hint="default"/>
+        <w:sz w:val="20"/>
+      </w:rPr>
+    </w:lvl>
+    <w:lvl w:ilvl="7" w:tentative="1">
+      <w:start w:val="1"/>
+      <w:numFmt w:val="bullet"/>
+      <w:lvlText w:val=""/>
+      <w:lvlJc w:val="left"/>
+      <w:pPr>
+        <w:tabs>
+          <w:tab w:val="num" w:pos="5760"/>
+        </w:tabs>
+        <w:ind w:left="5760" w:hanging="360"/>
+      </w:pPr>
+      <w:rPr>
+        <w:rFonts w:ascii="Wingdings" w:hAnsi="Wingdings" w:hint="default"/>
+        <w:sz w:val="20"/>
+      </w:rPr>
+    </w:lvl>
+    <w:lvl w:ilvl="8" w:tentative="1">
+      <w:start w:val="1"/>
+      <w:numFmt w:val="bullet"/>
+      <w:lvlText w:val=""/>
+      <w:lvlJc w:val="left"/>
+      <w:pPr>
+        <w:tabs>
+          <w:tab w:val="num" w:pos="6480"/>
+        </w:tabs>
+        <w:ind w:left="6480" w:hanging="360"/>
+      </w:pPr>
+      <w:rPr>
+        <w:rFonts w:ascii="Wingdings" w:hAnsi="Wingdings" w:hint="default"/>
+        <w:sz w:val="20"/>
+      </w:rPr>
+    </w:lvl>
+  </w:abstractNum>
+  <w:abstractNum w:abstractNumId="8" w15:restartNumberingAfterBreak="0">
+    <w:nsid w:val="356C3AAE"/>
+    <w:multiLevelType w:val="multilevel"/>
+    <w:tmpl w:val="E6FA9F2E"/>
+    <w:lvl w:ilvl="0">
+      <w:start w:val="1"/>
+      <w:numFmt w:val="bullet"/>
+      <w:lvlText w:val=""/>
+      <w:lvlJc w:val="left"/>
+      <w:pPr>
+        <w:tabs>
+          <w:tab w:val="num" w:pos="720"/>
+        </w:tabs>
+        <w:ind w:left="720" w:hanging="360"/>
+      </w:pPr>
+      <w:rPr>
+        <w:rFonts w:ascii="Symbol" w:hAnsi="Symbol" w:hint="default"/>
+        <w:sz w:val="20"/>
+      </w:rPr>
+    </w:lvl>
+    <w:lvl w:ilvl="1">
+      <w:start w:val="1"/>
+      <w:numFmt w:val="bullet"/>
+      <w:lvlText w:val="o"/>
+      <w:lvlJc w:val="left"/>
+      <w:pPr>
+        <w:tabs>
+          <w:tab w:val="num" w:pos="1440"/>
+        </w:tabs>
+        <w:ind w:left="1440" w:hanging="360"/>
+      </w:pPr>
+      <w:rPr>
+        <w:rFonts w:ascii="Courier New" w:hAnsi="Courier New" w:hint="default"/>
+        <w:sz w:val="20"/>
+      </w:rPr>
+    </w:lvl>
+    <w:lvl w:ilvl="2">
+      <w:start w:val="1"/>
+      <w:numFmt w:val="bullet"/>
+      <w:lvlText w:val=""/>
+      <w:lvlJc w:val="left"/>
+      <w:pPr>
+        <w:tabs>
+          <w:tab w:val="num" w:pos="2160"/>
+        </w:tabs>
+        <w:ind w:left="2160" w:hanging="360"/>
+      </w:pPr>
+      <w:rPr>
+        <w:rFonts w:ascii="Wingdings" w:hAnsi="Wingdings" w:hint="default"/>
+        <w:sz w:val="20"/>
+      </w:rPr>
+    </w:lvl>
+    <w:lvl w:ilvl="3" w:tentative="1">
+      <w:start w:val="1"/>
+      <w:numFmt w:val="bullet"/>
+      <w:lvlText w:val=""/>
+      <w:lvlJc w:val="left"/>
+      <w:pPr>
+        <w:tabs>
+          <w:tab w:val="num" w:pos="2880"/>
+        </w:tabs>
+        <w:ind w:left="2880" w:hanging="360"/>
+      </w:pPr>
+      <w:rPr>
+        <w:rFonts w:ascii="Wingdings" w:hAnsi="Wingdings" w:hint="default"/>
+        <w:sz w:val="20"/>
+      </w:rPr>
+    </w:lvl>
+    <w:lvl w:ilvl="4" w:tentative="1">
+      <w:start w:val="1"/>
+      <w:numFmt w:val="bullet"/>
+      <w:lvlText w:val=""/>
+      <w:lvlJc w:val="left"/>
+      <w:pPr>
+        <w:tabs>
+          <w:tab w:val="num" w:pos="3600"/>
+        </w:tabs>
+        <w:ind w:left="3600" w:hanging="360"/>
+      </w:pPr>
+      <w:rPr>
+        <w:rFonts w:ascii="Wingdings" w:hAnsi="Wingdings" w:hint="default"/>
+        <w:sz w:val="20"/>
+      </w:rPr>
+    </w:lvl>
+    <w:lvl w:ilvl="5" w:tentative="1">
+      <w:start w:val="1"/>
+      <w:numFmt w:val="bullet"/>
+      <w:lvlText w:val=""/>
+      <w:lvlJc w:val="left"/>
+      <w:pPr>
+        <w:tabs>
+          <w:tab w:val="num" w:pos="4320"/>
+        </w:tabs>
+        <w:ind w:left="4320" w:hanging="360"/>
+      </w:pPr>
+      <w:rPr>
+        <w:rFonts w:ascii="Wingdings" w:hAnsi="Wingdings" w:hint="default"/>
+        <w:sz w:val="20"/>
+      </w:rPr>
+    </w:lvl>
+    <w:lvl w:ilvl="6" w:tentative="1">
+      <w:start w:val="1"/>
+      <w:numFmt w:val="bullet"/>
+      <w:lvlText w:val=""/>
+      <w:lvlJc w:val="left"/>
+      <w:pPr>
+        <w:tabs>
+          <w:tab w:val="num" w:pos="5040"/>
+        </w:tabs>
+        <w:ind w:left="5040" w:hanging="360"/>
+      </w:pPr>
+      <w:rPr>
+        <w:rFonts w:ascii="Wingdings" w:hAnsi="Wingdings" w:hint="default"/>
+        <w:sz w:val="20"/>
+      </w:rPr>
+    </w:lvl>
+    <w:lvl w:ilvl="7" w:tentative="1">
+      <w:start w:val="1"/>
+      <w:numFmt w:val="bullet"/>
+      <w:lvlText w:val=""/>
+      <w:lvlJc w:val="left"/>
+      <w:pPr>
+        <w:tabs>
+          <w:tab w:val="num" w:pos="5760"/>
+        </w:tabs>
+        <w:ind w:left="5760" w:hanging="360"/>
+      </w:pPr>
+      <w:rPr>
+        <w:rFonts w:ascii="Wingdings" w:hAnsi="Wingdings" w:hint="default"/>
+        <w:sz w:val="20"/>
+      </w:rPr>
+    </w:lvl>
+    <w:lvl w:ilvl="8" w:tentative="1">
+      <w:start w:val="1"/>
+      <w:numFmt w:val="bullet"/>
+      <w:lvlText w:val=""/>
+      <w:lvlJc w:val="left"/>
+      <w:pPr>
+        <w:tabs>
+          <w:tab w:val="num" w:pos="6480"/>
+        </w:tabs>
+        <w:ind w:left="6480" w:hanging="360"/>
+      </w:pPr>
+      <w:rPr>
+        <w:rFonts w:ascii="Wingdings" w:hAnsi="Wingdings" w:hint="default"/>
+        <w:sz w:val="20"/>
+      </w:rPr>
+    </w:lvl>
+  </w:abstractNum>
+  <w:abstractNum w:abstractNumId="9" w15:restartNumberingAfterBreak="0">
+    <w:nsid w:val="413A1551"/>
+    <w:multiLevelType w:val="multilevel"/>
+    <w:tmpl w:val="D7962D3A"/>
+    <w:lvl w:ilvl="0">
+      <w:start w:val="1"/>
+      <w:numFmt w:val="bullet"/>
+      <w:lvlText w:val=""/>
+      <w:lvlJc w:val="left"/>
+      <w:pPr>
+        <w:tabs>
+          <w:tab w:val="num" w:pos="720"/>
+        </w:tabs>
+        <w:ind w:left="720" w:hanging="360"/>
+      </w:pPr>
+      <w:rPr>
+        <w:rFonts w:ascii="Symbol" w:hAnsi="Symbol" w:hint="default"/>
+        <w:sz w:val="20"/>
+      </w:rPr>
+    </w:lvl>
+    <w:lvl w:ilvl="1">
+      <w:start w:val="1"/>
+      <w:numFmt w:val="bullet"/>
+      <w:lvlText w:val="o"/>
+      <w:lvlJc w:val="left"/>
+      <w:pPr>
+        <w:tabs>
+          <w:tab w:val="num" w:pos="1440"/>
+        </w:tabs>
+        <w:ind w:left="1440" w:hanging="360"/>
+      </w:pPr>
+      <w:rPr>
+        <w:rFonts w:ascii="Courier New" w:hAnsi="Courier New" w:hint="default"/>
+        <w:sz w:val="20"/>
+      </w:rPr>
+    </w:lvl>
+    <w:lvl w:ilvl="2">
+      <w:start w:val="1"/>
+      <w:numFmt w:val="bullet"/>
+      <w:lvlText w:val=""/>
+      <w:lvlJc w:val="left"/>
+      <w:pPr>
+        <w:tabs>
+          <w:tab w:val="num" w:pos="2160"/>
+        </w:tabs>
+        <w:ind w:left="2160" w:hanging="360"/>
+      </w:pPr>
+      <w:rPr>
+        <w:rFonts w:ascii="Wingdings" w:hAnsi="Wingdings" w:hint="default"/>
+        <w:sz w:val="20"/>
+      </w:rPr>
+    </w:lvl>
+    <w:lvl w:ilvl="3" w:tentative="1">
+      <w:start w:val="1"/>
+      <w:numFmt w:val="bullet"/>
+      <w:lvlText w:val=""/>
+      <w:lvlJc w:val="left"/>
+      <w:pPr>
+        <w:tabs>
+          <w:tab w:val="num" w:pos="2880"/>
+        </w:tabs>
+        <w:ind w:left="2880" w:hanging="360"/>
+      </w:pPr>
+      <w:rPr>
+        <w:rFonts w:ascii="Wingdings" w:hAnsi="Wingdings" w:hint="default"/>
+        <w:sz w:val="20"/>
+      </w:rPr>
+    </w:lvl>
+    <w:lvl w:ilvl="4" w:tentative="1">
+      <w:start w:val="1"/>
+      <w:numFmt w:val="bullet"/>
+      <w:lvlText w:val=""/>
+      <w:lvlJc w:val="left"/>
+      <w:pPr>
+        <w:tabs>
+          <w:tab w:val="num" w:pos="3600"/>
+        </w:tabs>
+        <w:ind w:left="3600" w:hanging="360"/>
+      </w:pPr>
+      <w:rPr>
+        <w:rFonts w:ascii="Wingdings" w:hAnsi="Wingdings" w:hint="default"/>
+        <w:sz w:val="20"/>
+      </w:rPr>
+    </w:lvl>
+    <w:lvl w:ilvl="5" w:tentative="1">
+      <w:start w:val="1"/>
+      <w:numFmt w:val="bullet"/>
+      <w:lvlText w:val=""/>
+      <w:lvlJc w:val="left"/>
+      <w:pPr>
+        <w:tabs>
+          <w:tab w:val="num" w:pos="4320"/>
+        </w:tabs>
+        <w:ind w:left="4320" w:hanging="360"/>
+      </w:pPr>
+      <w:rPr>
+        <w:rFonts w:ascii="Wingdings" w:hAnsi="Wingdings" w:hint="default"/>
+        <w:sz w:val="20"/>
+      </w:rPr>
+    </w:lvl>
+    <w:lvl w:ilvl="6" w:tentative="1">
+      <w:start w:val="1"/>
+      <w:numFmt w:val="bullet"/>
+      <w:lvlText w:val=""/>
+      <w:lvlJc w:val="left"/>
+      <w:pPr>
+        <w:tabs>
+          <w:tab w:val="num" w:pos="5040"/>
+        </w:tabs>
+        <w:ind w:left="5040" w:hanging="360"/>
+      </w:pPr>
+      <w:rPr>
+        <w:rFonts w:ascii="Wingdings" w:hAnsi="Wingdings" w:hint="default"/>
+        <w:sz w:val="20"/>
+      </w:rPr>
+    </w:lvl>
+    <w:lvl w:ilvl="7" w:tentative="1">
+      <w:start w:val="1"/>
+      <w:numFmt w:val="bullet"/>
+      <w:lvlText w:val=""/>
+      <w:lvlJc w:val="left"/>
+      <w:pPr>
+        <w:tabs>
+          <w:tab w:val="num" w:pos="5760"/>
+        </w:tabs>
+        <w:ind w:left="5760" w:hanging="360"/>
+      </w:pPr>
+      <w:rPr>
+        <w:rFonts w:ascii="Wingdings" w:hAnsi="Wingdings" w:hint="default"/>
+        <w:sz w:val="20"/>
+      </w:rPr>
+    </w:lvl>
+    <w:lvl w:ilvl="8" w:tentative="1">
+      <w:start w:val="1"/>
+      <w:numFmt w:val="bullet"/>
+      <w:lvlText w:val=""/>
+      <w:lvlJc w:val="left"/>
+      <w:pPr>
+        <w:tabs>
+          <w:tab w:val="num" w:pos="6480"/>
+        </w:tabs>
+        <w:ind w:left="6480" w:hanging="360"/>
+      </w:pPr>
+      <w:rPr>
+        <w:rFonts w:ascii="Wingdings" w:hAnsi="Wingdings" w:hint="default"/>
+        <w:sz w:val="20"/>
+      </w:rPr>
+    </w:lvl>
+  </w:abstractNum>
+  <w:abstractNum w:abstractNumId="10" w15:restartNumberingAfterBreak="0">
     <w:nsid w:val="4E684379"/>
     <w:multiLevelType w:val="hybridMultilevel"/>
     <w:tmpl w:val="A33A9682"/>
@@ -2832,7 +6927,7 @@
       </w:rPr>
     </w:lvl>
   </w:abstractNum>
-  <w:abstractNum w:abstractNumId="6" w15:restartNumberingAfterBreak="0">
+  <w:abstractNum w:abstractNumId="11" w15:restartNumberingAfterBreak="0">
     <w:nsid w:val="5B797BDF"/>
     <w:multiLevelType w:val="hybridMultilevel"/>
     <w:tmpl w:val="00FAE470"/>
@@ -2945,7 +7040,305 @@
       </w:rPr>
     </w:lvl>
   </w:abstractNum>
-  <w:abstractNum w:abstractNumId="7" w15:restartNumberingAfterBreak="0">
+  <w:abstractNum w:abstractNumId="12" w15:restartNumberingAfterBreak="0">
+    <w:nsid w:val="5E5D6FF6"/>
+    <w:multiLevelType w:val="multilevel"/>
+    <w:tmpl w:val="0F404F4A"/>
+    <w:lvl w:ilvl="0">
+      <w:start w:val="1"/>
+      <w:numFmt w:val="bullet"/>
+      <w:lvlText w:val=""/>
+      <w:lvlJc w:val="left"/>
+      <w:pPr>
+        <w:tabs>
+          <w:tab w:val="num" w:pos="720"/>
+        </w:tabs>
+        <w:ind w:left="720" w:hanging="360"/>
+      </w:pPr>
+      <w:rPr>
+        <w:rFonts w:ascii="Symbol" w:hAnsi="Symbol" w:hint="default"/>
+        <w:sz w:val="20"/>
+      </w:rPr>
+    </w:lvl>
+    <w:lvl w:ilvl="1">
+      <w:start w:val="1"/>
+      <w:numFmt w:val="bullet"/>
+      <w:lvlText w:val="o"/>
+      <w:lvlJc w:val="left"/>
+      <w:pPr>
+        <w:tabs>
+          <w:tab w:val="num" w:pos="1440"/>
+        </w:tabs>
+        <w:ind w:left="1440" w:hanging="360"/>
+      </w:pPr>
+      <w:rPr>
+        <w:rFonts w:ascii="Courier New" w:hAnsi="Courier New" w:hint="default"/>
+        <w:sz w:val="20"/>
+      </w:rPr>
+    </w:lvl>
+    <w:lvl w:ilvl="2">
+      <w:start w:val="1"/>
+      <w:numFmt w:val="bullet"/>
+      <w:lvlText w:val=""/>
+      <w:lvlJc w:val="left"/>
+      <w:pPr>
+        <w:tabs>
+          <w:tab w:val="num" w:pos="2160"/>
+        </w:tabs>
+        <w:ind w:left="2160" w:hanging="360"/>
+      </w:pPr>
+      <w:rPr>
+        <w:rFonts w:ascii="Wingdings" w:hAnsi="Wingdings" w:hint="default"/>
+        <w:sz w:val="20"/>
+      </w:rPr>
+    </w:lvl>
+    <w:lvl w:ilvl="3" w:tentative="1">
+      <w:start w:val="1"/>
+      <w:numFmt w:val="bullet"/>
+      <w:lvlText w:val=""/>
+      <w:lvlJc w:val="left"/>
+      <w:pPr>
+        <w:tabs>
+          <w:tab w:val="num" w:pos="2880"/>
+        </w:tabs>
+        <w:ind w:left="2880" w:hanging="360"/>
+      </w:pPr>
+      <w:rPr>
+        <w:rFonts w:ascii="Wingdings" w:hAnsi="Wingdings" w:hint="default"/>
+        <w:sz w:val="20"/>
+      </w:rPr>
+    </w:lvl>
+    <w:lvl w:ilvl="4" w:tentative="1">
+      <w:start w:val="1"/>
+      <w:numFmt w:val="bullet"/>
+      <w:lvlText w:val=""/>
+      <w:lvlJc w:val="left"/>
+      <w:pPr>
+        <w:tabs>
+          <w:tab w:val="num" w:pos="3600"/>
+        </w:tabs>
+        <w:ind w:left="3600" w:hanging="360"/>
+      </w:pPr>
+      <w:rPr>
+        <w:rFonts w:ascii="Wingdings" w:hAnsi="Wingdings" w:hint="default"/>
+        <w:sz w:val="20"/>
+      </w:rPr>
+    </w:lvl>
+    <w:lvl w:ilvl="5" w:tentative="1">
+      <w:start w:val="1"/>
+      <w:numFmt w:val="bullet"/>
+      <w:lvlText w:val=""/>
+      <w:lvlJc w:val="left"/>
+      <w:pPr>
+        <w:tabs>
+          <w:tab w:val="num" w:pos="4320"/>
+        </w:tabs>
+        <w:ind w:left="4320" w:hanging="360"/>
+      </w:pPr>
+      <w:rPr>
+        <w:rFonts w:ascii="Wingdings" w:hAnsi="Wingdings" w:hint="default"/>
+        <w:sz w:val="20"/>
+      </w:rPr>
+    </w:lvl>
+    <w:lvl w:ilvl="6" w:tentative="1">
+      <w:start w:val="1"/>
+      <w:numFmt w:val="bullet"/>
+      <w:lvlText w:val=""/>
+      <w:lvlJc w:val="left"/>
+      <w:pPr>
+        <w:tabs>
+          <w:tab w:val="num" w:pos="5040"/>
+        </w:tabs>
+        <w:ind w:left="5040" w:hanging="360"/>
+      </w:pPr>
+      <w:rPr>
+        <w:rFonts w:ascii="Wingdings" w:hAnsi="Wingdings" w:hint="default"/>
+        <w:sz w:val="20"/>
+      </w:rPr>
+    </w:lvl>
+    <w:lvl w:ilvl="7" w:tentative="1">
+      <w:start w:val="1"/>
+      <w:numFmt w:val="bullet"/>
+      <w:lvlText w:val=""/>
+      <w:lvlJc w:val="left"/>
+      <w:pPr>
+        <w:tabs>
+          <w:tab w:val="num" w:pos="5760"/>
+        </w:tabs>
+        <w:ind w:left="5760" w:hanging="360"/>
+      </w:pPr>
+      <w:rPr>
+        <w:rFonts w:ascii="Wingdings" w:hAnsi="Wingdings" w:hint="default"/>
+        <w:sz w:val="20"/>
+      </w:rPr>
+    </w:lvl>
+    <w:lvl w:ilvl="8" w:tentative="1">
+      <w:start w:val="1"/>
+      <w:numFmt w:val="bullet"/>
+      <w:lvlText w:val=""/>
+      <w:lvlJc w:val="left"/>
+      <w:pPr>
+        <w:tabs>
+          <w:tab w:val="num" w:pos="6480"/>
+        </w:tabs>
+        <w:ind w:left="6480" w:hanging="360"/>
+      </w:pPr>
+      <w:rPr>
+        <w:rFonts w:ascii="Wingdings" w:hAnsi="Wingdings" w:hint="default"/>
+        <w:sz w:val="20"/>
+      </w:rPr>
+    </w:lvl>
+  </w:abstractNum>
+  <w:abstractNum w:abstractNumId="13" w15:restartNumberingAfterBreak="0">
+    <w:nsid w:val="5F9B1046"/>
+    <w:multiLevelType w:val="multilevel"/>
+    <w:tmpl w:val="EBD045E6"/>
+    <w:lvl w:ilvl="0">
+      <w:start w:val="1"/>
+      <w:numFmt w:val="bullet"/>
+      <w:lvlText w:val=""/>
+      <w:lvlJc w:val="left"/>
+      <w:pPr>
+        <w:tabs>
+          <w:tab w:val="num" w:pos="720"/>
+        </w:tabs>
+        <w:ind w:left="720" w:hanging="360"/>
+      </w:pPr>
+      <w:rPr>
+        <w:rFonts w:ascii="Symbol" w:hAnsi="Symbol" w:hint="default"/>
+        <w:sz w:val="20"/>
+      </w:rPr>
+    </w:lvl>
+    <w:lvl w:ilvl="1">
+      <w:start w:val="1"/>
+      <w:numFmt w:val="bullet"/>
+      <w:lvlText w:val="o"/>
+      <w:lvlJc w:val="left"/>
+      <w:pPr>
+        <w:tabs>
+          <w:tab w:val="num" w:pos="1440"/>
+        </w:tabs>
+        <w:ind w:left="1440" w:hanging="360"/>
+      </w:pPr>
+      <w:rPr>
+        <w:rFonts w:ascii="Courier New" w:hAnsi="Courier New" w:hint="default"/>
+        <w:sz w:val="20"/>
+      </w:rPr>
+    </w:lvl>
+    <w:lvl w:ilvl="2">
+      <w:start w:val="1"/>
+      <w:numFmt w:val="bullet"/>
+      <w:lvlText w:val=""/>
+      <w:lvlJc w:val="left"/>
+      <w:pPr>
+        <w:tabs>
+          <w:tab w:val="num" w:pos="2160"/>
+        </w:tabs>
+        <w:ind w:left="2160" w:hanging="360"/>
+      </w:pPr>
+      <w:rPr>
+        <w:rFonts w:ascii="Wingdings" w:hAnsi="Wingdings" w:hint="default"/>
+        <w:sz w:val="20"/>
+      </w:rPr>
+    </w:lvl>
+    <w:lvl w:ilvl="3" w:tentative="1">
+      <w:start w:val="1"/>
+      <w:numFmt w:val="bullet"/>
+      <w:lvlText w:val=""/>
+      <w:lvlJc w:val="left"/>
+      <w:pPr>
+        <w:tabs>
+          <w:tab w:val="num" w:pos="2880"/>
+        </w:tabs>
+        <w:ind w:left="2880" w:hanging="360"/>
+      </w:pPr>
+      <w:rPr>
+        <w:rFonts w:ascii="Wingdings" w:hAnsi="Wingdings" w:hint="default"/>
+        <w:sz w:val="20"/>
+      </w:rPr>
+    </w:lvl>
+    <w:lvl w:ilvl="4" w:tentative="1">
+      <w:start w:val="1"/>
+      <w:numFmt w:val="bullet"/>
+      <w:lvlText w:val=""/>
+      <w:lvlJc w:val="left"/>
+      <w:pPr>
+        <w:tabs>
+          <w:tab w:val="num" w:pos="3600"/>
+        </w:tabs>
+        <w:ind w:left="3600" w:hanging="360"/>
+      </w:pPr>
+      <w:rPr>
+        <w:rFonts w:ascii="Wingdings" w:hAnsi="Wingdings" w:hint="default"/>
+        <w:sz w:val="20"/>
+      </w:rPr>
+    </w:lvl>
+    <w:lvl w:ilvl="5" w:tentative="1">
+      <w:start w:val="1"/>
+      <w:numFmt w:val="bullet"/>
+      <w:lvlText w:val=""/>
+      <w:lvlJc w:val="left"/>
+      <w:pPr>
+        <w:tabs>
+          <w:tab w:val="num" w:pos="4320"/>
+        </w:tabs>
+        <w:ind w:left="4320" w:hanging="360"/>
+      </w:pPr>
+      <w:rPr>
+        <w:rFonts w:ascii="Wingdings" w:hAnsi="Wingdings" w:hint="default"/>
+        <w:sz w:val="20"/>
+      </w:rPr>
+    </w:lvl>
+    <w:lvl w:ilvl="6" w:tentative="1">
+      <w:start w:val="1"/>
+      <w:numFmt w:val="bullet"/>
+      <w:lvlText w:val=""/>
+      <w:lvlJc w:val="left"/>
+      <w:pPr>
+        <w:tabs>
+          <w:tab w:val="num" w:pos="5040"/>
+        </w:tabs>
+        <w:ind w:left="5040" w:hanging="360"/>
+      </w:pPr>
+      <w:rPr>
+        <w:rFonts w:ascii="Wingdings" w:hAnsi="Wingdings" w:hint="default"/>
+        <w:sz w:val="20"/>
+      </w:rPr>
+    </w:lvl>
+    <w:lvl w:ilvl="7" w:tentative="1">
+      <w:start w:val="1"/>
+      <w:numFmt w:val="bullet"/>
+      <w:lvlText w:val=""/>
+      <w:lvlJc w:val="left"/>
+      <w:pPr>
+        <w:tabs>
+          <w:tab w:val="num" w:pos="5760"/>
+        </w:tabs>
+        <w:ind w:left="5760" w:hanging="360"/>
+      </w:pPr>
+      <w:rPr>
+        <w:rFonts w:ascii="Wingdings" w:hAnsi="Wingdings" w:hint="default"/>
+        <w:sz w:val="20"/>
+      </w:rPr>
+    </w:lvl>
+    <w:lvl w:ilvl="8" w:tentative="1">
+      <w:start w:val="1"/>
+      <w:numFmt w:val="bullet"/>
+      <w:lvlText w:val=""/>
+      <w:lvlJc w:val="left"/>
+      <w:pPr>
+        <w:tabs>
+          <w:tab w:val="num" w:pos="6480"/>
+        </w:tabs>
+        <w:ind w:left="6480" w:hanging="360"/>
+      </w:pPr>
+      <w:rPr>
+        <w:rFonts w:ascii="Wingdings" w:hAnsi="Wingdings" w:hint="default"/>
+        <w:sz w:val="20"/>
+      </w:rPr>
+    </w:lvl>
+  </w:abstractNum>
+  <w:abstractNum w:abstractNumId="14" w15:restartNumberingAfterBreak="0">
     <w:nsid w:val="68E91257"/>
     <w:multiLevelType w:val="hybridMultilevel"/>
     <w:tmpl w:val="0FEC1C1C"/>
@@ -2961,7 +7354,7 @@
         <w:rFonts w:ascii="Symbol" w:hAnsi="Symbol" w:hint="default"/>
       </w:rPr>
     </w:lvl>
-    <w:lvl w:ilvl="1" w:tplc="240A0003" w:tentative="1">
+    <w:lvl w:ilvl="1" w:tplc="240A0003">
       <w:start w:val="1"/>
       <w:numFmt w:val="bullet"/>
       <w:lvlText w:val="o"/>
@@ -2973,7 +7366,7 @@
         <w:rFonts w:ascii="Courier New" w:hAnsi="Courier New" w:cs="Courier New" w:hint="default"/>
       </w:rPr>
     </w:lvl>
-    <w:lvl w:ilvl="2" w:tplc="240A0005" w:tentative="1">
+    <w:lvl w:ilvl="2" w:tplc="240A0005">
       <w:start w:val="1"/>
       <w:numFmt w:val="bullet"/>
       <w:lvlText w:val=""/>
@@ -3055,32 +7448,205 @@
       </w:pPr>
       <w:rPr>
         <w:rFonts w:ascii="Wingdings" w:hAnsi="Wingdings" w:hint="default"/>
+      </w:rPr>
+    </w:lvl>
+  </w:abstractNum>
+  <w:abstractNum w:abstractNumId="15" w15:restartNumberingAfterBreak="0">
+    <w:nsid w:val="73CD5909"/>
+    <w:multiLevelType w:val="multilevel"/>
+    <w:tmpl w:val="DACA2B12"/>
+    <w:lvl w:ilvl="0">
+      <w:start w:val="1"/>
+      <w:numFmt w:val="bullet"/>
+      <w:lvlText w:val=""/>
+      <w:lvlJc w:val="left"/>
+      <w:pPr>
+        <w:tabs>
+          <w:tab w:val="num" w:pos="720"/>
+        </w:tabs>
+        <w:ind w:left="720" w:hanging="360"/>
+      </w:pPr>
+      <w:rPr>
+        <w:rFonts w:ascii="Symbol" w:hAnsi="Symbol" w:hint="default"/>
+        <w:sz w:val="20"/>
+      </w:rPr>
+    </w:lvl>
+    <w:lvl w:ilvl="1">
+      <w:start w:val="1"/>
+      <w:numFmt w:val="bullet"/>
+      <w:lvlText w:val="o"/>
+      <w:lvlJc w:val="left"/>
+      <w:pPr>
+        <w:tabs>
+          <w:tab w:val="num" w:pos="1440"/>
+        </w:tabs>
+        <w:ind w:left="1440" w:hanging="360"/>
+      </w:pPr>
+      <w:rPr>
+        <w:rFonts w:ascii="Courier New" w:hAnsi="Courier New" w:hint="default"/>
+        <w:sz w:val="20"/>
+      </w:rPr>
+    </w:lvl>
+    <w:lvl w:ilvl="2">
+      <w:start w:val="1"/>
+      <w:numFmt w:val="bullet"/>
+      <w:lvlText w:val=""/>
+      <w:lvlJc w:val="left"/>
+      <w:pPr>
+        <w:tabs>
+          <w:tab w:val="num" w:pos="2160"/>
+        </w:tabs>
+        <w:ind w:left="2160" w:hanging="360"/>
+      </w:pPr>
+      <w:rPr>
+        <w:rFonts w:ascii="Wingdings" w:hAnsi="Wingdings" w:hint="default"/>
+        <w:sz w:val="20"/>
+      </w:rPr>
+    </w:lvl>
+    <w:lvl w:ilvl="3" w:tentative="1">
+      <w:start w:val="1"/>
+      <w:numFmt w:val="bullet"/>
+      <w:lvlText w:val=""/>
+      <w:lvlJc w:val="left"/>
+      <w:pPr>
+        <w:tabs>
+          <w:tab w:val="num" w:pos="2880"/>
+        </w:tabs>
+        <w:ind w:left="2880" w:hanging="360"/>
+      </w:pPr>
+      <w:rPr>
+        <w:rFonts w:ascii="Wingdings" w:hAnsi="Wingdings" w:hint="default"/>
+        <w:sz w:val="20"/>
+      </w:rPr>
+    </w:lvl>
+    <w:lvl w:ilvl="4" w:tentative="1">
+      <w:start w:val="1"/>
+      <w:numFmt w:val="bullet"/>
+      <w:lvlText w:val=""/>
+      <w:lvlJc w:val="left"/>
+      <w:pPr>
+        <w:tabs>
+          <w:tab w:val="num" w:pos="3600"/>
+        </w:tabs>
+        <w:ind w:left="3600" w:hanging="360"/>
+      </w:pPr>
+      <w:rPr>
+        <w:rFonts w:ascii="Wingdings" w:hAnsi="Wingdings" w:hint="default"/>
+        <w:sz w:val="20"/>
+      </w:rPr>
+    </w:lvl>
+    <w:lvl w:ilvl="5" w:tentative="1">
+      <w:start w:val="1"/>
+      <w:numFmt w:val="bullet"/>
+      <w:lvlText w:val=""/>
+      <w:lvlJc w:val="left"/>
+      <w:pPr>
+        <w:tabs>
+          <w:tab w:val="num" w:pos="4320"/>
+        </w:tabs>
+        <w:ind w:left="4320" w:hanging="360"/>
+      </w:pPr>
+      <w:rPr>
+        <w:rFonts w:ascii="Wingdings" w:hAnsi="Wingdings" w:hint="default"/>
+        <w:sz w:val="20"/>
+      </w:rPr>
+    </w:lvl>
+    <w:lvl w:ilvl="6" w:tentative="1">
+      <w:start w:val="1"/>
+      <w:numFmt w:val="bullet"/>
+      <w:lvlText w:val=""/>
+      <w:lvlJc w:val="left"/>
+      <w:pPr>
+        <w:tabs>
+          <w:tab w:val="num" w:pos="5040"/>
+        </w:tabs>
+        <w:ind w:left="5040" w:hanging="360"/>
+      </w:pPr>
+      <w:rPr>
+        <w:rFonts w:ascii="Wingdings" w:hAnsi="Wingdings" w:hint="default"/>
+        <w:sz w:val="20"/>
+      </w:rPr>
+    </w:lvl>
+    <w:lvl w:ilvl="7" w:tentative="1">
+      <w:start w:val="1"/>
+      <w:numFmt w:val="bullet"/>
+      <w:lvlText w:val=""/>
+      <w:lvlJc w:val="left"/>
+      <w:pPr>
+        <w:tabs>
+          <w:tab w:val="num" w:pos="5760"/>
+        </w:tabs>
+        <w:ind w:left="5760" w:hanging="360"/>
+      </w:pPr>
+      <w:rPr>
+        <w:rFonts w:ascii="Wingdings" w:hAnsi="Wingdings" w:hint="default"/>
+        <w:sz w:val="20"/>
+      </w:rPr>
+    </w:lvl>
+    <w:lvl w:ilvl="8" w:tentative="1">
+      <w:start w:val="1"/>
+      <w:numFmt w:val="bullet"/>
+      <w:lvlText w:val=""/>
+      <w:lvlJc w:val="left"/>
+      <w:pPr>
+        <w:tabs>
+          <w:tab w:val="num" w:pos="6480"/>
+        </w:tabs>
+        <w:ind w:left="6480" w:hanging="360"/>
+      </w:pPr>
+      <w:rPr>
+        <w:rFonts w:ascii="Wingdings" w:hAnsi="Wingdings" w:hint="default"/>
+        <w:sz w:val="20"/>
       </w:rPr>
     </w:lvl>
   </w:abstractNum>
   <w:num w:numId="1" w16cid:durableId="1851212558">
+    <w:abstractNumId w:val="4"/>
+  </w:num>
+  <w:num w:numId="2" w16cid:durableId="1690329398">
+    <w:abstractNumId w:val="3"/>
+  </w:num>
+  <w:num w:numId="3" w16cid:durableId="1671373070">
     <w:abstractNumId w:val="2"/>
   </w:num>
-  <w:num w:numId="2" w16cid:durableId="1690329398">
+  <w:num w:numId="4" w16cid:durableId="909655760">
+    <w:abstractNumId w:val="14"/>
+  </w:num>
+  <w:num w:numId="5" w16cid:durableId="2038963864">
+    <w:abstractNumId w:val="11"/>
+  </w:num>
+  <w:num w:numId="6" w16cid:durableId="1480922455">
+    <w:abstractNumId w:val="10"/>
+  </w:num>
+  <w:num w:numId="7" w16cid:durableId="1416321877">
+    <w:abstractNumId w:val="5"/>
+  </w:num>
+  <w:num w:numId="8" w16cid:durableId="630747131">
+    <w:abstractNumId w:val="6"/>
+  </w:num>
+  <w:num w:numId="9" w16cid:durableId="1440877577">
+    <w:abstractNumId w:val="15"/>
+  </w:num>
+  <w:num w:numId="10" w16cid:durableId="650673928">
+    <w:abstractNumId w:val="12"/>
+  </w:num>
+  <w:num w:numId="11" w16cid:durableId="215092933">
+    <w:abstractNumId w:val="8"/>
+  </w:num>
+  <w:num w:numId="12" w16cid:durableId="926572883">
+    <w:abstractNumId w:val="9"/>
+  </w:num>
+  <w:num w:numId="13" w16cid:durableId="602373095">
+    <w:abstractNumId w:val="0"/>
+  </w:num>
+  <w:num w:numId="14" w16cid:durableId="1353411528">
     <w:abstractNumId w:val="1"/>
   </w:num>
-  <w:num w:numId="3" w16cid:durableId="1671373070">
-    <w:abstractNumId w:val="0"/>
-  </w:num>
-  <w:num w:numId="4" w16cid:durableId="909655760">
+  <w:num w:numId="15" w16cid:durableId="1926104679">
     <w:abstractNumId w:val="7"/>
   </w:num>
-  <w:num w:numId="5" w16cid:durableId="2038963864">
-    <w:abstractNumId w:val="6"/>
-  </w:num>
-  <w:num w:numId="6" w16cid:durableId="1480922455">
-    <w:abstractNumId w:val="5"/>
-  </w:num>
-  <w:num w:numId="7" w16cid:durableId="1416321877">
-    <w:abstractNumId w:val="3"/>
-  </w:num>
-  <w:num w:numId="8" w16cid:durableId="630747131">
-    <w:abstractNumId w:val="4"/>
+  <w:num w:numId="16" w16cid:durableId="172426386">
+    <w:abstractNumId w:val="13"/>
   </w:num>
 </w:numbering>
 </file>
@@ -3689,6 +8255,7 @@
   <w:style w:type="character" w:default="1" w:styleId="DefaultParagraphFont">
     <w:name w:val="Default Paragraph Font"/>
     <w:uiPriority w:val="1"/>
+    <w:semiHidden/>
     <w:unhideWhenUsed/>
   </w:style>
   <w:style w:type="table" w:default="1" w:styleId="TableNormal">

</xml_diff>

<commit_message>
chore: sync pending changes from analysis session
Includes minor fixes to auth router, schemas, init.sql,
workflow docs, requerimientos, and auth page styling.
</commit_message>
<xml_diff>
--- a/docs/Docx/P. Requerimientos (F + NF) y Épicas.docx
+++ b/docs/Docx/P. Requerimientos (F + NF) y Épicas.docx
@@ -144,6 +144,24 @@
     </w:p>
     <w:p>
       <w:pPr>
+        <w:spacing w:before="240" w:line="360" w:lineRule="auto"/>
+        <w:rPr>
+          <w:rFonts w:asciiTheme="majorHAnsi" w:hAnsiTheme="majorHAnsi"/>
+          <w:b/>
+          <w:bCs/>
+        </w:rPr>
+      </w:pPr>
+      <w:r>
+        <w:rPr>
+          <w:rFonts w:asciiTheme="majorHAnsi" w:hAnsiTheme="majorHAnsi"/>
+          <w:b/>
+          <w:bCs/>
+        </w:rPr>
+        <w:t>Sprint 1: HU 0.1, HU 0.2, HU 0.3</w:t>
+      </w:r>
+    </w:p>
+    <w:p>
+      <w:pPr>
         <w:pStyle w:val="ListParagraph"/>
         <w:numPr>
           <w:ilvl w:val="0"/>
@@ -184,39 +202,7 @@
         <w:t xml:space="preserve">HU 0.1: </w:t>
       </w:r>
       <w:r>
-        <w:t xml:space="preserve">Inicialización del </w:t>
-      </w:r>
-      <w:proofErr w:type="spellStart"/>
-      <w:r>
-        <w:t>monorepo</w:t>
-      </w:r>
-      <w:proofErr w:type="spellEnd"/>
-      <w:r>
-        <w:t xml:space="preserve"> (</w:t>
-      </w:r>
-      <w:proofErr w:type="spellStart"/>
-      <w:r>
-        <w:t>Frontend</w:t>
-      </w:r>
-      <w:proofErr w:type="spellEnd"/>
-      <w:r>
-        <w:t xml:space="preserve"> Next.js, </w:t>
-      </w:r>
-      <w:proofErr w:type="spellStart"/>
-      <w:r>
-        <w:t>Backend</w:t>
-      </w:r>
-      <w:proofErr w:type="spellEnd"/>
-      <w:r>
-        <w:t xml:space="preserve"> </w:t>
-      </w:r>
-      <w:proofErr w:type="spellStart"/>
-      <w:r>
-        <w:t>FastAPI</w:t>
-      </w:r>
-      <w:proofErr w:type="spellEnd"/>
-      <w:r>
-        <w:t>) y configuración del pipeline CI/CD.</w:t>
+        <w:t>Inicialización del monorepo (Frontend Next.js, Backend FastAPI) y configuración del pipeline CI/CD.</w:t>
       </w:r>
     </w:p>
     <w:p>
@@ -240,15 +226,7 @@
         <w:t xml:space="preserve">HU 0.2: </w:t>
       </w:r>
       <w:r>
-        <w:t>Modelado y despliegue del esquema de base de datos relacional (PostgreSQL) con soporte espacial (</w:t>
-      </w:r>
-      <w:proofErr w:type="spellStart"/>
-      <w:r>
-        <w:t>PostGIS</w:t>
-      </w:r>
-      <w:proofErr w:type="spellEnd"/>
-      <w:r>
-        <w:t>).</w:t>
+        <w:t>Modelado y despliegue del esquema de base de datos relacional (PostgreSQL) con soporte espacial (PostGIS).</w:t>
       </w:r>
     </w:p>
     <w:p>
@@ -272,52 +250,39 @@
         <w:t xml:space="preserve">HU 0.3: </w:t>
       </w:r>
       <w:r>
-        <w:t xml:space="preserve">Configuración de dominios, certificados SSL y entornos de </w:t>
-      </w:r>
-      <w:proofErr w:type="spellStart"/>
-      <w:r>
-        <w:t>Staging</w:t>
-      </w:r>
-      <w:proofErr w:type="spellEnd"/>
-      <w:r>
-        <w:t>/Producción.</w:t>
-      </w:r>
-    </w:p>
-    <w:p>
-      <w:pPr>
-        <w:pStyle w:val="ListParagraph"/>
-        <w:numPr>
-          <w:ilvl w:val="0"/>
-          <w:numId w:val="6"/>
-        </w:numPr>
-        <w:spacing w:before="240" w:line="360" w:lineRule="auto"/>
-        <w:rPr>
-          <w:b/>
-          <w:bCs/>
-        </w:rPr>
-      </w:pPr>
-      <w:r>
-        <w:rPr>
-          <w:b/>
-          <w:bCs/>
-        </w:rPr>
-        <w:t>EP-01: Autenticación Segura y Perfilamiento (</w:t>
-      </w:r>
-      <w:proofErr w:type="spellStart"/>
-      <w:r>
-        <w:rPr>
-          <w:b/>
-          <w:bCs/>
-        </w:rPr>
-        <w:t>Privacy</w:t>
-      </w:r>
-      <w:proofErr w:type="spellEnd"/>
-      <w:r>
-        <w:rPr>
-          <w:b/>
-          <w:bCs/>
-        </w:rPr>
-        <w:t>-First)</w:t>
+        <w:t>Configuración de dominios, certificados SSL y entornos de Staging/Producción.</w:t>
+      </w:r>
+    </w:p>
+    <w:p>
+      <w:pPr>
+        <w:spacing w:before="240" w:line="360" w:lineRule="auto"/>
+        <w:rPr>
+          <w:b/>
+          <w:bCs/>
+        </w:rPr>
+      </w:pPr>
+      <w:r>
+        <w:rPr>
+          <w:b/>
+          <w:bCs/>
+        </w:rPr>
+        <w:t>Sprint 2: HU 1.1, HU 1.2, HU 1.3, HU 1.4, HU 1.5, HU 2.1, HU 2.2, HU 2.3</w:t>
+      </w:r>
+    </w:p>
+    <w:p>
+      <w:pPr>
+        <w:spacing w:before="240" w:line="360" w:lineRule="auto"/>
+        <w:rPr>
+          <w:b/>
+          <w:bCs/>
+        </w:rPr>
+      </w:pPr>
+      <w:r>
+        <w:rPr>
+          <w:b/>
+          <w:bCs/>
+        </w:rPr>
+        <w:t>EP-01: Autenticación Segura y Perfilamiento (Privacy-First)</w:t>
       </w:r>
     </w:p>
     <w:p>
@@ -506,6 +471,7 @@
           <w:bCs/>
           <w:highlight w:val="yellow"/>
         </w:rPr>
+        <w:lastRenderedPageBreak/>
         <w:t>HU 1.</w:t>
       </w:r>
       <w:r>
@@ -528,35 +494,7 @@
         <w:rPr>
           <w:highlight w:val="yellow"/>
         </w:rPr>
-        <w:t>Validación Sinapsis (</w:t>
-      </w:r>
-      <w:proofErr w:type="spellStart"/>
-      <w:r>
-        <w:rPr>
-          <w:highlight w:val="yellow"/>
-        </w:rPr>
-        <w:t>Whitelist</w:t>
-      </w:r>
-      <w:proofErr w:type="spellEnd"/>
-      <w:r>
-        <w:rPr>
-          <w:highlight w:val="yellow"/>
-        </w:rPr>
-        <w:t xml:space="preserve">): El sistema debe contrastar la solicitud del usuario con un listado (archivo CSV o </w:t>
-      </w:r>
-      <w:proofErr w:type="spellStart"/>
-      <w:r>
-        <w:rPr>
-          <w:highlight w:val="yellow"/>
-        </w:rPr>
-        <w:t>endpoint</w:t>
-      </w:r>
-      <w:proofErr w:type="spellEnd"/>
-      <w:r>
-        <w:rPr>
-          <w:highlight w:val="yellow"/>
-        </w:rPr>
-        <w:t>) provisto por Sinapsis para aprobar automáticamente la creación del perfil de vendedor.</w:t>
+        <w:t>Validación Sinapsis (Whitelist): El sistema debe contrastar la solicitud del usuario con un listado (archivo CSV o endpoint) provisto por Sinapsis para aprobar automáticamente la creación del perfil de vendedor.</w:t>
       </w:r>
     </w:p>
     <w:p>
@@ -631,15 +569,7 @@
         <w:t>1:</w:t>
       </w:r>
       <w:r>
-        <w:t xml:space="preserve"> Instalación de la aplicación en la pantalla de inicio del móvil (Add </w:t>
-      </w:r>
-      <w:proofErr w:type="spellStart"/>
-      <w:r>
-        <w:t>to</w:t>
-      </w:r>
-      <w:proofErr w:type="spellEnd"/>
-      <w:r>
-        <w:t xml:space="preserve"> Home Screen).</w:t>
+        <w:t xml:space="preserve"> Instalación de la aplicación en la pantalla de inicio del móvil (Add to Home Screen).</w:t>
       </w:r>
     </w:p>
     <w:p>
@@ -663,23 +593,7 @@
         <w:t xml:space="preserve">HU 2.2: </w:t>
       </w:r>
       <w:r>
-        <w:t>Implementación de estados de carga esqueléticos (</w:t>
-      </w:r>
-      <w:proofErr w:type="spellStart"/>
-      <w:r>
-        <w:t>Skeleton</w:t>
-      </w:r>
-      <w:proofErr w:type="spellEnd"/>
-      <w:r>
-        <w:t xml:space="preserve"> </w:t>
-      </w:r>
-      <w:proofErr w:type="spellStart"/>
-      <w:r>
-        <w:t>loaders</w:t>
-      </w:r>
-      <w:proofErr w:type="spellEnd"/>
-      <w:r>
-        <w:t>) y manejo de errores amigables ante pérdida de red. (Reemplaza la antigua HU de navegación offline)</w:t>
+        <w:t>Implementación de estados de carga esqueléticos (Skeleton loaders) y manejo de errores amigables ante pérdida de red. (Reemplaza la antigua HU de navegación offline)</w:t>
       </w:r>
     </w:p>
     <w:p>
@@ -703,15 +617,23 @@
         <w:t xml:space="preserve">HU 2.3: </w:t>
       </w:r>
       <w:r>
-        <w:t xml:space="preserve">Configuración de notificaciones </w:t>
-      </w:r>
-      <w:proofErr w:type="spellStart"/>
-      <w:r>
-        <w:t>push</w:t>
-      </w:r>
-      <w:proofErr w:type="spellEnd"/>
-      <w:r>
-        <w:t xml:space="preserve"> web para alertas del sistema.</w:t>
+        <w:t>Configuración de notificaciones push web para alertas del sistema.</w:t>
+      </w:r>
+    </w:p>
+    <w:p>
+      <w:pPr>
+        <w:spacing w:before="240" w:line="360" w:lineRule="auto"/>
+        <w:rPr>
+          <w:b/>
+          <w:bCs/>
+        </w:rPr>
+      </w:pPr>
+      <w:r>
+        <w:rPr>
+          <w:b/>
+          <w:bCs/>
+        </w:rPr>
+        <w:t>Sprint 3: HU 3.1, HU 3.2, HU 3.3</w:t>
       </w:r>
     </w:p>
     <w:p>
@@ -819,6 +741,22 @@
     </w:p>
     <w:p>
       <w:pPr>
+        <w:spacing w:before="240" w:line="360" w:lineRule="auto"/>
+        <w:rPr>
+          <w:b/>
+          <w:bCs/>
+        </w:rPr>
+      </w:pPr>
+      <w:r>
+        <w:rPr>
+          <w:b/>
+          <w:bCs/>
+        </w:rPr>
+        <w:t>Sprint 4: HU 4.1, HU 4.2, HU 4.3</w:t>
+      </w:r>
+    </w:p>
+    <w:p>
+      <w:pPr>
         <w:pStyle w:val="ListParagraph"/>
         <w:numPr>
           <w:ilvl w:val="0"/>
@@ -849,23 +787,7 @@
           <w:b/>
           <w:bCs/>
         </w:rPr>
-        <w:t xml:space="preserve">: Búsqueda Inteligente (MVP - Motor Open </w:t>
-      </w:r>
-      <w:proofErr w:type="spellStart"/>
-      <w:r>
-        <w:rPr>
-          <w:b/>
-          <w:bCs/>
-        </w:rPr>
-        <w:t>Source</w:t>
-      </w:r>
-      <w:proofErr w:type="spellEnd"/>
-      <w:r>
-        <w:rPr>
-          <w:b/>
-          <w:bCs/>
-        </w:rPr>
-        <w:t>)</w:t>
+        <w:t>: Búsqueda Inteligente (MVP - Motor Open Source)</w:t>
       </w:r>
     </w:p>
     <w:p>
@@ -937,15 +859,23 @@
         <w:t xml:space="preserve">HU 4.3: </w:t>
       </w:r>
       <w:r>
-        <w:t>Visualización de recomendaciones de productos similares ("</w:t>
-      </w:r>
-      <w:proofErr w:type="spellStart"/>
-      <w:r>
-        <w:t>VeraMatch</w:t>
-      </w:r>
-      <w:proofErr w:type="spellEnd"/>
-      <w:r>
-        <w:t>" MVP).</w:t>
+        <w:t>Visualización de recomendaciones de productos similares ("VeraMatch" MVP).</w:t>
+      </w:r>
+    </w:p>
+    <w:p>
+      <w:pPr>
+        <w:spacing w:before="240" w:line="360" w:lineRule="auto"/>
+        <w:rPr>
+          <w:b/>
+          <w:bCs/>
+        </w:rPr>
+      </w:pPr>
+      <w:r>
+        <w:rPr>
+          <w:b/>
+          <w:bCs/>
+        </w:rPr>
+        <w:t>Sprint 5: HU 5.1, HU 5.2, HU 5.3, HU 6.1, HU 6.2, HU 6.3, HU 6.4, HU 6.5</w:t>
       </w:r>
     </w:p>
     <w:p>
@@ -1004,15 +934,7 @@
         <w:t xml:space="preserve">HU 5.1: </w:t>
       </w:r>
       <w:r>
-        <w:t>Visualización del mapa interactivo del campus (</w:t>
-      </w:r>
-      <w:proofErr w:type="spellStart"/>
-      <w:r>
-        <w:t>OpenStreetMap</w:t>
-      </w:r>
-      <w:proofErr w:type="spellEnd"/>
-      <w:r>
-        <w:t>) con marcadores de productos.</w:t>
+        <w:t>Visualización del mapa interactivo del campus (OpenStreetMap) con marcadores de productos.</w:t>
       </w:r>
     </w:p>
     <w:p>
@@ -1057,6 +979,7 @@
           <w:b/>
           <w:bCs/>
         </w:rPr>
+        <w:lastRenderedPageBreak/>
         <w:t xml:space="preserve">HU 5.3: </w:t>
       </w:r>
       <w:r>
@@ -1111,23 +1034,7 @@
           <w:b/>
           <w:bCs/>
         </w:rPr>
-        <w:t>: Negociación y Cierre P2P (</w:t>
-      </w:r>
-      <w:proofErr w:type="spellStart"/>
-      <w:r>
-        <w:rPr>
-          <w:b/>
-          <w:bCs/>
-        </w:rPr>
-        <w:t>Frictionless</w:t>
-      </w:r>
-      <w:proofErr w:type="spellEnd"/>
-      <w:r>
-        <w:rPr>
-          <w:b/>
-          <w:bCs/>
-        </w:rPr>
-        <w:t>)</w:t>
+        <w:t>: Negociación y Cierre P2P (Frictionless)</w:t>
       </w:r>
     </w:p>
     <w:p>
@@ -1175,23 +1082,7 @@
         <w:t xml:space="preserve">HU 6.2: </w:t>
       </w:r>
       <w:r>
-        <w:t xml:space="preserve">Integración de Deep </w:t>
-      </w:r>
-      <w:proofErr w:type="gramStart"/>
-      <w:r>
-        <w:t>Link</w:t>
-      </w:r>
-      <w:proofErr w:type="gramEnd"/>
-      <w:r>
-        <w:t xml:space="preserve"> para facilitar el salto directo de pago hacia </w:t>
-      </w:r>
-      <w:proofErr w:type="spellStart"/>
-      <w:r>
-        <w:t>Nequi</w:t>
-      </w:r>
-      <w:proofErr w:type="spellEnd"/>
-      <w:r>
-        <w:t>.</w:t>
+        <w:t>Integración de Deep Link para facilitar el salto directo de pago hacia Nequi.</w:t>
       </w:r>
     </w:p>
     <w:p>
@@ -1215,23 +1106,7 @@
         <w:t xml:space="preserve">HU 6.3: </w:t>
       </w:r>
       <w:r>
-        <w:t xml:space="preserve">Integración de Deep </w:t>
-      </w:r>
-      <w:proofErr w:type="gramStart"/>
-      <w:r>
-        <w:t>Link</w:t>
-      </w:r>
-      <w:proofErr w:type="gramEnd"/>
-      <w:r>
-        <w:t xml:space="preserve"> para facilitar el salto directo de pago hacia </w:t>
-      </w:r>
-      <w:proofErr w:type="spellStart"/>
-      <w:r>
-        <w:t>DaviPlata</w:t>
-      </w:r>
-      <w:proofErr w:type="spellEnd"/>
-      <w:r>
-        <w:t>.</w:t>
+        <w:t>Integración de Deep Link para facilitar el salto directo de pago hacia DaviPlata.</w:t>
       </w:r>
     </w:p>
     <w:p>
@@ -1282,21 +1157,24 @@
         <w:rPr>
           <w:highlight w:val="yellow"/>
         </w:rPr>
-        <w:t xml:space="preserve">Registro automático en base de datos del valor en COP del producto al momento de confirmar una transacción, para la generación del cálculo de GMV (Gross Merchandise </w:t>
-      </w:r>
-      <w:proofErr w:type="spellStart"/>
-      <w:r>
-        <w:rPr>
+        <w:t>Registro automático en base de datos del valor en COP del producto al momento de confirmar una transacción, para la generación del cálculo de GMV (Gross Merchandise Value).</w:t>
+      </w:r>
+    </w:p>
+    <w:p>
+      <w:pPr>
+        <w:spacing w:before="240" w:line="360" w:lineRule="auto"/>
+        <w:rPr>
+          <w:b/>
+          <w:bCs/>
           <w:highlight w:val="yellow"/>
         </w:rPr>
-        <w:t>Value</w:t>
-      </w:r>
-      <w:proofErr w:type="spellEnd"/>
-      <w:r>
-        <w:rPr>
-          <w:highlight w:val="yellow"/>
-        </w:rPr>
-        <w:t>).</w:t>
+      </w:pPr>
+      <w:r>
+        <w:rPr>
+          <w:b/>
+          <w:bCs/>
+        </w:rPr>
+        <w:t>Sprint 6: HU 7.1, HU 7.2, HU 7.3</w:t>
       </w:r>
     </w:p>
     <w:p>
@@ -1348,15 +1226,7 @@
         <w:t xml:space="preserve">HU 7.1: </w:t>
       </w:r>
       <w:r>
-        <w:t xml:space="preserve">Calificación de transacciones (1 a 5 estrellas) </w:t>
-      </w:r>
-      <w:proofErr w:type="spellStart"/>
-      <w:r>
-        <w:t>post-compra</w:t>
-      </w:r>
-      <w:proofErr w:type="spellEnd"/>
-      <w:r>
-        <w:t>.</w:t>
+        <w:t>Calificación de transacciones (1 a 5 estrellas) post-compra.</w:t>
       </w:r>
     </w:p>
     <w:p>
@@ -1460,7 +1330,10 @@
         <w:t xml:space="preserve">RF-01 (Gestión de Identidad): </w:t>
       </w:r>
       <w:r>
-        <w:t>El sistema debe validar que los correos electrónicos ingresados en el registro pertenezcan al dominio de la institución (ej. @uao.edu.co).</w:t>
+        <w:t>El sistema debe validar que los correos electrónicos ingresados en el registro pertenezcan</w:t>
+      </w:r>
+      <w:r>
+        <w:t xml:space="preserve"> a los registros dados por sinapsis uao (archivos .csv)</w:t>
       </w:r>
     </w:p>
     <w:p>
@@ -1580,23 +1453,7 @@
         <w:t xml:space="preserve">RF-07 (Enlaces de Pago Externos): </w:t>
       </w:r>
       <w:r>
-        <w:t>El sistema debe generar botones que abran directamente las aplicaciones de billeteras digitales (</w:t>
-      </w:r>
-      <w:proofErr w:type="spellStart"/>
-      <w:r>
-        <w:t>Nequi</w:t>
-      </w:r>
-      <w:proofErr w:type="spellEnd"/>
-      <w:r>
-        <w:t>/</w:t>
-      </w:r>
-      <w:proofErr w:type="spellStart"/>
-      <w:r>
-        <w:t>DaviPlata</w:t>
-      </w:r>
-      <w:proofErr w:type="spellEnd"/>
-      <w:r>
-        <w:t>) instaladas en el dispositivo del usuario.</w:t>
+        <w:t>El sistema debe generar botones que abran directamente las aplicaciones de billeteras digitales (Nequi/DaviPlata) instaladas en el dispositivo del usuario.</w:t>
       </w:r>
     </w:p>
     <w:p>
@@ -1756,95 +1613,37 @@
         <w:spacing w:before="240" w:line="360" w:lineRule="auto"/>
       </w:pPr>
       <w:r>
-        <w:t xml:space="preserve">La arquitectura </w:t>
-      </w:r>
-      <w:proofErr w:type="spellStart"/>
-      <w:r>
-        <w:t>backend</w:t>
-      </w:r>
-      <w:proofErr w:type="spellEnd"/>
-      <w:r>
-        <w:t xml:space="preserve"> (</w:t>
-      </w:r>
-      <w:proofErr w:type="spellStart"/>
-      <w:r>
-        <w:t>FastAPI</w:t>
-      </w:r>
-      <w:proofErr w:type="spellEnd"/>
-      <w:r>
-        <w:t>) debe soportar 500 usuarios concurrentes y picos de hasta 1,200 usuarios/hora sin degradación de servicio. La base de datos debe soportar un catálogo de 15,000 productos activos.</w:t>
-      </w:r>
-    </w:p>
-    <w:p>
-      <w:pPr>
-        <w:pStyle w:val="ListParagraph"/>
-        <w:numPr>
-          <w:ilvl w:val="0"/>
-          <w:numId w:val="4"/>
-        </w:numPr>
-        <w:spacing w:before="240" w:line="360" w:lineRule="auto"/>
-        <w:rPr>
-          <w:b/>
-          <w:bCs/>
-        </w:rPr>
-      </w:pPr>
-      <w:r>
-        <w:rPr>
-          <w:b/>
-          <w:bCs/>
-        </w:rPr>
-        <w:t>RNF-03 (</w:t>
-      </w:r>
-      <w:proofErr w:type="spellStart"/>
-      <w:r>
-        <w:rPr>
-          <w:b/>
-          <w:bCs/>
-        </w:rPr>
-        <w:t>Instalabilidad</w:t>
-      </w:r>
-      <w:proofErr w:type="spellEnd"/>
-      <w:r>
-        <w:rPr>
-          <w:b/>
-          <w:bCs/>
-        </w:rPr>
-        <w:t xml:space="preserve"> PWA): </w:t>
-      </w:r>
-    </w:p>
-    <w:p>
-      <w:pPr>
-        <w:pStyle w:val="ListParagraph"/>
-        <w:spacing w:before="240" w:line="360" w:lineRule="auto"/>
-      </w:pPr>
-      <w:r>
-        <w:t xml:space="preserve">La interfaz </w:t>
-      </w:r>
-      <w:proofErr w:type="spellStart"/>
-      <w:r>
-        <w:t>frontend</w:t>
-      </w:r>
-      <w:proofErr w:type="spellEnd"/>
-      <w:r>
-        <w:t xml:space="preserve"> (Next.js) debe cumplir con los estándares de </w:t>
-      </w:r>
-      <w:proofErr w:type="spellStart"/>
-      <w:r>
-        <w:t>Progressive</w:t>
-      </w:r>
-      <w:proofErr w:type="spellEnd"/>
-      <w:r>
-        <w:t xml:space="preserve"> Web App (Service Worker base, </w:t>
-      </w:r>
-      <w:proofErr w:type="spellStart"/>
-      <w:proofErr w:type="gramStart"/>
-      <w:r>
-        <w:t>manifest.json</w:t>
-      </w:r>
-      <w:proofErr w:type="spellEnd"/>
-      <w:proofErr w:type="gramEnd"/>
-      <w:r>
-        <w:t>) para permitir su instalación en iOS y Android.</w:t>
+        <w:t>La arquitectura backend (FastAPI) debe soportar 500 usuarios concurrentes y picos de hasta 1,200 usuarios/hora sin degradación de servicio. La base de datos debe soportar un catálogo de 15,000 productos activos.</w:t>
+      </w:r>
+    </w:p>
+    <w:p>
+      <w:pPr>
+        <w:pStyle w:val="ListParagraph"/>
+        <w:numPr>
+          <w:ilvl w:val="0"/>
+          <w:numId w:val="4"/>
+        </w:numPr>
+        <w:spacing w:before="240" w:line="360" w:lineRule="auto"/>
+        <w:rPr>
+          <w:b/>
+          <w:bCs/>
+        </w:rPr>
+      </w:pPr>
+      <w:r>
+        <w:rPr>
+          <w:b/>
+          <w:bCs/>
+        </w:rPr>
+        <w:t xml:space="preserve">RNF-03 (Instalabilidad PWA): </w:t>
+      </w:r>
+    </w:p>
+    <w:p>
+      <w:pPr>
+        <w:pStyle w:val="ListParagraph"/>
+        <w:spacing w:before="240" w:line="360" w:lineRule="auto"/>
+      </w:pPr>
+      <w:r>
+        <w:t>La interfaz frontend (Next.js) debe cumplir con los estándares de Progressive Web App (Service Worker base, manifest.json) para permitir su instalación en iOS y Android.</w:t>
       </w:r>
     </w:p>
     <w:p>
@@ -1887,161 +1686,97 @@
         <w:rPr>
           <w:highlight w:val="yellow"/>
         </w:rPr>
-        <w:t xml:space="preserve">Durante una prueba de carga simulando 500 usuarios concurrentes enviando mensajes simultáneamente, el sistema de </w:t>
-      </w:r>
-      <w:proofErr w:type="spellStart"/>
-      <w:r>
+        <w:t>Durante una prueba de carga simulando 500 usuarios concurrentes enviando mensajes simultáneamente, el sistema de WebSockets debe procesar y entregar el 95% de los mensajes (percentil p95) en un tiempo de viaje de ida y vuelta (round-trip time) inferior a 500 milisegundos.</w:t>
+      </w:r>
+    </w:p>
+    <w:p>
+      <w:pPr>
+        <w:pStyle w:val="ListParagraph"/>
+        <w:numPr>
+          <w:ilvl w:val="0"/>
+          <w:numId w:val="4"/>
+        </w:numPr>
+        <w:spacing w:before="240" w:line="360" w:lineRule="auto"/>
+        <w:rPr>
+          <w:b/>
+          <w:bCs/>
+        </w:rPr>
+      </w:pPr>
+      <w:r>
+        <w:rPr>
+          <w:b/>
+          <w:bCs/>
+        </w:rPr>
+        <w:t xml:space="preserve">RNF-05 (Seguridad y Privacidad): </w:t>
+      </w:r>
+    </w:p>
+    <w:p>
+      <w:pPr>
+        <w:pStyle w:val="ListParagraph"/>
+        <w:spacing w:before="240" w:line="360" w:lineRule="auto"/>
+      </w:pPr>
+      <w:r>
+        <w:t>Todo dato sensible en la base de datos (PostgreSQL) debe estar encriptado. El sistema no expondrá directamente el número de teléfono del usuario a menos que este lo habilite explícitamente en su privacidad.</w:t>
+      </w:r>
+    </w:p>
+    <w:p>
+      <w:pPr>
+        <w:pStyle w:val="ListParagraph"/>
+        <w:numPr>
+          <w:ilvl w:val="0"/>
+          <w:numId w:val="4"/>
+        </w:numPr>
+        <w:spacing w:before="240" w:line="360" w:lineRule="auto"/>
+      </w:pPr>
+      <w:r>
+        <w:rPr>
+          <w:b/>
+          <w:bCs/>
+        </w:rPr>
+        <w:t xml:space="preserve">RNF-06 (Tolerancia a fallos de red): </w:t>
+      </w:r>
+    </w:p>
+    <w:p>
+      <w:pPr>
+        <w:pStyle w:val="ListParagraph"/>
+        <w:spacing w:before="240" w:line="360" w:lineRule="auto"/>
+      </w:pPr>
+      <w:r>
+        <w:t>Si el usuario pierde la conexión a internet de la universidad, la app debe mostrar una advertencia de "Sin conexión" de forma controlada y no romper la interfaz gráfica de manera abrupta.</w:t>
+      </w:r>
+    </w:p>
+    <w:p>
+      <w:pPr>
+        <w:pStyle w:val="ListParagraph"/>
+        <w:numPr>
+          <w:ilvl w:val="0"/>
+          <w:numId w:val="4"/>
+        </w:numPr>
+        <w:spacing w:before="240" w:line="360" w:lineRule="auto"/>
         <w:rPr>
           <w:highlight w:val="yellow"/>
         </w:rPr>
-        <w:t>WebSockets</w:t>
-      </w:r>
-      <w:proofErr w:type="spellEnd"/>
-      <w:r>
-        <w:rPr>
+      </w:pPr>
+      <w:r>
+        <w:rPr>
+          <w:b/>
+          <w:bCs/>
           <w:highlight w:val="yellow"/>
         </w:rPr>
-        <w:t xml:space="preserve"> debe procesar y entregar el 95% de los mensajes (percentil p95) en un tiempo de viaje de ida y vuelta (</w:t>
-      </w:r>
-      <w:proofErr w:type="gramStart"/>
+        <w:t xml:space="preserve">RNF-07 (Escalabilidad de Fases): </w:t>
+      </w:r>
       <w:r>
         <w:rPr>
           <w:highlight w:val="yellow"/>
         </w:rPr>
-        <w:t>round</w:t>
-      </w:r>
-      <w:proofErr w:type="gramEnd"/>
+        <w:t xml:space="preserve">La arquitectura de la Fase Piloto debe operar íntegramente en servicios de capa gratuita (Free Tier). El código debe ser agnóstico a la infraestructura (Cloud-Native) para permitir la migración sin reescritura de </w:t>
+      </w:r>
       <w:r>
         <w:rPr>
           <w:highlight w:val="yellow"/>
         </w:rPr>
-        <w:t>-</w:t>
-      </w:r>
-      <w:proofErr w:type="spellStart"/>
-      <w:r>
-        <w:rPr>
-          <w:highlight w:val="yellow"/>
-        </w:rPr>
-        <w:t>trip</w:t>
-      </w:r>
-      <w:proofErr w:type="spellEnd"/>
-      <w:r>
-        <w:rPr>
-          <w:highlight w:val="yellow"/>
-        </w:rPr>
-        <w:t xml:space="preserve"> time) inferior a 500 milisegundos.</w:t>
-      </w:r>
-    </w:p>
-    <w:p>
-      <w:pPr>
-        <w:pStyle w:val="ListParagraph"/>
-        <w:numPr>
-          <w:ilvl w:val="0"/>
-          <w:numId w:val="4"/>
-        </w:numPr>
-        <w:spacing w:before="240" w:line="360" w:lineRule="auto"/>
-        <w:rPr>
-          <w:b/>
-          <w:bCs/>
-        </w:rPr>
-      </w:pPr>
-      <w:r>
-        <w:rPr>
-          <w:b/>
-          <w:bCs/>
-        </w:rPr>
-        <w:t xml:space="preserve">RNF-05 (Seguridad y Privacidad): </w:t>
-      </w:r>
-    </w:p>
-    <w:p>
-      <w:pPr>
-        <w:pStyle w:val="ListParagraph"/>
-        <w:spacing w:before="240" w:line="360" w:lineRule="auto"/>
-      </w:pPr>
-      <w:r>
-        <w:t>Todo dato sensible en la base de datos (PostgreSQL) debe estar encriptado. El sistema no expondrá directamente el número de teléfono del usuario a menos que este lo habilite explícitamente en su privacidad.</w:t>
-      </w:r>
-    </w:p>
-    <w:p>
-      <w:pPr>
-        <w:pStyle w:val="ListParagraph"/>
-        <w:numPr>
-          <w:ilvl w:val="0"/>
-          <w:numId w:val="4"/>
-        </w:numPr>
-        <w:spacing w:before="240" w:line="360" w:lineRule="auto"/>
-      </w:pPr>
-      <w:r>
-        <w:rPr>
-          <w:b/>
-          <w:bCs/>
-        </w:rPr>
-        <w:t xml:space="preserve">RNF-06 (Tolerancia a fallos de red): </w:t>
-      </w:r>
-    </w:p>
-    <w:p>
-      <w:pPr>
-        <w:pStyle w:val="ListParagraph"/>
-        <w:spacing w:before="240" w:line="360" w:lineRule="auto"/>
-      </w:pPr>
-      <w:r>
-        <w:t xml:space="preserve">Si el usuario pierde la conexión a internet de la universidad, la </w:t>
-      </w:r>
-      <w:proofErr w:type="gramStart"/>
-      <w:r>
-        <w:t>app</w:t>
-      </w:r>
-      <w:proofErr w:type="gramEnd"/>
-      <w:r>
-        <w:t xml:space="preserve"> debe mostrar una advertencia de "Sin conexión" de forma controlada y no romper la interfaz gráfica de manera abrupta.</w:t>
-      </w:r>
-    </w:p>
-    <w:p>
-      <w:pPr>
-        <w:pStyle w:val="ListParagraph"/>
-        <w:numPr>
-          <w:ilvl w:val="0"/>
-          <w:numId w:val="4"/>
-        </w:numPr>
-        <w:spacing w:before="240" w:line="360" w:lineRule="auto"/>
-        <w:rPr>
-          <w:highlight w:val="yellow"/>
-        </w:rPr>
-      </w:pPr>
-      <w:r>
-        <w:rPr>
-          <w:b/>
-          <w:bCs/>
-          <w:highlight w:val="yellow"/>
-        </w:rPr>
-        <w:t xml:space="preserve">RNF-07 (Escalabilidad de Fases): </w:t>
-      </w:r>
-      <w:r>
-        <w:rPr>
-          <w:highlight w:val="yellow"/>
-        </w:rPr>
-        <w:t xml:space="preserve">La arquitectura de la Fase Piloto debe operar íntegramente en servicios de capa gratuita (Free Tier). El código debe ser agnóstico a la infraestructura (Cloud-Native) para permitir la migración sin reescritura de </w:t>
-      </w:r>
-      <w:r>
-        <w:rPr>
-          <w:highlight w:val="yellow"/>
-        </w:rPr>
         <w:lastRenderedPageBreak/>
-        <w:t xml:space="preserve">código hacia servicios pagos (AWS RDS, </w:t>
-      </w:r>
-      <w:proofErr w:type="spellStart"/>
-      <w:r>
-        <w:rPr>
-          <w:highlight w:val="yellow"/>
-        </w:rPr>
-        <w:t>Vercel</w:t>
-      </w:r>
-      <w:proofErr w:type="spellEnd"/>
-      <w:r>
-        <w:rPr>
-          <w:highlight w:val="yellow"/>
-        </w:rPr>
-        <w:t xml:space="preserve"> Pro) una vez se confirme la escalabilidad futura.</w:t>
+        <w:t>código hacia servicios pagos (AWS RDS, Vercel Pro) una vez se confirme la escalabilidad futura.</w:t>
       </w:r>
     </w:p>
     <w:p>
@@ -2093,23 +1828,7 @@
           <w:b/>
           <w:bCs/>
         </w:rPr>
-        <w:t xml:space="preserve">HU 0.1: Inicialización del </w:t>
-      </w:r>
-      <w:proofErr w:type="spellStart"/>
-      <w:r>
-        <w:rPr>
-          <w:b/>
-          <w:bCs/>
-        </w:rPr>
-        <w:t>monorepo</w:t>
-      </w:r>
-      <w:proofErr w:type="spellEnd"/>
-      <w:r>
-        <w:rPr>
-          <w:b/>
-          <w:bCs/>
-        </w:rPr>
-        <w:t xml:space="preserve"> y configuración del pipeline CI/CD.</w:t>
+        <w:t>HU 0.1: Inicialización del monorepo y configuración del pipeline CI/CD.</w:t>
       </w:r>
     </w:p>
     <w:p>
@@ -2125,23 +1844,7 @@
         <w:t>Descripción:</w:t>
       </w:r>
       <w:r>
-        <w:t xml:space="preserve"> Como Desarrollador, quiero tener un </w:t>
-      </w:r>
-      <w:proofErr w:type="spellStart"/>
-      <w:r>
-        <w:t>monorepo</w:t>
-      </w:r>
-      <w:proofErr w:type="spellEnd"/>
-      <w:r>
-        <w:t xml:space="preserve"> configurado con Next.js y </w:t>
-      </w:r>
-      <w:proofErr w:type="spellStart"/>
-      <w:r>
-        <w:t>FastAPI</w:t>
-      </w:r>
-      <w:proofErr w:type="spellEnd"/>
-      <w:r>
-        <w:t>, integrado con un pipeline de CI/CD, para poder desplegar cambios automáticamente y sin errores en los entornos de nube gratuitos.</w:t>
+        <w:t xml:space="preserve"> Como Desarrollador, quiero tener un monorepo configurado con Next.js y FastAPI, integrado con un pipeline de CI/CD, para poder desplegar cambios automáticamente y sin errores en los entornos de nube gratuitos.</w:t>
       </w:r>
     </w:p>
     <w:p>
@@ -2167,23 +1870,7 @@
         <w:spacing w:before="240" w:line="360" w:lineRule="auto"/>
       </w:pPr>
       <w:r>
-        <w:t>Estructura de carpetas /</w:t>
-      </w:r>
-      <w:proofErr w:type="spellStart"/>
-      <w:r>
-        <w:t>frontend</w:t>
-      </w:r>
-      <w:proofErr w:type="spellEnd"/>
-      <w:r>
-        <w:t xml:space="preserve"> y /</w:t>
-      </w:r>
-      <w:proofErr w:type="spellStart"/>
-      <w:r>
-        <w:t>backend</w:t>
-      </w:r>
-      <w:proofErr w:type="spellEnd"/>
-      <w:r>
-        <w:t xml:space="preserve"> creada.</w:t>
+        <w:t>Estructura de carpetas /frontend y /backend creada.</w:t>
       </w:r>
     </w:p>
     <w:p>
@@ -2196,23 +1883,7 @@
         <w:spacing w:before="240" w:line="360" w:lineRule="auto"/>
       </w:pPr>
       <w:r>
-        <w:t xml:space="preserve">GitHub </w:t>
-      </w:r>
-      <w:proofErr w:type="spellStart"/>
-      <w:r>
-        <w:t>Actions</w:t>
-      </w:r>
-      <w:proofErr w:type="spellEnd"/>
-      <w:r>
-        <w:t xml:space="preserve"> configurado (</w:t>
-      </w:r>
-      <w:proofErr w:type="spellStart"/>
-      <w:r>
-        <w:t>deploy.yml</w:t>
-      </w:r>
-      <w:proofErr w:type="spellEnd"/>
-      <w:r>
-        <w:t>).</w:t>
+        <w:t>GitHub Actions configurado (deploy.yml).</w:t>
       </w:r>
     </w:p>
     <w:p>
@@ -2227,7 +1898,6 @@
       <w:r>
         <w:t xml:space="preserve">Un </w:t>
       </w:r>
-      <w:proofErr w:type="spellStart"/>
       <w:r>
         <w:rPr>
           <w:i/>
@@ -2235,19 +1905,9 @@
         </w:rPr>
         <w:t>push</w:t>
       </w:r>
-      <w:proofErr w:type="spellEnd"/>
-      <w:r>
-        <w:t xml:space="preserve"> a la rama </w:t>
-      </w:r>
-      <w:proofErr w:type="spellStart"/>
-      <w:r>
-        <w:t>main</w:t>
-      </w:r>
-      <w:proofErr w:type="spellEnd"/>
-      <w:r>
-        <w:t xml:space="preserve"> dispara automáticamente el </w:t>
-      </w:r>
-      <w:proofErr w:type="spellStart"/>
+      <w:r>
+        <w:t xml:space="preserve"> a la rama main dispara automáticamente el </w:t>
+      </w:r>
       <w:r>
         <w:rPr>
           <w:i/>
@@ -2255,33 +1915,8 @@
         </w:rPr>
         <w:t>linting</w:t>
       </w:r>
-      <w:proofErr w:type="spellEnd"/>
-      <w:r>
-        <w:t xml:space="preserve"> y el despliegue en </w:t>
-      </w:r>
-      <w:proofErr w:type="spellStart"/>
-      <w:r>
-        <w:t>Vercel</w:t>
-      </w:r>
-      <w:proofErr w:type="spellEnd"/>
-      <w:r>
-        <w:t xml:space="preserve"> (</w:t>
-      </w:r>
-      <w:proofErr w:type="spellStart"/>
-      <w:r>
-        <w:t>Frontend</w:t>
-      </w:r>
-      <w:proofErr w:type="spellEnd"/>
-      <w:r>
-        <w:t>) y Render.com (</w:t>
-      </w:r>
-      <w:proofErr w:type="spellStart"/>
-      <w:r>
-        <w:t>Backend</w:t>
-      </w:r>
-      <w:proofErr w:type="spellEnd"/>
-      <w:r>
-        <w:t>).</w:t>
+      <w:r>
+        <w:t xml:space="preserve"> y el despliegue en Vercel (Frontend) y Render.com (Backend).</w:t>
       </w:r>
     </w:p>
     <w:p>
@@ -2305,23 +1940,7 @@
           <w:b/>
           <w:bCs/>
         </w:rPr>
-        <w:t>HU 0.2: Modelado y despliegue del esquema de base de datos relacional con soporte espacial (</w:t>
-      </w:r>
-      <w:proofErr w:type="spellStart"/>
-      <w:r>
-        <w:rPr>
-          <w:b/>
-          <w:bCs/>
-        </w:rPr>
-        <w:t>PostGIS</w:t>
-      </w:r>
-      <w:proofErr w:type="spellEnd"/>
-      <w:r>
-        <w:rPr>
-          <w:b/>
-          <w:bCs/>
-        </w:rPr>
-        <w:t>).</w:t>
+        <w:t>HU 0.2: Modelado y despliegue del esquema de base de datos relacional con soporte espacial (PostGIS).</w:t>
       </w:r>
     </w:p>
     <w:p>
@@ -2337,15 +1956,7 @@
         <w:t>Descripción:</w:t>
       </w:r>
       <w:r>
-        <w:t xml:space="preserve"> Como Arquitecto de Datos, quiero desplegar el esquema en PostgreSQL habilitando </w:t>
-      </w:r>
-      <w:proofErr w:type="spellStart"/>
-      <w:r>
-        <w:t>PostGIS</w:t>
-      </w:r>
-      <w:proofErr w:type="spellEnd"/>
-      <w:r>
-        <w:t>, para almacenar usuarios, productos y coordenadas geográficas de forma segura.</w:t>
+        <w:t xml:space="preserve"> Como Arquitecto de Datos, quiero desplegar el esquema en PostgreSQL habilitando PostGIS, para almacenar usuarios, productos y coordenadas geográficas de forma segura.</w:t>
       </w:r>
     </w:p>
     <w:p>
@@ -2371,15 +1982,7 @@
         <w:spacing w:before="240" w:line="360" w:lineRule="auto"/>
       </w:pPr>
       <w:r>
-        <w:t>Instancia creada en capa gratuita (</w:t>
-      </w:r>
-      <w:proofErr w:type="spellStart"/>
-      <w:r>
-        <w:t>Supabase</w:t>
-      </w:r>
-      <w:proofErr w:type="spellEnd"/>
-      <w:r>
-        <w:t>/Neon).</w:t>
+        <w:t>Instancia creada en capa gratuita (Supabase/Neon).</w:t>
       </w:r>
     </w:p>
     <w:p>
@@ -2392,15 +1995,7 @@
         <w:spacing w:before="240" w:line="360" w:lineRule="auto"/>
       </w:pPr>
       <w:r>
-        <w:t xml:space="preserve">Extensión </w:t>
-      </w:r>
-      <w:proofErr w:type="spellStart"/>
-      <w:r>
-        <w:t>PostGIS</w:t>
-      </w:r>
-      <w:proofErr w:type="spellEnd"/>
-      <w:r>
-        <w:t xml:space="preserve"> activada.</w:t>
+        <w:t>Extensión PostGIS activada.</w:t>
       </w:r>
     </w:p>
     <w:p>
@@ -2472,15 +2067,7 @@
         <w:t>Descripción:</w:t>
       </w:r>
       <w:r>
-        <w:t xml:space="preserve"> Como DevOps, quiero configurar los dominios y el SSL, para garantizar que toda la transferencia de datos (especialmente la geolocalización de la PWA) </w:t>
-      </w:r>
-      <w:proofErr w:type="gramStart"/>
-      <w:r>
-        <w:t>viaje cifrada</w:t>
-      </w:r>
-      <w:proofErr w:type="gramEnd"/>
-      <w:r>
-        <w:t>.</w:t>
+        <w:t xml:space="preserve"> Como DevOps, quiero configurar los dominios y el SSL, para garantizar que toda la transferencia de datos (especialmente la geolocalización de la PWA) viaje cifrada.</w:t>
       </w:r>
     </w:p>
     <w:p>
@@ -2510,23 +2097,7 @@
         <w:spacing w:before="240" w:line="360" w:lineRule="auto"/>
       </w:pPr>
       <w:r>
-        <w:t xml:space="preserve">Dominio </w:t>
-      </w:r>
-      <w:proofErr w:type="spellStart"/>
-      <w:r>
-        <w:t>veramarket.app</w:t>
-      </w:r>
-      <w:proofErr w:type="spellEnd"/>
-      <w:r>
-        <w:t xml:space="preserve"> configurado en </w:t>
-      </w:r>
-      <w:proofErr w:type="spellStart"/>
-      <w:r>
-        <w:t>Cloudflare</w:t>
-      </w:r>
-      <w:proofErr w:type="spellEnd"/>
-      <w:r>
-        <w:t>.</w:t>
+        <w:t>Dominio veramarket.app configurado en Cloudflare.</w:t>
       </w:r>
     </w:p>
     <w:p>
@@ -2551,63 +2122,29 @@
         </w:numPr>
         <w:spacing w:before="240" w:line="360" w:lineRule="auto"/>
       </w:pPr>
-      <w:proofErr w:type="gramStart"/>
-      <w:r>
-        <w:t>Archivos .</w:t>
-      </w:r>
-      <w:proofErr w:type="spellStart"/>
-      <w:r>
-        <w:t>env</w:t>
-      </w:r>
-      <w:proofErr w:type="spellEnd"/>
-      <w:proofErr w:type="gramEnd"/>
-      <w:r>
-        <w:t xml:space="preserve"> segregados (Local, </w:t>
-      </w:r>
-      <w:proofErr w:type="spellStart"/>
-      <w:r>
-        <w:t>Staging</w:t>
-      </w:r>
-      <w:proofErr w:type="spellEnd"/>
-      <w:r>
-        <w:t>, Producción) sin subir secretos al repositorio.</w:t>
-      </w:r>
-    </w:p>
-    <w:p>
-      <w:pPr>
-        <w:pStyle w:val="ListParagraph"/>
-        <w:numPr>
-          <w:ilvl w:val="0"/>
-          <w:numId w:val="4"/>
-        </w:numPr>
-        <w:spacing w:before="240" w:line="360" w:lineRule="auto"/>
-        <w:rPr>
-          <w:b/>
-          <w:bCs/>
-        </w:rPr>
-      </w:pPr>
-      <w:r>
-        <w:rPr>
-          <w:b/>
-          <w:bCs/>
-        </w:rPr>
-        <w:t>EP-01: Autenticación Segura y Perfilamiento (</w:t>
-      </w:r>
-      <w:proofErr w:type="spellStart"/>
-      <w:r>
-        <w:rPr>
-          <w:b/>
-          <w:bCs/>
-        </w:rPr>
-        <w:t>Privacy</w:t>
-      </w:r>
-      <w:proofErr w:type="spellEnd"/>
-      <w:r>
-        <w:rPr>
-          <w:b/>
-          <w:bCs/>
-        </w:rPr>
-        <w:t>-First)</w:t>
+      <w:r>
+        <w:t>Archivos .env segregados (Local, Staging, Producción) sin subir secretos al repositorio.</w:t>
+      </w:r>
+    </w:p>
+    <w:p>
+      <w:pPr>
+        <w:pStyle w:val="ListParagraph"/>
+        <w:numPr>
+          <w:ilvl w:val="0"/>
+          <w:numId w:val="4"/>
+        </w:numPr>
+        <w:spacing w:before="240" w:line="360" w:lineRule="auto"/>
+        <w:rPr>
+          <w:b/>
+          <w:bCs/>
+        </w:rPr>
+      </w:pPr>
+      <w:r>
+        <w:rPr>
+          <w:b/>
+          <w:bCs/>
+        </w:rPr>
+        <w:t>EP-01: Autenticación Segura y Perfilamiento (Privacy-First)</w:t>
       </w:r>
     </w:p>
     <w:p>
@@ -2642,24 +2179,11 @@
       <w:r>
         <w:t xml:space="preserve"> Como Usuario, quiero ingresar con mi </w:t>
       </w:r>
-      <w:proofErr w:type="gramStart"/>
       <w:r>
         <w:t xml:space="preserve">correo </w:t>
       </w:r>
       <w:r>
-        <w:t xml:space="preserve"> y</w:t>
-      </w:r>
-      <w:proofErr w:type="gramEnd"/>
-      <w:r>
-        <w:t xml:space="preserve"> recibir un código temporal, para acceder a la </w:t>
-      </w:r>
-      <w:proofErr w:type="gramStart"/>
-      <w:r>
-        <w:t>app</w:t>
-      </w:r>
-      <w:proofErr w:type="gramEnd"/>
-      <w:r>
-        <w:t xml:space="preserve"> sin tener que memorizar otra contraseña.</w:t>
+        <w:t xml:space="preserve"> y recibir un código temporal, para acceder a la app sin tener que memorizar otra contraseña.</w:t>
       </w:r>
     </w:p>
     <w:p>
@@ -2687,13 +2211,8 @@
       <w:r>
         <w:t xml:space="preserve">El sistema solo acepta </w:t>
       </w:r>
-      <w:proofErr w:type="gramStart"/>
-      <w:r>
-        <w:t>correos concordante</w:t>
-      </w:r>
-      <w:proofErr w:type="gramEnd"/>
-      <w:r>
-        <w:t xml:space="preserve"> a los registros dados por sinapsis</w:t>
+      <w:r>
+        <w:t>correos concordante a los registros dados por sinapsis</w:t>
       </w:r>
     </w:p>
     <w:p>
@@ -2778,15 +2297,7 @@
         <w:spacing w:before="240" w:line="360" w:lineRule="auto"/>
       </w:pPr>
       <w:r>
-        <w:t xml:space="preserve">Se crea el registro en la tabla </w:t>
-      </w:r>
-      <w:proofErr w:type="spellStart"/>
-      <w:r>
-        <w:t>users</w:t>
-      </w:r>
-      <w:proofErr w:type="spellEnd"/>
-      <w:r>
-        <w:t xml:space="preserve"> al validar el primer OTP.</w:t>
+        <w:t>Se crea el registro en la tabla users al validar el primer OTP.</w:t>
       </w:r>
     </w:p>
     <w:p>
@@ -2859,39 +2370,7 @@
       </w:pPr>
       <w:r>
         <w:lastRenderedPageBreak/>
-        <w:t xml:space="preserve">El </w:t>
-      </w:r>
-      <w:proofErr w:type="spellStart"/>
-      <w:r>
-        <w:t>toggle</w:t>
-      </w:r>
-      <w:proofErr w:type="spellEnd"/>
-      <w:r>
-        <w:t xml:space="preserve"> por defecto está en Oculto (</w:t>
-      </w:r>
-      <w:proofErr w:type="spellStart"/>
-      <w:r>
-        <w:t>Privacy</w:t>
-      </w:r>
-      <w:proofErr w:type="spellEnd"/>
-      <w:r>
-        <w:t xml:space="preserve"> </w:t>
-      </w:r>
-      <w:proofErr w:type="spellStart"/>
-      <w:r>
-        <w:t>by</w:t>
-      </w:r>
-      <w:proofErr w:type="spellEnd"/>
-      <w:r>
-        <w:t xml:space="preserve"> </w:t>
-      </w:r>
-      <w:proofErr w:type="spellStart"/>
-      <w:r>
-        <w:t>Design</w:t>
-      </w:r>
-      <w:proofErr w:type="spellEnd"/>
-      <w:r>
-        <w:t>).</w:t>
+        <w:t>El toggle por defecto está en Oculto (Privacy by Design).</w:t>
       </w:r>
     </w:p>
     <w:p>
@@ -2904,15 +2383,7 @@
         <w:spacing w:before="240" w:line="360" w:lineRule="auto"/>
       </w:pPr>
       <w:r>
-        <w:t xml:space="preserve">Si está oculto, el </w:t>
-      </w:r>
-      <w:proofErr w:type="spellStart"/>
-      <w:r>
-        <w:t>backend</w:t>
-      </w:r>
-      <w:proofErr w:type="spellEnd"/>
-      <w:r>
-        <w:t xml:space="preserve"> enmascara o elimina el campo de contacto en la respuesta JSON pública.</w:t>
+        <w:t>Si está oculto, el backend enmascara o elimina el campo de contacto en la respuesta JSON pública.</w:t>
       </w:r>
     </w:p>
     <w:p>
@@ -2949,15 +2420,7 @@
         <w:t>Descripción:</w:t>
       </w:r>
       <w:r>
-        <w:t xml:space="preserve"> Como Comprador, quiero ingresar mi código de emprendedor de Sinapsis, para solicitar permisos de publicación en el </w:t>
-      </w:r>
-      <w:proofErr w:type="spellStart"/>
-      <w:r>
-        <w:t>marketplace</w:t>
-      </w:r>
-      <w:proofErr w:type="spellEnd"/>
-      <w:r>
-        <w:t>.</w:t>
+        <w:t xml:space="preserve"> Como Comprador, quiero ingresar mi código de emprendedor de Sinapsis, para solicitar permisos de publicación en el marketplace.</w:t>
       </w:r>
     </w:p>
     <w:p>
@@ -3017,23 +2480,7 @@
           <w:b/>
           <w:bCs/>
         </w:rPr>
-        <w:t>HU 1.5: Validación Sinapsis (</w:t>
-      </w:r>
-      <w:proofErr w:type="spellStart"/>
-      <w:r>
-        <w:rPr>
-          <w:b/>
-          <w:bCs/>
-        </w:rPr>
-        <w:t>Whitelist</w:t>
-      </w:r>
-      <w:proofErr w:type="spellEnd"/>
-      <w:r>
-        <w:rPr>
-          <w:b/>
-          <w:bCs/>
-        </w:rPr>
-        <w:t>).</w:t>
+        <w:t>HU 1.5: Validación Sinapsis (Whitelist).</w:t>
       </w:r>
     </w:p>
     <w:p>
@@ -3083,15 +2530,7 @@
         <w:spacing w:before="240" w:line="360" w:lineRule="auto"/>
       </w:pPr>
       <w:r>
-        <w:t>Lectura exitosa del CSV/</w:t>
-      </w:r>
-      <w:proofErr w:type="spellStart"/>
-      <w:r>
-        <w:t>Endpoint</w:t>
-      </w:r>
-      <w:proofErr w:type="spellEnd"/>
-      <w:r>
-        <w:t xml:space="preserve"> de validación.</w:t>
+        <w:t>Lectura exitosa del CSV/Endpoint de validación.</w:t>
       </w:r>
     </w:p>
     <w:p>
@@ -3185,23 +2624,7 @@
         <w:t>Descripción:</w:t>
       </w:r>
       <w:r>
-        <w:t xml:space="preserve"> Como Usuario móvil, quiero ver un botón para agregar </w:t>
-      </w:r>
-      <w:proofErr w:type="spellStart"/>
-      <w:r>
-        <w:t>VeraMarket</w:t>
-      </w:r>
-      <w:proofErr w:type="spellEnd"/>
-      <w:r>
-        <w:t xml:space="preserve"> a mi pantalla de inicio, para usarla como una </w:t>
-      </w:r>
-      <w:proofErr w:type="gramStart"/>
-      <w:r>
-        <w:t>app</w:t>
-      </w:r>
-      <w:proofErr w:type="gramEnd"/>
-      <w:r>
-        <w:t xml:space="preserve"> nativa sin consumir espacio de almacenamiento.</w:t>
+        <w:t xml:space="preserve"> Como Usuario móvil, quiero ver un botón para agregar VeraMarket a mi pantalla de inicio, para usarla como una app nativa sin consumir espacio de almacenamiento.</w:t>
       </w:r>
     </w:p>
     <w:p>
@@ -3230,15 +2653,8 @@
         </w:numPr>
         <w:spacing w:before="240" w:line="360" w:lineRule="auto"/>
       </w:pPr>
-      <w:proofErr w:type="spellStart"/>
-      <w:proofErr w:type="gramStart"/>
-      <w:r>
-        <w:t>manifest.json</w:t>
-      </w:r>
-      <w:proofErr w:type="spellEnd"/>
-      <w:proofErr w:type="gramEnd"/>
-      <w:r>
-        <w:t xml:space="preserve"> configurado correctamente (iconos, colores de tema).</w:t>
+      <w:r>
+        <w:t>manifest.json configurado correctamente (iconos, colores de tema).</w:t>
       </w:r>
     </w:p>
     <w:p>
@@ -3253,7 +2669,6 @@
       <w:r>
         <w:t xml:space="preserve">El navegador dispara el </w:t>
       </w:r>
-      <w:proofErr w:type="spellStart"/>
       <w:r>
         <w:rPr>
           <w:i/>
@@ -3261,7 +2676,6 @@
         </w:rPr>
         <w:t>prompt</w:t>
       </w:r>
-      <w:proofErr w:type="spellEnd"/>
       <w:r>
         <w:t xml:space="preserve"> nativo de "Añadir a pantalla de inicio".</w:t>
       </w:r>
@@ -3280,39 +2694,7 @@
           <w:b/>
           <w:bCs/>
         </w:rPr>
-        <w:t xml:space="preserve">HU 2.2: </w:t>
-      </w:r>
-      <w:proofErr w:type="spellStart"/>
-      <w:r>
-        <w:rPr>
-          <w:b/>
-          <w:bCs/>
-        </w:rPr>
-        <w:t>Skeleton</w:t>
-      </w:r>
-      <w:proofErr w:type="spellEnd"/>
-      <w:r>
-        <w:rPr>
-          <w:b/>
-          <w:bCs/>
-        </w:rPr>
-        <w:t xml:space="preserve"> </w:t>
-      </w:r>
-      <w:proofErr w:type="spellStart"/>
-      <w:r>
-        <w:rPr>
-          <w:b/>
-          <w:bCs/>
-        </w:rPr>
-        <w:t>loaders</w:t>
-      </w:r>
-      <w:proofErr w:type="spellEnd"/>
-      <w:r>
-        <w:rPr>
-          <w:b/>
-          <w:bCs/>
-        </w:rPr>
-        <w:t xml:space="preserve"> y manejo de errores sin red.</w:t>
+        <w:t>HU 2.2: Skeleton loaders y manejo de errores sin red.</w:t>
       </w:r>
     </w:p>
     <w:p>
@@ -3363,15 +2745,7 @@
         <w:spacing w:before="240" w:line="360" w:lineRule="auto"/>
       </w:pPr>
       <w:r>
-        <w:t>Los componentes de Next.js muestran animaciones "</w:t>
-      </w:r>
-      <w:proofErr w:type="spellStart"/>
-      <w:r>
-        <w:t>Skeleton</w:t>
-      </w:r>
-      <w:proofErr w:type="spellEnd"/>
-      <w:r>
-        <w:t>" mientras el Fetch de datos resuelve.</w:t>
+        <w:t>Los componentes de Next.js muestran animaciones "Skeleton" mientras el Fetch de datos resuelve.</w:t>
       </w:r>
     </w:p>
     <w:p>
@@ -3386,7 +2760,6 @@
       <w:r>
         <w:t xml:space="preserve">Si la API da </w:t>
       </w:r>
-      <w:proofErr w:type="spellStart"/>
       <w:r>
         <w:rPr>
           <w:i/>
@@ -3394,7 +2767,6 @@
         </w:rPr>
         <w:t>timeout</w:t>
       </w:r>
-      <w:proofErr w:type="spellEnd"/>
       <w:r>
         <w:t xml:space="preserve"> o no hay internet, se muestra un banner de "Sin conexión a internet" interceptado por el Service Worker.</w:t>
       </w:r>
@@ -3413,23 +2785,7 @@
           <w:b/>
           <w:bCs/>
         </w:rPr>
-        <w:t xml:space="preserve">HU 2.3: Configuración de notificaciones </w:t>
-      </w:r>
-      <w:proofErr w:type="spellStart"/>
-      <w:r>
-        <w:rPr>
-          <w:b/>
-          <w:bCs/>
-        </w:rPr>
-        <w:t>push</w:t>
-      </w:r>
-      <w:proofErr w:type="spellEnd"/>
-      <w:r>
-        <w:rPr>
-          <w:b/>
-          <w:bCs/>
-        </w:rPr>
-        <w:t xml:space="preserve"> web.</w:t>
+        <w:t>HU 2.3: Configuración de notificaciones push web.</w:t>
       </w:r>
     </w:p>
     <w:p>
@@ -3449,15 +2805,7 @@
         <w:t>Descripción:</w:t>
       </w:r>
       <w:r>
-        <w:t xml:space="preserve"> Como Vendedor, quiero recibir notificaciones </w:t>
-      </w:r>
-      <w:proofErr w:type="spellStart"/>
-      <w:r>
-        <w:t>push</w:t>
-      </w:r>
-      <w:proofErr w:type="spellEnd"/>
-      <w:r>
-        <w:t xml:space="preserve"> en mi celular cuando alguien me escriba, para no perder oportunidades de venta.</w:t>
+        <w:t xml:space="preserve"> Como Vendedor, quiero recibir notificaciones push en mi celular cuando alguien me escriba, para no perder oportunidades de venta.</w:t>
       </w:r>
     </w:p>
     <w:p>
@@ -3500,15 +2848,7 @@
         <w:spacing w:before="240" w:line="360" w:lineRule="auto"/>
       </w:pPr>
       <w:r>
-        <w:t xml:space="preserve">El Service Worker es capaz de recibir y renderizar una alerta </w:t>
-      </w:r>
-      <w:proofErr w:type="spellStart"/>
-      <w:r>
-        <w:t>push</w:t>
-      </w:r>
-      <w:proofErr w:type="spellEnd"/>
-      <w:r>
-        <w:t xml:space="preserve"> en el dispositivo.</w:t>
+        <w:t>El Service Worker es capaz de recibir y renderizar una alerta push en el dispositivo.</w:t>
       </w:r>
     </w:p>
     <w:p>
@@ -3632,23 +2972,7 @@
         <w:spacing w:before="240" w:line="360" w:lineRule="auto"/>
       </w:pPr>
       <w:r>
-        <w:t xml:space="preserve">La imagen se optimiza y sube a un </w:t>
-      </w:r>
-      <w:proofErr w:type="spellStart"/>
-      <w:r>
-        <w:t>bucket</w:t>
-      </w:r>
-      <w:proofErr w:type="spellEnd"/>
-      <w:r>
-        <w:t xml:space="preserve"> (ej. </w:t>
-      </w:r>
-      <w:proofErr w:type="spellStart"/>
-      <w:r>
-        <w:t>Supabase</w:t>
-      </w:r>
-      <w:proofErr w:type="spellEnd"/>
-      <w:r>
-        <w:t xml:space="preserve"> Storage) con límite de peso (ej. 2MB).</w:t>
+        <w:t>La imagen se optimiza y sube a un bucket (ej. Supabase Storage) con límite de peso (ej. 2MB).</w:t>
       </w:r>
     </w:p>
     <w:p>
@@ -3798,32 +3122,15 @@
       <w:r>
         <w:t xml:space="preserve">Se implementa un </w:t>
       </w:r>
-      <w:proofErr w:type="spellStart"/>
       <w:r>
         <w:rPr>
           <w:i/>
           <w:iCs/>
         </w:rPr>
-        <w:t>Soft</w:t>
-      </w:r>
-      <w:proofErr w:type="spellEnd"/>
-      <w:r>
-        <w:rPr>
-          <w:i/>
-          <w:iCs/>
-        </w:rPr>
-        <w:t>-Delete</w:t>
-      </w:r>
-      <w:r>
-        <w:t xml:space="preserve"> (ej. campo </w:t>
-      </w:r>
-      <w:proofErr w:type="spellStart"/>
-      <w:r>
-        <w:t>is_active</w:t>
-      </w:r>
-      <w:proofErr w:type="spellEnd"/>
-      <w:r>
-        <w:t xml:space="preserve"> = false en la BD) en lugar de un DELETE real.</w:t>
+        <w:t>Soft-Delete</w:t>
+      </w:r>
+      <w:r>
+        <w:t xml:space="preserve"> (ej. campo is_active = false en la BD) en lugar de un DELETE real.</w:t>
       </w:r>
     </w:p>
     <w:p>
@@ -3880,39 +3187,7 @@
           <w:b/>
           <w:bCs/>
         </w:rPr>
-        <w:t xml:space="preserve"> EP-04: Búsqueda Inteligente (MVP - Motor Open </w:t>
-      </w:r>
-      <w:proofErr w:type="spellStart"/>
-      <w:r>
-        <w:rPr>
-          <w:b/>
-          <w:bCs/>
-        </w:rPr>
-        <w:t>Source</w:t>
-      </w:r>
-      <w:proofErr w:type="spellEnd"/>
-      <w:r>
-        <w:rPr>
-          <w:b/>
-          <w:bCs/>
-        </w:rPr>
-        <w:t xml:space="preserve"> / </w:t>
-      </w:r>
-      <w:proofErr w:type="spellStart"/>
-      <w:r>
-        <w:rPr>
-          <w:b/>
-          <w:bCs/>
-        </w:rPr>
-        <w:t>Fallback</w:t>
-      </w:r>
-      <w:proofErr w:type="spellEnd"/>
-      <w:r>
-        <w:rPr>
-          <w:b/>
-          <w:bCs/>
-        </w:rPr>
-        <w:t>)</w:t>
+        <w:t xml:space="preserve"> EP-04: Búsqueda Inteligente (MVP - Motor Open Source / Fallback)</w:t>
       </w:r>
     </w:p>
     <w:p>
@@ -3989,15 +3264,7 @@
         <w:t>Full-Text Search</w:t>
       </w:r>
       <w:r>
-        <w:t xml:space="preserve"> usando </w:t>
-      </w:r>
-      <w:proofErr w:type="spellStart"/>
-      <w:r>
-        <w:t>tsvector</w:t>
-      </w:r>
-      <w:proofErr w:type="spellEnd"/>
-      <w:r>
-        <w:t xml:space="preserve"> en PostgreSQL.</w:t>
+        <w:t xml:space="preserve"> usando tsvector en PostgreSQL.</w:t>
       </w:r>
     </w:p>
     <w:p>
@@ -4047,23 +3314,7 @@
         <w:t>Descripción:</w:t>
       </w:r>
       <w:r>
-        <w:t xml:space="preserve"> Como Comprador, quiero buscar con lenguaje natural o modismos caleños (ej. "algo </w:t>
-      </w:r>
-      <w:proofErr w:type="spellStart"/>
-      <w:r>
-        <w:t>pa</w:t>
-      </w:r>
-      <w:proofErr w:type="spellEnd"/>
-      <w:r>
-        <w:t xml:space="preserve"> picar", "mecato"), para que la IA me sugiera productos </w:t>
-      </w:r>
-      <w:proofErr w:type="gramStart"/>
-      <w:r>
-        <w:t>relevantes</w:t>
-      </w:r>
-      <w:proofErr w:type="gramEnd"/>
-      <w:r>
-        <w:t xml:space="preserve"> aunque no tengan esa palabra exacta en el título.</w:t>
+        <w:t xml:space="preserve"> Como Comprador, quiero buscar con lenguaje natural o modismos caleños (ej. "algo pa picar", "mecato"), para que la IA me sugiera productos relevantes aunque no tengan esa palabra exacta en el título.</w:t>
       </w:r>
     </w:p>
     <w:p>
@@ -4093,15 +3344,7 @@
         <w:spacing w:before="240" w:line="360" w:lineRule="auto"/>
       </w:pPr>
       <w:r>
-        <w:t xml:space="preserve">Se envía la consulta a la API de </w:t>
-      </w:r>
-      <w:proofErr w:type="spellStart"/>
-      <w:r>
-        <w:t>OpenAI</w:t>
-      </w:r>
-      <w:proofErr w:type="spellEnd"/>
-      <w:r>
-        <w:t xml:space="preserve"> (GPT-4o-mini).</w:t>
+        <w:t>Se envía la consulta a la API de OpenAI (GPT-4o-mini).</w:t>
       </w:r>
     </w:p>
     <w:p>
@@ -4121,17 +3364,8 @@
         <w:t>Arquitectura:</w:t>
       </w:r>
       <w:r>
-        <w:t xml:space="preserve"> Si la API de </w:t>
-      </w:r>
-      <w:proofErr w:type="spellStart"/>
-      <w:r>
-        <w:t>OpenAI</w:t>
-      </w:r>
-      <w:proofErr w:type="spellEnd"/>
-      <w:r>
-        <w:t xml:space="preserve"> falla o hay límite de uso, el sistema hace un </w:t>
-      </w:r>
-      <w:proofErr w:type="spellStart"/>
+        <w:t xml:space="preserve"> Si la API de OpenAI falla o hay límite de uso, el sistema hace un </w:t>
+      </w:r>
       <w:r>
         <w:rPr>
           <w:i/>
@@ -4139,7 +3373,6 @@
         </w:rPr>
         <w:t>fallback</w:t>
       </w:r>
-      <w:proofErr w:type="spellEnd"/>
       <w:r>
         <w:t xml:space="preserve"> automático a la búsqueda tradicional de la HU 4.1.</w:t>
       </w:r>
@@ -4158,23 +3391,7 @@
           <w:b/>
           <w:bCs/>
         </w:rPr>
-        <w:t>HU 4.3: Visualización de recomendaciones ("</w:t>
-      </w:r>
-      <w:proofErr w:type="spellStart"/>
-      <w:r>
-        <w:rPr>
-          <w:b/>
-          <w:bCs/>
-        </w:rPr>
-        <w:t>VeraMatch</w:t>
-      </w:r>
-      <w:proofErr w:type="spellEnd"/>
-      <w:r>
-        <w:rPr>
-          <w:b/>
-          <w:bCs/>
-        </w:rPr>
-        <w:t>").</w:t>
+        <w:t>HU 4.3: Visualización de recomendaciones ("VeraMatch").</w:t>
       </w:r>
     </w:p>
     <w:p>
@@ -4286,23 +3503,7 @@
           <w:b/>
           <w:bCs/>
         </w:rPr>
-        <w:t>HU 5.1: Visualización del mapa interactivo (</w:t>
-      </w:r>
-      <w:proofErr w:type="spellStart"/>
-      <w:r>
-        <w:rPr>
-          <w:b/>
-          <w:bCs/>
-        </w:rPr>
-        <w:t>OpenStreetMap</w:t>
-      </w:r>
-      <w:proofErr w:type="spellEnd"/>
-      <w:r>
-        <w:rPr>
-          <w:b/>
-          <w:bCs/>
-        </w:rPr>
-        <w:t>).</w:t>
+        <w:t>HU 5.1: Visualización del mapa interactivo (OpenStreetMap).</w:t>
       </w:r>
     </w:p>
     <w:p>
@@ -4354,62 +3555,28 @@
       <w:r>
         <w:t xml:space="preserve">Librería tipo </w:t>
       </w:r>
-      <w:proofErr w:type="spellStart"/>
       <w:r>
         <w:rPr>
           <w:i/>
           <w:iCs/>
         </w:rPr>
-        <w:t>Leaflet</w:t>
-      </w:r>
-      <w:proofErr w:type="spellEnd"/>
-      <w:r>
-        <w:rPr>
-          <w:i/>
-          <w:iCs/>
-        </w:rPr>
-        <w:t>/</w:t>
-      </w:r>
-      <w:proofErr w:type="spellStart"/>
-      <w:r>
-        <w:rPr>
-          <w:i/>
-          <w:iCs/>
-        </w:rPr>
-        <w:t>Mapbox</w:t>
-      </w:r>
-      <w:proofErr w:type="spellEnd"/>
-      <w:r>
-        <w:t xml:space="preserve"> integrada con tiles de </w:t>
-      </w:r>
-      <w:proofErr w:type="spellStart"/>
-      <w:r>
-        <w:t>OpenStreetMap</w:t>
-      </w:r>
-      <w:proofErr w:type="spellEnd"/>
-      <w:r>
-        <w:t xml:space="preserve"> (costo $0).</w:t>
-      </w:r>
-    </w:p>
-    <w:p>
-      <w:pPr>
-        <w:pStyle w:val="ListParagraph"/>
-        <w:numPr>
-          <w:ilvl w:val="0"/>
-          <w:numId w:val="4"/>
-        </w:numPr>
-        <w:spacing w:before="240" w:line="360" w:lineRule="auto"/>
-      </w:pPr>
-      <w:r>
-        <w:t xml:space="preserve">Renderizado de pines leyendo coordenadas desde el </w:t>
-      </w:r>
-      <w:proofErr w:type="spellStart"/>
-      <w:r>
-        <w:t>backend</w:t>
-      </w:r>
-      <w:proofErr w:type="spellEnd"/>
-      <w:r>
-        <w:t>.</w:t>
+        <w:t>Leaflet/Mapbox</w:t>
+      </w:r>
+      <w:r>
+        <w:t xml:space="preserve"> integrada con tiles de OpenStreetMap (costo $0).</w:t>
+      </w:r>
+    </w:p>
+    <w:p>
+      <w:pPr>
+        <w:pStyle w:val="ListParagraph"/>
+        <w:numPr>
+          <w:ilvl w:val="0"/>
+          <w:numId w:val="4"/>
+        </w:numPr>
+        <w:spacing w:before="240" w:line="360" w:lineRule="auto"/>
+      </w:pPr>
+      <w:r>
+        <w:t>Renderizado de pines leyendo coordenadas desde el backend.</w:t>
       </w:r>
     </w:p>
     <w:p>
@@ -4476,15 +3643,7 @@
         <w:spacing w:before="240" w:line="360" w:lineRule="auto"/>
       </w:pPr>
       <w:r>
-        <w:t xml:space="preserve">Guardado de la latitud y longitud en formato GEOMETRY(Point) en </w:t>
-      </w:r>
-      <w:proofErr w:type="spellStart"/>
-      <w:r>
-        <w:t>PostGIS</w:t>
-      </w:r>
-      <w:proofErr w:type="spellEnd"/>
-      <w:r>
-        <w:t>.</w:t>
+        <w:t>Guardado de la latitud y longitud en formato GEOMETRY(Point) en PostGIS.</w:t>
       </w:r>
     </w:p>
     <w:p>
@@ -4551,23 +3710,7 @@
         <w:spacing w:before="240" w:line="360" w:lineRule="auto"/>
       </w:pPr>
       <w:r>
-        <w:t xml:space="preserve">Query espacial utilizando la función </w:t>
-      </w:r>
-      <w:proofErr w:type="spellStart"/>
-      <w:r>
-        <w:t>ST_DWithin</w:t>
-      </w:r>
-      <w:proofErr w:type="spellEnd"/>
-      <w:r>
-        <w:t xml:space="preserve"> de </w:t>
-      </w:r>
-      <w:proofErr w:type="spellStart"/>
-      <w:r>
-        <w:t>PostGIS</w:t>
-      </w:r>
-      <w:proofErr w:type="spellEnd"/>
-      <w:r>
-        <w:t xml:space="preserve"> para devolver resultados por radio en metros.</w:t>
+        <w:t>Query espacial utilizando la función ST_DWithin de PostGIS para devolver resultados por radio en metros.</w:t>
       </w:r>
     </w:p>
     <w:p>
@@ -4611,23 +3754,7 @@
           <w:b/>
           <w:bCs/>
         </w:rPr>
-        <w:t xml:space="preserve"> EP-06: Negociación y Cierre P2P (</w:t>
-      </w:r>
-      <w:proofErr w:type="spellStart"/>
-      <w:r>
-        <w:rPr>
-          <w:b/>
-          <w:bCs/>
-        </w:rPr>
-        <w:t>Frictionless</w:t>
-      </w:r>
-      <w:proofErr w:type="spellEnd"/>
-      <w:r>
-        <w:rPr>
-          <w:b/>
-          <w:bCs/>
-        </w:rPr>
-        <w:t>)</w:t>
+        <w:t xml:space="preserve"> EP-06: Negociación y Cierre P2P (Frictionless)</w:t>
       </w:r>
     </w:p>
     <w:p>
@@ -4664,15 +3791,7 @@
         <w:t>Descripción:</w:t>
       </w:r>
       <w:r>
-        <w:t xml:space="preserve"> Como Usuario, quiero chatear con el vendedor dentro de la </w:t>
-      </w:r>
-      <w:proofErr w:type="gramStart"/>
-      <w:r>
-        <w:t>app</w:t>
-      </w:r>
-      <w:proofErr w:type="gramEnd"/>
-      <w:r>
-        <w:t>, para negociar sin tener que darle mi número de WhatsApp.</w:t>
+        <w:t xml:space="preserve"> Como Usuario, quiero chatear con el vendedor dentro de la app, para negociar sin tener que darle mi número de WhatsApp.</w:t>
       </w:r>
     </w:p>
     <w:p>
@@ -4702,31 +3821,7 @@
         <w:spacing w:before="240" w:line="360" w:lineRule="auto"/>
       </w:pPr>
       <w:r>
-        <w:t xml:space="preserve">Implementación usando </w:t>
-      </w:r>
-      <w:proofErr w:type="spellStart"/>
-      <w:r>
-        <w:t>WebSockets</w:t>
-      </w:r>
-      <w:proofErr w:type="spellEnd"/>
-      <w:r>
-        <w:t xml:space="preserve"> (</w:t>
-      </w:r>
-      <w:proofErr w:type="spellStart"/>
-      <w:r>
-        <w:t>FastAPI</w:t>
-      </w:r>
-      <w:proofErr w:type="spellEnd"/>
-      <w:r>
-        <w:t xml:space="preserve"> </w:t>
-      </w:r>
-      <w:proofErr w:type="spellStart"/>
-      <w:r>
-        <w:t>websockets</w:t>
-      </w:r>
-      <w:proofErr w:type="spellEnd"/>
-      <w:r>
-        <w:t xml:space="preserve"> / Socket.io).</w:t>
+        <w:t>Implementación usando WebSockets (FastAPI websockets / Socket.io).</w:t>
       </w:r>
     </w:p>
     <w:p>
@@ -4756,55 +3851,7 @@
           <w:b/>
           <w:bCs/>
         </w:rPr>
-        <w:t xml:space="preserve">HU 6.2 y 6.3: Integración de Deep </w:t>
-      </w:r>
-      <w:proofErr w:type="gramStart"/>
-      <w:r>
-        <w:rPr>
-          <w:b/>
-          <w:bCs/>
-        </w:rPr>
-        <w:t>Link</w:t>
-      </w:r>
-      <w:proofErr w:type="gramEnd"/>
-      <w:r>
-        <w:rPr>
-          <w:b/>
-          <w:bCs/>
-        </w:rPr>
-        <w:t xml:space="preserve"> para </w:t>
-      </w:r>
-      <w:proofErr w:type="spellStart"/>
-      <w:r>
-        <w:rPr>
-          <w:b/>
-          <w:bCs/>
-        </w:rPr>
-        <w:t>Nequi</w:t>
-      </w:r>
-      <w:proofErr w:type="spellEnd"/>
-      <w:r>
-        <w:rPr>
-          <w:b/>
-          <w:bCs/>
-        </w:rPr>
-        <w:t xml:space="preserve"> / </w:t>
-      </w:r>
-      <w:proofErr w:type="spellStart"/>
-      <w:r>
-        <w:rPr>
-          <w:b/>
-          <w:bCs/>
-        </w:rPr>
-        <w:t>DaviPlata</w:t>
-      </w:r>
-      <w:proofErr w:type="spellEnd"/>
-      <w:r>
-        <w:rPr>
-          <w:b/>
-          <w:bCs/>
-        </w:rPr>
-        <w:t>.</w:t>
+        <w:t>HU 6.2 y 6.3: Integración de Deep Link para Nequi / DaviPlata.</w:t>
       </w:r>
     </w:p>
     <w:p>
@@ -4825,31 +3872,7 @@
         <w:t>Descripción:</w:t>
       </w:r>
       <w:r>
-        <w:t xml:space="preserve"> Como Comprador, quiero un botón que me abra directamente mi </w:t>
-      </w:r>
-      <w:proofErr w:type="gramStart"/>
-      <w:r>
-        <w:t>app</w:t>
-      </w:r>
-      <w:proofErr w:type="gramEnd"/>
-      <w:r>
-        <w:t xml:space="preserve"> de </w:t>
-      </w:r>
-      <w:proofErr w:type="spellStart"/>
-      <w:r>
-        <w:t>Nequi</w:t>
-      </w:r>
-      <w:proofErr w:type="spellEnd"/>
-      <w:r>
-        <w:t xml:space="preserve"> o </w:t>
-      </w:r>
-      <w:proofErr w:type="spellStart"/>
-      <w:r>
-        <w:t>DaviPlata</w:t>
-      </w:r>
-      <w:proofErr w:type="spellEnd"/>
-      <w:r>
-        <w:t xml:space="preserve"> con el número del vendedor, para pagar rápido sin digitar.</w:t>
+        <w:t xml:space="preserve"> Como Comprador, quiero un botón que me abra directamente mi app de Nequi o DaviPlata con el número del vendedor, para pagar rápido sin digitar.</w:t>
       </w:r>
     </w:p>
     <w:p>
@@ -4886,236 +3909,184 @@
         <w:t>Restricción de Arquitectura:</w:t>
       </w:r>
       <w:r>
-        <w:t xml:space="preserve"> NO hay integración con </w:t>
-      </w:r>
-      <w:proofErr w:type="spellStart"/>
-      <w:r>
-        <w:t>APIs</w:t>
-      </w:r>
-      <w:proofErr w:type="spellEnd"/>
-      <w:r>
-        <w:t xml:space="preserve"> bancarias (está fuera del alcance del MVP). Solo se genera un </w:t>
+        <w:t xml:space="preserve"> NO hay integración con APIs bancarias (está fuera del alcance del MVP). Solo se genera un </w:t>
       </w:r>
       <w:r>
         <w:rPr>
           <w:i/>
           <w:iCs/>
         </w:rPr>
-        <w:t xml:space="preserve">Deep </w:t>
-      </w:r>
-      <w:proofErr w:type="gramStart"/>
+        <w:t>Deep Link</w:t>
+      </w:r>
+      <w:r>
+        <w:t xml:space="preserve"> o </w:t>
+      </w:r>
       <w:r>
         <w:rPr>
           <w:i/>
           <w:iCs/>
         </w:rPr>
-        <w:t>Link</w:t>
-      </w:r>
-      <w:proofErr w:type="gramEnd"/>
-      <w:r>
-        <w:t xml:space="preserve"> o </w:t>
+        <w:t>URI Scheme</w:t>
+      </w:r>
+      <w:r>
+        <w:t xml:space="preserve"> (ej. nequi://... o enlace web) que intenta abrir la app en el teléfono del usuario destino si el vendedor habilitó su número.</w:t>
+      </w:r>
+    </w:p>
+    <w:p>
+      <w:pPr>
+        <w:pStyle w:val="ListParagraph"/>
+        <w:numPr>
+          <w:ilvl w:val="0"/>
+          <w:numId w:val="4"/>
+        </w:numPr>
+        <w:spacing w:before="240" w:line="360" w:lineRule="auto"/>
+      </w:pPr>
+      <w:r>
+        <w:rPr>
+          <w:b/>
+          <w:bCs/>
+        </w:rPr>
+        <w:t>HU 6.4: Marcado manual de "Transacción Completada".</w:t>
+      </w:r>
+    </w:p>
+    <w:p>
+      <w:pPr>
+        <w:pStyle w:val="ListParagraph"/>
+        <w:numPr>
+          <w:ilvl w:val="0"/>
+          <w:numId w:val="4"/>
+        </w:numPr>
+        <w:spacing w:before="240" w:line="360" w:lineRule="auto"/>
+      </w:pPr>
+      <w:r>
+        <w:rPr>
+          <w:b/>
+          <w:bCs/>
+        </w:rPr>
+        <w:t>Descripción:</w:t>
+      </w:r>
+      <w:r>
+        <w:t xml:space="preserve"> Como Vendedor y Comprador, quiero un botón en el chat para confirmar que el producto fue entregado.</w:t>
+      </w:r>
+    </w:p>
+    <w:p>
+      <w:pPr>
+        <w:pStyle w:val="ListParagraph"/>
+        <w:numPr>
+          <w:ilvl w:val="0"/>
+          <w:numId w:val="4"/>
+        </w:numPr>
+        <w:spacing w:before="240" w:line="360" w:lineRule="auto"/>
+      </w:pPr>
+      <w:r>
+        <w:rPr>
+          <w:b/>
+          <w:bCs/>
+        </w:rPr>
+        <w:t>Criterios de Aceptación:</w:t>
+      </w:r>
+    </w:p>
+    <w:p>
+      <w:pPr>
+        <w:pStyle w:val="ListParagraph"/>
+        <w:numPr>
+          <w:ilvl w:val="0"/>
+          <w:numId w:val="4"/>
+        </w:numPr>
+        <w:spacing w:before="240" w:line="360" w:lineRule="auto"/>
+      </w:pPr>
+      <w:r>
+        <w:t>Ambos usuarios deben confirmar.</w:t>
+      </w:r>
+    </w:p>
+    <w:p>
+      <w:pPr>
+        <w:pStyle w:val="ListParagraph"/>
+        <w:numPr>
+          <w:ilvl w:val="0"/>
+          <w:numId w:val="4"/>
+        </w:numPr>
+        <w:spacing w:before="240" w:line="360" w:lineRule="auto"/>
+      </w:pPr>
+      <w:r>
+        <w:t>El chat se cierra o cambia de estado visual a "Completado".</w:t>
+      </w:r>
+    </w:p>
+    <w:p>
+      <w:pPr>
+        <w:pStyle w:val="ListParagraph"/>
+        <w:numPr>
+          <w:ilvl w:val="0"/>
+          <w:numId w:val="4"/>
+        </w:numPr>
+        <w:spacing w:before="240" w:line="360" w:lineRule="auto"/>
+      </w:pPr>
+      <w:r>
+        <w:rPr>
+          <w:b/>
+          <w:bCs/>
+        </w:rPr>
+        <w:t>HU 6.5: Registro automático del valor (GMV).</w:t>
+      </w:r>
+    </w:p>
+    <w:p>
+      <w:pPr>
+        <w:pStyle w:val="ListParagraph"/>
+        <w:numPr>
+          <w:ilvl w:val="0"/>
+          <w:numId w:val="4"/>
+        </w:numPr>
+        <w:spacing w:before="240" w:line="360" w:lineRule="auto"/>
+      </w:pPr>
+      <w:r>
+        <w:rPr>
+          <w:b/>
+          <w:bCs/>
+        </w:rPr>
+        <w:t>Descripción:</w:t>
+      </w:r>
+      <w:r>
+        <w:t xml:space="preserve"> Como Analista de Negocio, quiero que al confirmarse la transacción (HU 6.4), el sistema guarde el valor de la venta, para poder calcular métricas financieras (GMV) sin cobrar comisiones.</w:t>
+      </w:r>
+    </w:p>
+    <w:p>
+      <w:pPr>
+        <w:pStyle w:val="ListParagraph"/>
+        <w:numPr>
+          <w:ilvl w:val="0"/>
+          <w:numId w:val="4"/>
+        </w:numPr>
+        <w:spacing w:before="240" w:line="360" w:lineRule="auto"/>
+      </w:pPr>
+      <w:r>
+        <w:rPr>
+          <w:b/>
+          <w:bCs/>
+        </w:rPr>
+        <w:t>Criterios de Aceptación:</w:t>
+      </w:r>
+    </w:p>
+    <w:p>
+      <w:pPr>
+        <w:pStyle w:val="ListParagraph"/>
+        <w:numPr>
+          <w:ilvl w:val="0"/>
+          <w:numId w:val="4"/>
+        </w:numPr>
+        <w:spacing w:before="240" w:line="360" w:lineRule="auto"/>
+      </w:pPr>
+      <w:r>
+        <w:t xml:space="preserve">Un </w:t>
       </w:r>
       <w:r>
         <w:rPr>
           <w:i/>
           <w:iCs/>
         </w:rPr>
-        <w:t xml:space="preserve">URI </w:t>
-      </w:r>
-      <w:proofErr w:type="spellStart"/>
-      <w:r>
-        <w:rPr>
-          <w:i/>
-          <w:iCs/>
-        </w:rPr>
-        <w:t>Scheme</w:t>
-      </w:r>
-      <w:proofErr w:type="spellEnd"/>
-      <w:r>
-        <w:t xml:space="preserve"> (ej. </w:t>
-      </w:r>
-      <w:proofErr w:type="spellStart"/>
-      <w:r>
-        <w:t>nequi</w:t>
-      </w:r>
-      <w:proofErr w:type="spellEnd"/>
-      <w:r>
-        <w:t xml:space="preserve">://... o enlace web) que intenta abrir la </w:t>
-      </w:r>
-      <w:proofErr w:type="gramStart"/>
-      <w:r>
-        <w:t>app</w:t>
-      </w:r>
-      <w:proofErr w:type="gramEnd"/>
-      <w:r>
-        <w:t xml:space="preserve"> en el teléfono del usuario destino si el vendedor habilitó su número.</w:t>
-      </w:r>
-    </w:p>
-    <w:p>
-      <w:pPr>
-        <w:pStyle w:val="ListParagraph"/>
-        <w:numPr>
-          <w:ilvl w:val="0"/>
-          <w:numId w:val="4"/>
-        </w:numPr>
-        <w:spacing w:before="240" w:line="360" w:lineRule="auto"/>
-      </w:pPr>
-      <w:r>
-        <w:rPr>
-          <w:b/>
-          <w:bCs/>
-        </w:rPr>
-        <w:t>HU 6.4: Marcado manual de "Transacción Completada".</w:t>
-      </w:r>
-    </w:p>
-    <w:p>
-      <w:pPr>
-        <w:pStyle w:val="ListParagraph"/>
-        <w:numPr>
-          <w:ilvl w:val="0"/>
-          <w:numId w:val="4"/>
-        </w:numPr>
-        <w:spacing w:before="240" w:line="360" w:lineRule="auto"/>
-      </w:pPr>
-      <w:r>
-        <w:rPr>
-          <w:b/>
-          <w:bCs/>
-        </w:rPr>
-        <w:t>Descripción:</w:t>
-      </w:r>
-      <w:r>
-        <w:t xml:space="preserve"> Como Vendedor y Comprador, quiero un botón en el chat para confirmar que el producto fue entregado.</w:t>
-      </w:r>
-    </w:p>
-    <w:p>
-      <w:pPr>
-        <w:pStyle w:val="ListParagraph"/>
-        <w:numPr>
-          <w:ilvl w:val="0"/>
-          <w:numId w:val="4"/>
-        </w:numPr>
-        <w:spacing w:before="240" w:line="360" w:lineRule="auto"/>
-      </w:pPr>
-      <w:r>
-        <w:rPr>
-          <w:b/>
-          <w:bCs/>
-        </w:rPr>
-        <w:t>Criterios de Aceptación:</w:t>
-      </w:r>
-    </w:p>
-    <w:p>
-      <w:pPr>
-        <w:pStyle w:val="ListParagraph"/>
-        <w:numPr>
-          <w:ilvl w:val="0"/>
-          <w:numId w:val="4"/>
-        </w:numPr>
-        <w:spacing w:before="240" w:line="360" w:lineRule="auto"/>
-      </w:pPr>
-      <w:r>
-        <w:t>Ambos usuarios deben confirmar.</w:t>
-      </w:r>
-    </w:p>
-    <w:p>
-      <w:pPr>
-        <w:pStyle w:val="ListParagraph"/>
-        <w:numPr>
-          <w:ilvl w:val="0"/>
-          <w:numId w:val="4"/>
-        </w:numPr>
-        <w:spacing w:before="240" w:line="360" w:lineRule="auto"/>
-      </w:pPr>
-      <w:r>
-        <w:t>El chat se cierra o cambia de estado visual a "Completado".</w:t>
-      </w:r>
-    </w:p>
-    <w:p>
-      <w:pPr>
-        <w:pStyle w:val="ListParagraph"/>
-        <w:numPr>
-          <w:ilvl w:val="0"/>
-          <w:numId w:val="4"/>
-        </w:numPr>
-        <w:spacing w:before="240" w:line="360" w:lineRule="auto"/>
-      </w:pPr>
-      <w:r>
-        <w:rPr>
-          <w:b/>
-          <w:bCs/>
-        </w:rPr>
-        <w:t>HU 6.5: Registro automático del valor (GMV).</w:t>
-      </w:r>
-    </w:p>
-    <w:p>
-      <w:pPr>
-        <w:pStyle w:val="ListParagraph"/>
-        <w:numPr>
-          <w:ilvl w:val="0"/>
-          <w:numId w:val="4"/>
-        </w:numPr>
-        <w:spacing w:before="240" w:line="360" w:lineRule="auto"/>
-      </w:pPr>
-      <w:r>
-        <w:rPr>
-          <w:b/>
-          <w:bCs/>
-        </w:rPr>
-        <w:t>Descripción:</w:t>
-      </w:r>
-      <w:r>
-        <w:t xml:space="preserve"> Como Analista de Negocio, quiero que al confirmarse la transacción (HU 6.4), el sistema guarde el valor de la venta, para poder calcular métricas financieras (GMV) sin cobrar comisiones.</w:t>
-      </w:r>
-    </w:p>
-    <w:p>
-      <w:pPr>
-        <w:pStyle w:val="ListParagraph"/>
-        <w:numPr>
-          <w:ilvl w:val="0"/>
-          <w:numId w:val="4"/>
-        </w:numPr>
-        <w:spacing w:before="240" w:line="360" w:lineRule="auto"/>
-      </w:pPr>
-      <w:r>
-        <w:rPr>
-          <w:b/>
-          <w:bCs/>
-        </w:rPr>
-        <w:t>Criterios de Aceptación:</w:t>
-      </w:r>
-    </w:p>
-    <w:p>
-      <w:pPr>
-        <w:pStyle w:val="ListParagraph"/>
-        <w:numPr>
-          <w:ilvl w:val="0"/>
-          <w:numId w:val="4"/>
-        </w:numPr>
-        <w:spacing w:before="240" w:line="360" w:lineRule="auto"/>
-      </w:pPr>
-      <w:r>
-        <w:t xml:space="preserve">Un </w:t>
-      </w:r>
-      <w:proofErr w:type="spellStart"/>
-      <w:r>
-        <w:rPr>
-          <w:i/>
-          <w:iCs/>
-        </w:rPr>
         <w:t>trigger</w:t>
       </w:r>
-      <w:proofErr w:type="spellEnd"/>
-      <w:r>
-        <w:t xml:space="preserve"> o función </w:t>
-      </w:r>
-      <w:proofErr w:type="spellStart"/>
-      <w:r>
-        <w:t>backend</w:t>
-      </w:r>
-      <w:proofErr w:type="spellEnd"/>
-      <w:r>
-        <w:t xml:space="preserve"> inserta el valor transaccional en COP en una tabla de métricas en el momento en que el estado cambia a "Completado".</w:t>
+      <w:r>
+        <w:t xml:space="preserve"> o función backend inserta el valor transaccional en COP en una tabla de métricas en el momento en que el estado cambia a "Completado".</w:t>
       </w:r>
     </w:p>
     <w:p>
@@ -5374,15 +4345,7 @@
         <w:spacing w:before="240" w:line="360" w:lineRule="auto"/>
       </w:pPr>
       <w:r>
-        <w:t xml:space="preserve">Si un producto recibe X número de reportes (ej. 3), el sistema lo oculta automáticamente (cambia </w:t>
-      </w:r>
-      <w:proofErr w:type="spellStart"/>
-      <w:r>
-        <w:t>is_active</w:t>
-      </w:r>
-      <w:proofErr w:type="spellEnd"/>
-      <w:r>
-        <w:t>=false) hasta que un administrador lo revise.</w:t>
+        <w:t>Si un producto recibe X número de reportes (ej. 3), el sistema lo oculta automáticamente (cambia is_active=false) hasta que un administrador lo revise.</w:t>
       </w:r>
     </w:p>
     <w:p>

</xml_diff>

<commit_message>
feat(sinapsis): add CSV path configuration and update requirements docs
</commit_message>
<xml_diff>
--- a/docs/Docx/P. Requerimientos (F + NF) y Épicas.docx
+++ b/docs/Docx/P. Requerimientos (F + NF) y Épicas.docx
@@ -29,22 +29,17 @@
         </w:numPr>
         <w:spacing w:before="240" w:line="360" w:lineRule="auto"/>
         <w:rPr>
-          <w:rFonts w:asciiTheme="minorHAnsi" w:hAnsiTheme="minorHAnsi" w:cs="Calibri"/>
-          <w:b/>
-          <w:bCs/>
-          <w:color w:val="000000" w:themeColor="text1"/>
-          <w:sz w:val="24"/>
-          <w:szCs w:val="24"/>
-        </w:rPr>
-      </w:pPr>
-      <w:r>
-        <w:rPr>
           <w:rFonts w:asciiTheme="minorHAnsi" w:hAnsiTheme="minorHAnsi"/>
           <w:sz w:val="24"/>
           <w:szCs w:val="24"/>
         </w:rPr>
-        <w:t>Eduard Criollo Yule (Cod: 2220335)</w:t>
-      </w:r>
+        <w:sectPr>
+          <w:pgSz w:w="12240" w:h="15840"/>
+          <w:pgMar w:top="1440" w:right="1440" w:bottom="1440" w:left="1440" w:header="708" w:footer="708" w:gutter="0"/>
+          <w:cols w:space="708"/>
+          <w:docGrid w:linePitch="360"/>
+        </w:sectPr>
+      </w:pPr>
     </w:p>
     <w:p>
       <w:pPr>
@@ -59,17 +54,17 @@
           <w:b/>
           <w:bCs/>
           <w:color w:val="000000" w:themeColor="text1"/>
-          <w:sz w:val="24"/>
-          <w:szCs w:val="24"/>
+          <w:sz w:val="20"/>
+          <w:szCs w:val="20"/>
         </w:rPr>
       </w:pPr>
       <w:r>
         <w:rPr>
           <w:rFonts w:asciiTheme="minorHAnsi" w:hAnsiTheme="minorHAnsi"/>
-          <w:sz w:val="24"/>
-          <w:szCs w:val="24"/>
-        </w:rPr>
-        <w:t>Juan Sebastián Delgado (Cod: 2216223)</w:t>
+          <w:sz w:val="20"/>
+          <w:szCs w:val="20"/>
+        </w:rPr>
+        <w:t>Eduard Criollo Yule (Cod: 2220335)</w:t>
       </w:r>
     </w:p>
     <w:p>
@@ -85,17 +80,17 @@
           <w:b/>
           <w:bCs/>
           <w:color w:val="000000" w:themeColor="text1"/>
-          <w:sz w:val="24"/>
-          <w:szCs w:val="24"/>
+          <w:sz w:val="20"/>
+          <w:szCs w:val="20"/>
         </w:rPr>
       </w:pPr>
       <w:r>
         <w:rPr>
           <w:rFonts w:asciiTheme="minorHAnsi" w:hAnsiTheme="minorHAnsi"/>
-          <w:sz w:val="24"/>
-          <w:szCs w:val="24"/>
-        </w:rPr>
-        <w:t>Felipe Charria Caicedo (Cod: 2216033)</w:t>
+          <w:sz w:val="20"/>
+          <w:szCs w:val="20"/>
+        </w:rPr>
+        <w:t>Juan Sebastián Delgado (Cod: 2216223)</w:t>
       </w:r>
     </w:p>
     <w:p>
@@ -111,18 +106,61 @@
           <w:b/>
           <w:bCs/>
           <w:color w:val="000000" w:themeColor="text1"/>
-          <w:sz w:val="24"/>
-          <w:szCs w:val="24"/>
+          <w:sz w:val="20"/>
+          <w:szCs w:val="20"/>
         </w:rPr>
       </w:pPr>
       <w:r>
         <w:rPr>
           <w:rFonts w:asciiTheme="minorHAnsi" w:hAnsiTheme="minorHAnsi"/>
-          <w:sz w:val="24"/>
-          <w:szCs w:val="24"/>
+          <w:sz w:val="20"/>
+          <w:szCs w:val="20"/>
+        </w:rPr>
+        <w:t>Felipe Charria Caicedo (Cod: 2216033)</w:t>
+      </w:r>
+    </w:p>
+    <w:p>
+      <w:pPr>
+        <w:pStyle w:val="Title"/>
+        <w:numPr>
+          <w:ilvl w:val="0"/>
+          <w:numId w:val="8"/>
+        </w:numPr>
+        <w:spacing w:before="240" w:line="360" w:lineRule="auto"/>
+        <w:rPr>
+          <w:rFonts w:asciiTheme="minorHAnsi" w:hAnsiTheme="minorHAnsi" w:cs="Calibri"/>
+          <w:b/>
+          <w:bCs/>
+          <w:color w:val="000000" w:themeColor="text1"/>
+          <w:sz w:val="20"/>
+          <w:szCs w:val="20"/>
+        </w:rPr>
+      </w:pPr>
+      <w:r>
+        <w:rPr>
+          <w:rFonts w:asciiTheme="minorHAnsi" w:hAnsiTheme="minorHAnsi"/>
+          <w:sz w:val="20"/>
+          <w:szCs w:val="20"/>
         </w:rPr>
         <w:t>Valentina Velastegui López (Cod: 2226725)</w:t>
       </w:r>
+    </w:p>
+    <w:p>
+      <w:pPr>
+        <w:spacing w:before="240" w:line="360" w:lineRule="auto"/>
+        <w:rPr>
+          <w:rFonts w:asciiTheme="majorHAnsi" w:hAnsiTheme="majorHAnsi"/>
+          <w:b/>
+          <w:bCs/>
+        </w:rPr>
+        <w:sectPr>
+          <w:type w:val="continuous"/>
+          <w:pgSz w:w="12240" w:h="15840"/>
+          <w:pgMar w:top="1440" w:right="1440" w:bottom="1440" w:left="1440" w:header="708" w:footer="708" w:gutter="0"/>
+          <w:cols w:num="2" w:space="708"/>
+          <w:docGrid w:linePitch="360"/>
+        </w:sectPr>
+      </w:pPr>
     </w:p>
     <w:p>
       <w:pPr>
@@ -195,7 +233,23 @@
           <w:b/>
           <w:bCs/>
         </w:rPr>
-        <w:t>HU 0.1: Inicialización del monorepo y configuración del pipeline CI/CD.</w:t>
+        <w:t xml:space="preserve">HU 0.1: Inicialización del </w:t>
+      </w:r>
+      <w:proofErr w:type="spellStart"/>
+      <w:r>
+        <w:rPr>
+          <w:b/>
+          <w:bCs/>
+        </w:rPr>
+        <w:t>monorepo</w:t>
+      </w:r>
+      <w:proofErr w:type="spellEnd"/>
+      <w:r>
+        <w:rPr>
+          <w:b/>
+          <w:bCs/>
+        </w:rPr>
+        <w:t xml:space="preserve"> y configuración del pipeline CI/CD.</w:t>
       </w:r>
     </w:p>
     <w:p>
@@ -211,7 +265,23 @@
         <w:t>Descripción:</w:t>
       </w:r>
       <w:r>
-        <w:t xml:space="preserve"> Como Desarrollador, quiero tener un monorepo configurado con Next.js y FastAPI, integrado con un pipeline de CI/CD, para poder desplegar cambios automáticamente y sin errores en los entornos de nube gratuitos.</w:t>
+        <w:t xml:space="preserve"> Como Desarrollador, quiero tener un </w:t>
+      </w:r>
+      <w:proofErr w:type="spellStart"/>
+      <w:r>
+        <w:t>monorepo</w:t>
+      </w:r>
+      <w:proofErr w:type="spellEnd"/>
+      <w:r>
+        <w:t xml:space="preserve"> configurado con Next.js y </w:t>
+      </w:r>
+      <w:proofErr w:type="spellStart"/>
+      <w:r>
+        <w:t>FastAPI</w:t>
+      </w:r>
+      <w:proofErr w:type="spellEnd"/>
+      <w:r>
+        <w:t>, integrado con un pipeline de CI/CD, para poder desplegar cambios automáticamente y sin errores en los entornos de nube gratuitos.</w:t>
       </w:r>
     </w:p>
     <w:p>
@@ -237,7 +307,23 @@
         <w:spacing w:before="240" w:line="360" w:lineRule="auto"/>
       </w:pPr>
       <w:r>
-        <w:t>Estructura de carpetas /frontend y /backend creada.</w:t>
+        <w:t>Estructura de carpetas /</w:t>
+      </w:r>
+      <w:proofErr w:type="spellStart"/>
+      <w:r>
+        <w:t>frontend</w:t>
+      </w:r>
+      <w:proofErr w:type="spellEnd"/>
+      <w:r>
+        <w:t xml:space="preserve"> y /</w:t>
+      </w:r>
+      <w:proofErr w:type="spellStart"/>
+      <w:r>
+        <w:t>backend</w:t>
+      </w:r>
+      <w:proofErr w:type="spellEnd"/>
+      <w:r>
+        <w:t xml:space="preserve"> creada.</w:t>
       </w:r>
     </w:p>
     <w:p>
@@ -250,7 +336,23 @@
         <w:spacing w:before="240" w:line="360" w:lineRule="auto"/>
       </w:pPr>
       <w:r>
-        <w:t>GitHub Actions configurado (deploy.yml).</w:t>
+        <w:t xml:space="preserve">GitHub </w:t>
+      </w:r>
+      <w:proofErr w:type="spellStart"/>
+      <w:r>
+        <w:t>Actions</w:t>
+      </w:r>
+      <w:proofErr w:type="spellEnd"/>
+      <w:r>
+        <w:t xml:space="preserve"> configurado (</w:t>
+      </w:r>
+      <w:proofErr w:type="spellStart"/>
+      <w:r>
+        <w:t>deploy.yml</w:t>
+      </w:r>
+      <w:proofErr w:type="spellEnd"/>
+      <w:r>
+        <w:t>).</w:t>
       </w:r>
     </w:p>
     <w:p>
@@ -265,6 +367,7 @@
       <w:r>
         <w:t xml:space="preserve">Un </w:t>
       </w:r>
+      <w:proofErr w:type="spellStart"/>
       <w:r>
         <w:rPr>
           <w:i/>
@@ -272,9 +375,19 @@
         </w:rPr>
         <w:t>push</w:t>
       </w:r>
-      <w:r>
-        <w:t xml:space="preserve"> a la rama main dispara automáticamente el </w:t>
-      </w:r>
+      <w:proofErr w:type="spellEnd"/>
+      <w:r>
+        <w:t xml:space="preserve"> a la rama </w:t>
+      </w:r>
+      <w:proofErr w:type="spellStart"/>
+      <w:r>
+        <w:t>main</w:t>
+      </w:r>
+      <w:proofErr w:type="spellEnd"/>
+      <w:r>
+        <w:t xml:space="preserve"> dispara automáticamente el </w:t>
+      </w:r>
+      <w:proofErr w:type="spellStart"/>
       <w:r>
         <w:rPr>
           <w:i/>
@@ -282,8 +395,33 @@
         </w:rPr>
         <w:t>linting</w:t>
       </w:r>
-      <w:r>
-        <w:t xml:space="preserve"> y el despliegue en Vercel (Frontend) y Render.com (Backend).</w:t>
+      <w:proofErr w:type="spellEnd"/>
+      <w:r>
+        <w:t xml:space="preserve"> y el despliegue en </w:t>
+      </w:r>
+      <w:proofErr w:type="spellStart"/>
+      <w:r>
+        <w:t>Vercel</w:t>
+      </w:r>
+      <w:proofErr w:type="spellEnd"/>
+      <w:r>
+        <w:t xml:space="preserve"> (</w:t>
+      </w:r>
+      <w:proofErr w:type="spellStart"/>
+      <w:r>
+        <w:t>Frontend</w:t>
+      </w:r>
+      <w:proofErr w:type="spellEnd"/>
+      <w:r>
+        <w:t>) y Render.com (</w:t>
+      </w:r>
+      <w:proofErr w:type="spellStart"/>
+      <w:r>
+        <w:t>Backend</w:t>
+      </w:r>
+      <w:proofErr w:type="spellEnd"/>
+      <w:r>
+        <w:t>).</w:t>
       </w:r>
     </w:p>
     <w:p>
@@ -307,7 +445,23 @@
           <w:b/>
           <w:bCs/>
         </w:rPr>
-        <w:t>HU 0.2: Modelado y despliegue del esquema de base de datos relacional con soporte espacial (PostGIS).</w:t>
+        <w:t>HU 0.2: Modelado y despliegue del esquema de base de datos relacional con soporte espacial (</w:t>
+      </w:r>
+      <w:proofErr w:type="spellStart"/>
+      <w:r>
+        <w:rPr>
+          <w:b/>
+          <w:bCs/>
+        </w:rPr>
+        <w:t>PostGIS</w:t>
+      </w:r>
+      <w:proofErr w:type="spellEnd"/>
+      <w:r>
+        <w:rPr>
+          <w:b/>
+          <w:bCs/>
+        </w:rPr>
+        <w:t>).</w:t>
       </w:r>
     </w:p>
     <w:p>
@@ -323,7 +477,15 @@
         <w:t>Descripción:</w:t>
       </w:r>
       <w:r>
-        <w:t xml:space="preserve"> Como Arquitecto de Datos, quiero desplegar el esquema en PostgreSQL habilitando PostGIS, para almacenar usuarios, productos y coordenadas geográficas de forma segura.</w:t>
+        <w:t xml:space="preserve"> Como Arquitecto de Datos, quiero desplegar el esquema en PostgreSQL habilitando </w:t>
+      </w:r>
+      <w:proofErr w:type="spellStart"/>
+      <w:r>
+        <w:t>PostGIS</w:t>
+      </w:r>
+      <w:proofErr w:type="spellEnd"/>
+      <w:r>
+        <w:t>, para almacenar usuarios, productos y coordenadas geográficas de forma segura.</w:t>
       </w:r>
     </w:p>
     <w:p>
@@ -349,8 +511,15 @@
         <w:spacing w:before="240" w:line="360" w:lineRule="auto"/>
       </w:pPr>
       <w:r>
-        <w:lastRenderedPageBreak/>
-        <w:t>Instancia creada en capa gratuita (Supabase/Neon).</w:t>
+        <w:t>Instancia creada en capa gratuita (</w:t>
+      </w:r>
+      <w:proofErr w:type="spellStart"/>
+      <w:r>
+        <w:t>Supabase</w:t>
+      </w:r>
+      <w:proofErr w:type="spellEnd"/>
+      <w:r>
+        <w:t>/Neon).</w:t>
       </w:r>
     </w:p>
     <w:p>
@@ -363,7 +532,15 @@
         <w:spacing w:before="240" w:line="360" w:lineRule="auto"/>
       </w:pPr>
       <w:r>
-        <w:t>Extensión PostGIS activada.</w:t>
+        <w:t xml:space="preserve">Extensión </w:t>
+      </w:r>
+      <w:proofErr w:type="spellStart"/>
+      <w:r>
+        <w:t>PostGIS</w:t>
+      </w:r>
+      <w:proofErr w:type="spellEnd"/>
+      <w:r>
+        <w:t xml:space="preserve"> activada.</w:t>
       </w:r>
     </w:p>
     <w:p>
@@ -376,6 +553,7 @@
         <w:spacing w:before="240" w:line="360" w:lineRule="auto"/>
       </w:pPr>
       <w:r>
+        <w:lastRenderedPageBreak/>
         <w:t xml:space="preserve">Políticas </w:t>
       </w:r>
       <w:r>
@@ -419,7 +597,15 @@
         <w:t>Descripción:</w:t>
       </w:r>
       <w:r>
-        <w:t xml:space="preserve"> Como DevOps, quiero configurar los dominios y el SSL, para garantizar que toda la transferencia de datos (especialmente la geolocalización de la PWA) viaje cifrada.</w:t>
+        <w:t xml:space="preserve"> Como DevOps, quiero configurar los dominios y el SSL, para garantizar que toda la transferencia de datos (especialmente la geolocalización de la PWA) </w:t>
+      </w:r>
+      <w:proofErr w:type="gramStart"/>
+      <w:r>
+        <w:t>viaje cifrada</w:t>
+      </w:r>
+      <w:proofErr w:type="gramEnd"/>
+      <w:r>
+        <w:t>.</w:t>
       </w:r>
     </w:p>
     <w:p>
@@ -449,7 +635,23 @@
         <w:spacing w:before="240" w:line="360" w:lineRule="auto"/>
       </w:pPr>
       <w:r>
-        <w:t>Dominio veramarket.app configurado en Cloudflare.</w:t>
+        <w:t xml:space="preserve">Dominio </w:t>
+      </w:r>
+      <w:proofErr w:type="spellStart"/>
+      <w:r>
+        <w:t>veramarket.app</w:t>
+      </w:r>
+      <w:proofErr w:type="spellEnd"/>
+      <w:r>
+        <w:t xml:space="preserve"> configurado en </w:t>
+      </w:r>
+      <w:proofErr w:type="spellStart"/>
+      <w:r>
+        <w:t>Cloudflare</w:t>
+      </w:r>
+      <w:proofErr w:type="spellEnd"/>
+      <w:r>
+        <w:t>.</w:t>
       </w:r>
     </w:p>
     <w:p>
@@ -474,8 +676,26 @@
         </w:numPr>
         <w:spacing w:before="240" w:line="360" w:lineRule="auto"/>
       </w:pPr>
-      <w:r>
-        <w:t>Archivos .env segregados (Local, Staging, Producción) sin subir secretos al repositorio.</w:t>
+      <w:proofErr w:type="gramStart"/>
+      <w:r>
+        <w:t>Archivos .</w:t>
+      </w:r>
+      <w:proofErr w:type="spellStart"/>
+      <w:r>
+        <w:t>env</w:t>
+      </w:r>
+      <w:proofErr w:type="spellEnd"/>
+      <w:proofErr w:type="gramEnd"/>
+      <w:r>
+        <w:t xml:space="preserve"> segregados (Local, </w:t>
+      </w:r>
+      <w:proofErr w:type="spellStart"/>
+      <w:r>
+        <w:t>Staging</w:t>
+      </w:r>
+      <w:proofErr w:type="spellEnd"/>
+      <w:r>
+        <w:t>, Producción) sin subir secretos al repositorio.</w:t>
       </w:r>
     </w:p>
     <w:p>
@@ -512,7 +732,23 @@
           <w:b/>
           <w:bCs/>
         </w:rPr>
-        <w:t>EP-01: Autenticación Segura y Perfilamiento (Privacy-First)</w:t>
+        <w:t>EP-01: Autenticación Segura y Perfilamiento (</w:t>
+      </w:r>
+      <w:proofErr w:type="spellStart"/>
+      <w:r>
+        <w:rPr>
+          <w:b/>
+          <w:bCs/>
+        </w:rPr>
+        <w:t>Privacy</w:t>
+      </w:r>
+      <w:proofErr w:type="spellEnd"/>
+      <w:r>
+        <w:rPr>
+          <w:b/>
+          <w:bCs/>
+        </w:rPr>
+        <w:t>-First)</w:t>
       </w:r>
     </w:p>
     <w:p>
@@ -547,11 +783,24 @@
       <w:r>
         <w:t xml:space="preserve"> Como Usuario, quiero ingresar con mi </w:t>
       </w:r>
+      <w:proofErr w:type="gramStart"/>
       <w:r>
         <w:t xml:space="preserve">correo </w:t>
       </w:r>
       <w:r>
-        <w:t xml:space="preserve"> y recibir un código temporal, para acceder a la app sin tener que memorizar otra contraseña.</w:t>
+        <w:t xml:space="preserve"> y</w:t>
+      </w:r>
+      <w:proofErr w:type="gramEnd"/>
+      <w:r>
+        <w:t xml:space="preserve"> recibir un código temporal, para acceder a la </w:t>
+      </w:r>
+      <w:proofErr w:type="gramStart"/>
+      <w:r>
+        <w:t>app</w:t>
+      </w:r>
+      <w:proofErr w:type="gramEnd"/>
+      <w:r>
+        <w:t xml:space="preserve"> sin tener que memorizar otra contraseña.</w:t>
       </w:r>
     </w:p>
     <w:p>
@@ -579,8 +828,13 @@
       <w:r>
         <w:t xml:space="preserve">El sistema solo acepta </w:t>
       </w:r>
-      <w:r>
-        <w:t>correos concordante a los registros dados por sinapsis</w:t>
+      <w:proofErr w:type="gramStart"/>
+      <w:r>
+        <w:t>correos concordante</w:t>
+      </w:r>
+      <w:proofErr w:type="gramEnd"/>
+      <w:r>
+        <w:t xml:space="preserve"> a los registros dados por sinapsis</w:t>
       </w:r>
     </w:p>
     <w:p>
@@ -665,8 +919,75 @@
         <w:spacing w:before="240" w:line="360" w:lineRule="auto"/>
       </w:pPr>
       <w:r>
+        <w:t xml:space="preserve">Se crea el registro en la tabla </w:t>
+      </w:r>
+      <w:proofErr w:type="spellStart"/>
+      <w:r>
+        <w:t>users</w:t>
+      </w:r>
+      <w:proofErr w:type="spellEnd"/>
+      <w:r>
+        <w:t xml:space="preserve"> al validar el primer OTP.</w:t>
+      </w:r>
+    </w:p>
+    <w:p>
+      <w:pPr>
+        <w:pStyle w:val="ListParagraph"/>
+        <w:numPr>
+          <w:ilvl w:val="2"/>
+          <w:numId w:val="4"/>
+        </w:numPr>
+        <w:spacing w:before="240" w:line="360" w:lineRule="auto"/>
+      </w:pPr>
+      <w:r>
+        <w:t>Solo se capturan datos mínimos (ID institucional, rol base).</w:t>
+      </w:r>
+    </w:p>
+    <w:p>
+      <w:pPr>
+        <w:pStyle w:val="ListParagraph"/>
+        <w:numPr>
+          <w:ilvl w:val="1"/>
+          <w:numId w:val="4"/>
+        </w:numPr>
+        <w:spacing w:before="240" w:line="360" w:lineRule="auto"/>
+      </w:pPr>
+      <w:r>
+        <w:rPr>
+          <w:b/>
+          <w:bCs/>
+        </w:rPr>
         <w:lastRenderedPageBreak/>
-        <w:t>Se crea el registro en la tabla users al validar el primer OTP.</w:t>
+        <w:t>HU 1.3: Configuración de privacidad (Ocultar contacto).</w:t>
+      </w:r>
+    </w:p>
+    <w:p>
+      <w:pPr>
+        <w:pStyle w:val="ListParagraph"/>
+        <w:spacing w:before="240" w:line="360" w:lineRule="auto"/>
+      </w:pPr>
+      <w:r>
+        <w:rPr>
+          <w:b/>
+          <w:bCs/>
+        </w:rPr>
+        <w:t>Descripción:</w:t>
+      </w:r>
+      <w:r>
+        <w:t xml:space="preserve"> Como Usuario, quiero un interruptor en mi perfil para ocultar mi número de teléfono, para proteger mi privacidad hasta que decida compartirlo.</w:t>
+      </w:r>
+    </w:p>
+    <w:p>
+      <w:pPr>
+        <w:pStyle w:val="ListParagraph"/>
+        <w:spacing w:before="240" w:line="360" w:lineRule="auto"/>
+      </w:pPr>
+      <w:r>
+        <w:rPr>
+          <w:b/>
+          <w:bCs/>
+        </w:rPr>
+        <w:t>Criterios de Aceptación:</w:t>
       </w:r>
     </w:p>
     <w:p>
@@ -679,7 +1000,60 @@
         <w:spacing w:before="240" w:line="360" w:lineRule="auto"/>
       </w:pPr>
       <w:r>
-        <w:t>Solo se capturan datos mínimos (ID institucional, rol base).</w:t>
+        <w:t xml:space="preserve">El </w:t>
+      </w:r>
+      <w:proofErr w:type="spellStart"/>
+      <w:r>
+        <w:t>toggle</w:t>
+      </w:r>
+      <w:proofErr w:type="spellEnd"/>
+      <w:r>
+        <w:t xml:space="preserve"> por defecto está en Oculto (</w:t>
+      </w:r>
+      <w:proofErr w:type="spellStart"/>
+      <w:r>
+        <w:t>Privacy</w:t>
+      </w:r>
+      <w:proofErr w:type="spellEnd"/>
+      <w:r>
+        <w:t xml:space="preserve"> </w:t>
+      </w:r>
+      <w:proofErr w:type="spellStart"/>
+      <w:r>
+        <w:t>by</w:t>
+      </w:r>
+      <w:proofErr w:type="spellEnd"/>
+      <w:r>
+        <w:t xml:space="preserve"> </w:t>
+      </w:r>
+      <w:proofErr w:type="spellStart"/>
+      <w:r>
+        <w:t>Design</w:t>
+      </w:r>
+      <w:proofErr w:type="spellEnd"/>
+      <w:r>
+        <w:t>).</w:t>
+      </w:r>
+    </w:p>
+    <w:p>
+      <w:pPr>
+        <w:pStyle w:val="ListParagraph"/>
+        <w:numPr>
+          <w:ilvl w:val="2"/>
+          <w:numId w:val="4"/>
+        </w:numPr>
+        <w:spacing w:before="240" w:line="360" w:lineRule="auto"/>
+      </w:pPr>
+      <w:r>
+        <w:t xml:space="preserve">Si está oculto, el </w:t>
+      </w:r>
+      <w:proofErr w:type="spellStart"/>
+      <w:r>
+        <w:t>backend</w:t>
+      </w:r>
+      <w:proofErr w:type="spellEnd"/>
+      <w:r>
+        <w:t xml:space="preserve"> enmascara o elimina el campo de contacto en la respuesta JSON pública.</w:t>
       </w:r>
     </w:p>
     <w:p>
@@ -696,7 +1070,7 @@
           <w:b/>
           <w:bCs/>
         </w:rPr>
-        <w:t>HU 1.3: Configuración de privacidad (Ocultar contacto).</w:t>
+        <w:t>HU 1.4: Solicitud de Rol Vendedor con código de Sinapsis.</w:t>
       </w:r>
     </w:p>
     <w:p>
@@ -712,7 +1086,15 @@
         <w:t>Descripción:</w:t>
       </w:r>
       <w:r>
-        <w:t xml:space="preserve"> Como Usuario, quiero un interruptor en mi perfil para ocultar mi número de teléfono, para proteger mi privacidad hasta que decida compartirlo.</w:t>
+        <w:t xml:space="preserve"> Como Comprador, quiero ingresar mi código de emprendedor de Sinapsis, para solicitar permisos de publicación en el </w:t>
+      </w:r>
+      <w:proofErr w:type="spellStart"/>
+      <w:r>
+        <w:t>marketplace</w:t>
+      </w:r>
+      <w:proofErr w:type="spellEnd"/>
+      <w:r>
+        <w:t>.</w:t>
       </w:r>
     </w:p>
     <w:p>
@@ -738,7 +1120,7 @@
         <w:spacing w:before="240" w:line="360" w:lineRule="auto"/>
       </w:pPr>
       <w:r>
-        <w:t>El toggle por defecto está en Oculto (Privacy by Design).</w:t>
+        <w:t>Formulario simple de 1 campo en el perfil del usuario.</w:t>
       </w:r>
     </w:p>
     <w:p>
@@ -751,7 +1133,7 @@
         <w:spacing w:before="240" w:line="360" w:lineRule="auto"/>
       </w:pPr>
       <w:r>
-        <w:t>Si está oculto, el backend enmascara o elimina el campo de contacto en la respuesta JSON pública.</w:t>
+        <w:t>El estado de la solicitud queda marcado en la BD como "Pendiente".</w:t>
       </w:r>
     </w:p>
     <w:p>
@@ -768,7 +1150,23 @@
           <w:b/>
           <w:bCs/>
         </w:rPr>
-        <w:t>HU 1.4: Solicitud de Rol Vendedor con código de Sinapsis.</w:t>
+        <w:t>HU 1.5: Validación Sinapsis (</w:t>
+      </w:r>
+      <w:proofErr w:type="spellStart"/>
+      <w:r>
+        <w:rPr>
+          <w:b/>
+          <w:bCs/>
+        </w:rPr>
+        <w:t>Whitelist</w:t>
+      </w:r>
+      <w:proofErr w:type="spellEnd"/>
+      <w:r>
+        <w:rPr>
+          <w:b/>
+          <w:bCs/>
+        </w:rPr>
+        <w:t>).</w:t>
       </w:r>
     </w:p>
     <w:p>
@@ -784,7 +1182,7 @@
         <w:t>Descripción:</w:t>
       </w:r>
       <w:r>
-        <w:t xml:space="preserve"> Como Comprador, quiero ingresar mi código de emprendedor de Sinapsis, para solicitar permisos de publicación en el marketplace.</w:t>
+        <w:t xml:space="preserve"> Como Sistema, quiero cruzar el código ingresado con la base de datos de Sinapsis, para aprobar el rol de Vendedor automáticamente sin intervención humana.</w:t>
       </w:r>
     </w:p>
     <w:p>
@@ -810,7 +1208,15 @@
         <w:spacing w:before="240" w:line="360" w:lineRule="auto"/>
       </w:pPr>
       <w:r>
-        <w:t>Formulario simple de 1 campo en el perfil del usuario.</w:t>
+        <w:t>Lectura exitosa del CSV/</w:t>
+      </w:r>
+      <w:proofErr w:type="spellStart"/>
+      <w:r>
+        <w:t>Endpoint</w:t>
+      </w:r>
+      <w:proofErr w:type="spellEnd"/>
+      <w:r>
+        <w:t xml:space="preserve"> de validación.</w:t>
       </w:r>
     </w:p>
     <w:p>
@@ -823,7 +1229,28 @@
         <w:spacing w:before="240" w:line="360" w:lineRule="auto"/>
       </w:pPr>
       <w:r>
-        <w:t>El estado de la solicitud queda marcado en la BD como "Pendiente".</w:t>
+        <w:t>Si hay coincidencia, el rol cambia a "Vendedor" inmediatamente.</w:t>
+      </w:r>
+    </w:p>
+    <w:p>
+      <w:pPr>
+        <w:pStyle w:val="ListParagraph"/>
+        <w:numPr>
+          <w:ilvl w:val="0"/>
+          <w:numId w:val="4"/>
+        </w:numPr>
+        <w:spacing w:before="240" w:line="360" w:lineRule="auto"/>
+        <w:rPr>
+          <w:b/>
+          <w:bCs/>
+        </w:rPr>
+      </w:pPr>
+      <w:r>
+        <w:rPr>
+          <w:b/>
+          <w:bCs/>
+        </w:rPr>
+        <w:t>EP-02: Core PWA y Experiencia de Usuario Móvil</w:t>
       </w:r>
     </w:p>
     <w:p>
@@ -840,7 +1267,7 @@
           <w:b/>
           <w:bCs/>
         </w:rPr>
-        <w:t>HU 1.5: Validación Sinapsis (Whitelist).</w:t>
+        <w:t>HU 2.1: Instalación de la aplicación en la pantalla de inicio.</w:t>
       </w:r>
     </w:p>
     <w:p>
@@ -856,7 +1283,23 @@
         <w:t>Descripción:</w:t>
       </w:r>
       <w:r>
-        <w:t xml:space="preserve"> Como Sistema, quiero cruzar el código ingresado con la base de datos de Sinapsis, para aprobar el rol de Vendedor automáticamente sin intervención humana.</w:t>
+        <w:t xml:space="preserve"> Como Usuario móvil, quiero ver un botón para agregar </w:t>
+      </w:r>
+      <w:proofErr w:type="spellStart"/>
+      <w:r>
+        <w:t>VeraMarket</w:t>
+      </w:r>
+      <w:proofErr w:type="spellEnd"/>
+      <w:r>
+        <w:t xml:space="preserve"> a mi pantalla de inicio, para usarla como una </w:t>
+      </w:r>
+      <w:proofErr w:type="gramStart"/>
+      <w:r>
+        <w:t>app</w:t>
+      </w:r>
+      <w:proofErr w:type="gramEnd"/>
+      <w:r>
+        <w:t xml:space="preserve"> nativa sin consumir espacio de almacenamiento.</w:t>
       </w:r>
     </w:p>
     <w:p>
@@ -881,8 +1324,15 @@
         </w:numPr>
         <w:spacing w:before="240" w:line="360" w:lineRule="auto"/>
       </w:pPr>
-      <w:r>
-        <w:t>Lectura exitosa del CSV/Endpoint de validación.</w:t>
+      <w:proofErr w:type="spellStart"/>
+      <w:proofErr w:type="gramStart"/>
+      <w:r>
+        <w:t>manifest.json</w:t>
+      </w:r>
+      <w:proofErr w:type="spellEnd"/>
+      <w:proofErr w:type="gramEnd"/>
+      <w:r>
+        <w:t xml:space="preserve"> configurado correctamente (iconos, colores de tema).</w:t>
       </w:r>
     </w:p>
     <w:p>
@@ -895,102 +1345,9 @@
         <w:spacing w:before="240" w:line="360" w:lineRule="auto"/>
       </w:pPr>
       <w:r>
-        <w:t>Si hay coincidencia, el rol cambia a "Vendedor" inmediatamente.</w:t>
-      </w:r>
-    </w:p>
-    <w:p>
-      <w:pPr>
-        <w:pStyle w:val="ListParagraph"/>
-        <w:numPr>
-          <w:ilvl w:val="0"/>
-          <w:numId w:val="4"/>
-        </w:numPr>
-        <w:spacing w:before="240" w:line="360" w:lineRule="auto"/>
-        <w:rPr>
-          <w:b/>
-          <w:bCs/>
-        </w:rPr>
-      </w:pPr>
-      <w:r>
-        <w:rPr>
-          <w:b/>
-          <w:bCs/>
-        </w:rPr>
-        <w:t>EP-02: Core PWA y Experiencia de Usuario Móvil</w:t>
-      </w:r>
-    </w:p>
-    <w:p>
-      <w:pPr>
-        <w:pStyle w:val="ListParagraph"/>
-        <w:numPr>
-          <w:ilvl w:val="1"/>
-          <w:numId w:val="4"/>
-        </w:numPr>
-        <w:spacing w:before="240" w:line="360" w:lineRule="auto"/>
-      </w:pPr>
-      <w:r>
-        <w:rPr>
-          <w:b/>
-          <w:bCs/>
-        </w:rPr>
-        <w:t>HU 2.1: Instalación de la aplicación en la pantalla de inicio.</w:t>
-      </w:r>
-    </w:p>
-    <w:p>
-      <w:pPr>
-        <w:pStyle w:val="ListParagraph"/>
-        <w:spacing w:before="240" w:line="360" w:lineRule="auto"/>
-      </w:pPr>
-      <w:r>
-        <w:rPr>
-          <w:b/>
-          <w:bCs/>
-        </w:rPr>
-        <w:t>Descripción:</w:t>
-      </w:r>
-      <w:r>
-        <w:t xml:space="preserve"> Como Usuario móvil, quiero ver un botón para agregar VeraMarket a mi pantalla de inicio, para usarla como una app nativa sin consumir espacio de almacenamiento.</w:t>
-      </w:r>
-    </w:p>
-    <w:p>
-      <w:pPr>
-        <w:pStyle w:val="ListParagraph"/>
-        <w:spacing w:before="240" w:line="360" w:lineRule="auto"/>
-      </w:pPr>
-      <w:r>
-        <w:rPr>
-          <w:b/>
-          <w:bCs/>
-        </w:rPr>
-        <w:t>Criterios de Aceptación:</w:t>
-      </w:r>
-    </w:p>
-    <w:p>
-      <w:pPr>
-        <w:pStyle w:val="ListParagraph"/>
-        <w:numPr>
-          <w:ilvl w:val="2"/>
-          <w:numId w:val="4"/>
-        </w:numPr>
-        <w:spacing w:before="240" w:line="360" w:lineRule="auto"/>
-      </w:pPr>
-      <w:r>
-        <w:t>manifest.json configurado correctamente (iconos, colores de tema).</w:t>
-      </w:r>
-    </w:p>
-    <w:p>
-      <w:pPr>
-        <w:pStyle w:val="ListParagraph"/>
-        <w:numPr>
-          <w:ilvl w:val="2"/>
-          <w:numId w:val="4"/>
-        </w:numPr>
-        <w:spacing w:before="240" w:line="360" w:lineRule="auto"/>
-      </w:pPr>
-      <w:r>
-        <w:lastRenderedPageBreak/>
         <w:t xml:space="preserve">El navegador dispara el </w:t>
       </w:r>
+      <w:proofErr w:type="spellStart"/>
       <w:r>
         <w:rPr>
           <w:i/>
@@ -998,6 +1355,7 @@
         </w:rPr>
         <w:t>prompt</w:t>
       </w:r>
+      <w:proofErr w:type="spellEnd"/>
       <w:r>
         <w:t xml:space="preserve"> nativo de "Añadir a pantalla de inicio".</w:t>
       </w:r>
@@ -1016,19 +1374,52 @@
           <w:b/>
           <w:bCs/>
         </w:rPr>
-        <w:t>HU 2.2: Skeleton loaders y manejo de errores sin red.</w:t>
-      </w:r>
-    </w:p>
-    <w:p>
-      <w:pPr>
-        <w:pStyle w:val="ListParagraph"/>
-        <w:spacing w:before="240" w:line="360" w:lineRule="auto"/>
-      </w:pPr>
-      <w:r>
-        <w:rPr>
-          <w:b/>
-          <w:bCs/>
-        </w:rPr>
+        <w:t xml:space="preserve">HU 2.2: </w:t>
+      </w:r>
+      <w:proofErr w:type="spellStart"/>
+      <w:r>
+        <w:rPr>
+          <w:b/>
+          <w:bCs/>
+        </w:rPr>
+        <w:t>Skeleton</w:t>
+      </w:r>
+      <w:proofErr w:type="spellEnd"/>
+      <w:r>
+        <w:rPr>
+          <w:b/>
+          <w:bCs/>
+        </w:rPr>
+        <w:t xml:space="preserve"> </w:t>
+      </w:r>
+      <w:proofErr w:type="spellStart"/>
+      <w:r>
+        <w:rPr>
+          <w:b/>
+          <w:bCs/>
+        </w:rPr>
+        <w:t>loaders</w:t>
+      </w:r>
+      <w:proofErr w:type="spellEnd"/>
+      <w:r>
+        <w:rPr>
+          <w:b/>
+          <w:bCs/>
+        </w:rPr>
+        <w:t xml:space="preserve"> y manejo de errores sin red.</w:t>
+      </w:r>
+    </w:p>
+    <w:p>
+      <w:pPr>
+        <w:pStyle w:val="ListParagraph"/>
+        <w:spacing w:before="240" w:line="360" w:lineRule="auto"/>
+      </w:pPr>
+      <w:r>
+        <w:rPr>
+          <w:b/>
+          <w:bCs/>
+        </w:rPr>
+        <w:lastRenderedPageBreak/>
         <w:t>Descripción:</w:t>
       </w:r>
       <w:r>
@@ -1058,7 +1449,15 @@
         <w:spacing w:before="240" w:line="360" w:lineRule="auto"/>
       </w:pPr>
       <w:r>
-        <w:t>Los componentes de Next.js muestran animaciones "Skeleton" mientras el Fetch de datos resuelve.</w:t>
+        <w:t>Los componentes de Next.js muestran animaciones "</w:t>
+      </w:r>
+      <w:proofErr w:type="spellStart"/>
+      <w:r>
+        <w:t>Skeleton</w:t>
+      </w:r>
+      <w:proofErr w:type="spellEnd"/>
+      <w:r>
+        <w:t>" mientras el Fetch de datos resuelve.</w:t>
       </w:r>
     </w:p>
     <w:p>
@@ -1073,6 +1472,7 @@
       <w:r>
         <w:t xml:space="preserve">Si la API da </w:t>
       </w:r>
+      <w:proofErr w:type="spellStart"/>
       <w:r>
         <w:rPr>
           <w:i/>
@@ -1080,6 +1480,7 @@
         </w:rPr>
         <w:t>timeout</w:t>
       </w:r>
+      <w:proofErr w:type="spellEnd"/>
       <w:r>
         <w:t xml:space="preserve"> o no hay internet, se muestra un banner de "Sin conexión a internet" interceptado por el Service Worker.</w:t>
       </w:r>
@@ -1098,7 +1499,23 @@
           <w:b/>
           <w:bCs/>
         </w:rPr>
-        <w:t>HU 2.3: Configuración de notificaciones push web.</w:t>
+        <w:t xml:space="preserve">HU 2.3: Configuración de notificaciones </w:t>
+      </w:r>
+      <w:proofErr w:type="spellStart"/>
+      <w:r>
+        <w:rPr>
+          <w:b/>
+          <w:bCs/>
+        </w:rPr>
+        <w:t>push</w:t>
+      </w:r>
+      <w:proofErr w:type="spellEnd"/>
+      <w:r>
+        <w:rPr>
+          <w:b/>
+          <w:bCs/>
+        </w:rPr>
+        <w:t xml:space="preserve"> web.</w:t>
       </w:r>
     </w:p>
     <w:p>
@@ -1114,7 +1531,15 @@
         <w:t>Descripción:</w:t>
       </w:r>
       <w:r>
-        <w:t xml:space="preserve"> Como Vendedor, quiero recibir notificaciones push en mi celular cuando alguien me escriba, para no perder oportunidades de venta.</w:t>
+        <w:t xml:space="preserve"> Como Vendedor, quiero recibir notificaciones </w:t>
+      </w:r>
+      <w:proofErr w:type="spellStart"/>
+      <w:r>
+        <w:t>push</w:t>
+      </w:r>
+      <w:proofErr w:type="spellEnd"/>
+      <w:r>
+        <w:t xml:space="preserve"> en mi celular cuando alguien me escriba, para no perder oportunidades de venta.</w:t>
       </w:r>
     </w:p>
     <w:p>
@@ -1153,7 +1578,15 @@
         <w:spacing w:before="240" w:line="360" w:lineRule="auto"/>
       </w:pPr>
       <w:r>
-        <w:t>El Service Worker es capaz de recibir y renderizar una alerta push en el dispositivo.</w:t>
+        <w:t xml:space="preserve">El Service Worker es capaz de recibir y renderizar una alerta </w:t>
+      </w:r>
+      <w:proofErr w:type="spellStart"/>
+      <w:r>
+        <w:t>push</w:t>
+      </w:r>
+      <w:proofErr w:type="spellEnd"/>
+      <w:r>
+        <w:t xml:space="preserve"> en el dispositivo.</w:t>
       </w:r>
     </w:p>
     <w:p>
@@ -1262,7 +1695,23 @@
         <w:spacing w:before="240" w:line="360" w:lineRule="auto"/>
       </w:pPr>
       <w:r>
-        <w:t>La imagen se optimiza y sube a un bucket (ej. Supabase Storage) con límite de peso (ej. 2MB).</w:t>
+        <w:t xml:space="preserve">La imagen se optimiza y sube a un </w:t>
+      </w:r>
+      <w:proofErr w:type="spellStart"/>
+      <w:r>
+        <w:t>bucket</w:t>
+      </w:r>
+      <w:proofErr w:type="spellEnd"/>
+      <w:r>
+        <w:t xml:space="preserve"> (ej. </w:t>
+      </w:r>
+      <w:proofErr w:type="spellStart"/>
+      <w:r>
+        <w:t>Supabase</w:t>
+      </w:r>
+      <w:proofErr w:type="spellEnd"/>
+      <w:r>
+        <w:t xml:space="preserve"> Storage) con límite de peso (ej. 2MB).</w:t>
       </w:r>
     </w:p>
     <w:p>
@@ -1279,20 +1728,20 @@
           <w:b/>
           <w:bCs/>
         </w:rPr>
+        <w:t>HU 3.2: Edición y actualización de inventario.</w:t>
+      </w:r>
+    </w:p>
+    <w:p>
+      <w:pPr>
+        <w:pStyle w:val="ListParagraph"/>
+        <w:spacing w:before="240" w:line="360" w:lineRule="auto"/>
+      </w:pPr>
+      <w:r>
+        <w:rPr>
+          <w:b/>
+          <w:bCs/>
+        </w:rPr>
         <w:lastRenderedPageBreak/>
-        <w:t>HU 3.2: Edición y actualización de inventario.</w:t>
-      </w:r>
-    </w:p>
-    <w:p>
-      <w:pPr>
-        <w:pStyle w:val="ListParagraph"/>
-        <w:spacing w:before="240" w:line="360" w:lineRule="auto"/>
-      </w:pPr>
-      <w:r>
-        <w:rPr>
-          <w:b/>
-          <w:bCs/>
-        </w:rPr>
         <w:t>Descripción:</w:t>
       </w:r>
       <w:r>
@@ -1396,134 +1845,32 @@
       <w:r>
         <w:t xml:space="preserve">Se implementa un </w:t>
       </w:r>
+      <w:proofErr w:type="spellStart"/>
       <w:r>
         <w:rPr>
           <w:i/>
           <w:iCs/>
         </w:rPr>
-        <w:t>Soft-Delete</w:t>
-      </w:r>
-      <w:r>
-        <w:t xml:space="preserve"> (ej. campo is_active = false en la BD) en lugar de un DELETE real.</w:t>
-      </w:r>
-    </w:p>
-    <w:p>
-      <w:pPr>
-        <w:pStyle w:val="ListParagraph"/>
-        <w:numPr>
-          <w:ilvl w:val="2"/>
-          <w:numId w:val="4"/>
-        </w:numPr>
-        <w:spacing w:before="240" w:line="360" w:lineRule="auto"/>
-      </w:pPr>
-      <w:r>
-        <w:t>El producto desaparece instantáneamente del catálogo público.</w:t>
-      </w:r>
-    </w:p>
-    <w:p>
-      <w:pPr>
-        <w:spacing w:before="240" w:line="360" w:lineRule="auto"/>
-        <w:rPr>
-          <w:b/>
-          <w:bCs/>
-        </w:rPr>
-      </w:pPr>
-      <w:r>
-        <w:rPr>
-          <w:b/>
-          <w:bCs/>
-        </w:rPr>
-        <w:t>Sprint 4: HU 4.1, HU 4.2, HU 4.3</w:t>
-      </w:r>
-    </w:p>
-    <w:p>
-      <w:pPr>
-        <w:pStyle w:val="ListParagraph"/>
-        <w:numPr>
-          <w:ilvl w:val="0"/>
-          <w:numId w:val="4"/>
-        </w:numPr>
-        <w:spacing w:before="240" w:line="360" w:lineRule="auto"/>
-        <w:rPr>
-          <w:b/>
-          <w:bCs/>
-        </w:rPr>
-      </w:pPr>
-      <w:r>
-        <w:rPr>
-          <w:b/>
-          <w:bCs/>
-        </w:rPr>
-        <w:t>EP-04: Búsqueda Inteligente (MVP - Motor Open Source / Fallback)</w:t>
-      </w:r>
-    </w:p>
-    <w:p>
-      <w:pPr>
-        <w:pStyle w:val="ListParagraph"/>
-        <w:numPr>
-          <w:ilvl w:val="1"/>
-          <w:numId w:val="4"/>
-        </w:numPr>
-        <w:spacing w:before="240" w:line="360" w:lineRule="auto"/>
-      </w:pPr>
-      <w:r>
-        <w:rPr>
-          <w:b/>
-          <w:bCs/>
-        </w:rPr>
-        <w:t>HU 4.1: Búsqueda tradicional y filtros.</w:t>
-      </w:r>
-    </w:p>
-    <w:p>
-      <w:pPr>
-        <w:pStyle w:val="ListParagraph"/>
-        <w:spacing w:before="240" w:line="360" w:lineRule="auto"/>
-      </w:pPr>
-      <w:r>
-        <w:rPr>
-          <w:b/>
-          <w:bCs/>
-        </w:rPr>
-        <w:t>Descripción:</w:t>
-      </w:r>
-      <w:r>
-        <w:t xml:space="preserve"> Como Comprador, quiero usar una barra de búsqueda para buscar productos exactos o filtrar por categorías, para encontrar lo que quiero rápido.</w:t>
-      </w:r>
-    </w:p>
-    <w:p>
-      <w:pPr>
-        <w:pStyle w:val="ListParagraph"/>
-        <w:spacing w:before="240" w:line="360" w:lineRule="auto"/>
-      </w:pPr>
-      <w:r>
-        <w:rPr>
-          <w:b/>
-          <w:bCs/>
-        </w:rPr>
-        <w:t>Criterios de Aceptación:</w:t>
-      </w:r>
-    </w:p>
-    <w:p>
-      <w:pPr>
-        <w:pStyle w:val="ListParagraph"/>
-        <w:numPr>
-          <w:ilvl w:val="2"/>
-          <w:numId w:val="4"/>
-        </w:numPr>
-        <w:spacing w:before="240" w:line="360" w:lineRule="auto"/>
-      </w:pPr>
-      <w:r>
-        <w:t xml:space="preserve">Implementación de </w:t>
-      </w:r>
+        <w:t>Soft</w:t>
+      </w:r>
+      <w:proofErr w:type="spellEnd"/>
       <w:r>
         <w:rPr>
           <w:i/>
           <w:iCs/>
         </w:rPr>
-        <w:t>Full-Text Search</w:t>
-      </w:r>
-      <w:r>
-        <w:t xml:space="preserve"> usando tsvector en PostgreSQL.</w:t>
+        <w:t>-Delete</w:t>
+      </w:r>
+      <w:r>
+        <w:t xml:space="preserve"> (ej. campo </w:t>
+      </w:r>
+      <w:proofErr w:type="spellStart"/>
+      <w:r>
+        <w:t>is_active</w:t>
+      </w:r>
+      <w:proofErr w:type="spellEnd"/>
+      <w:r>
+        <w:t xml:space="preserve"> = false en la BD) en lugar de un DELETE real.</w:t>
       </w:r>
     </w:p>
     <w:p>
@@ -1536,7 +1883,76 @@
         <w:spacing w:before="240" w:line="360" w:lineRule="auto"/>
       </w:pPr>
       <w:r>
-        <w:t>Latencia de respuesta menor a 1 segundo.</w:t>
+        <w:t>El producto desaparece instantáneamente del catálogo público.</w:t>
+      </w:r>
+    </w:p>
+    <w:p>
+      <w:pPr>
+        <w:spacing w:before="240" w:line="360" w:lineRule="auto"/>
+        <w:rPr>
+          <w:b/>
+          <w:bCs/>
+        </w:rPr>
+      </w:pPr>
+      <w:r>
+        <w:rPr>
+          <w:b/>
+          <w:bCs/>
+        </w:rPr>
+        <w:t>Sprint 4: HU 4.1, HU 4.2, HU 4.3</w:t>
+      </w:r>
+    </w:p>
+    <w:p>
+      <w:pPr>
+        <w:pStyle w:val="ListParagraph"/>
+        <w:numPr>
+          <w:ilvl w:val="0"/>
+          <w:numId w:val="4"/>
+        </w:numPr>
+        <w:spacing w:before="240" w:line="360" w:lineRule="auto"/>
+        <w:rPr>
+          <w:b/>
+          <w:bCs/>
+        </w:rPr>
+      </w:pPr>
+      <w:r>
+        <w:rPr>
+          <w:b/>
+          <w:bCs/>
+        </w:rPr>
+        <w:t xml:space="preserve">EP-04: Búsqueda Inteligente (MVP - Motor Open </w:t>
+      </w:r>
+      <w:proofErr w:type="spellStart"/>
+      <w:r>
+        <w:rPr>
+          <w:b/>
+          <w:bCs/>
+        </w:rPr>
+        <w:t>Source</w:t>
+      </w:r>
+      <w:proofErr w:type="spellEnd"/>
+      <w:r>
+        <w:rPr>
+          <w:b/>
+          <w:bCs/>
+        </w:rPr>
+        <w:t xml:space="preserve"> / </w:t>
+      </w:r>
+      <w:proofErr w:type="spellStart"/>
+      <w:r>
+        <w:rPr>
+          <w:b/>
+          <w:bCs/>
+        </w:rPr>
+        <w:t>Fallback</w:t>
+      </w:r>
+      <w:proofErr w:type="spellEnd"/>
+      <w:r>
+        <w:rPr>
+          <w:b/>
+          <w:bCs/>
+        </w:rPr>
+        <w:t>)</w:t>
       </w:r>
     </w:p>
     <w:p>
@@ -1553,7 +1969,7 @@
           <w:b/>
           <w:bCs/>
         </w:rPr>
-        <w:t>HU 4.2: Búsqueda semántica usando el motor IA.</w:t>
+        <w:t>HU 4.1: Búsqueda tradicional y filtros.</w:t>
       </w:r>
     </w:p>
     <w:p>
@@ -1569,7 +1985,7 @@
         <w:t>Descripción:</w:t>
       </w:r>
       <w:r>
-        <w:t xml:space="preserve"> Como Comprador, quiero buscar con lenguaje natural o modismos caleños (ej. "algo pa picar", "mecato"), para que la IA me sugiera productos relevantes aunque no tengan esa palabra exacta en el título.</w:t>
+        <w:t xml:space="preserve"> Como Comprador, quiero usar una barra de búsqueda para buscar productos exactos o filtrar por categorías, para encontrar lo que quiero rápido.</w:t>
       </w:r>
     </w:p>
     <w:p>
@@ -1595,29 +2011,152 @@
         <w:spacing w:before="240" w:line="360" w:lineRule="auto"/>
       </w:pPr>
       <w:r>
-        <w:t>Se envía la consulta a la API de OpenAI (GPT-4o-mini).</w:t>
-      </w:r>
-    </w:p>
-    <w:p>
-      <w:pPr>
-        <w:pStyle w:val="ListParagraph"/>
-        <w:numPr>
-          <w:ilvl w:val="2"/>
-          <w:numId w:val="4"/>
-        </w:numPr>
-        <w:spacing w:before="240" w:line="360" w:lineRule="auto"/>
-      </w:pPr>
+        <w:t xml:space="preserve">Implementación de </w:t>
+      </w:r>
       <w:r>
         <w:rPr>
           <w:i/>
           <w:iCs/>
         </w:rPr>
+        <w:t>Full-Text Search</w:t>
+      </w:r>
+      <w:r>
+        <w:t xml:space="preserve"> usando </w:t>
+      </w:r>
+      <w:proofErr w:type="spellStart"/>
+      <w:r>
+        <w:t>tsvector</w:t>
+      </w:r>
+      <w:proofErr w:type="spellEnd"/>
+      <w:r>
+        <w:t xml:space="preserve"> en PostgreSQL.</w:t>
+      </w:r>
+    </w:p>
+    <w:p>
+      <w:pPr>
+        <w:pStyle w:val="ListParagraph"/>
+        <w:numPr>
+          <w:ilvl w:val="2"/>
+          <w:numId w:val="4"/>
+        </w:numPr>
+        <w:spacing w:before="240" w:line="360" w:lineRule="auto"/>
+      </w:pPr>
+      <w:r>
+        <w:t>Latencia de respuesta menor a 1 segundo.</w:t>
+      </w:r>
+    </w:p>
+    <w:p>
+      <w:pPr>
+        <w:pStyle w:val="ListParagraph"/>
+        <w:numPr>
+          <w:ilvl w:val="1"/>
+          <w:numId w:val="4"/>
+        </w:numPr>
+        <w:spacing w:before="240" w:line="360" w:lineRule="auto"/>
+      </w:pPr>
+      <w:r>
+        <w:rPr>
+          <w:b/>
+          <w:bCs/>
+        </w:rPr>
+        <w:t>HU 4.2: Búsqueda semántica usando el motor IA.</w:t>
+      </w:r>
+    </w:p>
+    <w:p>
+      <w:pPr>
+        <w:pStyle w:val="ListParagraph"/>
+        <w:spacing w:before="240" w:line="360" w:lineRule="auto"/>
+      </w:pPr>
+      <w:r>
+        <w:rPr>
+          <w:b/>
+          <w:bCs/>
+        </w:rPr>
+        <w:t>Descripción:</w:t>
+      </w:r>
+      <w:r>
+        <w:t xml:space="preserve"> Como Comprador, quiero buscar con lenguaje natural o modismos caleños (ej. "algo </w:t>
+      </w:r>
+      <w:proofErr w:type="spellStart"/>
+      <w:r>
+        <w:t>pa</w:t>
+      </w:r>
+      <w:proofErr w:type="spellEnd"/>
+      <w:r>
+        <w:t xml:space="preserve"> picar", "mecato"), para que la IA me sugiera productos </w:t>
+      </w:r>
+      <w:proofErr w:type="gramStart"/>
+      <w:r>
+        <w:t>relevantes</w:t>
+      </w:r>
+      <w:proofErr w:type="gramEnd"/>
+      <w:r>
+        <w:t xml:space="preserve"> aunque no tengan esa palabra exacta en el título.</w:t>
+      </w:r>
+    </w:p>
+    <w:p>
+      <w:pPr>
+        <w:pStyle w:val="ListParagraph"/>
+        <w:spacing w:before="240" w:line="360" w:lineRule="auto"/>
+      </w:pPr>
+      <w:r>
+        <w:rPr>
+          <w:b/>
+          <w:bCs/>
+        </w:rPr>
+        <w:t>Criterios de Aceptación:</w:t>
+      </w:r>
+    </w:p>
+    <w:p>
+      <w:pPr>
+        <w:pStyle w:val="ListParagraph"/>
+        <w:numPr>
+          <w:ilvl w:val="2"/>
+          <w:numId w:val="4"/>
+        </w:numPr>
+        <w:spacing w:before="240" w:line="360" w:lineRule="auto"/>
+      </w:pPr>
+      <w:r>
+        <w:t xml:space="preserve">Se envía la consulta a la API de </w:t>
+      </w:r>
+      <w:proofErr w:type="spellStart"/>
+      <w:r>
+        <w:t>OpenAI</w:t>
+      </w:r>
+      <w:proofErr w:type="spellEnd"/>
+      <w:r>
+        <w:t xml:space="preserve"> (GPT-4o-mini).</w:t>
+      </w:r>
+    </w:p>
+    <w:p>
+      <w:pPr>
+        <w:pStyle w:val="ListParagraph"/>
+        <w:numPr>
+          <w:ilvl w:val="2"/>
+          <w:numId w:val="4"/>
+        </w:numPr>
+        <w:spacing w:before="240" w:line="360" w:lineRule="auto"/>
+      </w:pPr>
+      <w:r>
+        <w:rPr>
+          <w:i/>
+          <w:iCs/>
+        </w:rPr>
         <w:lastRenderedPageBreak/>
         <w:t>Arquitectura:</w:t>
       </w:r>
       <w:r>
-        <w:t xml:space="preserve"> Si la API de OpenAI falla o hay límite de uso, el sistema hace un </w:t>
-      </w:r>
+        <w:t xml:space="preserve"> Si la API de </w:t>
+      </w:r>
+      <w:proofErr w:type="spellStart"/>
+      <w:r>
+        <w:t>OpenAI</w:t>
+      </w:r>
+      <w:proofErr w:type="spellEnd"/>
+      <w:r>
+        <w:t xml:space="preserve"> falla o hay límite de uso, el sistema hace un </w:t>
+      </w:r>
+      <w:proofErr w:type="spellStart"/>
       <w:r>
         <w:rPr>
           <w:i/>
@@ -1625,6 +2164,7 @@
         </w:rPr>
         <w:t>fallback</w:t>
       </w:r>
+      <w:proofErr w:type="spellEnd"/>
       <w:r>
         <w:t xml:space="preserve"> automático a la búsqueda tradicional de la HU 4.1.</w:t>
       </w:r>
@@ -1643,7 +2183,23 @@
           <w:b/>
           <w:bCs/>
         </w:rPr>
-        <w:t>HU 4.3: Visualización de recomendaciones ("VeraMatch").</w:t>
+        <w:t>HU 4.3: Visualización de recomendaciones ("</w:t>
+      </w:r>
+      <w:proofErr w:type="spellStart"/>
+      <w:r>
+        <w:rPr>
+          <w:b/>
+          <w:bCs/>
+        </w:rPr>
+        <w:t>VeraMatch</w:t>
+      </w:r>
+      <w:proofErr w:type="spellEnd"/>
+      <w:r>
+        <w:rPr>
+          <w:b/>
+          <w:bCs/>
+        </w:rPr>
+        <w:t>").</w:t>
       </w:r>
     </w:p>
     <w:p>
@@ -1739,7 +2295,23 @@
           <w:b/>
           <w:bCs/>
         </w:rPr>
-        <w:t>HU 5.1: Visualización del mapa interactivo (OpenStreetMap).</w:t>
+        <w:t>HU 5.1: Visualización del mapa interactivo (</w:t>
+      </w:r>
+      <w:proofErr w:type="spellStart"/>
+      <w:r>
+        <w:rPr>
+          <w:b/>
+          <w:bCs/>
+        </w:rPr>
+        <w:t>OpenStreetMap</w:t>
+      </w:r>
+      <w:proofErr w:type="spellEnd"/>
+      <w:r>
+        <w:rPr>
+          <w:b/>
+          <w:bCs/>
+        </w:rPr>
+        <w:t>).</w:t>
       </w:r>
     </w:p>
     <w:p>
@@ -1783,322 +2355,542 @@
       <w:r>
         <w:t xml:space="preserve">Librería tipo </w:t>
       </w:r>
+      <w:proofErr w:type="spellStart"/>
       <w:r>
         <w:rPr>
           <w:i/>
           <w:iCs/>
         </w:rPr>
-        <w:t>Leaflet/Mapbox</w:t>
-      </w:r>
-      <w:r>
-        <w:t xml:space="preserve"> integrada con tiles de OpenStreetMap (costo $0).</w:t>
-      </w:r>
-    </w:p>
-    <w:p>
-      <w:pPr>
-        <w:pStyle w:val="ListParagraph"/>
-        <w:numPr>
-          <w:ilvl w:val="2"/>
-          <w:numId w:val="4"/>
-        </w:numPr>
-        <w:spacing w:before="240" w:line="360" w:lineRule="auto"/>
-      </w:pPr>
-      <w:r>
-        <w:t>Renderizado de pines leyendo coordenadas desde el backend.</w:t>
-      </w:r>
-    </w:p>
-    <w:p>
-      <w:pPr>
-        <w:pStyle w:val="ListParagraph"/>
-        <w:numPr>
-          <w:ilvl w:val="1"/>
-          <w:numId w:val="4"/>
-        </w:numPr>
-        <w:spacing w:before="240" w:line="360" w:lineRule="auto"/>
-      </w:pPr>
-      <w:r>
-        <w:rPr>
-          <w:b/>
-          <w:bCs/>
-        </w:rPr>
-        <w:t>HU 5.2: Asignación de ubicación física a una publicación.</w:t>
-      </w:r>
-    </w:p>
-    <w:p>
-      <w:pPr>
-        <w:pStyle w:val="ListParagraph"/>
-        <w:spacing w:before="240" w:line="360" w:lineRule="auto"/>
-      </w:pPr>
-      <w:r>
-        <w:rPr>
-          <w:b/>
-          <w:bCs/>
-        </w:rPr>
-        <w:t>Descripción:</w:t>
-      </w:r>
-      <w:r>
-        <w:t xml:space="preserve"> Como Vendedor, quiero pinchar en el mapa el lugar del campus donde me encuentro, para que los compradores puedan caminar hacia mí.</w:t>
-      </w:r>
-    </w:p>
-    <w:p>
-      <w:pPr>
-        <w:pStyle w:val="ListParagraph"/>
-        <w:spacing w:before="240" w:line="360" w:lineRule="auto"/>
-      </w:pPr>
-      <w:r>
-        <w:rPr>
-          <w:b/>
-          <w:bCs/>
-        </w:rPr>
-        <w:t>Criterios de Aceptación:</w:t>
-      </w:r>
-    </w:p>
-    <w:p>
-      <w:pPr>
-        <w:pStyle w:val="ListParagraph"/>
-        <w:numPr>
-          <w:ilvl w:val="2"/>
-          <w:numId w:val="4"/>
-        </w:numPr>
-        <w:spacing w:before="240" w:line="360" w:lineRule="auto"/>
-      </w:pPr>
-      <w:r>
-        <w:t>Guardado de la latitud y longitud en formato GEOMETRY(Point) en PostGIS.</w:t>
-      </w:r>
-    </w:p>
-    <w:p>
-      <w:pPr>
-        <w:pStyle w:val="ListParagraph"/>
-        <w:numPr>
-          <w:ilvl w:val="1"/>
-          <w:numId w:val="4"/>
-        </w:numPr>
-        <w:spacing w:before="240" w:line="360" w:lineRule="auto"/>
-      </w:pPr>
-      <w:r>
-        <w:rPr>
-          <w:b/>
-          <w:bCs/>
-        </w:rPr>
-        <w:t>HU 5.3: Filtrado del catálogo por radio de cercanía.</w:t>
-      </w:r>
-    </w:p>
-    <w:p>
-      <w:pPr>
-        <w:pStyle w:val="ListParagraph"/>
-        <w:spacing w:before="240" w:line="360" w:lineRule="auto"/>
-      </w:pPr>
-      <w:r>
-        <w:rPr>
-          <w:b/>
-          <w:bCs/>
-        </w:rPr>
-        <w:t>Descripción:</w:t>
-      </w:r>
-      <w:r>
-        <w:t xml:space="preserve"> Como Comprador con hambre, quiero filtrar para ver solo los vendedores que estén a menos de 100 metros de mi edificio.</w:t>
-      </w:r>
-    </w:p>
-    <w:p>
-      <w:pPr>
-        <w:pStyle w:val="ListParagraph"/>
-        <w:spacing w:before="240" w:line="360" w:lineRule="auto"/>
-      </w:pPr>
-      <w:r>
-        <w:rPr>
-          <w:b/>
-          <w:bCs/>
-        </w:rPr>
-        <w:t>Criterios de Aceptación:</w:t>
-      </w:r>
-    </w:p>
-    <w:p>
-      <w:pPr>
-        <w:pStyle w:val="ListParagraph"/>
-        <w:numPr>
-          <w:ilvl w:val="2"/>
-          <w:numId w:val="4"/>
-        </w:numPr>
-        <w:spacing w:before="240" w:line="360" w:lineRule="auto"/>
-      </w:pPr>
-      <w:r>
-        <w:lastRenderedPageBreak/>
-        <w:t>Query espacial utilizando la función ST_DWithin de PostGIS para devolver resultados por radio en metros.</w:t>
-      </w:r>
-    </w:p>
-    <w:p>
-      <w:pPr>
-        <w:pStyle w:val="ListParagraph"/>
-        <w:numPr>
-          <w:ilvl w:val="0"/>
-          <w:numId w:val="4"/>
-        </w:numPr>
-        <w:spacing w:before="240" w:line="360" w:lineRule="auto"/>
-        <w:rPr>
-          <w:b/>
-          <w:bCs/>
-        </w:rPr>
-      </w:pPr>
-      <w:r>
-        <w:rPr>
-          <w:b/>
-          <w:bCs/>
-        </w:rPr>
-        <w:t>EP-06: Negociación y Cierre P2P (Frictionless)</w:t>
-      </w:r>
-    </w:p>
-    <w:p>
-      <w:pPr>
-        <w:pStyle w:val="ListParagraph"/>
-        <w:numPr>
-          <w:ilvl w:val="1"/>
-          <w:numId w:val="4"/>
-        </w:numPr>
-        <w:spacing w:before="240" w:line="360" w:lineRule="auto"/>
-      </w:pPr>
-      <w:r>
-        <w:rPr>
-          <w:b/>
-          <w:bCs/>
-        </w:rPr>
-        <w:t>HU 6.1: Chat interno en tiempo real.</w:t>
-      </w:r>
-    </w:p>
-    <w:p>
-      <w:pPr>
-        <w:pStyle w:val="ListParagraph"/>
-        <w:spacing w:before="240" w:line="360" w:lineRule="auto"/>
-      </w:pPr>
-      <w:r>
-        <w:rPr>
-          <w:b/>
-          <w:bCs/>
-        </w:rPr>
-        <w:t>Descripción:</w:t>
-      </w:r>
-      <w:r>
-        <w:t xml:space="preserve"> Como Usuario, quiero chatear con el vendedor dentro de la app, para negociar sin tener que darle mi número de WhatsApp.</w:t>
-      </w:r>
-    </w:p>
-    <w:p>
-      <w:pPr>
-        <w:pStyle w:val="ListParagraph"/>
-        <w:spacing w:before="240" w:line="360" w:lineRule="auto"/>
-      </w:pPr>
-      <w:r>
-        <w:rPr>
-          <w:b/>
-          <w:bCs/>
-        </w:rPr>
-        <w:t>Criterios de Aceptación:</w:t>
-      </w:r>
-    </w:p>
-    <w:p>
-      <w:pPr>
-        <w:pStyle w:val="ListParagraph"/>
-        <w:numPr>
-          <w:ilvl w:val="2"/>
-          <w:numId w:val="4"/>
-        </w:numPr>
-        <w:spacing w:before="240" w:line="360" w:lineRule="auto"/>
-      </w:pPr>
-      <w:r>
-        <w:t>Implementación usando WebSockets (FastAPI websockets / Socket.io).</w:t>
-      </w:r>
-    </w:p>
-    <w:p>
-      <w:pPr>
-        <w:pStyle w:val="ListParagraph"/>
-        <w:numPr>
-          <w:ilvl w:val="2"/>
-          <w:numId w:val="4"/>
-        </w:numPr>
-        <w:spacing w:before="240" w:line="360" w:lineRule="auto"/>
-      </w:pPr>
-      <w:r>
-        <w:t>Los mensajes se persisten en la base de datos para historial de auditoría.</w:t>
-      </w:r>
-    </w:p>
-    <w:p>
-      <w:pPr>
-        <w:pStyle w:val="ListParagraph"/>
-        <w:numPr>
-          <w:ilvl w:val="1"/>
-          <w:numId w:val="4"/>
-        </w:numPr>
-        <w:spacing w:before="240" w:line="360" w:lineRule="auto"/>
-      </w:pPr>
-      <w:r>
-        <w:rPr>
-          <w:b/>
-          <w:bCs/>
-        </w:rPr>
-        <w:t>HU 6.2 y 6.3: Integración de Deep Link para Nequi / DaviPlata.</w:t>
-      </w:r>
-    </w:p>
-    <w:p>
-      <w:pPr>
-        <w:pStyle w:val="ListParagraph"/>
-        <w:spacing w:before="240" w:line="360" w:lineRule="auto"/>
-      </w:pPr>
-      <w:r>
-        <w:rPr>
-          <w:b/>
-          <w:bCs/>
-        </w:rPr>
-        <w:t>Descripción:</w:t>
-      </w:r>
-      <w:r>
-        <w:t xml:space="preserve"> Como Comprador, quiero un botón que me abra directamente mi app de Nequi o DaviPlata con el número del vendedor, para pagar rápido sin digitar.</w:t>
-      </w:r>
-    </w:p>
-    <w:p>
-      <w:pPr>
-        <w:pStyle w:val="ListParagraph"/>
-        <w:spacing w:before="240" w:line="360" w:lineRule="auto"/>
-      </w:pPr>
-      <w:r>
-        <w:rPr>
-          <w:b/>
-          <w:bCs/>
-        </w:rPr>
-        <w:t>Criterios de Aceptación:</w:t>
-      </w:r>
-    </w:p>
-    <w:p>
-      <w:pPr>
-        <w:pStyle w:val="ListParagraph"/>
-        <w:spacing w:before="240" w:line="360" w:lineRule="auto"/>
-      </w:pPr>
-      <w:r>
-        <w:rPr>
-          <w:b/>
-          <w:bCs/>
-        </w:rPr>
-        <w:t>Restricción de Arquitectura:</w:t>
-      </w:r>
-      <w:r>
-        <w:t xml:space="preserve"> NO hay integración con APIs bancarias (está fuera del alcance del MVP). Solo se genera un </w:t>
-      </w:r>
+        <w:t>Leaflet</w:t>
+      </w:r>
+      <w:proofErr w:type="spellEnd"/>
       <w:r>
         <w:rPr>
           <w:i/>
           <w:iCs/>
         </w:rPr>
-        <w:t>Deep Link</w:t>
-      </w:r>
-      <w:r>
-        <w:t xml:space="preserve"> o </w:t>
-      </w:r>
+        <w:t>/</w:t>
+      </w:r>
+      <w:proofErr w:type="spellStart"/>
       <w:r>
         <w:rPr>
           <w:i/>
           <w:iCs/>
         </w:rPr>
-        <w:t>URI Scheme</w:t>
-      </w:r>
-      <w:r>
-        <w:t xml:space="preserve"> (ej. nequi://... o enlace web) que intenta abrir la app en el teléfono del usuario destino si el vendedor habilitó su número.</w:t>
+        <w:t>Mapbox</w:t>
+      </w:r>
+      <w:proofErr w:type="spellEnd"/>
+      <w:r>
+        <w:t xml:space="preserve"> integrada con tiles de </w:t>
+      </w:r>
+      <w:proofErr w:type="spellStart"/>
+      <w:r>
+        <w:t>OpenStreetMap</w:t>
+      </w:r>
+      <w:proofErr w:type="spellEnd"/>
+      <w:r>
+        <w:t xml:space="preserve"> (costo $0).</w:t>
+      </w:r>
+    </w:p>
+    <w:p>
+      <w:pPr>
+        <w:pStyle w:val="ListParagraph"/>
+        <w:numPr>
+          <w:ilvl w:val="2"/>
+          <w:numId w:val="4"/>
+        </w:numPr>
+        <w:spacing w:before="240" w:line="360" w:lineRule="auto"/>
+      </w:pPr>
+      <w:r>
+        <w:t xml:space="preserve">Renderizado de pines leyendo coordenadas desde el </w:t>
+      </w:r>
+      <w:proofErr w:type="spellStart"/>
+      <w:r>
+        <w:t>backend</w:t>
+      </w:r>
+      <w:proofErr w:type="spellEnd"/>
+      <w:r>
+        <w:t>.</w:t>
+      </w:r>
+    </w:p>
+    <w:p>
+      <w:pPr>
+        <w:pStyle w:val="ListParagraph"/>
+        <w:numPr>
+          <w:ilvl w:val="1"/>
+          <w:numId w:val="4"/>
+        </w:numPr>
+        <w:spacing w:before="240" w:line="360" w:lineRule="auto"/>
+      </w:pPr>
+      <w:r>
+        <w:rPr>
+          <w:b/>
+          <w:bCs/>
+        </w:rPr>
+        <w:t>HU 5.2: Asignación de ubicación física a una publicación.</w:t>
+      </w:r>
+    </w:p>
+    <w:p>
+      <w:pPr>
+        <w:pStyle w:val="ListParagraph"/>
+        <w:spacing w:before="240" w:line="360" w:lineRule="auto"/>
+      </w:pPr>
+      <w:r>
+        <w:rPr>
+          <w:b/>
+          <w:bCs/>
+        </w:rPr>
+        <w:t>Descripción:</w:t>
+      </w:r>
+      <w:r>
+        <w:t xml:space="preserve"> Como Vendedor, quiero pinchar en el mapa el lugar del campus donde me encuentro, para que los compradores puedan caminar hacia mí.</w:t>
+      </w:r>
+    </w:p>
+    <w:p>
+      <w:pPr>
+        <w:pStyle w:val="ListParagraph"/>
+        <w:spacing w:before="240" w:line="360" w:lineRule="auto"/>
+      </w:pPr>
+      <w:r>
+        <w:rPr>
+          <w:b/>
+          <w:bCs/>
+        </w:rPr>
+        <w:t>Criterios de Aceptación:</w:t>
+      </w:r>
+    </w:p>
+    <w:p>
+      <w:pPr>
+        <w:pStyle w:val="ListParagraph"/>
+        <w:numPr>
+          <w:ilvl w:val="2"/>
+          <w:numId w:val="4"/>
+        </w:numPr>
+        <w:spacing w:before="240" w:line="360" w:lineRule="auto"/>
+      </w:pPr>
+      <w:r>
+        <w:t xml:space="preserve">Guardado de la latitud y longitud en formato GEOMETRY(Point) en </w:t>
+      </w:r>
+      <w:proofErr w:type="spellStart"/>
+      <w:r>
+        <w:t>PostGIS</w:t>
+      </w:r>
+      <w:proofErr w:type="spellEnd"/>
+      <w:r>
+        <w:t>.</w:t>
+      </w:r>
+    </w:p>
+    <w:p>
+      <w:pPr>
+        <w:pStyle w:val="ListParagraph"/>
+        <w:numPr>
+          <w:ilvl w:val="1"/>
+          <w:numId w:val="4"/>
+        </w:numPr>
+        <w:spacing w:before="240" w:line="360" w:lineRule="auto"/>
+      </w:pPr>
+      <w:r>
+        <w:rPr>
+          <w:b/>
+          <w:bCs/>
+        </w:rPr>
+        <w:t>HU 5.3: Filtrado del catálogo por radio de cercanía.</w:t>
+      </w:r>
+    </w:p>
+    <w:p>
+      <w:pPr>
+        <w:pStyle w:val="ListParagraph"/>
+        <w:spacing w:before="240" w:line="360" w:lineRule="auto"/>
+      </w:pPr>
+      <w:r>
+        <w:rPr>
+          <w:b/>
+          <w:bCs/>
+        </w:rPr>
+        <w:t>Descripción:</w:t>
+      </w:r>
+      <w:r>
+        <w:t xml:space="preserve"> Como Comprador con hambre, quiero filtrar para ver solo los vendedores que estén a menos de 100 metros de mi edificio.</w:t>
+      </w:r>
+    </w:p>
+    <w:p>
+      <w:pPr>
+        <w:pStyle w:val="ListParagraph"/>
+        <w:spacing w:before="240" w:line="360" w:lineRule="auto"/>
+      </w:pPr>
+      <w:r>
+        <w:rPr>
+          <w:b/>
+          <w:bCs/>
+        </w:rPr>
+        <w:t>Criterios de Aceptación:</w:t>
+      </w:r>
+    </w:p>
+    <w:p>
+      <w:pPr>
+        <w:pStyle w:val="ListParagraph"/>
+        <w:numPr>
+          <w:ilvl w:val="2"/>
+          <w:numId w:val="4"/>
+        </w:numPr>
+        <w:spacing w:before="240" w:line="360" w:lineRule="auto"/>
+      </w:pPr>
+      <w:r>
+        <w:lastRenderedPageBreak/>
+        <w:t xml:space="preserve">Query espacial utilizando la función </w:t>
+      </w:r>
+      <w:proofErr w:type="spellStart"/>
+      <w:r>
+        <w:t>ST_DWithin</w:t>
+      </w:r>
+      <w:proofErr w:type="spellEnd"/>
+      <w:r>
+        <w:t xml:space="preserve"> de </w:t>
+      </w:r>
+      <w:proofErr w:type="spellStart"/>
+      <w:r>
+        <w:t>PostGIS</w:t>
+      </w:r>
+      <w:proofErr w:type="spellEnd"/>
+      <w:r>
+        <w:t xml:space="preserve"> para devolver resultados por radio en metros.</w:t>
+      </w:r>
+    </w:p>
+    <w:p>
+      <w:pPr>
+        <w:pStyle w:val="ListParagraph"/>
+        <w:numPr>
+          <w:ilvl w:val="0"/>
+          <w:numId w:val="4"/>
+        </w:numPr>
+        <w:spacing w:before="240" w:line="360" w:lineRule="auto"/>
+        <w:rPr>
+          <w:b/>
+          <w:bCs/>
+        </w:rPr>
+      </w:pPr>
+      <w:r>
+        <w:rPr>
+          <w:b/>
+          <w:bCs/>
+        </w:rPr>
+        <w:t>EP-06: Negociación y Cierre P2P (</w:t>
+      </w:r>
+      <w:proofErr w:type="spellStart"/>
+      <w:r>
+        <w:rPr>
+          <w:b/>
+          <w:bCs/>
+        </w:rPr>
+        <w:t>Frictionless</w:t>
+      </w:r>
+      <w:proofErr w:type="spellEnd"/>
+      <w:r>
+        <w:rPr>
+          <w:b/>
+          <w:bCs/>
+        </w:rPr>
+        <w:t>)</w:t>
+      </w:r>
+    </w:p>
+    <w:p>
+      <w:pPr>
+        <w:pStyle w:val="ListParagraph"/>
+        <w:numPr>
+          <w:ilvl w:val="1"/>
+          <w:numId w:val="4"/>
+        </w:numPr>
+        <w:spacing w:before="240" w:line="360" w:lineRule="auto"/>
+      </w:pPr>
+      <w:r>
+        <w:rPr>
+          <w:b/>
+          <w:bCs/>
+        </w:rPr>
+        <w:t>HU 6.1: Chat interno en tiempo real.</w:t>
+      </w:r>
+    </w:p>
+    <w:p>
+      <w:pPr>
+        <w:pStyle w:val="ListParagraph"/>
+        <w:spacing w:before="240" w:line="360" w:lineRule="auto"/>
+      </w:pPr>
+      <w:r>
+        <w:rPr>
+          <w:b/>
+          <w:bCs/>
+        </w:rPr>
+        <w:t>Descripción:</w:t>
+      </w:r>
+      <w:r>
+        <w:t xml:space="preserve"> Como Usuario, quiero chatear con el vendedor dentro de la </w:t>
+      </w:r>
+      <w:proofErr w:type="gramStart"/>
+      <w:r>
+        <w:t>app</w:t>
+      </w:r>
+      <w:proofErr w:type="gramEnd"/>
+      <w:r>
+        <w:t>, para negociar sin tener que darle mi número de WhatsApp.</w:t>
+      </w:r>
+    </w:p>
+    <w:p>
+      <w:pPr>
+        <w:pStyle w:val="ListParagraph"/>
+        <w:spacing w:before="240" w:line="360" w:lineRule="auto"/>
+      </w:pPr>
+      <w:r>
+        <w:rPr>
+          <w:b/>
+          <w:bCs/>
+        </w:rPr>
+        <w:t>Criterios de Aceptación:</w:t>
+      </w:r>
+    </w:p>
+    <w:p>
+      <w:pPr>
+        <w:pStyle w:val="ListParagraph"/>
+        <w:numPr>
+          <w:ilvl w:val="2"/>
+          <w:numId w:val="4"/>
+        </w:numPr>
+        <w:spacing w:before="240" w:line="360" w:lineRule="auto"/>
+      </w:pPr>
+      <w:r>
+        <w:t xml:space="preserve">Implementación usando </w:t>
+      </w:r>
+      <w:proofErr w:type="spellStart"/>
+      <w:r>
+        <w:t>WebSockets</w:t>
+      </w:r>
+      <w:proofErr w:type="spellEnd"/>
+      <w:r>
+        <w:t xml:space="preserve"> (</w:t>
+      </w:r>
+      <w:proofErr w:type="spellStart"/>
+      <w:r>
+        <w:t>FastAPI</w:t>
+      </w:r>
+      <w:proofErr w:type="spellEnd"/>
+      <w:r>
+        <w:t xml:space="preserve"> </w:t>
+      </w:r>
+      <w:proofErr w:type="spellStart"/>
+      <w:r>
+        <w:t>websockets</w:t>
+      </w:r>
+      <w:proofErr w:type="spellEnd"/>
+      <w:r>
+        <w:t xml:space="preserve"> / Socket.io).</w:t>
+      </w:r>
+    </w:p>
+    <w:p>
+      <w:pPr>
+        <w:pStyle w:val="ListParagraph"/>
+        <w:numPr>
+          <w:ilvl w:val="2"/>
+          <w:numId w:val="4"/>
+        </w:numPr>
+        <w:spacing w:before="240" w:line="360" w:lineRule="auto"/>
+      </w:pPr>
+      <w:r>
+        <w:t>Los mensajes se persisten en la base de datos para historial de auditoría.</w:t>
+      </w:r>
+    </w:p>
+    <w:p>
+      <w:pPr>
+        <w:pStyle w:val="ListParagraph"/>
+        <w:numPr>
+          <w:ilvl w:val="1"/>
+          <w:numId w:val="4"/>
+        </w:numPr>
+        <w:spacing w:before="240" w:line="360" w:lineRule="auto"/>
+      </w:pPr>
+      <w:r>
+        <w:rPr>
+          <w:b/>
+          <w:bCs/>
+        </w:rPr>
+        <w:t xml:space="preserve">HU 6.2 y 6.3: Integración de Deep </w:t>
+      </w:r>
+      <w:proofErr w:type="gramStart"/>
+      <w:r>
+        <w:rPr>
+          <w:b/>
+          <w:bCs/>
+        </w:rPr>
+        <w:t>Link</w:t>
+      </w:r>
+      <w:proofErr w:type="gramEnd"/>
+      <w:r>
+        <w:rPr>
+          <w:b/>
+          <w:bCs/>
+        </w:rPr>
+        <w:t xml:space="preserve"> para </w:t>
+      </w:r>
+      <w:proofErr w:type="spellStart"/>
+      <w:r>
+        <w:rPr>
+          <w:b/>
+          <w:bCs/>
+        </w:rPr>
+        <w:t>Nequi</w:t>
+      </w:r>
+      <w:proofErr w:type="spellEnd"/>
+      <w:r>
+        <w:rPr>
+          <w:b/>
+          <w:bCs/>
+        </w:rPr>
+        <w:t xml:space="preserve"> / </w:t>
+      </w:r>
+      <w:proofErr w:type="spellStart"/>
+      <w:r>
+        <w:rPr>
+          <w:b/>
+          <w:bCs/>
+        </w:rPr>
+        <w:t>DaviPlata</w:t>
+      </w:r>
+      <w:proofErr w:type="spellEnd"/>
+      <w:r>
+        <w:rPr>
+          <w:b/>
+          <w:bCs/>
+        </w:rPr>
+        <w:t>.</w:t>
+      </w:r>
+    </w:p>
+    <w:p>
+      <w:pPr>
+        <w:pStyle w:val="ListParagraph"/>
+        <w:spacing w:before="240" w:line="360" w:lineRule="auto"/>
+      </w:pPr>
+      <w:r>
+        <w:rPr>
+          <w:b/>
+          <w:bCs/>
+        </w:rPr>
+        <w:t>Descripción:</w:t>
+      </w:r>
+      <w:r>
+        <w:t xml:space="preserve"> Como Comprador, quiero un botón que me abra directamente mi </w:t>
+      </w:r>
+      <w:proofErr w:type="gramStart"/>
+      <w:r>
+        <w:t>app</w:t>
+      </w:r>
+      <w:proofErr w:type="gramEnd"/>
+      <w:r>
+        <w:t xml:space="preserve"> de </w:t>
+      </w:r>
+      <w:proofErr w:type="spellStart"/>
+      <w:r>
+        <w:t>Nequi</w:t>
+      </w:r>
+      <w:proofErr w:type="spellEnd"/>
+      <w:r>
+        <w:t xml:space="preserve"> o </w:t>
+      </w:r>
+      <w:proofErr w:type="spellStart"/>
+      <w:r>
+        <w:t>DaviPlata</w:t>
+      </w:r>
+      <w:proofErr w:type="spellEnd"/>
+      <w:r>
+        <w:t xml:space="preserve"> con el número del vendedor, para pagar rápido sin digitar.</w:t>
+      </w:r>
+    </w:p>
+    <w:p>
+      <w:pPr>
+        <w:pStyle w:val="ListParagraph"/>
+        <w:spacing w:before="240" w:line="360" w:lineRule="auto"/>
+      </w:pPr>
+      <w:r>
+        <w:rPr>
+          <w:b/>
+          <w:bCs/>
+        </w:rPr>
+        <w:t>Criterios de Aceptación:</w:t>
+      </w:r>
+    </w:p>
+    <w:p>
+      <w:pPr>
+        <w:pStyle w:val="ListParagraph"/>
+        <w:spacing w:before="240" w:line="360" w:lineRule="auto"/>
+      </w:pPr>
+      <w:r>
+        <w:rPr>
+          <w:b/>
+          <w:bCs/>
+        </w:rPr>
+        <w:t>Restricción de Arquitectura:</w:t>
+      </w:r>
+      <w:r>
+        <w:t xml:space="preserve"> NO hay integración con </w:t>
+      </w:r>
+      <w:proofErr w:type="spellStart"/>
+      <w:r>
+        <w:t>APIs</w:t>
+      </w:r>
+      <w:proofErr w:type="spellEnd"/>
+      <w:r>
+        <w:t xml:space="preserve"> bancarias (está fuera del alcance del MVP). Solo se genera un </w:t>
+      </w:r>
+      <w:r>
+        <w:rPr>
+          <w:i/>
+          <w:iCs/>
+        </w:rPr>
+        <w:t xml:space="preserve">Deep </w:t>
+      </w:r>
+      <w:proofErr w:type="gramStart"/>
+      <w:r>
+        <w:rPr>
+          <w:i/>
+          <w:iCs/>
+        </w:rPr>
+        <w:t>Link</w:t>
+      </w:r>
+      <w:proofErr w:type="gramEnd"/>
+      <w:r>
+        <w:t xml:space="preserve"> o </w:t>
+      </w:r>
+      <w:r>
+        <w:rPr>
+          <w:i/>
+          <w:iCs/>
+        </w:rPr>
+        <w:t xml:space="preserve">URI </w:t>
+      </w:r>
+      <w:proofErr w:type="spellStart"/>
+      <w:r>
+        <w:rPr>
+          <w:i/>
+          <w:iCs/>
+        </w:rPr>
+        <w:t>Scheme</w:t>
+      </w:r>
+      <w:proofErr w:type="spellEnd"/>
+      <w:r>
+        <w:t xml:space="preserve"> (ej. </w:t>
+      </w:r>
+      <w:proofErr w:type="spellStart"/>
+      <w:r>
+        <w:t>nequi</w:t>
+      </w:r>
+      <w:proofErr w:type="spellEnd"/>
+      <w:r>
+        <w:t xml:space="preserve">://... o enlace web) que intenta abrir la </w:t>
+      </w:r>
+      <w:proofErr w:type="gramStart"/>
+      <w:r>
+        <w:t>app</w:t>
+      </w:r>
+      <w:proofErr w:type="gramEnd"/>
+      <w:r>
+        <w:t xml:space="preserve"> en el teléfono del usuario destino si el vendedor habilitó su número.</w:t>
       </w:r>
     </w:p>
     <w:p>
@@ -2232,6 +3024,7 @@
       <w:r>
         <w:t xml:space="preserve">Un </w:t>
       </w:r>
+      <w:proofErr w:type="spellStart"/>
       <w:r>
         <w:rPr>
           <w:i/>
@@ -2239,8 +3032,17 @@
         </w:rPr>
         <w:t>trigger</w:t>
       </w:r>
-      <w:r>
-        <w:t xml:space="preserve"> o función backend inserta el valor transaccional en COP en una tabla de métricas en el momento en que el estado cambia a "Completado".</w:t>
+      <w:proofErr w:type="spellEnd"/>
+      <w:r>
+        <w:t xml:space="preserve"> o función </w:t>
+      </w:r>
+      <w:proofErr w:type="spellStart"/>
+      <w:r>
+        <w:t>backend</w:t>
+      </w:r>
+      <w:proofErr w:type="spellEnd"/>
+      <w:r>
+        <w:t xml:space="preserve"> inserta el valor transaccional en COP en una tabla de métricas en el momento en que el estado cambia a "Completado".</w:t>
       </w:r>
     </w:p>
     <w:p>
@@ -2468,7 +3270,15 @@
         <w:spacing w:before="240" w:line="360" w:lineRule="auto"/>
       </w:pPr>
       <w:r>
-        <w:t>Si un producto recibe X número de reportes (ej. 3), el sistema lo oculta automáticamente (cambia is_active=false) hasta que un administrador lo revise.</w:t>
+        <w:t xml:space="preserve">Si un producto recibe X número de reportes (ej. 3), el sistema lo oculta automáticamente (cambia </w:t>
+      </w:r>
+      <w:proofErr w:type="spellStart"/>
+      <w:r>
+        <w:t>is_active</w:t>
+      </w:r>
+      <w:proofErr w:type="spellEnd"/>
+      <w:r>
+        <w:t>=false) hasta que un administrador lo revise.</w:t>
       </w:r>
       <w:r>
         <w:rPr>
@@ -2516,7 +3326,23 @@
         <w:t>El sistema debe validar que los correos electrónicos ingresados en el registro pertenezcan</w:t>
       </w:r>
       <w:r>
-        <w:t xml:space="preserve"> a los registros dados por sinapsis uao (archivos .csv)</w:t>
+        <w:t xml:space="preserve"> a los registros dados por sinapsis </w:t>
+      </w:r>
+      <w:proofErr w:type="spellStart"/>
+      <w:r>
+        <w:t>uao</w:t>
+      </w:r>
+      <w:proofErr w:type="spellEnd"/>
+      <w:r>
+        <w:t xml:space="preserve"> (archivos .</w:t>
+      </w:r>
+      <w:proofErr w:type="spellStart"/>
+      <w:r>
+        <w:t>csv</w:t>
+      </w:r>
+      <w:proofErr w:type="spellEnd"/>
+      <w:r>
+        <w:t>)</w:t>
       </w:r>
     </w:p>
     <w:p>
@@ -2636,7 +3462,23 @@
         <w:t xml:space="preserve">RF-07 (Enlaces de Pago Externos): </w:t>
       </w:r>
       <w:r>
-        <w:t>El sistema debe generar botones que abran directamente las aplicaciones de billeteras digitales (Nequi/DaviPlata) instaladas en el dispositivo del usuario.</w:t>
+        <w:t>El sistema debe generar botones que abran directamente las aplicaciones de billeteras digitales (</w:t>
+      </w:r>
+      <w:proofErr w:type="spellStart"/>
+      <w:r>
+        <w:t>Nequi</w:t>
+      </w:r>
+      <w:proofErr w:type="spellEnd"/>
+      <w:r>
+        <w:t>/</w:t>
+      </w:r>
+      <w:proofErr w:type="spellStart"/>
+      <w:r>
+        <w:t>DaviPlata</w:t>
+      </w:r>
+      <w:proofErr w:type="spellEnd"/>
+      <w:r>
+        <w:t>) instaladas en el dispositivo del usuario.</w:t>
       </w:r>
     </w:p>
     <w:p>
@@ -2790,7 +3632,23 @@
         <w:spacing w:before="240" w:line="360" w:lineRule="auto"/>
       </w:pPr>
       <w:r>
-        <w:t>La arquitectura backend (FastAPI) debe soportar 500 usuarios concurrentes y picos de hasta 1,200 usuarios/hora sin degradación de servicio. La base de datos debe soportar un catálogo de 15,000 productos activos.</w:t>
+        <w:t xml:space="preserve">La arquitectura </w:t>
+      </w:r>
+      <w:proofErr w:type="spellStart"/>
+      <w:r>
+        <w:t>backend</w:t>
+      </w:r>
+      <w:proofErr w:type="spellEnd"/>
+      <w:r>
+        <w:t xml:space="preserve"> (</w:t>
+      </w:r>
+      <w:proofErr w:type="spellStart"/>
+      <w:r>
+        <w:t>FastAPI</w:t>
+      </w:r>
+      <w:proofErr w:type="spellEnd"/>
+      <w:r>
+        <w:t>) debe soportar 500 usuarios concurrentes y picos de hasta 1,200 usuarios/hora sin degradación de servicio. La base de datos debe soportar un catálogo de 15,000 productos activos.</w:t>
       </w:r>
     </w:p>
     <w:p>
@@ -2811,16 +3669,58 @@
           <w:b/>
           <w:bCs/>
         </w:rPr>
-        <w:t xml:space="preserve">RNF-03 (Instalabilidad PWA): </w:t>
-      </w:r>
-    </w:p>
-    <w:p>
-      <w:pPr>
-        <w:pStyle w:val="ListParagraph"/>
-        <w:spacing w:before="240" w:line="360" w:lineRule="auto"/>
-      </w:pPr>
-      <w:r>
-        <w:t>La interfaz frontend (Next.js) debe cumplir con los estándares de Progressive Web App (Service Worker base, manifest.json) para permitir su instalación en iOS y Android.</w:t>
+        <w:t>RNF-03 (</w:t>
+      </w:r>
+      <w:proofErr w:type="spellStart"/>
+      <w:r>
+        <w:rPr>
+          <w:b/>
+          <w:bCs/>
+        </w:rPr>
+        <w:t>Instalabilidad</w:t>
+      </w:r>
+      <w:proofErr w:type="spellEnd"/>
+      <w:r>
+        <w:rPr>
+          <w:b/>
+          <w:bCs/>
+        </w:rPr>
+        <w:t xml:space="preserve"> PWA): </w:t>
+      </w:r>
+    </w:p>
+    <w:p>
+      <w:pPr>
+        <w:pStyle w:val="ListParagraph"/>
+        <w:spacing w:before="240" w:line="360" w:lineRule="auto"/>
+      </w:pPr>
+      <w:r>
+        <w:t xml:space="preserve">La interfaz </w:t>
+      </w:r>
+      <w:proofErr w:type="spellStart"/>
+      <w:r>
+        <w:t>frontend</w:t>
+      </w:r>
+      <w:proofErr w:type="spellEnd"/>
+      <w:r>
+        <w:t xml:space="preserve"> (Next.js) debe cumplir con los estándares de </w:t>
+      </w:r>
+      <w:proofErr w:type="spellStart"/>
+      <w:r>
+        <w:t>Progressive</w:t>
+      </w:r>
+      <w:proofErr w:type="spellEnd"/>
+      <w:r>
+        <w:t xml:space="preserve"> Web App (Service Worker base, </w:t>
+      </w:r>
+      <w:proofErr w:type="spellStart"/>
+      <w:proofErr w:type="gramStart"/>
+      <w:r>
+        <w:t>manifest.json</w:t>
+      </w:r>
+      <w:proofErr w:type="spellEnd"/>
+      <w:proofErr w:type="gramEnd"/>
+      <w:r>
+        <w:t>) para permitir su instalación en iOS y Android.</w:t>
       </w:r>
     </w:p>
     <w:p>
@@ -2855,7 +3755,49 @@
         <w:rPr>
           <w:highlight w:val="yellow"/>
         </w:rPr>
-        <w:t>Durante una prueba de carga simulando 500 usuarios concurrentes enviando mensajes simultáneamente, el sistema de WebSockets debe procesar y entregar el 95% de los mensajes (percentil p95) en un tiempo de viaje de ida y vuelta (round-trip time) inferior a 500 milisegundos.</w:t>
+        <w:t xml:space="preserve">Durante una prueba de carga simulando 500 usuarios concurrentes enviando mensajes simultáneamente, el sistema de </w:t>
+      </w:r>
+      <w:proofErr w:type="spellStart"/>
+      <w:r>
+        <w:rPr>
+          <w:highlight w:val="yellow"/>
+        </w:rPr>
+        <w:t>WebSockets</w:t>
+      </w:r>
+      <w:proofErr w:type="spellEnd"/>
+      <w:r>
+        <w:rPr>
+          <w:highlight w:val="yellow"/>
+        </w:rPr>
+        <w:t xml:space="preserve"> debe procesar y entregar el 95% de los mensajes (percentil p95) en un tiempo de viaje de ida y vuelta (</w:t>
+      </w:r>
+      <w:proofErr w:type="gramStart"/>
+      <w:r>
+        <w:rPr>
+          <w:highlight w:val="yellow"/>
+        </w:rPr>
+        <w:t>round</w:t>
+      </w:r>
+      <w:proofErr w:type="gramEnd"/>
+      <w:r>
+        <w:rPr>
+          <w:highlight w:val="yellow"/>
+        </w:rPr>
+        <w:t>-</w:t>
+      </w:r>
+      <w:proofErr w:type="spellStart"/>
+      <w:r>
+        <w:rPr>
+          <w:highlight w:val="yellow"/>
+        </w:rPr>
+        <w:t>trip</w:t>
+      </w:r>
+      <w:proofErr w:type="spellEnd"/>
+      <w:r>
+        <w:rPr>
+          <w:highlight w:val="yellow"/>
+        </w:rPr>
+        <w:t xml:space="preserve"> time) inferior a 500 milisegundos.</w:t>
       </w:r>
     </w:p>
     <w:p>
@@ -2911,7 +3853,15 @@
         <w:spacing w:before="240" w:line="360" w:lineRule="auto"/>
       </w:pPr>
       <w:r>
-        <w:t>Si el usuario pierde la conexión a internet de la universidad, la app debe mostrar una advertencia de "Sin conexión" de forma controlada y no romper la interfaz gráfica de manera abrupta.</w:t>
+        <w:t xml:space="preserve">Si el usuario pierde la conexión a internet de la universidad, la </w:t>
+      </w:r>
+      <w:proofErr w:type="gramStart"/>
+      <w:r>
+        <w:t>app</w:t>
+      </w:r>
+      <w:proofErr w:type="gramEnd"/>
+      <w:r>
+        <w:t xml:space="preserve"> debe mostrar una advertencia de "Sin conexión" de forma controlada y no romper la interfaz gráfica de manera abrupta.</w:t>
       </w:r>
     </w:p>
     <w:p>
@@ -2945,19 +3895,34 @@
           <w:highlight w:val="yellow"/>
         </w:rPr>
         <w:lastRenderedPageBreak/>
-        <w:t>código hacia servicios pagos (AWS RDS, Vercel Pro) una vez se confirme la escalabilidad futura.</w:t>
-      </w:r>
-    </w:p>
-    <w:p>
-      <w:pPr>
-        <w:pStyle w:val="ListParagraph"/>
-        <w:spacing w:before="240" w:line="360" w:lineRule="auto"/>
+        <w:t xml:space="preserve">código hacia servicios pagos (AWS RDS, </w:t>
+      </w:r>
+      <w:proofErr w:type="spellStart"/>
+      <w:r>
         <w:rPr>
           <w:highlight w:val="yellow"/>
         </w:rPr>
+        <w:t>Vercel</w:t>
+      </w:r>
+      <w:proofErr w:type="spellEnd"/>
+      <w:r>
+        <w:rPr>
+          <w:highlight w:val="yellow"/>
+        </w:rPr>
+        <w:t xml:space="preserve"> Pro) una vez se confirme la escalabilidad futura.</w:t>
+      </w:r>
+    </w:p>
+    <w:p>
+      <w:pPr>
+        <w:pStyle w:val="ListParagraph"/>
+        <w:spacing w:before="240" w:line="360" w:lineRule="auto"/>
+        <w:rPr>
+          <w:highlight w:val="yellow"/>
+        </w:rPr>
       </w:pPr>
     </w:p>
     <w:sectPr>
+      <w:type w:val="continuous"/>
       <w:pgSz w:w="12240" w:h="15840"/>
       <w:pgMar w:top="1440" w:right="1440" w:bottom="1440" w:left="1440" w:header="708" w:footer="708" w:gutter="0"/>
       <w:cols w:space="708"/>

</xml_diff>

<commit_message>
docs: seed products script, docker environments and Sprint 3 architecture walkthrough
</commit_message>
<xml_diff>
--- a/docs/Docx/P. Requerimientos (F + NF) y Épicas.docx
+++ b/docs/Docx/P. Requerimientos (F + NF) y Épicas.docx
@@ -195,7 +195,23 @@
           <w:b/>
           <w:bCs/>
         </w:rPr>
-        <w:t>Sprint 1: HU 0.1, HU 0.2, HU 0.3</w:t>
+        <w:t xml:space="preserve">Sprint </w:t>
+      </w:r>
+      <w:r>
+        <w:rPr>
+          <w:rFonts w:asciiTheme="majorHAnsi" w:hAnsiTheme="majorHAnsi"/>
+          <w:b/>
+          <w:bCs/>
+        </w:rPr>
+        <w:t>0</w:t>
+      </w:r>
+      <w:r>
+        <w:rPr>
+          <w:rFonts w:asciiTheme="majorHAnsi" w:hAnsiTheme="majorHAnsi"/>
+          <w:b/>
+          <w:bCs/>
+        </w:rPr>
+        <w:t>: HU 0.1, HU 0.2, HU 0.3</w:t>
       </w:r>
     </w:p>
     <w:p>
@@ -233,23 +249,7 @@
           <w:b/>
           <w:bCs/>
         </w:rPr>
-        <w:t xml:space="preserve">HU 0.1: Inicialización del </w:t>
-      </w:r>
-      <w:proofErr w:type="spellStart"/>
-      <w:r>
-        <w:rPr>
-          <w:b/>
-          <w:bCs/>
-        </w:rPr>
-        <w:t>monorepo</w:t>
-      </w:r>
-      <w:proofErr w:type="spellEnd"/>
-      <w:r>
-        <w:rPr>
-          <w:b/>
-          <w:bCs/>
-        </w:rPr>
-        <w:t xml:space="preserve"> y configuración del pipeline CI/CD.</w:t>
+        <w:t>HU 0.1: Inicialización del monorepo y configuración del pipeline CI/CD.</w:t>
       </w:r>
     </w:p>
     <w:p>
@@ -265,23 +265,7 @@
         <w:t>Descripción:</w:t>
       </w:r>
       <w:r>
-        <w:t xml:space="preserve"> Como Desarrollador, quiero tener un </w:t>
-      </w:r>
-      <w:proofErr w:type="spellStart"/>
-      <w:r>
-        <w:t>monorepo</w:t>
-      </w:r>
-      <w:proofErr w:type="spellEnd"/>
-      <w:r>
-        <w:t xml:space="preserve"> configurado con Next.js y </w:t>
-      </w:r>
-      <w:proofErr w:type="spellStart"/>
-      <w:r>
-        <w:t>FastAPI</w:t>
-      </w:r>
-      <w:proofErr w:type="spellEnd"/>
-      <w:r>
-        <w:t>, integrado con un pipeline de CI/CD, para poder desplegar cambios automáticamente y sin errores en los entornos de nube gratuitos.</w:t>
+        <w:t xml:space="preserve"> Como Desarrollador, quiero tener un monorepo configurado con Next.js y FastAPI, integrado con un pipeline de CI/CD, para poder desplegar cambios automáticamente y sin errores en los entornos de nube gratuitos.</w:t>
       </w:r>
     </w:p>
     <w:p>
@@ -307,23 +291,7 @@
         <w:spacing w:before="240" w:line="360" w:lineRule="auto"/>
       </w:pPr>
       <w:r>
-        <w:t>Estructura de carpetas /</w:t>
-      </w:r>
-      <w:proofErr w:type="spellStart"/>
-      <w:r>
-        <w:t>frontend</w:t>
-      </w:r>
-      <w:proofErr w:type="spellEnd"/>
-      <w:r>
-        <w:t xml:space="preserve"> y /</w:t>
-      </w:r>
-      <w:proofErr w:type="spellStart"/>
-      <w:r>
-        <w:t>backend</w:t>
-      </w:r>
-      <w:proofErr w:type="spellEnd"/>
-      <w:r>
-        <w:t xml:space="preserve"> creada.</w:t>
+        <w:t>Estructura de carpetas /frontend y /backend creada.</w:t>
       </w:r>
     </w:p>
     <w:p>
@@ -336,23 +304,7 @@
         <w:spacing w:before="240" w:line="360" w:lineRule="auto"/>
       </w:pPr>
       <w:r>
-        <w:t xml:space="preserve">GitHub </w:t>
-      </w:r>
-      <w:proofErr w:type="spellStart"/>
-      <w:r>
-        <w:t>Actions</w:t>
-      </w:r>
-      <w:proofErr w:type="spellEnd"/>
-      <w:r>
-        <w:t xml:space="preserve"> configurado (</w:t>
-      </w:r>
-      <w:proofErr w:type="spellStart"/>
-      <w:r>
-        <w:t>deploy.yml</w:t>
-      </w:r>
-      <w:proofErr w:type="spellEnd"/>
-      <w:r>
-        <w:t>).</w:t>
+        <w:t>GitHub Actions configurado (deploy.yml).</w:t>
       </w:r>
     </w:p>
     <w:p>
@@ -367,7 +319,6 @@
       <w:r>
         <w:t xml:space="preserve">Un </w:t>
       </w:r>
-      <w:proofErr w:type="spellStart"/>
       <w:r>
         <w:rPr>
           <w:i/>
@@ -375,19 +326,9 @@
         </w:rPr>
         <w:t>push</w:t>
       </w:r>
-      <w:proofErr w:type="spellEnd"/>
-      <w:r>
-        <w:t xml:space="preserve"> a la rama </w:t>
-      </w:r>
-      <w:proofErr w:type="spellStart"/>
-      <w:r>
-        <w:t>main</w:t>
-      </w:r>
-      <w:proofErr w:type="spellEnd"/>
-      <w:r>
-        <w:t xml:space="preserve"> dispara automáticamente el </w:t>
-      </w:r>
-      <w:proofErr w:type="spellStart"/>
+      <w:r>
+        <w:t xml:space="preserve"> a la rama main dispara automáticamente el </w:t>
+      </w:r>
       <w:r>
         <w:rPr>
           <w:i/>
@@ -395,33 +336,8 @@
         </w:rPr>
         <w:t>linting</w:t>
       </w:r>
-      <w:proofErr w:type="spellEnd"/>
-      <w:r>
-        <w:t xml:space="preserve"> y el despliegue en </w:t>
-      </w:r>
-      <w:proofErr w:type="spellStart"/>
-      <w:r>
-        <w:t>Vercel</w:t>
-      </w:r>
-      <w:proofErr w:type="spellEnd"/>
-      <w:r>
-        <w:t xml:space="preserve"> (</w:t>
-      </w:r>
-      <w:proofErr w:type="spellStart"/>
-      <w:r>
-        <w:t>Frontend</w:t>
-      </w:r>
-      <w:proofErr w:type="spellEnd"/>
-      <w:r>
-        <w:t>) y Render.com (</w:t>
-      </w:r>
-      <w:proofErr w:type="spellStart"/>
-      <w:r>
-        <w:t>Backend</w:t>
-      </w:r>
-      <w:proofErr w:type="spellEnd"/>
-      <w:r>
-        <w:t>).</w:t>
+      <w:r>
+        <w:t xml:space="preserve"> y el despliegue en Vercel (Frontend) y Render.com (Backend).</w:t>
       </w:r>
     </w:p>
     <w:p>
@@ -445,23 +361,7 @@
           <w:b/>
           <w:bCs/>
         </w:rPr>
-        <w:t>HU 0.2: Modelado y despliegue del esquema de base de datos relacional con soporte espacial (</w:t>
-      </w:r>
-      <w:proofErr w:type="spellStart"/>
-      <w:r>
-        <w:rPr>
-          <w:b/>
-          <w:bCs/>
-        </w:rPr>
-        <w:t>PostGIS</w:t>
-      </w:r>
-      <w:proofErr w:type="spellEnd"/>
-      <w:r>
-        <w:rPr>
-          <w:b/>
-          <w:bCs/>
-        </w:rPr>
-        <w:t>).</w:t>
+        <w:t>HU 0.2: Modelado y despliegue del esquema de base de datos relacional con soporte espacial (PostGIS).</w:t>
       </w:r>
     </w:p>
     <w:p>
@@ -477,15 +377,7 @@
         <w:t>Descripción:</w:t>
       </w:r>
       <w:r>
-        <w:t xml:space="preserve"> Como Arquitecto de Datos, quiero desplegar el esquema en PostgreSQL habilitando </w:t>
-      </w:r>
-      <w:proofErr w:type="spellStart"/>
-      <w:r>
-        <w:t>PostGIS</w:t>
-      </w:r>
-      <w:proofErr w:type="spellEnd"/>
-      <w:r>
-        <w:t>, para almacenar usuarios, productos y coordenadas geográficas de forma segura.</w:t>
+        <w:t xml:space="preserve"> Como Arquitecto de Datos, quiero desplegar el esquema en PostgreSQL habilitando PostGIS, para almacenar usuarios, productos y coordenadas geográficas de forma segura.</w:t>
       </w:r>
     </w:p>
     <w:p>
@@ -511,15 +403,7 @@
         <w:spacing w:before="240" w:line="360" w:lineRule="auto"/>
       </w:pPr>
       <w:r>
-        <w:t>Instancia creada en capa gratuita (</w:t>
-      </w:r>
-      <w:proofErr w:type="spellStart"/>
-      <w:r>
-        <w:t>Supabase</w:t>
-      </w:r>
-      <w:proofErr w:type="spellEnd"/>
-      <w:r>
-        <w:t>/Neon).</w:t>
+        <w:t>Instancia creada en capa gratuita (Supabase/Neon).</w:t>
       </w:r>
     </w:p>
     <w:p>
@@ -532,15 +416,7 @@
         <w:spacing w:before="240" w:line="360" w:lineRule="auto"/>
       </w:pPr>
       <w:r>
-        <w:t xml:space="preserve">Extensión </w:t>
-      </w:r>
-      <w:proofErr w:type="spellStart"/>
-      <w:r>
-        <w:t>PostGIS</w:t>
-      </w:r>
-      <w:proofErr w:type="spellEnd"/>
-      <w:r>
-        <w:t xml:space="preserve"> activada.</w:t>
+        <w:t>Extensión PostGIS activada.</w:t>
       </w:r>
     </w:p>
     <w:p>
@@ -597,15 +473,7 @@
         <w:t>Descripción:</w:t>
       </w:r>
       <w:r>
-        <w:t xml:space="preserve"> Como DevOps, quiero configurar los dominios y el SSL, para garantizar que toda la transferencia de datos (especialmente la geolocalización de la PWA) </w:t>
-      </w:r>
-      <w:proofErr w:type="gramStart"/>
-      <w:r>
-        <w:t>viaje cifrada</w:t>
-      </w:r>
-      <w:proofErr w:type="gramEnd"/>
-      <w:r>
-        <w:t>.</w:t>
+        <w:t xml:space="preserve"> Como DevOps, quiero configurar los dominios y el SSL, para garantizar que toda la transferencia de datos (especialmente la geolocalización de la PWA) viaje cifrada.</w:t>
       </w:r>
     </w:p>
     <w:p>
@@ -635,23 +503,7 @@
         <w:spacing w:before="240" w:line="360" w:lineRule="auto"/>
       </w:pPr>
       <w:r>
-        <w:t xml:space="preserve">Dominio </w:t>
-      </w:r>
-      <w:proofErr w:type="spellStart"/>
-      <w:r>
-        <w:t>veramarket.app</w:t>
-      </w:r>
-      <w:proofErr w:type="spellEnd"/>
-      <w:r>
-        <w:t xml:space="preserve"> configurado en </w:t>
-      </w:r>
-      <w:proofErr w:type="spellStart"/>
-      <w:r>
-        <w:t>Cloudflare</w:t>
-      </w:r>
-      <w:proofErr w:type="spellEnd"/>
-      <w:r>
-        <w:t>.</w:t>
+        <w:t>Dominio veramarket.app configurado en Cloudflare.</w:t>
       </w:r>
     </w:p>
     <w:p>
@@ -676,42 +528,38 @@
         </w:numPr>
         <w:spacing w:before="240" w:line="360" w:lineRule="auto"/>
       </w:pPr>
-      <w:proofErr w:type="gramStart"/>
-      <w:r>
-        <w:t>Archivos .</w:t>
-      </w:r>
-      <w:proofErr w:type="spellStart"/>
-      <w:r>
-        <w:t>env</w:t>
-      </w:r>
-      <w:proofErr w:type="spellEnd"/>
-      <w:proofErr w:type="gramEnd"/>
-      <w:r>
-        <w:t xml:space="preserve"> segregados (Local, </w:t>
-      </w:r>
-      <w:proofErr w:type="spellStart"/>
-      <w:r>
-        <w:t>Staging</w:t>
-      </w:r>
-      <w:proofErr w:type="spellEnd"/>
-      <w:r>
-        <w:t>, Producción) sin subir secretos al repositorio.</w:t>
-      </w:r>
-    </w:p>
-    <w:p>
-      <w:pPr>
-        <w:spacing w:before="240" w:line="360" w:lineRule="auto"/>
-        <w:rPr>
-          <w:b/>
-          <w:bCs/>
-        </w:rPr>
-      </w:pPr>
-      <w:r>
-        <w:rPr>
-          <w:b/>
-          <w:bCs/>
-        </w:rPr>
-        <w:t>Sprint 2: HU 1.1, HU 1.2, HU 1.3, HU 1.4, HU 1.5, HU 2.1, HU 2.2, HU 2.3</w:t>
+      <w:r>
+        <w:t>Archivos .env segregados (Local, Staging, Producción) sin subir secretos al repositorio.</w:t>
+      </w:r>
+    </w:p>
+    <w:p>
+      <w:pPr>
+        <w:spacing w:before="240" w:line="360" w:lineRule="auto"/>
+        <w:rPr>
+          <w:b/>
+          <w:bCs/>
+        </w:rPr>
+      </w:pPr>
+      <w:r>
+        <w:rPr>
+          <w:b/>
+          <w:bCs/>
+        </w:rPr>
+        <w:t xml:space="preserve">Sprint </w:t>
+      </w:r>
+      <w:r>
+        <w:rPr>
+          <w:b/>
+          <w:bCs/>
+        </w:rPr>
+        <w:t>1</w:t>
+      </w:r>
+      <w:r>
+        <w:rPr>
+          <w:b/>
+          <w:bCs/>
+        </w:rPr>
+        <w:t>: HU 1.1, HU 1.2, HU 1.3, HU 1.4, HU 1.5, HU 2.1, HU 2.2, HU 2.3</w:t>
       </w:r>
     </w:p>
     <w:p>
@@ -732,23 +580,7 @@
           <w:b/>
           <w:bCs/>
         </w:rPr>
-        <w:t>EP-01: Autenticación Segura y Perfilamiento (</w:t>
-      </w:r>
-      <w:proofErr w:type="spellStart"/>
-      <w:r>
-        <w:rPr>
-          <w:b/>
-          <w:bCs/>
-        </w:rPr>
-        <w:t>Privacy</w:t>
-      </w:r>
-      <w:proofErr w:type="spellEnd"/>
-      <w:r>
-        <w:rPr>
-          <w:b/>
-          <w:bCs/>
-        </w:rPr>
-        <w:t>-First)</w:t>
+        <w:t>EP-01: Autenticación Segura y Perfilamiento (Privacy-First)</w:t>
       </w:r>
     </w:p>
     <w:p>
@@ -783,24 +615,11 @@
       <w:r>
         <w:t xml:space="preserve"> Como Usuario, quiero ingresar con mi </w:t>
       </w:r>
-      <w:proofErr w:type="gramStart"/>
       <w:r>
         <w:t xml:space="preserve">correo </w:t>
       </w:r>
       <w:r>
-        <w:t xml:space="preserve"> y</w:t>
-      </w:r>
-      <w:proofErr w:type="gramEnd"/>
-      <w:r>
-        <w:t xml:space="preserve"> recibir un código temporal, para acceder a la </w:t>
-      </w:r>
-      <w:proofErr w:type="gramStart"/>
-      <w:r>
-        <w:t>app</w:t>
-      </w:r>
-      <w:proofErr w:type="gramEnd"/>
-      <w:r>
-        <w:t xml:space="preserve"> sin tener que memorizar otra contraseña.</w:t>
+        <w:t xml:space="preserve"> y recibir un código temporal, para acceder a la app sin tener que memorizar otra contraseña.</w:t>
       </w:r>
     </w:p>
     <w:p>
@@ -828,13 +647,8 @@
       <w:r>
         <w:t xml:space="preserve">El sistema solo acepta </w:t>
       </w:r>
-      <w:proofErr w:type="gramStart"/>
-      <w:r>
-        <w:t>correos concordante</w:t>
-      </w:r>
-      <w:proofErr w:type="gramEnd"/>
-      <w:r>
-        <w:t xml:space="preserve"> a los registros dados por sinapsis</w:t>
+      <w:r>
+        <w:t>correos concordante a los registros dados por sinapsis</w:t>
       </w:r>
     </w:p>
     <w:p>
@@ -919,15 +733,7 @@
         <w:spacing w:before="240" w:line="360" w:lineRule="auto"/>
       </w:pPr>
       <w:r>
-        <w:t xml:space="preserve">Se crea el registro en la tabla </w:t>
-      </w:r>
-      <w:proofErr w:type="spellStart"/>
-      <w:r>
-        <w:t>users</w:t>
-      </w:r>
-      <w:proofErr w:type="spellEnd"/>
-      <w:r>
-        <w:t xml:space="preserve"> al validar el primer OTP.</w:t>
+        <w:t>Se crea el registro en la tabla users al validar el primer OTP.</w:t>
       </w:r>
     </w:p>
     <w:p>
@@ -1000,39 +806,7 @@
         <w:spacing w:before="240" w:line="360" w:lineRule="auto"/>
       </w:pPr>
       <w:r>
-        <w:t xml:space="preserve">El </w:t>
-      </w:r>
-      <w:proofErr w:type="spellStart"/>
-      <w:r>
-        <w:t>toggle</w:t>
-      </w:r>
-      <w:proofErr w:type="spellEnd"/>
-      <w:r>
-        <w:t xml:space="preserve"> por defecto está en Oculto (</w:t>
-      </w:r>
-      <w:proofErr w:type="spellStart"/>
-      <w:r>
-        <w:t>Privacy</w:t>
-      </w:r>
-      <w:proofErr w:type="spellEnd"/>
-      <w:r>
-        <w:t xml:space="preserve"> </w:t>
-      </w:r>
-      <w:proofErr w:type="spellStart"/>
-      <w:r>
-        <w:t>by</w:t>
-      </w:r>
-      <w:proofErr w:type="spellEnd"/>
-      <w:r>
-        <w:t xml:space="preserve"> </w:t>
-      </w:r>
-      <w:proofErr w:type="spellStart"/>
-      <w:r>
-        <w:t>Design</w:t>
-      </w:r>
-      <w:proofErr w:type="spellEnd"/>
-      <w:r>
-        <w:t>).</w:t>
+        <w:t>El toggle por defecto está en Oculto (Privacy by Design).</w:t>
       </w:r>
     </w:p>
     <w:p>
@@ -1045,15 +819,7 @@
         <w:spacing w:before="240" w:line="360" w:lineRule="auto"/>
       </w:pPr>
       <w:r>
-        <w:t xml:space="preserve">Si está oculto, el </w:t>
-      </w:r>
-      <w:proofErr w:type="spellStart"/>
-      <w:r>
-        <w:t>backend</w:t>
-      </w:r>
-      <w:proofErr w:type="spellEnd"/>
-      <w:r>
-        <w:t xml:space="preserve"> enmascara o elimina el campo de contacto en la respuesta JSON pública.</w:t>
+        <w:t>Si está oculto, el backend enmascara o elimina el campo de contacto en la respuesta JSON pública.</w:t>
       </w:r>
     </w:p>
     <w:p>
@@ -1086,15 +852,7 @@
         <w:t>Descripción:</w:t>
       </w:r>
       <w:r>
-        <w:t xml:space="preserve"> Como Comprador, quiero ingresar mi código de emprendedor de Sinapsis, para solicitar permisos de publicación en el </w:t>
-      </w:r>
-      <w:proofErr w:type="spellStart"/>
-      <w:r>
-        <w:t>marketplace</w:t>
-      </w:r>
-      <w:proofErr w:type="spellEnd"/>
-      <w:r>
-        <w:t>.</w:t>
+        <w:t xml:space="preserve"> Como Comprador, quiero ingresar mi código de emprendedor de Sinapsis, para solicitar permisos de publicación en el marketplace.</w:t>
       </w:r>
     </w:p>
     <w:p>
@@ -1150,23 +908,7 @@
           <w:b/>
           <w:bCs/>
         </w:rPr>
-        <w:t>HU 1.5: Validación Sinapsis (</w:t>
-      </w:r>
-      <w:proofErr w:type="spellStart"/>
-      <w:r>
-        <w:rPr>
-          <w:b/>
-          <w:bCs/>
-        </w:rPr>
-        <w:t>Whitelist</w:t>
-      </w:r>
-      <w:proofErr w:type="spellEnd"/>
-      <w:r>
-        <w:rPr>
-          <w:b/>
-          <w:bCs/>
-        </w:rPr>
-        <w:t>).</w:t>
+        <w:t>HU 1.5: Validación Sinapsis (Whitelist).</w:t>
       </w:r>
     </w:p>
     <w:p>
@@ -1208,15 +950,7 @@
         <w:spacing w:before="240" w:line="360" w:lineRule="auto"/>
       </w:pPr>
       <w:r>
-        <w:t>Lectura exitosa del CSV/</w:t>
-      </w:r>
-      <w:proofErr w:type="spellStart"/>
-      <w:r>
-        <w:t>Endpoint</w:t>
-      </w:r>
-      <w:proofErr w:type="spellEnd"/>
-      <w:r>
-        <w:t xml:space="preserve"> de validación.</w:t>
+        <w:t>Lectura exitosa del CSV/Endpoint de validación.</w:t>
       </w:r>
     </w:p>
     <w:p>
@@ -1283,23 +1017,7 @@
         <w:t>Descripción:</w:t>
       </w:r>
       <w:r>
-        <w:t xml:space="preserve"> Como Usuario móvil, quiero ver un botón para agregar </w:t>
-      </w:r>
-      <w:proofErr w:type="spellStart"/>
-      <w:r>
-        <w:t>VeraMarket</w:t>
-      </w:r>
-      <w:proofErr w:type="spellEnd"/>
-      <w:r>
-        <w:t xml:space="preserve"> a mi pantalla de inicio, para usarla como una </w:t>
-      </w:r>
-      <w:proofErr w:type="gramStart"/>
-      <w:r>
-        <w:t>app</w:t>
-      </w:r>
-      <w:proofErr w:type="gramEnd"/>
-      <w:r>
-        <w:t xml:space="preserve"> nativa sin consumir espacio de almacenamiento.</w:t>
+        <w:t xml:space="preserve"> Como Usuario móvil, quiero ver un botón para agregar VeraMarket a mi pantalla de inicio, para usarla como una app nativa sin consumir espacio de almacenamiento.</w:t>
       </w:r>
     </w:p>
     <w:p>
@@ -1324,15 +1042,8 @@
         </w:numPr>
         <w:spacing w:before="240" w:line="360" w:lineRule="auto"/>
       </w:pPr>
-      <w:proofErr w:type="spellStart"/>
-      <w:proofErr w:type="gramStart"/>
-      <w:r>
-        <w:t>manifest.json</w:t>
-      </w:r>
-      <w:proofErr w:type="spellEnd"/>
-      <w:proofErr w:type="gramEnd"/>
-      <w:r>
-        <w:t xml:space="preserve"> configurado correctamente (iconos, colores de tema).</w:t>
+      <w:r>
+        <w:t>manifest.json configurado correctamente (iconos, colores de tema).</w:t>
       </w:r>
     </w:p>
     <w:p>
@@ -1347,7 +1058,6 @@
       <w:r>
         <w:t xml:space="preserve">El navegador dispara el </w:t>
       </w:r>
-      <w:proofErr w:type="spellStart"/>
       <w:r>
         <w:rPr>
           <w:i/>
@@ -1355,7 +1065,6 @@
         </w:rPr>
         <w:t>prompt</w:t>
       </w:r>
-      <w:proofErr w:type="spellEnd"/>
       <w:r>
         <w:t xml:space="preserve"> nativo de "Añadir a pantalla de inicio".</w:t>
       </w:r>
@@ -1374,39 +1083,7 @@
           <w:b/>
           <w:bCs/>
         </w:rPr>
-        <w:t xml:space="preserve">HU 2.2: </w:t>
-      </w:r>
-      <w:proofErr w:type="spellStart"/>
-      <w:r>
-        <w:rPr>
-          <w:b/>
-          <w:bCs/>
-        </w:rPr>
-        <w:t>Skeleton</w:t>
-      </w:r>
-      <w:proofErr w:type="spellEnd"/>
-      <w:r>
-        <w:rPr>
-          <w:b/>
-          <w:bCs/>
-        </w:rPr>
-        <w:t xml:space="preserve"> </w:t>
-      </w:r>
-      <w:proofErr w:type="spellStart"/>
-      <w:r>
-        <w:rPr>
-          <w:b/>
-          <w:bCs/>
-        </w:rPr>
-        <w:t>loaders</w:t>
-      </w:r>
-      <w:proofErr w:type="spellEnd"/>
-      <w:r>
-        <w:rPr>
-          <w:b/>
-          <w:bCs/>
-        </w:rPr>
-        <w:t xml:space="preserve"> y manejo de errores sin red.</w:t>
+        <w:t>HU 2.2: Skeleton loaders y manejo de errores sin red.</w:t>
       </w:r>
     </w:p>
     <w:p>
@@ -1449,15 +1126,7 @@
         <w:spacing w:before="240" w:line="360" w:lineRule="auto"/>
       </w:pPr>
       <w:r>
-        <w:t>Los componentes de Next.js muestran animaciones "</w:t>
-      </w:r>
-      <w:proofErr w:type="spellStart"/>
-      <w:r>
-        <w:t>Skeleton</w:t>
-      </w:r>
-      <w:proofErr w:type="spellEnd"/>
-      <w:r>
-        <w:t>" mientras el Fetch de datos resuelve.</w:t>
+        <w:t>Los componentes de Next.js muestran animaciones "Skeleton" mientras el Fetch de datos resuelve.</w:t>
       </w:r>
     </w:p>
     <w:p>
@@ -1472,7 +1141,6 @@
       <w:r>
         <w:t xml:space="preserve">Si la API da </w:t>
       </w:r>
-      <w:proofErr w:type="spellStart"/>
       <w:r>
         <w:rPr>
           <w:i/>
@@ -1480,7 +1148,6 @@
         </w:rPr>
         <w:t>timeout</w:t>
       </w:r>
-      <w:proofErr w:type="spellEnd"/>
       <w:r>
         <w:t xml:space="preserve"> o no hay internet, se muestra un banner de "Sin conexión a internet" interceptado por el Service Worker.</w:t>
       </w:r>
@@ -1499,23 +1166,7 @@
           <w:b/>
           <w:bCs/>
         </w:rPr>
-        <w:t xml:space="preserve">HU 2.3: Configuración de notificaciones </w:t>
-      </w:r>
-      <w:proofErr w:type="spellStart"/>
-      <w:r>
-        <w:rPr>
-          <w:b/>
-          <w:bCs/>
-        </w:rPr>
-        <w:t>push</w:t>
-      </w:r>
-      <w:proofErr w:type="spellEnd"/>
-      <w:r>
-        <w:rPr>
-          <w:b/>
-          <w:bCs/>
-        </w:rPr>
-        <w:t xml:space="preserve"> web.</w:t>
+        <w:t>HU 2.3: Configuración de notificaciones push web.</w:t>
       </w:r>
     </w:p>
     <w:p>
@@ -1531,15 +1182,7 @@
         <w:t>Descripción:</w:t>
       </w:r>
       <w:r>
-        <w:t xml:space="preserve"> Como Vendedor, quiero recibir notificaciones </w:t>
-      </w:r>
-      <w:proofErr w:type="spellStart"/>
-      <w:r>
-        <w:t>push</w:t>
-      </w:r>
-      <w:proofErr w:type="spellEnd"/>
-      <w:r>
-        <w:t xml:space="preserve"> en mi celular cuando alguien me escriba, para no perder oportunidades de venta.</w:t>
+        <w:t xml:space="preserve"> Como Vendedor, quiero recibir notificaciones push en mi celular cuando alguien me escriba, para no perder oportunidades de venta.</w:t>
       </w:r>
     </w:p>
     <w:p>
@@ -1578,31 +1221,37 @@
         <w:spacing w:before="240" w:line="360" w:lineRule="auto"/>
       </w:pPr>
       <w:r>
-        <w:t xml:space="preserve">El Service Worker es capaz de recibir y renderizar una alerta </w:t>
-      </w:r>
-      <w:proofErr w:type="spellStart"/>
-      <w:r>
-        <w:t>push</w:t>
-      </w:r>
-      <w:proofErr w:type="spellEnd"/>
-      <w:r>
-        <w:t xml:space="preserve"> en el dispositivo.</w:t>
-      </w:r>
-    </w:p>
-    <w:p>
-      <w:pPr>
-        <w:spacing w:before="240" w:line="360" w:lineRule="auto"/>
-        <w:rPr>
-          <w:b/>
-          <w:bCs/>
-        </w:rPr>
-      </w:pPr>
-      <w:r>
-        <w:rPr>
-          <w:b/>
-          <w:bCs/>
-        </w:rPr>
-        <w:t>Sprint 3: HU 3.1, HU 3.2, HU 3.3</w:t>
+        <w:t>El Service Worker es capaz de recibir y renderizar una alerta push en el dispositivo.</w:t>
+      </w:r>
+    </w:p>
+    <w:p>
+      <w:pPr>
+        <w:spacing w:before="240" w:line="360" w:lineRule="auto"/>
+        <w:rPr>
+          <w:b/>
+          <w:bCs/>
+        </w:rPr>
+      </w:pPr>
+      <w:r>
+        <w:rPr>
+          <w:b/>
+          <w:bCs/>
+        </w:rPr>
+        <w:t xml:space="preserve">Sprint </w:t>
+      </w:r>
+      <w:r>
+        <w:rPr>
+          <w:b/>
+          <w:bCs/>
+        </w:rPr>
+        <w:t>2</w:t>
+      </w:r>
+      <w:r>
+        <w:rPr>
+          <w:b/>
+          <w:bCs/>
+        </w:rPr>
+        <w:t>: HU 3.1, HU 3.2, HU 3.3</w:t>
       </w:r>
     </w:p>
     <w:p>
@@ -1695,23 +1344,7 @@
         <w:spacing w:before="240" w:line="360" w:lineRule="auto"/>
       </w:pPr>
       <w:r>
-        <w:t xml:space="preserve">La imagen se optimiza y sube a un </w:t>
-      </w:r>
-      <w:proofErr w:type="spellStart"/>
-      <w:r>
-        <w:t>bucket</w:t>
-      </w:r>
-      <w:proofErr w:type="spellEnd"/>
-      <w:r>
-        <w:t xml:space="preserve"> (ej. </w:t>
-      </w:r>
-      <w:proofErr w:type="spellStart"/>
-      <w:r>
-        <w:t>Supabase</w:t>
-      </w:r>
-      <w:proofErr w:type="spellEnd"/>
-      <w:r>
-        <w:t xml:space="preserve"> Storage) con límite de peso (ej. 2MB).</w:t>
+        <w:t>La imagen se optimiza y sube a un bucket (ej. Supabase Storage) con límite de peso (ej. 2MB).</w:t>
       </w:r>
     </w:p>
     <w:p>
@@ -1845,32 +1478,168 @@
       <w:r>
         <w:t xml:space="preserve">Se implementa un </w:t>
       </w:r>
-      <w:proofErr w:type="spellStart"/>
       <w:r>
         <w:rPr>
           <w:i/>
           <w:iCs/>
         </w:rPr>
-        <w:t>Soft</w:t>
-      </w:r>
-      <w:proofErr w:type="spellEnd"/>
+        <w:t>Soft-Delete</w:t>
+      </w:r>
+      <w:r>
+        <w:t xml:space="preserve"> (ej. campo is_active = false en la BD) en lugar de un DELETE real.</w:t>
+      </w:r>
+    </w:p>
+    <w:p>
+      <w:pPr>
+        <w:pStyle w:val="ListParagraph"/>
+        <w:numPr>
+          <w:ilvl w:val="2"/>
+          <w:numId w:val="4"/>
+        </w:numPr>
+        <w:spacing w:before="240" w:line="360" w:lineRule="auto"/>
+      </w:pPr>
+      <w:r>
+        <w:t>El producto desaparece instantáneamente del catálogo público.</w:t>
+      </w:r>
+    </w:p>
+    <w:p>
+      <w:pPr>
+        <w:spacing w:before="240" w:line="360" w:lineRule="auto"/>
+        <w:rPr>
+          <w:b/>
+          <w:bCs/>
+        </w:rPr>
+      </w:pPr>
+      <w:r>
+        <w:rPr>
+          <w:b/>
+          <w:bCs/>
+        </w:rPr>
+        <w:t xml:space="preserve">Sprint </w:t>
+      </w:r>
+      <w:r>
+        <w:rPr>
+          <w:b/>
+          <w:bCs/>
+        </w:rPr>
+        <w:t>3</w:t>
+      </w:r>
+      <w:r>
+        <w:rPr>
+          <w:b/>
+          <w:bCs/>
+        </w:rPr>
+        <w:t>: HU 4.1, HU 4.2, HU 4.3</w:t>
+      </w:r>
+      <w:r>
+        <w:rPr>
+          <w:b/>
+          <w:bCs/>
+        </w:rPr>
+        <w:t xml:space="preserve">, </w:t>
+      </w:r>
+      <w:r>
+        <w:rPr>
+          <w:b/>
+          <w:bCs/>
+        </w:rPr>
+        <w:t>HU 5.1, HU 5.2, HU 5.3</w:t>
+      </w:r>
+    </w:p>
+    <w:p>
+      <w:pPr>
+        <w:pStyle w:val="ListParagraph"/>
+        <w:numPr>
+          <w:ilvl w:val="0"/>
+          <w:numId w:val="4"/>
+        </w:numPr>
+        <w:spacing w:before="240" w:line="360" w:lineRule="auto"/>
+        <w:rPr>
+          <w:b/>
+          <w:bCs/>
+        </w:rPr>
+      </w:pPr>
+      <w:r>
+        <w:rPr>
+          <w:b/>
+          <w:bCs/>
+        </w:rPr>
+        <w:t>EP-04: Búsqueda Inteligente (MVP - Motor Open Source / Fallback)</w:t>
+      </w:r>
+    </w:p>
+    <w:p>
+      <w:pPr>
+        <w:pStyle w:val="ListParagraph"/>
+        <w:numPr>
+          <w:ilvl w:val="1"/>
+          <w:numId w:val="4"/>
+        </w:numPr>
+        <w:spacing w:before="240" w:line="360" w:lineRule="auto"/>
+      </w:pPr>
+      <w:r>
+        <w:rPr>
+          <w:b/>
+          <w:bCs/>
+        </w:rPr>
+        <w:t>HU 4.1: Búsqueda tradicional y filtros.</w:t>
+      </w:r>
+    </w:p>
+    <w:p>
+      <w:pPr>
+        <w:pStyle w:val="ListParagraph"/>
+        <w:spacing w:before="240" w:line="360" w:lineRule="auto"/>
+      </w:pPr>
+      <w:r>
+        <w:rPr>
+          <w:b/>
+          <w:bCs/>
+        </w:rPr>
+        <w:t>Descripción:</w:t>
+      </w:r>
+      <w:r>
+        <w:t xml:space="preserve"> Como Comprador, quiero usar una barra de búsqueda para buscar productos exactos o filtrar por categorías, para encontrar lo que quiero rápido.</w:t>
+      </w:r>
+    </w:p>
+    <w:p>
+      <w:pPr>
+        <w:pStyle w:val="ListParagraph"/>
+        <w:spacing w:before="240" w:line="360" w:lineRule="auto"/>
+      </w:pPr>
+      <w:r>
+        <w:rPr>
+          <w:b/>
+          <w:bCs/>
+        </w:rPr>
+        <w:t>Criterios de Aceptación:</w:t>
+      </w:r>
+    </w:p>
+    <w:p>
+      <w:pPr>
+        <w:pStyle w:val="ListParagraph"/>
+        <w:numPr>
+          <w:ilvl w:val="2"/>
+          <w:numId w:val="4"/>
+        </w:numPr>
+        <w:spacing w:before="240" w:line="360" w:lineRule="auto"/>
+      </w:pPr>
+      <w:r>
+        <w:t xml:space="preserve">Implementación de </w:t>
+      </w:r>
       <w:r>
         <w:rPr>
           <w:i/>
           <w:iCs/>
         </w:rPr>
-        <w:t>-Delete</w:t>
-      </w:r>
-      <w:r>
-        <w:t xml:space="preserve"> (ej. campo </w:t>
-      </w:r>
-      <w:proofErr w:type="spellStart"/>
-      <w:r>
-        <w:t>is_active</w:t>
-      </w:r>
-      <w:proofErr w:type="spellEnd"/>
-      <w:r>
-        <w:t xml:space="preserve"> = false en la BD) en lugar de un DELETE real.</w:t>
+        <w:t>Full-Text Search</w:t>
+      </w:r>
+      <w:r>
+        <w:t xml:space="preserve"> usando </w:t>
+      </w:r>
+      <w:r>
+        <w:t>TypeSense</w:t>
+      </w:r>
+      <w:r>
+        <w:t xml:space="preserve"> en PostgreSQL.</w:t>
       </w:r>
     </w:p>
     <w:p>
@@ -1883,76 +1652,7 @@
         <w:spacing w:before="240" w:line="360" w:lineRule="auto"/>
       </w:pPr>
       <w:r>
-        <w:t>El producto desaparece instantáneamente del catálogo público.</w:t>
-      </w:r>
-    </w:p>
-    <w:p>
-      <w:pPr>
-        <w:spacing w:before="240" w:line="360" w:lineRule="auto"/>
-        <w:rPr>
-          <w:b/>
-          <w:bCs/>
-        </w:rPr>
-      </w:pPr>
-      <w:r>
-        <w:rPr>
-          <w:b/>
-          <w:bCs/>
-        </w:rPr>
-        <w:t>Sprint 4: HU 4.1, HU 4.2, HU 4.3</w:t>
-      </w:r>
-    </w:p>
-    <w:p>
-      <w:pPr>
-        <w:pStyle w:val="ListParagraph"/>
-        <w:numPr>
-          <w:ilvl w:val="0"/>
-          <w:numId w:val="4"/>
-        </w:numPr>
-        <w:spacing w:before="240" w:line="360" w:lineRule="auto"/>
-        <w:rPr>
-          <w:b/>
-          <w:bCs/>
-        </w:rPr>
-      </w:pPr>
-      <w:r>
-        <w:rPr>
-          <w:b/>
-          <w:bCs/>
-        </w:rPr>
-        <w:t xml:space="preserve">EP-04: Búsqueda Inteligente (MVP - Motor Open </w:t>
-      </w:r>
-      <w:proofErr w:type="spellStart"/>
-      <w:r>
-        <w:rPr>
-          <w:b/>
-          <w:bCs/>
-        </w:rPr>
-        <w:t>Source</w:t>
-      </w:r>
-      <w:proofErr w:type="spellEnd"/>
-      <w:r>
-        <w:rPr>
-          <w:b/>
-          <w:bCs/>
-        </w:rPr>
-        <w:t xml:space="preserve"> / </w:t>
-      </w:r>
-      <w:proofErr w:type="spellStart"/>
-      <w:r>
-        <w:rPr>
-          <w:b/>
-          <w:bCs/>
-        </w:rPr>
-        <w:t>Fallback</w:t>
-      </w:r>
-      <w:proofErr w:type="spellEnd"/>
-      <w:r>
-        <w:rPr>
-          <w:b/>
-          <w:bCs/>
-        </w:rPr>
-        <w:t>)</w:t>
+        <w:t>Latencia de respuesta menor a 1 segundo.</w:t>
       </w:r>
     </w:p>
     <w:p>
@@ -1969,7 +1669,7 @@
           <w:b/>
           <w:bCs/>
         </w:rPr>
-        <w:t>HU 4.1: Búsqueda tradicional y filtros.</w:t>
+        <w:t>HU 4.2: Búsqueda semántica usando el motor IA.</w:t>
       </w:r>
     </w:p>
     <w:p>
@@ -1985,7 +1685,7 @@
         <w:t>Descripción:</w:t>
       </w:r>
       <w:r>
-        <w:t xml:space="preserve"> Como Comprador, quiero usar una barra de búsqueda para buscar productos exactos o filtrar por categorías, para encontrar lo que quiero rápido.</w:t>
+        <w:t xml:space="preserve"> Como Comprador, quiero buscar con lenguaje natural o modismos caleños (ej. "algo pa picar", "mecato"), para que la IA me sugiera productos relevantes aunque no tengan esa palabra exacta en el título.</w:t>
       </w:r>
     </w:p>
     <w:p>
@@ -2011,162 +1711,212 @@
         <w:spacing w:before="240" w:line="360" w:lineRule="auto"/>
       </w:pPr>
       <w:r>
-        <w:t xml:space="preserve">Implementación de </w:t>
-      </w:r>
+        <w:t xml:space="preserve">Se envía la consulta a la API de </w:t>
+      </w:r>
+      <w:r>
+        <w:t>Google (Gemini 3.1-flash</w:t>
+      </w:r>
+      <w:r>
+        <w:t>).</w:t>
+      </w:r>
+    </w:p>
+    <w:p>
+      <w:pPr>
+        <w:pStyle w:val="ListParagraph"/>
+        <w:numPr>
+          <w:ilvl w:val="2"/>
+          <w:numId w:val="4"/>
+        </w:numPr>
+        <w:spacing w:before="240" w:line="360" w:lineRule="auto"/>
+      </w:pPr>
       <w:r>
         <w:rPr>
           <w:i/>
           <w:iCs/>
         </w:rPr>
-        <w:t>Full-Text Search</w:t>
-      </w:r>
-      <w:r>
-        <w:t xml:space="preserve"> usando </w:t>
-      </w:r>
-      <w:proofErr w:type="spellStart"/>
-      <w:r>
-        <w:t>tsvector</w:t>
-      </w:r>
-      <w:proofErr w:type="spellEnd"/>
-      <w:r>
-        <w:t xml:space="preserve"> en PostgreSQL.</w:t>
-      </w:r>
-    </w:p>
-    <w:p>
-      <w:pPr>
-        <w:pStyle w:val="ListParagraph"/>
-        <w:numPr>
-          <w:ilvl w:val="2"/>
-          <w:numId w:val="4"/>
-        </w:numPr>
-        <w:spacing w:before="240" w:line="360" w:lineRule="auto"/>
-      </w:pPr>
-      <w:r>
-        <w:t>Latencia de respuesta menor a 1 segundo.</w:t>
-      </w:r>
-    </w:p>
-    <w:p>
-      <w:pPr>
-        <w:pStyle w:val="ListParagraph"/>
-        <w:numPr>
-          <w:ilvl w:val="1"/>
-          <w:numId w:val="4"/>
-        </w:numPr>
-        <w:spacing w:before="240" w:line="360" w:lineRule="auto"/>
-      </w:pPr>
-      <w:r>
-        <w:rPr>
-          <w:b/>
-          <w:bCs/>
-        </w:rPr>
-        <w:t>HU 4.2: Búsqueda semántica usando el motor IA.</w:t>
-      </w:r>
-    </w:p>
-    <w:p>
-      <w:pPr>
-        <w:pStyle w:val="ListParagraph"/>
-        <w:spacing w:before="240" w:line="360" w:lineRule="auto"/>
-      </w:pPr>
-      <w:r>
-        <w:rPr>
-          <w:b/>
-          <w:bCs/>
-        </w:rPr>
-        <w:t>Descripción:</w:t>
-      </w:r>
-      <w:r>
-        <w:t xml:space="preserve"> Como Comprador, quiero buscar con lenguaje natural o modismos caleños (ej. "algo </w:t>
-      </w:r>
-      <w:proofErr w:type="spellStart"/>
-      <w:r>
-        <w:t>pa</w:t>
-      </w:r>
-      <w:proofErr w:type="spellEnd"/>
-      <w:r>
-        <w:t xml:space="preserve"> picar", "mecato"), para que la IA me sugiera productos </w:t>
-      </w:r>
-      <w:proofErr w:type="gramStart"/>
-      <w:r>
-        <w:t>relevantes</w:t>
-      </w:r>
-      <w:proofErr w:type="gramEnd"/>
-      <w:r>
-        <w:t xml:space="preserve"> aunque no tengan esa palabra exacta en el título.</w:t>
-      </w:r>
-    </w:p>
-    <w:p>
-      <w:pPr>
-        <w:pStyle w:val="ListParagraph"/>
-        <w:spacing w:before="240" w:line="360" w:lineRule="auto"/>
-      </w:pPr>
-      <w:r>
-        <w:rPr>
-          <w:b/>
-          <w:bCs/>
-        </w:rPr>
-        <w:t>Criterios de Aceptación:</w:t>
-      </w:r>
-    </w:p>
-    <w:p>
-      <w:pPr>
-        <w:pStyle w:val="ListParagraph"/>
-        <w:numPr>
-          <w:ilvl w:val="2"/>
-          <w:numId w:val="4"/>
-        </w:numPr>
-        <w:spacing w:before="240" w:line="360" w:lineRule="auto"/>
-      </w:pPr>
-      <w:r>
-        <w:t xml:space="preserve">Se envía la consulta a la API de </w:t>
-      </w:r>
-      <w:proofErr w:type="spellStart"/>
-      <w:r>
-        <w:t>OpenAI</w:t>
-      </w:r>
-      <w:proofErr w:type="spellEnd"/>
-      <w:r>
-        <w:t xml:space="preserve"> (GPT-4o-mini).</w:t>
-      </w:r>
-    </w:p>
-    <w:p>
-      <w:pPr>
-        <w:pStyle w:val="ListParagraph"/>
-        <w:numPr>
-          <w:ilvl w:val="2"/>
-          <w:numId w:val="4"/>
-        </w:numPr>
-        <w:spacing w:before="240" w:line="360" w:lineRule="auto"/>
-      </w:pPr>
+        <w:lastRenderedPageBreak/>
+        <w:t>Arquitectura:</w:t>
+      </w:r>
+      <w:r>
+        <w:t xml:space="preserve"> Si la API de </w:t>
+      </w:r>
+      <w:r>
+        <w:t>Google</w:t>
+      </w:r>
+      <w:r>
+        <w:t xml:space="preserve"> falla o hay límite de uso, el sistema hace un </w:t>
+      </w:r>
       <w:r>
         <w:rPr>
           <w:i/>
           <w:iCs/>
         </w:rPr>
-        <w:lastRenderedPageBreak/>
-        <w:t>Arquitectura:</w:t>
-      </w:r>
-      <w:r>
-        <w:t xml:space="preserve"> Si la API de </w:t>
-      </w:r>
-      <w:proofErr w:type="spellStart"/>
-      <w:r>
-        <w:t>OpenAI</w:t>
-      </w:r>
-      <w:proofErr w:type="spellEnd"/>
-      <w:r>
-        <w:t xml:space="preserve"> falla o hay límite de uso, el sistema hace un </w:t>
-      </w:r>
-      <w:proofErr w:type="spellStart"/>
+        <w:t>fallback</w:t>
+      </w:r>
+      <w:r>
+        <w:t xml:space="preserve"> automático a la búsqueda tradicional de la HU 4.1.</w:t>
+      </w:r>
+    </w:p>
+    <w:p>
+      <w:pPr>
+        <w:pStyle w:val="ListParagraph"/>
+        <w:numPr>
+          <w:ilvl w:val="1"/>
+          <w:numId w:val="4"/>
+        </w:numPr>
+        <w:spacing w:before="240" w:line="360" w:lineRule="auto"/>
+      </w:pPr>
+      <w:r>
+        <w:rPr>
+          <w:b/>
+          <w:bCs/>
+        </w:rPr>
+        <w:t>HU 4.3: Visualización de recomendaciones ("VeraMatch").</w:t>
+      </w:r>
+    </w:p>
+    <w:p>
+      <w:pPr>
+        <w:pStyle w:val="ListParagraph"/>
+        <w:spacing w:before="240" w:line="360" w:lineRule="auto"/>
+      </w:pPr>
+      <w:r>
+        <w:rPr>
+          <w:b/>
+          <w:bCs/>
+        </w:rPr>
+        <w:t>Descripción:</w:t>
+      </w:r>
+      <w:r>
+        <w:t xml:space="preserve"> Como Comprador, quiero ver productos similares al final del detalle de un producto, para descubrir otras opciones de emprendedores.</w:t>
+      </w:r>
+    </w:p>
+    <w:p>
+      <w:pPr>
+        <w:pStyle w:val="ListParagraph"/>
+        <w:spacing w:before="240" w:line="360" w:lineRule="auto"/>
+      </w:pPr>
+      <w:r>
+        <w:rPr>
+          <w:b/>
+          <w:bCs/>
+        </w:rPr>
+        <w:t>Criterios de Aceptación:</w:t>
+      </w:r>
+    </w:p>
+    <w:p>
+      <w:pPr>
+        <w:pStyle w:val="ListParagraph"/>
+        <w:numPr>
+          <w:ilvl w:val="2"/>
+          <w:numId w:val="4"/>
+        </w:numPr>
+        <w:spacing w:before="240" w:line="360" w:lineRule="auto"/>
+      </w:pPr>
+      <w:r>
+        <w:t>Se muestran de 3 a 5 productos sugeridos basados en la misma categoría o etiquetas del producto actual.</w:t>
+      </w:r>
+    </w:p>
+    <w:p>
+      <w:pPr>
+        <w:pStyle w:val="ListParagraph"/>
+        <w:numPr>
+          <w:ilvl w:val="0"/>
+          <w:numId w:val="4"/>
+        </w:numPr>
+        <w:spacing w:before="240" w:line="360" w:lineRule="auto"/>
+        <w:rPr>
+          <w:b/>
+          <w:bCs/>
+        </w:rPr>
+      </w:pPr>
+      <w:r>
+        <w:rPr>
+          <w:b/>
+          <w:bCs/>
+        </w:rPr>
+        <w:t>EP-05: Geolocalización Hiper-Local (Campus UAO)</w:t>
+      </w:r>
+    </w:p>
+    <w:p>
+      <w:pPr>
+        <w:pStyle w:val="ListParagraph"/>
+        <w:numPr>
+          <w:ilvl w:val="1"/>
+          <w:numId w:val="4"/>
+        </w:numPr>
+        <w:spacing w:before="240" w:line="360" w:lineRule="auto"/>
+      </w:pPr>
+      <w:r>
+        <w:rPr>
+          <w:b/>
+          <w:bCs/>
+        </w:rPr>
+        <w:t>HU 5.1: Visualización del mapa interactivo (OpenStreetMap).</w:t>
+      </w:r>
+    </w:p>
+    <w:p>
+      <w:pPr>
+        <w:pStyle w:val="ListParagraph"/>
+        <w:spacing w:before="240" w:line="360" w:lineRule="auto"/>
+      </w:pPr>
+      <w:r>
+        <w:rPr>
+          <w:b/>
+          <w:bCs/>
+        </w:rPr>
+        <w:t>Descripción:</w:t>
+      </w:r>
+      <w:r>
+        <w:t xml:space="preserve"> Como Usuario, quiero ver un mapa del campus con pines marcando dónde están los vendedores, para encontrarlos fácilmente.</w:t>
+      </w:r>
+    </w:p>
+    <w:p>
+      <w:pPr>
+        <w:pStyle w:val="ListParagraph"/>
+        <w:spacing w:before="240" w:line="360" w:lineRule="auto"/>
+      </w:pPr>
+      <w:r>
+        <w:rPr>
+          <w:b/>
+          <w:bCs/>
+        </w:rPr>
+        <w:t>Criterios de Aceptación:</w:t>
+      </w:r>
+    </w:p>
+    <w:p>
+      <w:pPr>
+        <w:pStyle w:val="ListParagraph"/>
+        <w:numPr>
+          <w:ilvl w:val="2"/>
+          <w:numId w:val="4"/>
+        </w:numPr>
+        <w:spacing w:before="240" w:line="360" w:lineRule="auto"/>
+      </w:pPr>
+      <w:r>
+        <w:t xml:space="preserve">Librería tipo </w:t>
+      </w:r>
       <w:r>
         <w:rPr>
           <w:i/>
           <w:iCs/>
         </w:rPr>
-        <w:t>fallback</w:t>
-      </w:r>
-      <w:proofErr w:type="spellEnd"/>
-      <w:r>
-        <w:t xml:space="preserve"> automático a la búsqueda tradicional de la HU 4.1.</w:t>
+        <w:t>Leaflet/Mapbox</w:t>
+      </w:r>
+      <w:r>
+        <w:t xml:space="preserve"> integrada con tiles de OpenStreetMap (costo $0).</w:t>
+      </w:r>
+    </w:p>
+    <w:p>
+      <w:pPr>
+        <w:pStyle w:val="ListParagraph"/>
+        <w:numPr>
+          <w:ilvl w:val="2"/>
+          <w:numId w:val="4"/>
+        </w:numPr>
+        <w:spacing w:before="240" w:line="360" w:lineRule="auto"/>
+      </w:pPr>
+      <w:r>
+        <w:t>Renderizado de pines leyendo coordenadas desde el backend.</w:t>
       </w:r>
     </w:p>
     <w:p>
@@ -2183,23 +1933,7 @@
           <w:b/>
           <w:bCs/>
         </w:rPr>
-        <w:t>HU 4.3: Visualización de recomendaciones ("</w:t>
-      </w:r>
-      <w:proofErr w:type="spellStart"/>
-      <w:r>
-        <w:rPr>
-          <w:b/>
-          <w:bCs/>
-        </w:rPr>
-        <w:t>VeraMatch</w:t>
-      </w:r>
-      <w:proofErr w:type="spellEnd"/>
-      <w:r>
-        <w:rPr>
-          <w:b/>
-          <w:bCs/>
-        </w:rPr>
-        <w:t>").</w:t>
+        <w:t>HU 5.2: Asignación de ubicación física a una publicación.</w:t>
       </w:r>
     </w:p>
     <w:p>
@@ -2215,7 +1949,7 @@
         <w:t>Descripción:</w:t>
       </w:r>
       <w:r>
-        <w:t xml:space="preserve"> Como Comprador, quiero ver productos similares al final del detalle de un producto, para descubrir otras opciones de emprendedores.</w:t>
+        <w:t xml:space="preserve"> Como Vendedor, quiero pinchar en el mapa el lugar del campus donde me encuentro, para que los compradores puedan caminar hacia mí.</w:t>
       </w:r>
     </w:p>
     <w:p>
@@ -2241,23 +1975,112 @@
         <w:spacing w:before="240" w:line="360" w:lineRule="auto"/>
       </w:pPr>
       <w:r>
-        <w:t>Se muestran de 3 a 5 productos sugeridos basados en la misma categoría o etiquetas del producto actual.</w:t>
-      </w:r>
-    </w:p>
-    <w:p>
-      <w:pPr>
-        <w:spacing w:before="240" w:line="360" w:lineRule="auto"/>
-        <w:rPr>
-          <w:b/>
-          <w:bCs/>
-        </w:rPr>
-      </w:pPr>
-      <w:r>
-        <w:rPr>
-          <w:b/>
-          <w:bCs/>
-        </w:rPr>
-        <w:t>Sprint 5: HU 5.1, HU 5.2, HU 5.3, HU 6.1, HU 6.2, HU 6.3, HU 6.4, HU 6.5</w:t>
+        <w:t>Guardado de la latitud y longitud en formato GEOMETRY(Point) en PostGIS.</w:t>
+      </w:r>
+    </w:p>
+    <w:p>
+      <w:pPr>
+        <w:pStyle w:val="ListParagraph"/>
+        <w:numPr>
+          <w:ilvl w:val="1"/>
+          <w:numId w:val="4"/>
+        </w:numPr>
+        <w:spacing w:before="240" w:line="360" w:lineRule="auto"/>
+      </w:pPr>
+      <w:r>
+        <w:rPr>
+          <w:b/>
+          <w:bCs/>
+        </w:rPr>
+        <w:t>HU 5.3: Filtrado del catálogo por radio de cercanía.</w:t>
+      </w:r>
+    </w:p>
+    <w:p>
+      <w:pPr>
+        <w:pStyle w:val="ListParagraph"/>
+        <w:spacing w:before="240" w:line="360" w:lineRule="auto"/>
+      </w:pPr>
+      <w:r>
+        <w:rPr>
+          <w:b/>
+          <w:bCs/>
+        </w:rPr>
+        <w:t>Descripción:</w:t>
+      </w:r>
+      <w:r>
+        <w:t xml:space="preserve"> Como Comprador con hambre, quiero filtrar para ver solo los vendedores que estén a menos de 100 metros de mi edificio.</w:t>
+      </w:r>
+    </w:p>
+    <w:p>
+      <w:pPr>
+        <w:pStyle w:val="ListParagraph"/>
+        <w:spacing w:before="240" w:line="360" w:lineRule="auto"/>
+      </w:pPr>
+      <w:r>
+        <w:rPr>
+          <w:b/>
+          <w:bCs/>
+        </w:rPr>
+        <w:t>Criterios de Aceptación:</w:t>
+      </w:r>
+    </w:p>
+    <w:p>
+      <w:pPr>
+        <w:pStyle w:val="ListParagraph"/>
+        <w:numPr>
+          <w:ilvl w:val="2"/>
+          <w:numId w:val="4"/>
+        </w:numPr>
+        <w:spacing w:before="240" w:line="360" w:lineRule="auto"/>
+      </w:pPr>
+      <w:r>
+        <w:t>Query espacial utilizando la función ST_DWithin de PostGIS para devolver resultados por radio en metros.</w:t>
+      </w:r>
+    </w:p>
+    <w:p>
+      <w:pPr>
+        <w:rPr>
+          <w:b/>
+          <w:bCs/>
+        </w:rPr>
+      </w:pPr>
+      <w:r>
+        <w:rPr>
+          <w:b/>
+          <w:bCs/>
+        </w:rPr>
+        <w:br w:type="page"/>
+      </w:r>
+    </w:p>
+    <w:p>
+      <w:pPr>
+        <w:spacing w:before="240" w:line="360" w:lineRule="auto"/>
+        <w:rPr>
+          <w:b/>
+          <w:bCs/>
+        </w:rPr>
+      </w:pPr>
+      <w:r>
+        <w:rPr>
+          <w:b/>
+          <w:bCs/>
+        </w:rPr>
+        <w:lastRenderedPageBreak/>
+        <w:t xml:space="preserve">Sprint </w:t>
+      </w:r>
+      <w:r>
+        <w:rPr>
+          <w:b/>
+          <w:bCs/>
+        </w:rPr>
+        <w:t>4</w:t>
+      </w:r>
+      <w:r>
+        <w:rPr>
+          <w:b/>
+          <w:bCs/>
+        </w:rPr>
+        <w:t>: HU 6.1, HU 6.2, HU 6.3, HU 6.4, HU 6.5</w:t>
       </w:r>
     </w:p>
     <w:p>
@@ -2278,7 +2101,7 @@
           <w:b/>
           <w:bCs/>
         </w:rPr>
-        <w:t>EP-05: Geolocalización Hiper-Local (Campus UAO)</w:t>
+        <w:t>EP-06: Negociación y Cierre P2P (Frictionless)</w:t>
       </w:r>
     </w:p>
     <w:p>
@@ -2295,23 +2118,7 @@
           <w:b/>
           <w:bCs/>
         </w:rPr>
-        <w:t>HU 5.1: Visualización del mapa interactivo (</w:t>
-      </w:r>
-      <w:proofErr w:type="spellStart"/>
-      <w:r>
-        <w:rPr>
-          <w:b/>
-          <w:bCs/>
-        </w:rPr>
-        <w:t>OpenStreetMap</w:t>
-      </w:r>
-      <w:proofErr w:type="spellEnd"/>
-      <w:r>
-        <w:rPr>
-          <w:b/>
-          <w:bCs/>
-        </w:rPr>
-        <w:t>).</w:t>
+        <w:t>HU 6.1: Chat interno en tiempo real.</w:t>
       </w:r>
     </w:p>
     <w:p>
@@ -2327,7 +2134,7 @@
         <w:t>Descripción:</w:t>
       </w:r>
       <w:r>
-        <w:t xml:space="preserve"> Como Usuario, quiero ver un mapa del campus con pines marcando dónde están los vendedores, para encontrarlos fácilmente.</w:t>
+        <w:t xml:space="preserve"> Como Usuario, quiero chatear con el vendedor dentro de la app, para negociar sin tener que darle mi número de WhatsApp.</w:t>
       </w:r>
     </w:p>
     <w:p>
@@ -2353,43 +2160,342 @@
         <w:spacing w:before="240" w:line="360" w:lineRule="auto"/>
       </w:pPr>
       <w:r>
-        <w:t xml:space="preserve">Librería tipo </w:t>
-      </w:r>
-      <w:proofErr w:type="spellStart"/>
+        <w:t>Implementación usando WebSockets (FastAPI websockets / Socket.io).</w:t>
+      </w:r>
+    </w:p>
+    <w:p>
+      <w:pPr>
+        <w:pStyle w:val="ListParagraph"/>
+        <w:numPr>
+          <w:ilvl w:val="2"/>
+          <w:numId w:val="4"/>
+        </w:numPr>
+        <w:spacing w:before="240" w:line="360" w:lineRule="auto"/>
+      </w:pPr>
+      <w:r>
+        <w:t>Los mensajes se persisten en la base de datos para historial de auditoría.</w:t>
+      </w:r>
+    </w:p>
+    <w:p>
+      <w:pPr>
+        <w:pStyle w:val="ListParagraph"/>
+        <w:numPr>
+          <w:ilvl w:val="1"/>
+          <w:numId w:val="4"/>
+        </w:numPr>
+        <w:spacing w:before="240" w:line="360" w:lineRule="auto"/>
+      </w:pPr>
+      <w:r>
+        <w:rPr>
+          <w:b/>
+          <w:bCs/>
+        </w:rPr>
+        <w:t>HU 6.2 y 6.3: Integración de Deep Link para Nequi / DaviPlata.</w:t>
+      </w:r>
+    </w:p>
+    <w:p>
+      <w:pPr>
+        <w:pStyle w:val="ListParagraph"/>
+        <w:spacing w:before="240" w:line="360" w:lineRule="auto"/>
+      </w:pPr>
+      <w:r>
+        <w:rPr>
+          <w:b/>
+          <w:bCs/>
+        </w:rPr>
+        <w:t>Descripción:</w:t>
+      </w:r>
+      <w:r>
+        <w:t xml:space="preserve"> Como Comprador, quiero un botón que me abra directamente mi app de Nequi o DaviPlata con el número del vendedor, para pagar rápido sin digitar.</w:t>
+      </w:r>
+    </w:p>
+    <w:p>
+      <w:pPr>
+        <w:pStyle w:val="ListParagraph"/>
+        <w:spacing w:before="240" w:line="360" w:lineRule="auto"/>
+      </w:pPr>
+      <w:r>
+        <w:rPr>
+          <w:b/>
+          <w:bCs/>
+        </w:rPr>
+        <w:t>Criterios de Aceptación:</w:t>
+      </w:r>
+    </w:p>
+    <w:p>
+      <w:pPr>
+        <w:pStyle w:val="ListParagraph"/>
+        <w:spacing w:before="240" w:line="360" w:lineRule="auto"/>
+      </w:pPr>
+      <w:r>
+        <w:rPr>
+          <w:b/>
+          <w:bCs/>
+        </w:rPr>
+        <w:t>Restricción de Arquitectura:</w:t>
+      </w:r>
+      <w:r>
+        <w:t xml:space="preserve"> NO hay integración con APIs bancarias (está fuera del alcance del MVP). Solo se genera un </w:t>
+      </w:r>
       <w:r>
         <w:rPr>
           <w:i/>
           <w:iCs/>
         </w:rPr>
-        <w:t>Leaflet</w:t>
-      </w:r>
-      <w:proofErr w:type="spellEnd"/>
+        <w:t>Deep Link</w:t>
+      </w:r>
+      <w:r>
+        <w:t xml:space="preserve"> o </w:t>
+      </w:r>
       <w:r>
         <w:rPr>
           <w:i/>
           <w:iCs/>
         </w:rPr>
-        <w:t>/</w:t>
-      </w:r>
-      <w:proofErr w:type="spellStart"/>
+        <w:t>URI Scheme</w:t>
+      </w:r>
+      <w:r>
+        <w:t xml:space="preserve"> (ej. nequi://... o enlace web) que intenta abrir la app en el teléfono del usuario destino si el vendedor habilitó su número.</w:t>
+      </w:r>
+    </w:p>
+    <w:p>
+      <w:pPr>
+        <w:pStyle w:val="ListParagraph"/>
+        <w:numPr>
+          <w:ilvl w:val="1"/>
+          <w:numId w:val="4"/>
+        </w:numPr>
+        <w:spacing w:before="240" w:line="360" w:lineRule="auto"/>
+      </w:pPr>
+      <w:r>
+        <w:rPr>
+          <w:b/>
+          <w:bCs/>
+        </w:rPr>
+        <w:t>HU 6.4: Marcado manual de "Transacción Completada".</w:t>
+      </w:r>
+    </w:p>
+    <w:p>
+      <w:pPr>
+        <w:pStyle w:val="ListParagraph"/>
+        <w:spacing w:before="240" w:line="360" w:lineRule="auto"/>
+      </w:pPr>
+      <w:r>
+        <w:rPr>
+          <w:b/>
+          <w:bCs/>
+        </w:rPr>
+        <w:t>Descripción:</w:t>
+      </w:r>
+      <w:r>
+        <w:t xml:space="preserve"> Como Vendedor y Comprador, quiero un botón en el chat para confirmar que el producto fue entregado.</w:t>
+      </w:r>
+    </w:p>
+    <w:p>
+      <w:pPr>
+        <w:pStyle w:val="ListParagraph"/>
+        <w:spacing w:before="240" w:line="360" w:lineRule="auto"/>
+      </w:pPr>
+      <w:r>
+        <w:rPr>
+          <w:b/>
+          <w:bCs/>
+        </w:rPr>
+        <w:t>Criterios de Aceptación:</w:t>
+      </w:r>
+    </w:p>
+    <w:p>
+      <w:pPr>
+        <w:pStyle w:val="ListParagraph"/>
+        <w:numPr>
+          <w:ilvl w:val="2"/>
+          <w:numId w:val="4"/>
+        </w:numPr>
+        <w:spacing w:before="240" w:line="360" w:lineRule="auto"/>
+      </w:pPr>
+      <w:r>
+        <w:t>Ambos usuarios deben confirmar.</w:t>
+      </w:r>
+    </w:p>
+    <w:p>
+      <w:pPr>
+        <w:pStyle w:val="ListParagraph"/>
+        <w:numPr>
+          <w:ilvl w:val="2"/>
+          <w:numId w:val="4"/>
+        </w:numPr>
+        <w:spacing w:before="240" w:line="360" w:lineRule="auto"/>
+      </w:pPr>
+      <w:r>
+        <w:t>El chat se cierra o cambia de estado visual a "Completado".</w:t>
+      </w:r>
+    </w:p>
+    <w:p>
+      <w:pPr>
+        <w:pStyle w:val="ListParagraph"/>
+        <w:numPr>
+          <w:ilvl w:val="1"/>
+          <w:numId w:val="4"/>
+        </w:numPr>
+        <w:spacing w:before="240" w:line="360" w:lineRule="auto"/>
+      </w:pPr>
+      <w:r>
+        <w:rPr>
+          <w:b/>
+          <w:bCs/>
+        </w:rPr>
+        <w:t>HU 6.5: Registro automático del valor (GMV).</w:t>
+      </w:r>
+    </w:p>
+    <w:p>
+      <w:pPr>
+        <w:pStyle w:val="ListParagraph"/>
+        <w:spacing w:before="240" w:line="360" w:lineRule="auto"/>
+      </w:pPr>
+      <w:r>
+        <w:rPr>
+          <w:b/>
+          <w:bCs/>
+        </w:rPr>
+        <w:t>Descripción:</w:t>
+      </w:r>
+      <w:r>
+        <w:t xml:space="preserve"> Como Analista de Negocio, quiero que al confirmarse la transacción (HU 6.4), el sistema guarde el valor de la venta, para poder calcular métricas financieras (GMV) sin cobrar comisiones.</w:t>
+      </w:r>
+    </w:p>
+    <w:p>
+      <w:pPr>
+        <w:pStyle w:val="ListParagraph"/>
+        <w:spacing w:before="240" w:line="360" w:lineRule="auto"/>
+      </w:pPr>
+      <w:r>
+        <w:rPr>
+          <w:b/>
+          <w:bCs/>
+        </w:rPr>
+        <w:t>Criterios de Aceptación:</w:t>
+      </w:r>
+    </w:p>
+    <w:p>
+      <w:pPr>
+        <w:pStyle w:val="ListParagraph"/>
+        <w:numPr>
+          <w:ilvl w:val="2"/>
+          <w:numId w:val="4"/>
+        </w:numPr>
+        <w:spacing w:before="240" w:line="360" w:lineRule="auto"/>
+      </w:pPr>
+      <w:r>
+        <w:lastRenderedPageBreak/>
+        <w:t xml:space="preserve">Un </w:t>
+      </w:r>
       <w:r>
         <w:rPr>
           <w:i/>
           <w:iCs/>
         </w:rPr>
-        <w:t>Mapbox</w:t>
-      </w:r>
-      <w:proofErr w:type="spellEnd"/>
-      <w:r>
-        <w:t xml:space="preserve"> integrada con tiles de </w:t>
-      </w:r>
-      <w:proofErr w:type="spellStart"/>
-      <w:r>
-        <w:t>OpenStreetMap</w:t>
-      </w:r>
-      <w:proofErr w:type="spellEnd"/>
-      <w:r>
-        <w:t xml:space="preserve"> (costo $0).</w:t>
+        <w:t>trigger</w:t>
+      </w:r>
+      <w:r>
+        <w:t xml:space="preserve"> o función backend inserta el valor transaccional en COP en una tabla de métricas en el momento en que el estado cambia a "Completado".</w:t>
+      </w:r>
+    </w:p>
+    <w:p>
+      <w:pPr>
+        <w:spacing w:before="240" w:line="360" w:lineRule="auto"/>
+        <w:rPr>
+          <w:b/>
+          <w:bCs/>
+          <w:highlight w:val="yellow"/>
+        </w:rPr>
+      </w:pPr>
+      <w:r>
+        <w:rPr>
+          <w:b/>
+          <w:bCs/>
+        </w:rPr>
+        <w:t xml:space="preserve">Sprint </w:t>
+      </w:r>
+      <w:r>
+        <w:rPr>
+          <w:b/>
+          <w:bCs/>
+        </w:rPr>
+        <w:t>5</w:t>
+      </w:r>
+      <w:r>
+        <w:rPr>
+          <w:b/>
+          <w:bCs/>
+        </w:rPr>
+        <w:t>: HU 7.1, HU 7.2, HU 7.3</w:t>
+      </w:r>
+    </w:p>
+    <w:p>
+      <w:pPr>
+        <w:pStyle w:val="ListParagraph"/>
+        <w:numPr>
+          <w:ilvl w:val="0"/>
+          <w:numId w:val="4"/>
+        </w:numPr>
+        <w:spacing w:before="240" w:line="360" w:lineRule="auto"/>
+        <w:rPr>
+          <w:b/>
+          <w:bCs/>
+        </w:rPr>
+      </w:pPr>
+      <w:r>
+        <w:rPr>
+          <w:b/>
+          <w:bCs/>
+        </w:rPr>
+        <w:t>EP-07: Moderación y Reputación Comunitaria</w:t>
+      </w:r>
+    </w:p>
+    <w:p>
+      <w:pPr>
+        <w:pStyle w:val="ListParagraph"/>
+        <w:numPr>
+          <w:ilvl w:val="1"/>
+          <w:numId w:val="4"/>
+        </w:numPr>
+        <w:spacing w:before="240" w:line="360" w:lineRule="auto"/>
+      </w:pPr>
+      <w:r>
+        <w:rPr>
+          <w:b/>
+          <w:bCs/>
+        </w:rPr>
+        <w:t>HU 7.1: Calificación de transacciones (1 a 5 estrellas).</w:t>
+      </w:r>
+    </w:p>
+    <w:p>
+      <w:pPr>
+        <w:pStyle w:val="ListParagraph"/>
+        <w:spacing w:before="240" w:line="360" w:lineRule="auto"/>
+      </w:pPr>
+      <w:r>
+        <w:rPr>
+          <w:b/>
+          <w:bCs/>
+        </w:rPr>
+        <w:t>Descripción:</w:t>
+      </w:r>
+      <w:r>
+        <w:t xml:space="preserve"> Como Comprador, quiero calificar al vendedor después de la entrega, para premiar el buen servicio.</w:t>
+      </w:r>
+    </w:p>
+    <w:p>
+      <w:pPr>
+        <w:pStyle w:val="ListParagraph"/>
+        <w:spacing w:before="240" w:line="360" w:lineRule="auto"/>
+      </w:pPr>
+      <w:r>
+        <w:rPr>
+          <w:b/>
+          <w:bCs/>
+        </w:rPr>
+        <w:t>Criterios de Aceptación:</w:t>
       </w:r>
     </w:p>
     <w:p>
@@ -2402,15 +2508,7 @@
         <w:spacing w:before="240" w:line="360" w:lineRule="auto"/>
       </w:pPr>
       <w:r>
-        <w:t xml:space="preserve">Renderizado de pines leyendo coordenadas desde el </w:t>
-      </w:r>
-      <w:proofErr w:type="spellStart"/>
-      <w:r>
-        <w:t>backend</w:t>
-      </w:r>
-      <w:proofErr w:type="spellEnd"/>
-      <w:r>
-        <w:t>.</w:t>
+        <w:t>Se habilita un modal de calificación única y exclusivamente después de que la transacción se marque como completada (HU 6.4).</w:t>
       </w:r>
     </w:p>
     <w:p>
@@ -2427,7 +2525,7 @@
           <w:b/>
           <w:bCs/>
         </w:rPr>
-        <w:t>HU 5.2: Asignación de ubicación física a una publicación.</w:t>
+        <w:t>HU 7.2: Visualización de reputación en el perfil.</w:t>
       </w:r>
     </w:p>
     <w:p>
@@ -2443,7 +2541,7 @@
         <w:t>Descripción:</w:t>
       </w:r>
       <w:r>
-        <w:t xml:space="preserve"> Como Vendedor, quiero pinchar en el mapa el lugar del campus donde me encuentro, para que los compradores puedan caminar hacia mí.</w:t>
+        <w:t xml:space="preserve"> Como Usuario, quiero ver el promedio de estrellas de un vendedor antes de comprarle, para generar confianza.</w:t>
       </w:r>
     </w:p>
     <w:p>
@@ -2469,15 +2567,7 @@
         <w:spacing w:before="240" w:line="360" w:lineRule="auto"/>
       </w:pPr>
       <w:r>
-        <w:t xml:space="preserve">Guardado de la latitud y longitud en formato GEOMETRY(Point) en </w:t>
-      </w:r>
-      <w:proofErr w:type="spellStart"/>
-      <w:r>
-        <w:t>PostGIS</w:t>
-      </w:r>
-      <w:proofErr w:type="spellEnd"/>
-      <w:r>
-        <w:t>.</w:t>
+        <w:t>El promedio se recalcula (o actualiza de manera asíncrona) y se muestra en la tarjeta del vendedor (ej. 4.8 / 5.0).</w:t>
       </w:r>
     </w:p>
     <w:p>
@@ -2494,7 +2584,7 @@
           <w:b/>
           <w:bCs/>
         </w:rPr>
-        <w:t>HU 5.3: Filtrado del catálogo por radio de cercanía.</w:t>
+        <w:t>HU 7.3: Sistema de reporte por comportamiento indebido.</w:t>
       </w:r>
     </w:p>
     <w:p>
@@ -2510,7 +2600,7 @@
         <w:t>Descripción:</w:t>
       </w:r>
       <w:r>
-        <w:t xml:space="preserve"> Como Comprador con hambre, quiero filtrar para ver solo los vendedores que estén a menos de 100 metros de mi edificio.</w:t>
+        <w:t xml:space="preserve"> Como Usuario, quiero un botón para denunciar un producto o perfil que incumpla las normas, para mantener seguro el campus digital.</w:t>
       </w:r>
     </w:p>
     <w:p>
@@ -2536,115 +2626,7 @@
         <w:spacing w:before="240" w:line="360" w:lineRule="auto"/>
       </w:pPr>
       <w:r>
-        <w:lastRenderedPageBreak/>
-        <w:t xml:space="preserve">Query espacial utilizando la función </w:t>
-      </w:r>
-      <w:proofErr w:type="spellStart"/>
-      <w:r>
-        <w:t>ST_DWithin</w:t>
-      </w:r>
-      <w:proofErr w:type="spellEnd"/>
-      <w:r>
-        <w:t xml:space="preserve"> de </w:t>
-      </w:r>
-      <w:proofErr w:type="spellStart"/>
-      <w:r>
-        <w:t>PostGIS</w:t>
-      </w:r>
-      <w:proofErr w:type="spellEnd"/>
-      <w:r>
-        <w:t xml:space="preserve"> para devolver resultados por radio en metros.</w:t>
-      </w:r>
-    </w:p>
-    <w:p>
-      <w:pPr>
-        <w:pStyle w:val="ListParagraph"/>
-        <w:numPr>
-          <w:ilvl w:val="0"/>
-          <w:numId w:val="4"/>
-        </w:numPr>
-        <w:spacing w:before="240" w:line="360" w:lineRule="auto"/>
-        <w:rPr>
-          <w:b/>
-          <w:bCs/>
-        </w:rPr>
-      </w:pPr>
-      <w:r>
-        <w:rPr>
-          <w:b/>
-          <w:bCs/>
-        </w:rPr>
-        <w:t>EP-06: Negociación y Cierre P2P (</w:t>
-      </w:r>
-      <w:proofErr w:type="spellStart"/>
-      <w:r>
-        <w:rPr>
-          <w:b/>
-          <w:bCs/>
-        </w:rPr>
-        <w:t>Frictionless</w:t>
-      </w:r>
-      <w:proofErr w:type="spellEnd"/>
-      <w:r>
-        <w:rPr>
-          <w:b/>
-          <w:bCs/>
-        </w:rPr>
-        <w:t>)</w:t>
-      </w:r>
-    </w:p>
-    <w:p>
-      <w:pPr>
-        <w:pStyle w:val="ListParagraph"/>
-        <w:numPr>
-          <w:ilvl w:val="1"/>
-          <w:numId w:val="4"/>
-        </w:numPr>
-        <w:spacing w:before="240" w:line="360" w:lineRule="auto"/>
-      </w:pPr>
-      <w:r>
-        <w:rPr>
-          <w:b/>
-          <w:bCs/>
-        </w:rPr>
-        <w:t>HU 6.1: Chat interno en tiempo real.</w:t>
-      </w:r>
-    </w:p>
-    <w:p>
-      <w:pPr>
-        <w:pStyle w:val="ListParagraph"/>
-        <w:spacing w:before="240" w:line="360" w:lineRule="auto"/>
-      </w:pPr>
-      <w:r>
-        <w:rPr>
-          <w:b/>
-          <w:bCs/>
-        </w:rPr>
-        <w:t>Descripción:</w:t>
-      </w:r>
-      <w:r>
-        <w:t xml:space="preserve"> Como Usuario, quiero chatear con el vendedor dentro de la </w:t>
-      </w:r>
-      <w:proofErr w:type="gramStart"/>
-      <w:r>
-        <w:t>app</w:t>
-      </w:r>
-      <w:proofErr w:type="gramEnd"/>
-      <w:r>
-        <w:t>, para negociar sin tener que darle mi número de WhatsApp.</w:t>
-      </w:r>
-    </w:p>
-    <w:p>
-      <w:pPr>
-        <w:pStyle w:val="ListParagraph"/>
-        <w:spacing w:before="240" w:line="360" w:lineRule="auto"/>
-      </w:pPr>
-      <w:r>
-        <w:rPr>
-          <w:b/>
-          <w:bCs/>
-        </w:rPr>
-        <w:t>Criterios de Aceptación:</w:t>
+        <w:t>Botón "Reportar" con lista desplegable de razones (Spam, Ofensivo, Fraude).</w:t>
       </w:r>
     </w:p>
     <w:p>
@@ -2657,628 +2639,7 @@
         <w:spacing w:before="240" w:line="360" w:lineRule="auto"/>
       </w:pPr>
       <w:r>
-        <w:t xml:space="preserve">Implementación usando </w:t>
-      </w:r>
-      <w:proofErr w:type="spellStart"/>
-      <w:r>
-        <w:t>WebSockets</w:t>
-      </w:r>
-      <w:proofErr w:type="spellEnd"/>
-      <w:r>
-        <w:t xml:space="preserve"> (</w:t>
-      </w:r>
-      <w:proofErr w:type="spellStart"/>
-      <w:r>
-        <w:t>FastAPI</w:t>
-      </w:r>
-      <w:proofErr w:type="spellEnd"/>
-      <w:r>
-        <w:t xml:space="preserve"> </w:t>
-      </w:r>
-      <w:proofErr w:type="spellStart"/>
-      <w:r>
-        <w:t>websockets</w:t>
-      </w:r>
-      <w:proofErr w:type="spellEnd"/>
-      <w:r>
-        <w:t xml:space="preserve"> / Socket.io).</w:t>
-      </w:r>
-    </w:p>
-    <w:p>
-      <w:pPr>
-        <w:pStyle w:val="ListParagraph"/>
-        <w:numPr>
-          <w:ilvl w:val="2"/>
-          <w:numId w:val="4"/>
-        </w:numPr>
-        <w:spacing w:before="240" w:line="360" w:lineRule="auto"/>
-      </w:pPr>
-      <w:r>
-        <w:t>Los mensajes se persisten en la base de datos para historial de auditoría.</w:t>
-      </w:r>
-    </w:p>
-    <w:p>
-      <w:pPr>
-        <w:pStyle w:val="ListParagraph"/>
-        <w:numPr>
-          <w:ilvl w:val="1"/>
-          <w:numId w:val="4"/>
-        </w:numPr>
-        <w:spacing w:before="240" w:line="360" w:lineRule="auto"/>
-      </w:pPr>
-      <w:r>
-        <w:rPr>
-          <w:b/>
-          <w:bCs/>
-        </w:rPr>
-        <w:t xml:space="preserve">HU 6.2 y 6.3: Integración de Deep </w:t>
-      </w:r>
-      <w:proofErr w:type="gramStart"/>
-      <w:r>
-        <w:rPr>
-          <w:b/>
-          <w:bCs/>
-        </w:rPr>
-        <w:t>Link</w:t>
-      </w:r>
-      <w:proofErr w:type="gramEnd"/>
-      <w:r>
-        <w:rPr>
-          <w:b/>
-          <w:bCs/>
-        </w:rPr>
-        <w:t xml:space="preserve"> para </w:t>
-      </w:r>
-      <w:proofErr w:type="spellStart"/>
-      <w:r>
-        <w:rPr>
-          <w:b/>
-          <w:bCs/>
-        </w:rPr>
-        <w:t>Nequi</w:t>
-      </w:r>
-      <w:proofErr w:type="spellEnd"/>
-      <w:r>
-        <w:rPr>
-          <w:b/>
-          <w:bCs/>
-        </w:rPr>
-        <w:t xml:space="preserve"> / </w:t>
-      </w:r>
-      <w:proofErr w:type="spellStart"/>
-      <w:r>
-        <w:rPr>
-          <w:b/>
-          <w:bCs/>
-        </w:rPr>
-        <w:t>DaviPlata</w:t>
-      </w:r>
-      <w:proofErr w:type="spellEnd"/>
-      <w:r>
-        <w:rPr>
-          <w:b/>
-          <w:bCs/>
-        </w:rPr>
-        <w:t>.</w:t>
-      </w:r>
-    </w:p>
-    <w:p>
-      <w:pPr>
-        <w:pStyle w:val="ListParagraph"/>
-        <w:spacing w:before="240" w:line="360" w:lineRule="auto"/>
-      </w:pPr>
-      <w:r>
-        <w:rPr>
-          <w:b/>
-          <w:bCs/>
-        </w:rPr>
-        <w:t>Descripción:</w:t>
-      </w:r>
-      <w:r>
-        <w:t xml:space="preserve"> Como Comprador, quiero un botón que me abra directamente mi </w:t>
-      </w:r>
-      <w:proofErr w:type="gramStart"/>
-      <w:r>
-        <w:t>app</w:t>
-      </w:r>
-      <w:proofErr w:type="gramEnd"/>
-      <w:r>
-        <w:t xml:space="preserve"> de </w:t>
-      </w:r>
-      <w:proofErr w:type="spellStart"/>
-      <w:r>
-        <w:t>Nequi</w:t>
-      </w:r>
-      <w:proofErr w:type="spellEnd"/>
-      <w:r>
-        <w:t xml:space="preserve"> o </w:t>
-      </w:r>
-      <w:proofErr w:type="spellStart"/>
-      <w:r>
-        <w:t>DaviPlata</w:t>
-      </w:r>
-      <w:proofErr w:type="spellEnd"/>
-      <w:r>
-        <w:t xml:space="preserve"> con el número del vendedor, para pagar rápido sin digitar.</w:t>
-      </w:r>
-    </w:p>
-    <w:p>
-      <w:pPr>
-        <w:pStyle w:val="ListParagraph"/>
-        <w:spacing w:before="240" w:line="360" w:lineRule="auto"/>
-      </w:pPr>
-      <w:r>
-        <w:rPr>
-          <w:b/>
-          <w:bCs/>
-        </w:rPr>
-        <w:t>Criterios de Aceptación:</w:t>
-      </w:r>
-    </w:p>
-    <w:p>
-      <w:pPr>
-        <w:pStyle w:val="ListParagraph"/>
-        <w:spacing w:before="240" w:line="360" w:lineRule="auto"/>
-      </w:pPr>
-      <w:r>
-        <w:rPr>
-          <w:b/>
-          <w:bCs/>
-        </w:rPr>
-        <w:t>Restricción de Arquitectura:</w:t>
-      </w:r>
-      <w:r>
-        <w:t xml:space="preserve"> NO hay integración con </w:t>
-      </w:r>
-      <w:proofErr w:type="spellStart"/>
-      <w:r>
-        <w:t>APIs</w:t>
-      </w:r>
-      <w:proofErr w:type="spellEnd"/>
-      <w:r>
-        <w:t xml:space="preserve"> bancarias (está fuera del alcance del MVP). Solo se genera un </w:t>
-      </w:r>
-      <w:r>
-        <w:rPr>
-          <w:i/>
-          <w:iCs/>
-        </w:rPr>
-        <w:t xml:space="preserve">Deep </w:t>
-      </w:r>
-      <w:proofErr w:type="gramStart"/>
-      <w:r>
-        <w:rPr>
-          <w:i/>
-          <w:iCs/>
-        </w:rPr>
-        <w:t>Link</w:t>
-      </w:r>
-      <w:proofErr w:type="gramEnd"/>
-      <w:r>
-        <w:t xml:space="preserve"> o </w:t>
-      </w:r>
-      <w:r>
-        <w:rPr>
-          <w:i/>
-          <w:iCs/>
-        </w:rPr>
-        <w:t xml:space="preserve">URI </w:t>
-      </w:r>
-      <w:proofErr w:type="spellStart"/>
-      <w:r>
-        <w:rPr>
-          <w:i/>
-          <w:iCs/>
-        </w:rPr>
-        <w:t>Scheme</w:t>
-      </w:r>
-      <w:proofErr w:type="spellEnd"/>
-      <w:r>
-        <w:t xml:space="preserve"> (ej. </w:t>
-      </w:r>
-      <w:proofErr w:type="spellStart"/>
-      <w:r>
-        <w:t>nequi</w:t>
-      </w:r>
-      <w:proofErr w:type="spellEnd"/>
-      <w:r>
-        <w:t xml:space="preserve">://... o enlace web) que intenta abrir la </w:t>
-      </w:r>
-      <w:proofErr w:type="gramStart"/>
-      <w:r>
-        <w:t>app</w:t>
-      </w:r>
-      <w:proofErr w:type="gramEnd"/>
-      <w:r>
-        <w:t xml:space="preserve"> en el teléfono del usuario destino si el vendedor habilitó su número.</w:t>
-      </w:r>
-    </w:p>
-    <w:p>
-      <w:pPr>
-        <w:pStyle w:val="ListParagraph"/>
-        <w:numPr>
-          <w:ilvl w:val="1"/>
-          <w:numId w:val="4"/>
-        </w:numPr>
-        <w:spacing w:before="240" w:line="360" w:lineRule="auto"/>
-      </w:pPr>
-      <w:r>
-        <w:rPr>
-          <w:b/>
-          <w:bCs/>
-        </w:rPr>
-        <w:t>HU 6.4: Marcado manual de "Transacción Completada".</w:t>
-      </w:r>
-    </w:p>
-    <w:p>
-      <w:pPr>
-        <w:pStyle w:val="ListParagraph"/>
-        <w:spacing w:before="240" w:line="360" w:lineRule="auto"/>
-      </w:pPr>
-      <w:r>
-        <w:rPr>
-          <w:b/>
-          <w:bCs/>
-        </w:rPr>
-        <w:t>Descripción:</w:t>
-      </w:r>
-      <w:r>
-        <w:t xml:space="preserve"> Como Vendedor y Comprador, quiero un botón en el chat para confirmar que el producto fue entregado.</w:t>
-      </w:r>
-    </w:p>
-    <w:p>
-      <w:pPr>
-        <w:pStyle w:val="ListParagraph"/>
-        <w:spacing w:before="240" w:line="360" w:lineRule="auto"/>
-      </w:pPr>
-      <w:r>
-        <w:rPr>
-          <w:b/>
-          <w:bCs/>
-        </w:rPr>
-        <w:t>Criterios de Aceptación:</w:t>
-      </w:r>
-    </w:p>
-    <w:p>
-      <w:pPr>
-        <w:pStyle w:val="ListParagraph"/>
-        <w:numPr>
-          <w:ilvl w:val="2"/>
-          <w:numId w:val="4"/>
-        </w:numPr>
-        <w:spacing w:before="240" w:line="360" w:lineRule="auto"/>
-      </w:pPr>
-      <w:r>
-        <w:t>Ambos usuarios deben confirmar.</w:t>
-      </w:r>
-    </w:p>
-    <w:p>
-      <w:pPr>
-        <w:pStyle w:val="ListParagraph"/>
-        <w:numPr>
-          <w:ilvl w:val="2"/>
-          <w:numId w:val="4"/>
-        </w:numPr>
-        <w:spacing w:before="240" w:line="360" w:lineRule="auto"/>
-      </w:pPr>
-      <w:r>
-        <w:t>El chat se cierra o cambia de estado visual a "Completado".</w:t>
-      </w:r>
-    </w:p>
-    <w:p>
-      <w:pPr>
-        <w:pStyle w:val="ListParagraph"/>
-        <w:numPr>
-          <w:ilvl w:val="1"/>
-          <w:numId w:val="4"/>
-        </w:numPr>
-        <w:spacing w:before="240" w:line="360" w:lineRule="auto"/>
-      </w:pPr>
-      <w:r>
-        <w:rPr>
-          <w:b/>
-          <w:bCs/>
-        </w:rPr>
-        <w:t>HU 6.5: Registro automático del valor (GMV).</w:t>
-      </w:r>
-    </w:p>
-    <w:p>
-      <w:pPr>
-        <w:pStyle w:val="ListParagraph"/>
-        <w:spacing w:before="240" w:line="360" w:lineRule="auto"/>
-      </w:pPr>
-      <w:r>
-        <w:rPr>
-          <w:b/>
-          <w:bCs/>
-        </w:rPr>
-        <w:t>Descripción:</w:t>
-      </w:r>
-      <w:r>
-        <w:t xml:space="preserve"> Como Analista de Negocio, quiero que al confirmarse la transacción (HU 6.4), el sistema guarde el valor de la venta, para poder calcular métricas financieras (GMV) sin cobrar comisiones.</w:t>
-      </w:r>
-    </w:p>
-    <w:p>
-      <w:pPr>
-        <w:pStyle w:val="ListParagraph"/>
-        <w:spacing w:before="240" w:line="360" w:lineRule="auto"/>
-      </w:pPr>
-      <w:r>
-        <w:rPr>
-          <w:b/>
-          <w:bCs/>
-        </w:rPr>
-        <w:lastRenderedPageBreak/>
-        <w:t>Criterios de Aceptación:</w:t>
-      </w:r>
-    </w:p>
-    <w:p>
-      <w:pPr>
-        <w:pStyle w:val="ListParagraph"/>
-        <w:numPr>
-          <w:ilvl w:val="2"/>
-          <w:numId w:val="4"/>
-        </w:numPr>
-        <w:spacing w:before="240" w:line="360" w:lineRule="auto"/>
-      </w:pPr>
-      <w:r>
-        <w:t xml:space="preserve">Un </w:t>
-      </w:r>
-      <w:proofErr w:type="spellStart"/>
-      <w:r>
-        <w:rPr>
-          <w:i/>
-          <w:iCs/>
-        </w:rPr>
-        <w:t>trigger</w:t>
-      </w:r>
-      <w:proofErr w:type="spellEnd"/>
-      <w:r>
-        <w:t xml:space="preserve"> o función </w:t>
-      </w:r>
-      <w:proofErr w:type="spellStart"/>
-      <w:r>
-        <w:t>backend</w:t>
-      </w:r>
-      <w:proofErr w:type="spellEnd"/>
-      <w:r>
-        <w:t xml:space="preserve"> inserta el valor transaccional en COP en una tabla de métricas en el momento en que el estado cambia a "Completado".</w:t>
-      </w:r>
-    </w:p>
-    <w:p>
-      <w:pPr>
-        <w:spacing w:before="240" w:line="360" w:lineRule="auto"/>
-        <w:rPr>
-          <w:b/>
-          <w:bCs/>
-          <w:highlight w:val="yellow"/>
-        </w:rPr>
-      </w:pPr>
-      <w:r>
-        <w:rPr>
-          <w:b/>
-          <w:bCs/>
-        </w:rPr>
-        <w:t>Sprint 6: HU 7.1, HU 7.2, HU 7.3</w:t>
-      </w:r>
-    </w:p>
-    <w:p>
-      <w:pPr>
-        <w:pStyle w:val="ListParagraph"/>
-        <w:numPr>
-          <w:ilvl w:val="0"/>
-          <w:numId w:val="4"/>
-        </w:numPr>
-        <w:spacing w:before="240" w:line="360" w:lineRule="auto"/>
-        <w:rPr>
-          <w:b/>
-          <w:bCs/>
-        </w:rPr>
-      </w:pPr>
-      <w:r>
-        <w:rPr>
-          <w:b/>
-          <w:bCs/>
-        </w:rPr>
-        <w:t>EP-07: Moderación y Reputación Comunitaria</w:t>
-      </w:r>
-    </w:p>
-    <w:p>
-      <w:pPr>
-        <w:pStyle w:val="ListParagraph"/>
-        <w:numPr>
-          <w:ilvl w:val="1"/>
-          <w:numId w:val="4"/>
-        </w:numPr>
-        <w:spacing w:before="240" w:line="360" w:lineRule="auto"/>
-      </w:pPr>
-      <w:r>
-        <w:rPr>
-          <w:b/>
-          <w:bCs/>
-        </w:rPr>
-        <w:t>HU 7.1: Calificación de transacciones (1 a 5 estrellas).</w:t>
-      </w:r>
-    </w:p>
-    <w:p>
-      <w:pPr>
-        <w:pStyle w:val="ListParagraph"/>
-        <w:spacing w:before="240" w:line="360" w:lineRule="auto"/>
-      </w:pPr>
-      <w:r>
-        <w:rPr>
-          <w:b/>
-          <w:bCs/>
-        </w:rPr>
-        <w:t>Descripción:</w:t>
-      </w:r>
-      <w:r>
-        <w:t xml:space="preserve"> Como Comprador, quiero calificar al vendedor después de la entrega, para premiar el buen servicio.</w:t>
-      </w:r>
-    </w:p>
-    <w:p>
-      <w:pPr>
-        <w:pStyle w:val="ListParagraph"/>
-        <w:spacing w:before="240" w:line="360" w:lineRule="auto"/>
-      </w:pPr>
-      <w:r>
-        <w:rPr>
-          <w:b/>
-          <w:bCs/>
-        </w:rPr>
-        <w:t>Criterios de Aceptación:</w:t>
-      </w:r>
-    </w:p>
-    <w:p>
-      <w:pPr>
-        <w:pStyle w:val="ListParagraph"/>
-        <w:numPr>
-          <w:ilvl w:val="2"/>
-          <w:numId w:val="4"/>
-        </w:numPr>
-        <w:spacing w:before="240" w:line="360" w:lineRule="auto"/>
-      </w:pPr>
-      <w:r>
-        <w:t>Se habilita un modal de calificación única y exclusivamente después de que la transacción se marque como completada (HU 6.4).</w:t>
-      </w:r>
-    </w:p>
-    <w:p>
-      <w:pPr>
-        <w:pStyle w:val="ListParagraph"/>
-        <w:numPr>
-          <w:ilvl w:val="1"/>
-          <w:numId w:val="4"/>
-        </w:numPr>
-        <w:spacing w:before="240" w:line="360" w:lineRule="auto"/>
-      </w:pPr>
-      <w:r>
-        <w:rPr>
-          <w:b/>
-          <w:bCs/>
-        </w:rPr>
-        <w:t>HU 7.2: Visualización de reputación en el perfil.</w:t>
-      </w:r>
-    </w:p>
-    <w:p>
-      <w:pPr>
-        <w:pStyle w:val="ListParagraph"/>
-        <w:spacing w:before="240" w:line="360" w:lineRule="auto"/>
-      </w:pPr>
-      <w:r>
-        <w:rPr>
-          <w:b/>
-          <w:bCs/>
-        </w:rPr>
-        <w:t>Descripción:</w:t>
-      </w:r>
-      <w:r>
-        <w:t xml:space="preserve"> Como Usuario, quiero ver el promedio de estrellas de un vendedor antes de comprarle, para generar confianza.</w:t>
-      </w:r>
-    </w:p>
-    <w:p>
-      <w:pPr>
-        <w:pStyle w:val="ListParagraph"/>
-        <w:spacing w:before="240" w:line="360" w:lineRule="auto"/>
-      </w:pPr>
-      <w:r>
-        <w:rPr>
-          <w:b/>
-          <w:bCs/>
-        </w:rPr>
-        <w:t>Criterios de Aceptación:</w:t>
-      </w:r>
-    </w:p>
-    <w:p>
-      <w:pPr>
-        <w:pStyle w:val="ListParagraph"/>
-        <w:numPr>
-          <w:ilvl w:val="2"/>
-          <w:numId w:val="4"/>
-        </w:numPr>
-        <w:spacing w:before="240" w:line="360" w:lineRule="auto"/>
-      </w:pPr>
-      <w:r>
-        <w:t>El promedio se recalcula (o actualiza de manera asíncrona) y se muestra en la tarjeta del vendedor (ej. 4.8 / 5.0).</w:t>
-      </w:r>
-    </w:p>
-    <w:p>
-      <w:pPr>
-        <w:pStyle w:val="ListParagraph"/>
-        <w:numPr>
-          <w:ilvl w:val="1"/>
-          <w:numId w:val="4"/>
-        </w:numPr>
-        <w:spacing w:before="240" w:line="360" w:lineRule="auto"/>
-      </w:pPr>
-      <w:r>
-        <w:rPr>
-          <w:b/>
-          <w:bCs/>
-        </w:rPr>
-        <w:t>HU 7.3: Sistema de reporte por comportamiento indebido.</w:t>
-      </w:r>
-    </w:p>
-    <w:p>
-      <w:pPr>
-        <w:pStyle w:val="ListParagraph"/>
-        <w:spacing w:before="240" w:line="360" w:lineRule="auto"/>
-      </w:pPr>
-      <w:r>
-        <w:rPr>
-          <w:b/>
-          <w:bCs/>
-        </w:rPr>
-        <w:t>Descripción:</w:t>
-      </w:r>
-      <w:r>
-        <w:t xml:space="preserve"> Como Usuario, quiero un botón para denunciar un producto o perfil que incumpla las normas, para mantener seguro el campus digital.</w:t>
-      </w:r>
-    </w:p>
-    <w:p>
-      <w:pPr>
-        <w:pStyle w:val="ListParagraph"/>
-        <w:spacing w:before="240" w:line="360" w:lineRule="auto"/>
-      </w:pPr>
-      <w:r>
-        <w:rPr>
-          <w:b/>
-          <w:bCs/>
-        </w:rPr>
-        <w:t>Criterios de Aceptación:</w:t>
-      </w:r>
-    </w:p>
-    <w:p>
-      <w:pPr>
-        <w:pStyle w:val="ListParagraph"/>
-        <w:numPr>
-          <w:ilvl w:val="2"/>
-          <w:numId w:val="4"/>
-        </w:numPr>
-        <w:spacing w:before="240" w:line="360" w:lineRule="auto"/>
-      </w:pPr>
-      <w:r>
-        <w:t>Botón "Reportar" con lista desplegable de razones (Spam, Ofensivo, Fraude).</w:t>
-      </w:r>
-    </w:p>
-    <w:p>
-      <w:pPr>
-        <w:pStyle w:val="ListParagraph"/>
-        <w:numPr>
-          <w:ilvl w:val="2"/>
-          <w:numId w:val="4"/>
-        </w:numPr>
-        <w:spacing w:before="240" w:line="360" w:lineRule="auto"/>
-      </w:pPr>
-      <w:r>
-        <w:t xml:space="preserve">Si un producto recibe X número de reportes (ej. 3), el sistema lo oculta automáticamente (cambia </w:t>
-      </w:r>
-      <w:proofErr w:type="spellStart"/>
-      <w:r>
-        <w:t>is_active</w:t>
-      </w:r>
-      <w:proofErr w:type="spellEnd"/>
-      <w:r>
-        <w:t>=false) hasta que un administrador lo revise.</w:t>
+        <w:t>Si un producto recibe X número de reportes (ej. 3), el sistema lo oculta automáticamente (cambia is_active=false) hasta que un administrador lo revise.</w:t>
       </w:r>
       <w:r>
         <w:rPr>
@@ -3326,23 +2687,7 @@
         <w:t>El sistema debe validar que los correos electrónicos ingresados en el registro pertenezcan</w:t>
       </w:r>
       <w:r>
-        <w:t xml:space="preserve"> a los registros dados por sinapsis </w:t>
-      </w:r>
-      <w:proofErr w:type="spellStart"/>
-      <w:r>
-        <w:t>uao</w:t>
-      </w:r>
-      <w:proofErr w:type="spellEnd"/>
-      <w:r>
-        <w:t xml:space="preserve"> (archivos .</w:t>
-      </w:r>
-      <w:proofErr w:type="spellStart"/>
-      <w:r>
-        <w:t>csv</w:t>
-      </w:r>
-      <w:proofErr w:type="spellEnd"/>
-      <w:r>
-        <w:t>)</w:t>
+        <w:t xml:space="preserve"> a los registros dados por sinapsis uao (archivos .csv)</w:t>
       </w:r>
     </w:p>
     <w:p>
@@ -3462,23 +2807,7 @@
         <w:t xml:space="preserve">RF-07 (Enlaces de Pago Externos): </w:t>
       </w:r>
       <w:r>
-        <w:t>El sistema debe generar botones que abran directamente las aplicaciones de billeteras digitales (</w:t>
-      </w:r>
-      <w:proofErr w:type="spellStart"/>
-      <w:r>
-        <w:t>Nequi</w:t>
-      </w:r>
-      <w:proofErr w:type="spellEnd"/>
-      <w:r>
-        <w:t>/</w:t>
-      </w:r>
-      <w:proofErr w:type="spellStart"/>
-      <w:r>
-        <w:t>DaviPlata</w:t>
-      </w:r>
-      <w:proofErr w:type="spellEnd"/>
-      <w:r>
-        <w:t>) instaladas en el dispositivo del usuario.</w:t>
+        <w:t>El sistema debe generar botones que abran directamente las aplicaciones de billeteras digitales (Nequi/DaviPlata) instaladas en el dispositivo del usuario.</w:t>
       </w:r>
     </w:p>
     <w:p>
@@ -3632,23 +2961,7 @@
         <w:spacing w:before="240" w:line="360" w:lineRule="auto"/>
       </w:pPr>
       <w:r>
-        <w:t xml:space="preserve">La arquitectura </w:t>
-      </w:r>
-      <w:proofErr w:type="spellStart"/>
-      <w:r>
-        <w:t>backend</w:t>
-      </w:r>
-      <w:proofErr w:type="spellEnd"/>
-      <w:r>
-        <w:t xml:space="preserve"> (</w:t>
-      </w:r>
-      <w:proofErr w:type="spellStart"/>
-      <w:r>
-        <w:t>FastAPI</w:t>
-      </w:r>
-      <w:proofErr w:type="spellEnd"/>
-      <w:r>
-        <w:t>) debe soportar 500 usuarios concurrentes y picos de hasta 1,200 usuarios/hora sin degradación de servicio. La base de datos debe soportar un catálogo de 15,000 productos activos.</w:t>
+        <w:t>La arquitectura backend (FastAPI) debe soportar 500 usuarios concurrentes y picos de hasta 1,200 usuarios/hora sin degradación de servicio. La base de datos debe soportar un catálogo de 15,000 productos activos.</w:t>
       </w:r>
     </w:p>
     <w:p>
@@ -3669,58 +2982,16 @@
           <w:b/>
           <w:bCs/>
         </w:rPr>
-        <w:t>RNF-03 (</w:t>
-      </w:r>
-      <w:proofErr w:type="spellStart"/>
-      <w:r>
-        <w:rPr>
-          <w:b/>
-          <w:bCs/>
-        </w:rPr>
-        <w:t>Instalabilidad</w:t>
-      </w:r>
-      <w:proofErr w:type="spellEnd"/>
-      <w:r>
-        <w:rPr>
-          <w:b/>
-          <w:bCs/>
-        </w:rPr>
-        <w:t xml:space="preserve"> PWA): </w:t>
-      </w:r>
-    </w:p>
-    <w:p>
-      <w:pPr>
-        <w:pStyle w:val="ListParagraph"/>
-        <w:spacing w:before="240" w:line="360" w:lineRule="auto"/>
-      </w:pPr>
-      <w:r>
-        <w:t xml:space="preserve">La interfaz </w:t>
-      </w:r>
-      <w:proofErr w:type="spellStart"/>
-      <w:r>
-        <w:t>frontend</w:t>
-      </w:r>
-      <w:proofErr w:type="spellEnd"/>
-      <w:r>
-        <w:t xml:space="preserve"> (Next.js) debe cumplir con los estándares de </w:t>
-      </w:r>
-      <w:proofErr w:type="spellStart"/>
-      <w:r>
-        <w:t>Progressive</w:t>
-      </w:r>
-      <w:proofErr w:type="spellEnd"/>
-      <w:r>
-        <w:t xml:space="preserve"> Web App (Service Worker base, </w:t>
-      </w:r>
-      <w:proofErr w:type="spellStart"/>
-      <w:proofErr w:type="gramStart"/>
-      <w:r>
-        <w:t>manifest.json</w:t>
-      </w:r>
-      <w:proofErr w:type="spellEnd"/>
-      <w:proofErr w:type="gramEnd"/>
-      <w:r>
-        <w:t>) para permitir su instalación en iOS y Android.</w:t>
+        <w:t xml:space="preserve">RNF-03 (Instalabilidad PWA): </w:t>
+      </w:r>
+    </w:p>
+    <w:p>
+      <w:pPr>
+        <w:pStyle w:val="ListParagraph"/>
+        <w:spacing w:before="240" w:line="360" w:lineRule="auto"/>
+      </w:pPr>
+      <w:r>
+        <w:t>La interfaz frontend (Next.js) debe cumplir con los estándares de Progressive Web App (Service Worker base, manifest.json) para permitir su instalación en iOS y Android.</w:t>
       </w:r>
     </w:p>
     <w:p>
@@ -3755,161 +3026,97 @@
         <w:rPr>
           <w:highlight w:val="yellow"/>
         </w:rPr>
-        <w:t xml:space="preserve">Durante una prueba de carga simulando 500 usuarios concurrentes enviando mensajes simultáneamente, el sistema de </w:t>
-      </w:r>
-      <w:proofErr w:type="spellStart"/>
-      <w:r>
+        <w:t>Durante una prueba de carga simulando 500 usuarios concurrentes enviando mensajes simultáneamente, el sistema de WebSockets debe procesar y entregar el 95% de los mensajes (percentil p95) en un tiempo de viaje de ida y vuelta (round-trip time) inferior a 500 milisegundos.</w:t>
+      </w:r>
+    </w:p>
+    <w:p>
+      <w:pPr>
+        <w:pStyle w:val="ListParagraph"/>
+        <w:numPr>
+          <w:ilvl w:val="0"/>
+          <w:numId w:val="4"/>
+        </w:numPr>
+        <w:spacing w:before="240" w:line="360" w:lineRule="auto"/>
+        <w:rPr>
+          <w:b/>
+          <w:bCs/>
+        </w:rPr>
+      </w:pPr>
+      <w:r>
+        <w:rPr>
+          <w:b/>
+          <w:bCs/>
+        </w:rPr>
+        <w:t xml:space="preserve">RNF-05 (Seguridad y Privacidad): </w:t>
+      </w:r>
+    </w:p>
+    <w:p>
+      <w:pPr>
+        <w:pStyle w:val="ListParagraph"/>
+        <w:spacing w:before="240" w:line="360" w:lineRule="auto"/>
+      </w:pPr>
+      <w:r>
+        <w:t>Todo dato sensible en la base de datos (PostgreSQL) debe estar encriptado. El sistema no expondrá directamente el número de teléfono del usuario a menos que este lo habilite explícitamente en su privacidad.</w:t>
+      </w:r>
+    </w:p>
+    <w:p>
+      <w:pPr>
+        <w:pStyle w:val="ListParagraph"/>
+        <w:numPr>
+          <w:ilvl w:val="0"/>
+          <w:numId w:val="4"/>
+        </w:numPr>
+        <w:spacing w:before="240" w:line="360" w:lineRule="auto"/>
+      </w:pPr>
+      <w:r>
+        <w:rPr>
+          <w:b/>
+          <w:bCs/>
+        </w:rPr>
+        <w:t xml:space="preserve">RNF-06 (Tolerancia a fallos de red): </w:t>
+      </w:r>
+    </w:p>
+    <w:p>
+      <w:pPr>
+        <w:pStyle w:val="ListParagraph"/>
+        <w:spacing w:before="240" w:line="360" w:lineRule="auto"/>
+      </w:pPr>
+      <w:r>
+        <w:t>Si el usuario pierde la conexión a internet de la universidad, la app debe mostrar una advertencia de "Sin conexión" de forma controlada y no romper la interfaz gráfica de manera abrupta.</w:t>
+      </w:r>
+    </w:p>
+    <w:p>
+      <w:pPr>
+        <w:pStyle w:val="ListParagraph"/>
+        <w:numPr>
+          <w:ilvl w:val="0"/>
+          <w:numId w:val="4"/>
+        </w:numPr>
+        <w:spacing w:before="240" w:line="360" w:lineRule="auto"/>
         <w:rPr>
           <w:highlight w:val="yellow"/>
         </w:rPr>
-        <w:t>WebSockets</w:t>
-      </w:r>
-      <w:proofErr w:type="spellEnd"/>
-      <w:r>
-        <w:rPr>
+      </w:pPr>
+      <w:r>
+        <w:rPr>
+          <w:b/>
+          <w:bCs/>
           <w:highlight w:val="yellow"/>
         </w:rPr>
-        <w:t xml:space="preserve"> debe procesar y entregar el 95% de los mensajes (percentil p95) en un tiempo de viaje de ida y vuelta (</w:t>
-      </w:r>
-      <w:proofErr w:type="gramStart"/>
+        <w:t xml:space="preserve">RNF-07 (Escalabilidad de Fases): </w:t>
+      </w:r>
       <w:r>
         <w:rPr>
           <w:highlight w:val="yellow"/>
         </w:rPr>
-        <w:t>round</w:t>
-      </w:r>
-      <w:proofErr w:type="gramEnd"/>
+        <w:t xml:space="preserve">La arquitectura de la Fase Piloto debe operar íntegramente en servicios de capa gratuita (Free Tier). El código debe ser agnóstico a la infraestructura (Cloud-Native) para permitir la migración sin reescritura de </w:t>
+      </w:r>
       <w:r>
         <w:rPr>
           <w:highlight w:val="yellow"/>
         </w:rPr>
-        <w:t>-</w:t>
-      </w:r>
-      <w:proofErr w:type="spellStart"/>
-      <w:r>
-        <w:rPr>
-          <w:highlight w:val="yellow"/>
-        </w:rPr>
-        <w:t>trip</w:t>
-      </w:r>
-      <w:proofErr w:type="spellEnd"/>
-      <w:r>
-        <w:rPr>
-          <w:highlight w:val="yellow"/>
-        </w:rPr>
-        <w:t xml:space="preserve"> time) inferior a 500 milisegundos.</w:t>
-      </w:r>
-    </w:p>
-    <w:p>
-      <w:pPr>
-        <w:pStyle w:val="ListParagraph"/>
-        <w:numPr>
-          <w:ilvl w:val="0"/>
-          <w:numId w:val="4"/>
-        </w:numPr>
-        <w:spacing w:before="240" w:line="360" w:lineRule="auto"/>
-        <w:rPr>
-          <w:b/>
-          <w:bCs/>
-        </w:rPr>
-      </w:pPr>
-      <w:r>
-        <w:rPr>
-          <w:b/>
-          <w:bCs/>
-        </w:rPr>
-        <w:t xml:space="preserve">RNF-05 (Seguridad y Privacidad): </w:t>
-      </w:r>
-    </w:p>
-    <w:p>
-      <w:pPr>
-        <w:pStyle w:val="ListParagraph"/>
-        <w:spacing w:before="240" w:line="360" w:lineRule="auto"/>
-      </w:pPr>
-      <w:r>
-        <w:t>Todo dato sensible en la base de datos (PostgreSQL) debe estar encriptado. El sistema no expondrá directamente el número de teléfono del usuario a menos que este lo habilite explícitamente en su privacidad.</w:t>
-      </w:r>
-    </w:p>
-    <w:p>
-      <w:pPr>
-        <w:pStyle w:val="ListParagraph"/>
-        <w:numPr>
-          <w:ilvl w:val="0"/>
-          <w:numId w:val="4"/>
-        </w:numPr>
-        <w:spacing w:before="240" w:line="360" w:lineRule="auto"/>
-      </w:pPr>
-      <w:r>
-        <w:rPr>
-          <w:b/>
-          <w:bCs/>
-        </w:rPr>
-        <w:t xml:space="preserve">RNF-06 (Tolerancia a fallos de red): </w:t>
-      </w:r>
-    </w:p>
-    <w:p>
-      <w:pPr>
-        <w:pStyle w:val="ListParagraph"/>
-        <w:spacing w:before="240" w:line="360" w:lineRule="auto"/>
-      </w:pPr>
-      <w:r>
-        <w:t xml:space="preserve">Si el usuario pierde la conexión a internet de la universidad, la </w:t>
-      </w:r>
-      <w:proofErr w:type="gramStart"/>
-      <w:r>
-        <w:t>app</w:t>
-      </w:r>
-      <w:proofErr w:type="gramEnd"/>
-      <w:r>
-        <w:t xml:space="preserve"> debe mostrar una advertencia de "Sin conexión" de forma controlada y no romper la interfaz gráfica de manera abrupta.</w:t>
-      </w:r>
-    </w:p>
-    <w:p>
-      <w:pPr>
-        <w:pStyle w:val="ListParagraph"/>
-        <w:numPr>
-          <w:ilvl w:val="0"/>
-          <w:numId w:val="4"/>
-        </w:numPr>
-        <w:spacing w:before="240" w:line="360" w:lineRule="auto"/>
-        <w:rPr>
-          <w:highlight w:val="yellow"/>
-        </w:rPr>
-      </w:pPr>
-      <w:r>
-        <w:rPr>
-          <w:b/>
-          <w:bCs/>
-          <w:highlight w:val="yellow"/>
-        </w:rPr>
-        <w:t xml:space="preserve">RNF-07 (Escalabilidad de Fases): </w:t>
-      </w:r>
-      <w:r>
-        <w:rPr>
-          <w:highlight w:val="yellow"/>
-        </w:rPr>
-        <w:t xml:space="preserve">La arquitectura de la Fase Piloto debe operar íntegramente en servicios de capa gratuita (Free Tier). El código debe ser agnóstico a la infraestructura (Cloud-Native) para permitir la migración sin reescritura de </w:t>
-      </w:r>
-      <w:r>
-        <w:rPr>
-          <w:highlight w:val="yellow"/>
-        </w:rPr>
         <w:lastRenderedPageBreak/>
-        <w:t xml:space="preserve">código hacia servicios pagos (AWS RDS, </w:t>
-      </w:r>
-      <w:proofErr w:type="spellStart"/>
-      <w:r>
-        <w:rPr>
-          <w:highlight w:val="yellow"/>
-        </w:rPr>
-        <w:t>Vercel</w:t>
-      </w:r>
-      <w:proofErr w:type="spellEnd"/>
-      <w:r>
-        <w:rPr>
-          <w:highlight w:val="yellow"/>
-        </w:rPr>
-        <w:t xml:space="preserve"> Pro) una vez se confirme la escalabilidad futura.</w:t>
+        <w:t>código hacia servicios pagos (AWS RDS, Vercel Pro) una vez se confirme la escalabilidad futura.</w:t>
       </w:r>
     </w:p>
     <w:p>

</xml_diff>

<commit_message>
feat(sprint-5): Implementación integral de Gestión de Pedidos, Analítica y Reputación (EP-07 & EP-08)
Backend:
- Implementación de modelos Rating, Coupon y Transaction.
- Refactorización de Negotiation con máquina de estados estricta y bloqueo transaccional (HU 8.1, 8.5).
- Servicios de analítica financiera con soporte para rangos temporales (HU 8.7).
- Notificaciones transaccionales por email (HU 8.2).
- Sistema de cupones de descuento (HU 8.9).
- Parámetros extra de compra: cantidad y notas (HU 8.3).

Documentación:
- Actualización completa del backlog con EP-08 y criterios de aceptación detallados.
- Depuración de archivos obsoletos y sincronización de requerimientos finales.

Calidad:
- Suite de pruebas actualizada con 98 tests exitosos (Backend).
- Cumplimiento de estándares de linting (Ruff).
</commit_message>
<xml_diff>
--- a/docs/Docx/P. Requerimientos (F + NF) y Épicas.docx
+++ b/docs/Docx/P. Requerimientos (F + NF) y Épicas.docx
@@ -249,7 +249,23 @@
           <w:b/>
           <w:bCs/>
         </w:rPr>
-        <w:t>HU 0.1: Inicialización del monorepo y configuración del pipeline CI/CD.</w:t>
+        <w:t xml:space="preserve">HU 0.1: Inicialización del </w:t>
+      </w:r>
+      <w:proofErr w:type="spellStart"/>
+      <w:r>
+        <w:rPr>
+          <w:b/>
+          <w:bCs/>
+        </w:rPr>
+        <w:t>monorepo</w:t>
+      </w:r>
+      <w:proofErr w:type="spellEnd"/>
+      <w:r>
+        <w:rPr>
+          <w:b/>
+          <w:bCs/>
+        </w:rPr>
+        <w:t xml:space="preserve"> y configuración del pipeline CI/CD.</w:t>
       </w:r>
     </w:p>
     <w:p>
@@ -265,7 +281,23 @@
         <w:t>Descripción:</w:t>
       </w:r>
       <w:r>
-        <w:t xml:space="preserve"> Como Desarrollador, quiero tener un monorepo configurado con Next.js y FastAPI, integrado con un pipeline de CI/CD, para poder desplegar cambios automáticamente y sin errores en los entornos de nube gratuitos.</w:t>
+        <w:t xml:space="preserve"> Como Desarrollador, quiero tener un </w:t>
+      </w:r>
+      <w:proofErr w:type="spellStart"/>
+      <w:r>
+        <w:t>monorepo</w:t>
+      </w:r>
+      <w:proofErr w:type="spellEnd"/>
+      <w:r>
+        <w:t xml:space="preserve"> configurado con Next.js y </w:t>
+      </w:r>
+      <w:proofErr w:type="spellStart"/>
+      <w:r>
+        <w:t>FastAPI</w:t>
+      </w:r>
+      <w:proofErr w:type="spellEnd"/>
+      <w:r>
+        <w:t>, integrado con un pipeline de CI/CD, para poder desplegar cambios automáticamente y sin errores en los entornos de nube gratuitos.</w:t>
       </w:r>
     </w:p>
     <w:p>
@@ -291,7 +323,23 @@
         <w:spacing w:before="240" w:line="360" w:lineRule="auto"/>
       </w:pPr>
       <w:r>
-        <w:t>Estructura de carpetas /frontend y /backend creada.</w:t>
+        <w:t>Estructura de carpetas /</w:t>
+      </w:r>
+      <w:proofErr w:type="spellStart"/>
+      <w:r>
+        <w:t>frontend</w:t>
+      </w:r>
+      <w:proofErr w:type="spellEnd"/>
+      <w:r>
+        <w:t xml:space="preserve"> y /</w:t>
+      </w:r>
+      <w:proofErr w:type="spellStart"/>
+      <w:r>
+        <w:t>backend</w:t>
+      </w:r>
+      <w:proofErr w:type="spellEnd"/>
+      <w:r>
+        <w:t xml:space="preserve"> creada.</w:t>
       </w:r>
     </w:p>
     <w:p>
@@ -304,7 +352,23 @@
         <w:spacing w:before="240" w:line="360" w:lineRule="auto"/>
       </w:pPr>
       <w:r>
-        <w:t>GitHub Actions configurado (deploy.yml).</w:t>
+        <w:t xml:space="preserve">GitHub </w:t>
+      </w:r>
+      <w:proofErr w:type="spellStart"/>
+      <w:r>
+        <w:t>Actions</w:t>
+      </w:r>
+      <w:proofErr w:type="spellEnd"/>
+      <w:r>
+        <w:t xml:space="preserve"> configurado (</w:t>
+      </w:r>
+      <w:proofErr w:type="spellStart"/>
+      <w:r>
+        <w:t>deploy.yml</w:t>
+      </w:r>
+      <w:proofErr w:type="spellEnd"/>
+      <w:r>
+        <w:t>).</w:t>
       </w:r>
     </w:p>
     <w:p>
@@ -319,6 +383,7 @@
       <w:r>
         <w:t xml:space="preserve">Un </w:t>
       </w:r>
+      <w:proofErr w:type="spellStart"/>
       <w:r>
         <w:rPr>
           <w:i/>
@@ -326,9 +391,19 @@
         </w:rPr>
         <w:t>push</w:t>
       </w:r>
-      <w:r>
-        <w:t xml:space="preserve"> a la rama main dispara automáticamente el </w:t>
-      </w:r>
+      <w:proofErr w:type="spellEnd"/>
+      <w:r>
+        <w:t xml:space="preserve"> a la rama </w:t>
+      </w:r>
+      <w:proofErr w:type="spellStart"/>
+      <w:r>
+        <w:t>main</w:t>
+      </w:r>
+      <w:proofErr w:type="spellEnd"/>
+      <w:r>
+        <w:t xml:space="preserve"> dispara automáticamente el </w:t>
+      </w:r>
+      <w:proofErr w:type="spellStart"/>
       <w:r>
         <w:rPr>
           <w:i/>
@@ -336,8 +411,33 @@
         </w:rPr>
         <w:t>linting</w:t>
       </w:r>
-      <w:r>
-        <w:t xml:space="preserve"> y el despliegue en Vercel (Frontend) y Render.com (Backend).</w:t>
+      <w:proofErr w:type="spellEnd"/>
+      <w:r>
+        <w:t xml:space="preserve"> y el despliegue en </w:t>
+      </w:r>
+      <w:proofErr w:type="spellStart"/>
+      <w:r>
+        <w:t>Vercel</w:t>
+      </w:r>
+      <w:proofErr w:type="spellEnd"/>
+      <w:r>
+        <w:t xml:space="preserve"> (</w:t>
+      </w:r>
+      <w:proofErr w:type="spellStart"/>
+      <w:r>
+        <w:t>Frontend</w:t>
+      </w:r>
+      <w:proofErr w:type="spellEnd"/>
+      <w:r>
+        <w:t>) y Render.com (</w:t>
+      </w:r>
+      <w:proofErr w:type="spellStart"/>
+      <w:r>
+        <w:t>Backend</w:t>
+      </w:r>
+      <w:proofErr w:type="spellEnd"/>
+      <w:r>
+        <w:t>).</w:t>
       </w:r>
     </w:p>
     <w:p>
@@ -361,7 +461,23 @@
           <w:b/>
           <w:bCs/>
         </w:rPr>
-        <w:t>HU 0.2: Modelado y despliegue del esquema de base de datos relacional con soporte espacial (PostGIS).</w:t>
+        <w:t>HU 0.2: Modelado y despliegue del esquema de base de datos relacional con soporte espacial (</w:t>
+      </w:r>
+      <w:proofErr w:type="spellStart"/>
+      <w:r>
+        <w:rPr>
+          <w:b/>
+          <w:bCs/>
+        </w:rPr>
+        <w:t>PostGIS</w:t>
+      </w:r>
+      <w:proofErr w:type="spellEnd"/>
+      <w:r>
+        <w:rPr>
+          <w:b/>
+          <w:bCs/>
+        </w:rPr>
+        <w:t>).</w:t>
       </w:r>
     </w:p>
     <w:p>
@@ -377,7 +493,15 @@
         <w:t>Descripción:</w:t>
       </w:r>
       <w:r>
-        <w:t xml:space="preserve"> Como Arquitecto de Datos, quiero desplegar el esquema en PostgreSQL habilitando PostGIS, para almacenar usuarios, productos y coordenadas geográficas de forma segura.</w:t>
+        <w:t xml:space="preserve"> Como Arquitecto de Datos, quiero desplegar el esquema en PostgreSQL habilitando </w:t>
+      </w:r>
+      <w:proofErr w:type="spellStart"/>
+      <w:r>
+        <w:t>PostGIS</w:t>
+      </w:r>
+      <w:proofErr w:type="spellEnd"/>
+      <w:r>
+        <w:t>, para almacenar usuarios, productos y coordenadas geográficas de forma segura.</w:t>
       </w:r>
     </w:p>
     <w:p>
@@ -403,7 +527,15 @@
         <w:spacing w:before="240" w:line="360" w:lineRule="auto"/>
       </w:pPr>
       <w:r>
-        <w:t>Instancia creada en capa gratuita (Supabase/Neon).</w:t>
+        <w:t>Instancia creada en capa gratuita (</w:t>
+      </w:r>
+      <w:proofErr w:type="spellStart"/>
+      <w:r>
+        <w:t>Supabase</w:t>
+      </w:r>
+      <w:proofErr w:type="spellEnd"/>
+      <w:r>
+        <w:t>/Neon).</w:t>
       </w:r>
     </w:p>
     <w:p>
@@ -416,7 +548,15 @@
         <w:spacing w:before="240" w:line="360" w:lineRule="auto"/>
       </w:pPr>
       <w:r>
-        <w:t>Extensión PostGIS activada.</w:t>
+        <w:t xml:space="preserve">Extensión </w:t>
+      </w:r>
+      <w:proofErr w:type="spellStart"/>
+      <w:r>
+        <w:t>PostGIS</w:t>
+      </w:r>
+      <w:proofErr w:type="spellEnd"/>
+      <w:r>
+        <w:t xml:space="preserve"> activada.</w:t>
       </w:r>
     </w:p>
     <w:p>
@@ -473,7 +613,15 @@
         <w:t>Descripción:</w:t>
       </w:r>
       <w:r>
-        <w:t xml:space="preserve"> Como DevOps, quiero configurar los dominios y el SSL, para garantizar que toda la transferencia de datos (especialmente la geolocalización de la PWA) viaje cifrada.</w:t>
+        <w:t xml:space="preserve"> Como DevOps, quiero configurar los dominios y el SSL, para garantizar que toda la transferencia de datos (especialmente la geolocalización de la PWA) </w:t>
+      </w:r>
+      <w:proofErr w:type="gramStart"/>
+      <w:r>
+        <w:t>viaje cifrada</w:t>
+      </w:r>
+      <w:proofErr w:type="gramEnd"/>
+      <w:r>
+        <w:t>.</w:t>
       </w:r>
     </w:p>
     <w:p>
@@ -503,7 +651,23 @@
         <w:spacing w:before="240" w:line="360" w:lineRule="auto"/>
       </w:pPr>
       <w:r>
-        <w:t>Dominio veramarket.app configurado en Cloudflare.</w:t>
+        <w:t xml:space="preserve">Dominio </w:t>
+      </w:r>
+      <w:proofErr w:type="spellStart"/>
+      <w:r>
+        <w:t>veramarket.app</w:t>
+      </w:r>
+      <w:proofErr w:type="spellEnd"/>
+      <w:r>
+        <w:t xml:space="preserve"> configurado en </w:t>
+      </w:r>
+      <w:proofErr w:type="spellStart"/>
+      <w:r>
+        <w:t>Cloudflare</w:t>
+      </w:r>
+      <w:proofErr w:type="spellEnd"/>
+      <w:r>
+        <w:t>.</w:t>
       </w:r>
     </w:p>
     <w:p>
@@ -528,8 +692,26 @@
         </w:numPr>
         <w:spacing w:before="240" w:line="360" w:lineRule="auto"/>
       </w:pPr>
-      <w:r>
-        <w:t>Archivos .env segregados (Local, Staging, Producción) sin subir secretos al repositorio.</w:t>
+      <w:proofErr w:type="gramStart"/>
+      <w:r>
+        <w:t>Archivos .</w:t>
+      </w:r>
+      <w:proofErr w:type="spellStart"/>
+      <w:r>
+        <w:t>env</w:t>
+      </w:r>
+      <w:proofErr w:type="spellEnd"/>
+      <w:proofErr w:type="gramEnd"/>
+      <w:r>
+        <w:t xml:space="preserve"> segregados (Local, </w:t>
+      </w:r>
+      <w:proofErr w:type="spellStart"/>
+      <w:r>
+        <w:t>Staging</w:t>
+      </w:r>
+      <w:proofErr w:type="spellEnd"/>
+      <w:r>
+        <w:t>, Producción) sin subir secretos al repositorio.</w:t>
       </w:r>
     </w:p>
     <w:p>
@@ -580,7 +762,23 @@
           <w:b/>
           <w:bCs/>
         </w:rPr>
-        <w:t>EP-01: Autenticación Segura y Perfilamiento (Privacy-First)</w:t>
+        <w:t>EP-01: Autenticación Segura y Perfilamiento (</w:t>
+      </w:r>
+      <w:proofErr w:type="spellStart"/>
+      <w:r>
+        <w:rPr>
+          <w:b/>
+          <w:bCs/>
+        </w:rPr>
+        <w:t>Privacy</w:t>
+      </w:r>
+      <w:proofErr w:type="spellEnd"/>
+      <w:r>
+        <w:rPr>
+          <w:b/>
+          <w:bCs/>
+        </w:rPr>
+        <w:t>-First)</w:t>
       </w:r>
     </w:p>
     <w:p>
@@ -615,11 +813,24 @@
       <w:r>
         <w:t xml:space="preserve"> Como Usuario, quiero ingresar con mi </w:t>
       </w:r>
+      <w:proofErr w:type="gramStart"/>
       <w:r>
         <w:t xml:space="preserve">correo </w:t>
       </w:r>
       <w:r>
-        <w:t xml:space="preserve"> y recibir un código temporal, para acceder a la app sin tener que memorizar otra contraseña.</w:t>
+        <w:t xml:space="preserve"> y</w:t>
+      </w:r>
+      <w:proofErr w:type="gramEnd"/>
+      <w:r>
+        <w:t xml:space="preserve"> recibir un código temporal, para acceder a la </w:t>
+      </w:r>
+      <w:proofErr w:type="gramStart"/>
+      <w:r>
+        <w:t>app</w:t>
+      </w:r>
+      <w:proofErr w:type="gramEnd"/>
+      <w:r>
+        <w:t xml:space="preserve"> sin tener que memorizar otra contraseña.</w:t>
       </w:r>
     </w:p>
     <w:p>
@@ -647,8 +858,13 @@
       <w:r>
         <w:t xml:space="preserve">El sistema solo acepta </w:t>
       </w:r>
-      <w:r>
-        <w:t>correos concordante a los registros dados por sinapsis</w:t>
+      <w:proofErr w:type="gramStart"/>
+      <w:r>
+        <w:t>correos concordante</w:t>
+      </w:r>
+      <w:proofErr w:type="gramEnd"/>
+      <w:r>
+        <w:t xml:space="preserve"> a los registros dados por sinapsis</w:t>
       </w:r>
     </w:p>
     <w:p>
@@ -733,7 +949,15 @@
         <w:spacing w:before="240" w:line="360" w:lineRule="auto"/>
       </w:pPr>
       <w:r>
-        <w:t>Se crea el registro en la tabla users al validar el primer OTP.</w:t>
+        <w:t xml:space="preserve">Se crea el registro en la tabla </w:t>
+      </w:r>
+      <w:proofErr w:type="spellStart"/>
+      <w:r>
+        <w:t>users</w:t>
+      </w:r>
+      <w:proofErr w:type="spellEnd"/>
+      <w:r>
+        <w:t xml:space="preserve"> al validar el primer OTP.</w:t>
       </w:r>
     </w:p>
     <w:p>
@@ -806,7 +1030,39 @@
         <w:spacing w:before="240" w:line="360" w:lineRule="auto"/>
       </w:pPr>
       <w:r>
-        <w:t>El toggle por defecto está en Oculto (Privacy by Design).</w:t>
+        <w:t xml:space="preserve">El </w:t>
+      </w:r>
+      <w:proofErr w:type="spellStart"/>
+      <w:r>
+        <w:t>toggle</w:t>
+      </w:r>
+      <w:proofErr w:type="spellEnd"/>
+      <w:r>
+        <w:t xml:space="preserve"> por defecto está en Oculto (</w:t>
+      </w:r>
+      <w:proofErr w:type="spellStart"/>
+      <w:r>
+        <w:t>Privacy</w:t>
+      </w:r>
+      <w:proofErr w:type="spellEnd"/>
+      <w:r>
+        <w:t xml:space="preserve"> </w:t>
+      </w:r>
+      <w:proofErr w:type="spellStart"/>
+      <w:r>
+        <w:t>by</w:t>
+      </w:r>
+      <w:proofErr w:type="spellEnd"/>
+      <w:r>
+        <w:t xml:space="preserve"> </w:t>
+      </w:r>
+      <w:proofErr w:type="spellStart"/>
+      <w:r>
+        <w:t>Design</w:t>
+      </w:r>
+      <w:proofErr w:type="spellEnd"/>
+      <w:r>
+        <w:t>).</w:t>
       </w:r>
     </w:p>
     <w:p>
@@ -819,7 +1075,15 @@
         <w:spacing w:before="240" w:line="360" w:lineRule="auto"/>
       </w:pPr>
       <w:r>
-        <w:t>Si está oculto, el backend enmascara o elimina el campo de contacto en la respuesta JSON pública.</w:t>
+        <w:t xml:space="preserve">Si está oculto, el </w:t>
+      </w:r>
+      <w:proofErr w:type="spellStart"/>
+      <w:r>
+        <w:t>backend</w:t>
+      </w:r>
+      <w:proofErr w:type="spellEnd"/>
+      <w:r>
+        <w:t xml:space="preserve"> enmascara o elimina el campo de contacto en la respuesta JSON pública.</w:t>
       </w:r>
     </w:p>
     <w:p>
@@ -852,7 +1116,15 @@
         <w:t>Descripción:</w:t>
       </w:r>
       <w:r>
-        <w:t xml:space="preserve"> Como Comprador, quiero ingresar mi código de emprendedor de Sinapsis, para solicitar permisos de publicación en el marketplace.</w:t>
+        <w:t xml:space="preserve"> Como Comprador, quiero ingresar mi código de emprendedor de Sinapsis, para solicitar permisos de publicación en el </w:t>
+      </w:r>
+      <w:proofErr w:type="spellStart"/>
+      <w:r>
+        <w:t>marketplace</w:t>
+      </w:r>
+      <w:proofErr w:type="spellEnd"/>
+      <w:r>
+        <w:t>.</w:t>
       </w:r>
     </w:p>
     <w:p>
@@ -908,7 +1180,23 @@
           <w:b/>
           <w:bCs/>
         </w:rPr>
-        <w:t>HU 1.5: Validación Sinapsis (Whitelist).</w:t>
+        <w:t>HU 1.5: Validación Sinapsis (</w:t>
+      </w:r>
+      <w:proofErr w:type="spellStart"/>
+      <w:r>
+        <w:rPr>
+          <w:b/>
+          <w:bCs/>
+        </w:rPr>
+        <w:t>Whitelist</w:t>
+      </w:r>
+      <w:proofErr w:type="spellEnd"/>
+      <w:r>
+        <w:rPr>
+          <w:b/>
+          <w:bCs/>
+        </w:rPr>
+        <w:t>).</w:t>
       </w:r>
     </w:p>
     <w:p>
@@ -950,7 +1238,15 @@
         <w:spacing w:before="240" w:line="360" w:lineRule="auto"/>
       </w:pPr>
       <w:r>
-        <w:t>Lectura exitosa del CSV/Endpoint de validación.</w:t>
+        <w:t>Lectura exitosa del CSV/</w:t>
+      </w:r>
+      <w:proofErr w:type="spellStart"/>
+      <w:r>
+        <w:t>Endpoint</w:t>
+      </w:r>
+      <w:proofErr w:type="spellEnd"/>
+      <w:r>
+        <w:t xml:space="preserve"> de validación.</w:t>
       </w:r>
     </w:p>
     <w:p>
@@ -1017,7 +1313,23 @@
         <w:t>Descripción:</w:t>
       </w:r>
       <w:r>
-        <w:t xml:space="preserve"> Como Usuario móvil, quiero ver un botón para agregar VeraMarket a mi pantalla de inicio, para usarla como una app nativa sin consumir espacio de almacenamiento.</w:t>
+        <w:t xml:space="preserve"> Como Usuario móvil, quiero ver un botón para agregar </w:t>
+      </w:r>
+      <w:proofErr w:type="spellStart"/>
+      <w:r>
+        <w:t>VeraMarket</w:t>
+      </w:r>
+      <w:proofErr w:type="spellEnd"/>
+      <w:r>
+        <w:t xml:space="preserve"> a mi pantalla de inicio, para usarla como una </w:t>
+      </w:r>
+      <w:proofErr w:type="gramStart"/>
+      <w:r>
+        <w:t>app</w:t>
+      </w:r>
+      <w:proofErr w:type="gramEnd"/>
+      <w:r>
+        <w:t xml:space="preserve"> nativa sin consumir espacio de almacenamiento.</w:t>
       </w:r>
     </w:p>
     <w:p>
@@ -1042,8 +1354,15 @@
         </w:numPr>
         <w:spacing w:before="240" w:line="360" w:lineRule="auto"/>
       </w:pPr>
-      <w:r>
-        <w:t>manifest.json configurado correctamente (iconos, colores de tema).</w:t>
+      <w:proofErr w:type="spellStart"/>
+      <w:proofErr w:type="gramStart"/>
+      <w:r>
+        <w:t>manifest.json</w:t>
+      </w:r>
+      <w:proofErr w:type="spellEnd"/>
+      <w:proofErr w:type="gramEnd"/>
+      <w:r>
+        <w:t xml:space="preserve"> configurado correctamente (iconos, colores de tema).</w:t>
       </w:r>
     </w:p>
     <w:p>
@@ -1058,6 +1377,7 @@
       <w:r>
         <w:t xml:space="preserve">El navegador dispara el </w:t>
       </w:r>
+      <w:proofErr w:type="spellStart"/>
       <w:r>
         <w:rPr>
           <w:i/>
@@ -1065,6 +1385,7 @@
         </w:rPr>
         <w:t>prompt</w:t>
       </w:r>
+      <w:proofErr w:type="spellEnd"/>
       <w:r>
         <w:t xml:space="preserve"> nativo de "Añadir a pantalla de inicio".</w:t>
       </w:r>
@@ -1083,7 +1404,39 @@
           <w:b/>
           <w:bCs/>
         </w:rPr>
-        <w:t>HU 2.2: Skeleton loaders y manejo de errores sin red.</w:t>
+        <w:t xml:space="preserve">HU 2.2: </w:t>
+      </w:r>
+      <w:proofErr w:type="spellStart"/>
+      <w:r>
+        <w:rPr>
+          <w:b/>
+          <w:bCs/>
+        </w:rPr>
+        <w:t>Skeleton</w:t>
+      </w:r>
+      <w:proofErr w:type="spellEnd"/>
+      <w:r>
+        <w:rPr>
+          <w:b/>
+          <w:bCs/>
+        </w:rPr>
+        <w:t xml:space="preserve"> </w:t>
+      </w:r>
+      <w:proofErr w:type="spellStart"/>
+      <w:r>
+        <w:rPr>
+          <w:b/>
+          <w:bCs/>
+        </w:rPr>
+        <w:t>loaders</w:t>
+      </w:r>
+      <w:proofErr w:type="spellEnd"/>
+      <w:r>
+        <w:rPr>
+          <w:b/>
+          <w:bCs/>
+        </w:rPr>
+        <w:t xml:space="preserve"> y manejo de errores sin red.</w:t>
       </w:r>
     </w:p>
     <w:p>
@@ -1126,7 +1479,15 @@
         <w:spacing w:before="240" w:line="360" w:lineRule="auto"/>
       </w:pPr>
       <w:r>
-        <w:t>Los componentes de Next.js muestran animaciones "Skeleton" mientras el Fetch de datos resuelve.</w:t>
+        <w:t>Los componentes de Next.js muestran animaciones "</w:t>
+      </w:r>
+      <w:proofErr w:type="spellStart"/>
+      <w:r>
+        <w:t>Skeleton</w:t>
+      </w:r>
+      <w:proofErr w:type="spellEnd"/>
+      <w:r>
+        <w:t>" mientras el Fetch de datos resuelve.</w:t>
       </w:r>
     </w:p>
     <w:p>
@@ -1141,6 +1502,7 @@
       <w:r>
         <w:t xml:space="preserve">Si la API da </w:t>
       </w:r>
+      <w:proofErr w:type="spellStart"/>
       <w:r>
         <w:rPr>
           <w:i/>
@@ -1148,6 +1510,7 @@
         </w:rPr>
         <w:t>timeout</w:t>
       </w:r>
+      <w:proofErr w:type="spellEnd"/>
       <w:r>
         <w:t xml:space="preserve"> o no hay internet, se muestra un banner de "Sin conexión a internet" interceptado por el Service Worker.</w:t>
       </w:r>
@@ -1166,7 +1529,23 @@
           <w:b/>
           <w:bCs/>
         </w:rPr>
-        <w:t>HU 2.3: Configuración de notificaciones push web.</w:t>
+        <w:t xml:space="preserve">HU 2.3: Configuración de notificaciones </w:t>
+      </w:r>
+      <w:proofErr w:type="spellStart"/>
+      <w:r>
+        <w:rPr>
+          <w:b/>
+          <w:bCs/>
+        </w:rPr>
+        <w:t>push</w:t>
+      </w:r>
+      <w:proofErr w:type="spellEnd"/>
+      <w:r>
+        <w:rPr>
+          <w:b/>
+          <w:bCs/>
+        </w:rPr>
+        <w:t xml:space="preserve"> web.</w:t>
       </w:r>
     </w:p>
     <w:p>
@@ -1182,7 +1561,15 @@
         <w:t>Descripción:</w:t>
       </w:r>
       <w:r>
-        <w:t xml:space="preserve"> Como Vendedor, quiero recibir notificaciones push en mi celular cuando alguien me escriba, para no perder oportunidades de venta.</w:t>
+        <w:t xml:space="preserve"> Como Vendedor, quiero recibir notificaciones </w:t>
+      </w:r>
+      <w:proofErr w:type="spellStart"/>
+      <w:r>
+        <w:t>push</w:t>
+      </w:r>
+      <w:proofErr w:type="spellEnd"/>
+      <w:r>
+        <w:t xml:space="preserve"> en mi celular cuando alguien me escriba, para no perder oportunidades de venta.</w:t>
       </w:r>
     </w:p>
     <w:p>
@@ -1221,7 +1608,15 @@
         <w:spacing w:before="240" w:line="360" w:lineRule="auto"/>
       </w:pPr>
       <w:r>
-        <w:t>El Service Worker es capaz de recibir y renderizar una alerta push en el dispositivo.</w:t>
+        <w:t xml:space="preserve">El Service Worker es capaz de recibir y renderizar una alerta </w:t>
+      </w:r>
+      <w:proofErr w:type="spellStart"/>
+      <w:r>
+        <w:t>push</w:t>
+      </w:r>
+      <w:proofErr w:type="spellEnd"/>
+      <w:r>
+        <w:t xml:space="preserve"> en el dispositivo.</w:t>
       </w:r>
     </w:p>
     <w:p>
@@ -1344,7 +1739,23 @@
         <w:spacing w:before="240" w:line="360" w:lineRule="auto"/>
       </w:pPr>
       <w:r>
-        <w:t>La imagen se optimiza y sube a un bucket (ej. Supabase Storage) con límite de peso (ej. 2MB).</w:t>
+        <w:t xml:space="preserve">La imagen se optimiza y sube a un </w:t>
+      </w:r>
+      <w:proofErr w:type="spellStart"/>
+      <w:r>
+        <w:t>bucket</w:t>
+      </w:r>
+      <w:proofErr w:type="spellEnd"/>
+      <w:r>
+        <w:t xml:space="preserve"> (ej. </w:t>
+      </w:r>
+      <w:proofErr w:type="spellStart"/>
+      <w:r>
+        <w:t>Supabase</w:t>
+      </w:r>
+      <w:proofErr w:type="spellEnd"/>
+      <w:r>
+        <w:t xml:space="preserve"> Storage) con límite de peso (ej. 2MB).</w:t>
       </w:r>
     </w:p>
     <w:p>
@@ -1478,168 +1889,32 @@
       <w:r>
         <w:t xml:space="preserve">Se implementa un </w:t>
       </w:r>
+      <w:proofErr w:type="spellStart"/>
       <w:r>
         <w:rPr>
           <w:i/>
           <w:iCs/>
         </w:rPr>
-        <w:t>Soft-Delete</w:t>
-      </w:r>
-      <w:r>
-        <w:t xml:space="preserve"> (ej. campo is_active = false en la BD) en lugar de un DELETE real.</w:t>
-      </w:r>
-    </w:p>
-    <w:p>
-      <w:pPr>
-        <w:pStyle w:val="ListParagraph"/>
-        <w:numPr>
-          <w:ilvl w:val="2"/>
-          <w:numId w:val="4"/>
-        </w:numPr>
-        <w:spacing w:before="240" w:line="360" w:lineRule="auto"/>
-      </w:pPr>
-      <w:r>
-        <w:t>El producto desaparece instantáneamente del catálogo público.</w:t>
-      </w:r>
-    </w:p>
-    <w:p>
-      <w:pPr>
-        <w:spacing w:before="240" w:line="360" w:lineRule="auto"/>
-        <w:rPr>
-          <w:b/>
-          <w:bCs/>
-        </w:rPr>
-      </w:pPr>
-      <w:r>
-        <w:rPr>
-          <w:b/>
-          <w:bCs/>
-        </w:rPr>
-        <w:t xml:space="preserve">Sprint </w:t>
-      </w:r>
-      <w:r>
-        <w:rPr>
-          <w:b/>
-          <w:bCs/>
-        </w:rPr>
-        <w:t>3</w:t>
-      </w:r>
-      <w:r>
-        <w:rPr>
-          <w:b/>
-          <w:bCs/>
-        </w:rPr>
-        <w:t>: HU 4.1, HU 4.2, HU 4.3</w:t>
-      </w:r>
-      <w:r>
-        <w:rPr>
-          <w:b/>
-          <w:bCs/>
-        </w:rPr>
-        <w:t xml:space="preserve">, </w:t>
-      </w:r>
-      <w:r>
-        <w:rPr>
-          <w:b/>
-          <w:bCs/>
-        </w:rPr>
-        <w:t>HU 5.1, HU 5.2, HU 5.3</w:t>
-      </w:r>
-    </w:p>
-    <w:p>
-      <w:pPr>
-        <w:pStyle w:val="ListParagraph"/>
-        <w:numPr>
-          <w:ilvl w:val="0"/>
-          <w:numId w:val="4"/>
-        </w:numPr>
-        <w:spacing w:before="240" w:line="360" w:lineRule="auto"/>
-        <w:rPr>
-          <w:b/>
-          <w:bCs/>
-        </w:rPr>
-      </w:pPr>
-      <w:r>
-        <w:rPr>
-          <w:b/>
-          <w:bCs/>
-        </w:rPr>
-        <w:t>EP-04: Búsqueda Inteligente (MVP - Motor Open Source / Fallback)</w:t>
-      </w:r>
-    </w:p>
-    <w:p>
-      <w:pPr>
-        <w:pStyle w:val="ListParagraph"/>
-        <w:numPr>
-          <w:ilvl w:val="1"/>
-          <w:numId w:val="4"/>
-        </w:numPr>
-        <w:spacing w:before="240" w:line="360" w:lineRule="auto"/>
-      </w:pPr>
-      <w:r>
-        <w:rPr>
-          <w:b/>
-          <w:bCs/>
-        </w:rPr>
-        <w:t>HU 4.1: Búsqueda tradicional y filtros.</w:t>
-      </w:r>
-    </w:p>
-    <w:p>
-      <w:pPr>
-        <w:pStyle w:val="ListParagraph"/>
-        <w:spacing w:before="240" w:line="360" w:lineRule="auto"/>
-      </w:pPr>
-      <w:r>
-        <w:rPr>
-          <w:b/>
-          <w:bCs/>
-        </w:rPr>
-        <w:t>Descripción:</w:t>
-      </w:r>
-      <w:r>
-        <w:t xml:space="preserve"> Como Comprador, quiero usar una barra de búsqueda para buscar productos exactos o filtrar por categorías, para encontrar lo que quiero rápido.</w:t>
-      </w:r>
-    </w:p>
-    <w:p>
-      <w:pPr>
-        <w:pStyle w:val="ListParagraph"/>
-        <w:spacing w:before="240" w:line="360" w:lineRule="auto"/>
-      </w:pPr>
-      <w:r>
-        <w:rPr>
-          <w:b/>
-          <w:bCs/>
-        </w:rPr>
-        <w:t>Criterios de Aceptación:</w:t>
-      </w:r>
-    </w:p>
-    <w:p>
-      <w:pPr>
-        <w:pStyle w:val="ListParagraph"/>
-        <w:numPr>
-          <w:ilvl w:val="2"/>
-          <w:numId w:val="4"/>
-        </w:numPr>
-        <w:spacing w:before="240" w:line="360" w:lineRule="auto"/>
-      </w:pPr>
-      <w:r>
-        <w:t xml:space="preserve">Implementación de </w:t>
-      </w:r>
+        <w:t>Soft</w:t>
+      </w:r>
+      <w:proofErr w:type="spellEnd"/>
       <w:r>
         <w:rPr>
           <w:i/>
           <w:iCs/>
         </w:rPr>
-        <w:t>Full-Text Search</w:t>
-      </w:r>
-      <w:r>
-        <w:t xml:space="preserve"> usando </w:t>
-      </w:r>
-      <w:r>
-        <w:t>TypeSense</w:t>
-      </w:r>
-      <w:r>
-        <w:t xml:space="preserve"> en PostgreSQL.</w:t>
+        <w:t>-Delete</w:t>
+      </w:r>
+      <w:r>
+        <w:t xml:space="preserve"> (ej. campo </w:t>
+      </w:r>
+      <w:proofErr w:type="spellStart"/>
+      <w:r>
+        <w:t>is_active</w:t>
+      </w:r>
+      <w:proofErr w:type="spellEnd"/>
+      <w:r>
+        <w:t xml:space="preserve"> = false en la BD) en lugar de un DELETE real.</w:t>
       </w:r>
     </w:p>
     <w:p>
@@ -1652,7 +1927,104 @@
         <w:spacing w:before="240" w:line="360" w:lineRule="auto"/>
       </w:pPr>
       <w:r>
-        <w:t>Latencia de respuesta menor a 1 segundo.</w:t>
+        <w:t>El producto desaparece instantáneamente del catálogo público.</w:t>
+      </w:r>
+    </w:p>
+    <w:p>
+      <w:pPr>
+        <w:spacing w:before="240" w:line="360" w:lineRule="auto"/>
+        <w:rPr>
+          <w:b/>
+          <w:bCs/>
+        </w:rPr>
+      </w:pPr>
+      <w:r>
+        <w:rPr>
+          <w:b/>
+          <w:bCs/>
+        </w:rPr>
+        <w:t xml:space="preserve">Sprint </w:t>
+      </w:r>
+      <w:r>
+        <w:rPr>
+          <w:b/>
+          <w:bCs/>
+        </w:rPr>
+        <w:t>3</w:t>
+      </w:r>
+      <w:r>
+        <w:rPr>
+          <w:b/>
+          <w:bCs/>
+        </w:rPr>
+        <w:t>: HU 4.1, HU 4.2, HU 4.3</w:t>
+      </w:r>
+      <w:r>
+        <w:rPr>
+          <w:b/>
+          <w:bCs/>
+        </w:rPr>
+        <w:t xml:space="preserve">, </w:t>
+      </w:r>
+      <w:r>
+        <w:rPr>
+          <w:b/>
+          <w:bCs/>
+        </w:rPr>
+        <w:t>HU 5.1, HU 5.2, HU 5.3</w:t>
+      </w:r>
+    </w:p>
+    <w:p>
+      <w:pPr>
+        <w:pStyle w:val="ListParagraph"/>
+        <w:numPr>
+          <w:ilvl w:val="0"/>
+          <w:numId w:val="4"/>
+        </w:numPr>
+        <w:spacing w:before="240" w:line="360" w:lineRule="auto"/>
+        <w:rPr>
+          <w:b/>
+          <w:bCs/>
+        </w:rPr>
+      </w:pPr>
+      <w:r>
+        <w:rPr>
+          <w:b/>
+          <w:bCs/>
+        </w:rPr>
+        <w:t xml:space="preserve">EP-04: Búsqueda Inteligente (MVP - Motor Open </w:t>
+      </w:r>
+      <w:proofErr w:type="spellStart"/>
+      <w:r>
+        <w:rPr>
+          <w:b/>
+          <w:bCs/>
+        </w:rPr>
+        <w:t>Source</w:t>
+      </w:r>
+      <w:proofErr w:type="spellEnd"/>
+      <w:r>
+        <w:rPr>
+          <w:b/>
+          <w:bCs/>
+        </w:rPr>
+        <w:t xml:space="preserve"> / </w:t>
+      </w:r>
+      <w:proofErr w:type="spellStart"/>
+      <w:r>
+        <w:rPr>
+          <w:b/>
+          <w:bCs/>
+        </w:rPr>
+        <w:t>Fallback</w:t>
+      </w:r>
+      <w:proofErr w:type="spellEnd"/>
+      <w:r>
+        <w:rPr>
+          <w:b/>
+          <w:bCs/>
+        </w:rPr>
+        <w:t>)</w:t>
       </w:r>
     </w:p>
     <w:p>
@@ -1669,7 +2041,7 @@
           <w:b/>
           <w:bCs/>
         </w:rPr>
-        <w:t>HU 4.2: Búsqueda semántica usando el motor IA.</w:t>
+        <w:t>HU 4.1: Búsqueda tradicional y filtros.</w:t>
       </w:r>
     </w:p>
     <w:p>
@@ -1685,7 +2057,7 @@
         <w:t>Descripción:</w:t>
       </w:r>
       <w:r>
-        <w:t xml:space="preserve"> Como Comprador, quiero buscar con lenguaje natural o modismos caleños (ej. "algo pa picar", "mecato"), para que la IA me sugiera productos relevantes aunque no tengan esa palabra exacta en el título.</w:t>
+        <w:t xml:space="preserve"> Como Comprador, quiero usar una barra de búsqueda para buscar productos exactos o filtrar por categorías, para encontrar lo que quiero rápido.</w:t>
       </w:r>
     </w:p>
     <w:p>
@@ -1711,29 +2083,140 @@
         <w:spacing w:before="240" w:line="360" w:lineRule="auto"/>
       </w:pPr>
       <w:r>
-        <w:t xml:space="preserve">Se envía la consulta a la API de </w:t>
-      </w:r>
-      <w:r>
-        <w:t>Google (Gemini 3.1-flash</w:t>
-      </w:r>
-      <w:r>
-        <w:t>).</w:t>
-      </w:r>
-    </w:p>
-    <w:p>
-      <w:pPr>
-        <w:pStyle w:val="ListParagraph"/>
-        <w:numPr>
-          <w:ilvl w:val="2"/>
-          <w:numId w:val="4"/>
-        </w:numPr>
-        <w:spacing w:before="240" w:line="360" w:lineRule="auto"/>
-      </w:pPr>
+        <w:t xml:space="preserve">Implementación de </w:t>
+      </w:r>
       <w:r>
         <w:rPr>
           <w:i/>
           <w:iCs/>
         </w:rPr>
+        <w:t>Full-Text Search</w:t>
+      </w:r>
+      <w:r>
+        <w:t xml:space="preserve"> usando </w:t>
+      </w:r>
+      <w:proofErr w:type="spellStart"/>
+      <w:r>
+        <w:t>TypeSense</w:t>
+      </w:r>
+      <w:proofErr w:type="spellEnd"/>
+      <w:r>
+        <w:t xml:space="preserve"> en PostgreSQL.</w:t>
+      </w:r>
+    </w:p>
+    <w:p>
+      <w:pPr>
+        <w:pStyle w:val="ListParagraph"/>
+        <w:numPr>
+          <w:ilvl w:val="2"/>
+          <w:numId w:val="4"/>
+        </w:numPr>
+        <w:spacing w:before="240" w:line="360" w:lineRule="auto"/>
+      </w:pPr>
+      <w:r>
+        <w:t>Latencia de respuesta menor a 1 segundo.</w:t>
+      </w:r>
+    </w:p>
+    <w:p>
+      <w:pPr>
+        <w:pStyle w:val="ListParagraph"/>
+        <w:numPr>
+          <w:ilvl w:val="1"/>
+          <w:numId w:val="4"/>
+        </w:numPr>
+        <w:spacing w:before="240" w:line="360" w:lineRule="auto"/>
+      </w:pPr>
+      <w:r>
+        <w:rPr>
+          <w:b/>
+          <w:bCs/>
+        </w:rPr>
+        <w:t>HU 4.2: Búsqueda semántica usando el motor IA.</w:t>
+      </w:r>
+    </w:p>
+    <w:p>
+      <w:pPr>
+        <w:pStyle w:val="ListParagraph"/>
+        <w:spacing w:before="240" w:line="360" w:lineRule="auto"/>
+      </w:pPr>
+      <w:r>
+        <w:rPr>
+          <w:b/>
+          <w:bCs/>
+        </w:rPr>
+        <w:t>Descripción:</w:t>
+      </w:r>
+      <w:r>
+        <w:t xml:space="preserve"> Como Comprador, quiero buscar con lenguaje natural o modismos caleños (ej. "algo </w:t>
+      </w:r>
+      <w:proofErr w:type="spellStart"/>
+      <w:r>
+        <w:t>pa</w:t>
+      </w:r>
+      <w:proofErr w:type="spellEnd"/>
+      <w:r>
+        <w:t xml:space="preserve"> picar", "mecato"), para que la IA me sugiera productos </w:t>
+      </w:r>
+      <w:proofErr w:type="gramStart"/>
+      <w:r>
+        <w:t>relevantes</w:t>
+      </w:r>
+      <w:proofErr w:type="gramEnd"/>
+      <w:r>
+        <w:t xml:space="preserve"> aunque no tengan esa palabra exacta en el título.</w:t>
+      </w:r>
+    </w:p>
+    <w:p>
+      <w:pPr>
+        <w:pStyle w:val="ListParagraph"/>
+        <w:spacing w:before="240" w:line="360" w:lineRule="auto"/>
+      </w:pPr>
+      <w:r>
+        <w:rPr>
+          <w:b/>
+          <w:bCs/>
+        </w:rPr>
+        <w:t>Criterios de Aceptación:</w:t>
+      </w:r>
+    </w:p>
+    <w:p>
+      <w:pPr>
+        <w:pStyle w:val="ListParagraph"/>
+        <w:numPr>
+          <w:ilvl w:val="2"/>
+          <w:numId w:val="4"/>
+        </w:numPr>
+        <w:spacing w:before="240" w:line="360" w:lineRule="auto"/>
+      </w:pPr>
+      <w:r>
+        <w:t xml:space="preserve">Se envía la consulta a la API de </w:t>
+      </w:r>
+      <w:r>
+        <w:t>Google (Gemini 3.1-</w:t>
+      </w:r>
+      <w:proofErr w:type="gramStart"/>
+      <w:r>
+        <w:t>flash</w:t>
+      </w:r>
+      <w:proofErr w:type="gramEnd"/>
+      <w:r>
+        <w:t>).</w:t>
+      </w:r>
+    </w:p>
+    <w:p>
+      <w:pPr>
+        <w:pStyle w:val="ListParagraph"/>
+        <w:numPr>
+          <w:ilvl w:val="2"/>
+          <w:numId w:val="4"/>
+        </w:numPr>
+        <w:spacing w:before="240" w:line="360" w:lineRule="auto"/>
+      </w:pPr>
+      <w:r>
+        <w:rPr>
+          <w:i/>
+          <w:iCs/>
+        </w:rPr>
         <w:lastRenderedPageBreak/>
         <w:t>Arquitectura:</w:t>
       </w:r>
@@ -1746,6 +2229,7 @@
       <w:r>
         <w:t xml:space="preserve"> falla o hay límite de uso, el sistema hace un </w:t>
       </w:r>
+      <w:proofErr w:type="spellStart"/>
       <w:r>
         <w:rPr>
           <w:i/>
@@ -1753,6 +2237,7 @@
         </w:rPr>
         <w:t>fallback</w:t>
       </w:r>
+      <w:proofErr w:type="spellEnd"/>
       <w:r>
         <w:t xml:space="preserve"> automático a la búsqueda tradicional de la HU 4.1.</w:t>
       </w:r>
@@ -1771,7 +2256,23 @@
           <w:b/>
           <w:bCs/>
         </w:rPr>
-        <w:t>HU 4.3: Visualización de recomendaciones ("VeraMatch").</w:t>
+        <w:t>HU 4.3: Visualización de recomendaciones ("</w:t>
+      </w:r>
+      <w:proofErr w:type="spellStart"/>
+      <w:r>
+        <w:rPr>
+          <w:b/>
+          <w:bCs/>
+        </w:rPr>
+        <w:t>VeraMatch</w:t>
+      </w:r>
+      <w:proofErr w:type="spellEnd"/>
+      <w:r>
+        <w:rPr>
+          <w:b/>
+          <w:bCs/>
+        </w:rPr>
+        <w:t>").</w:t>
       </w:r>
     </w:p>
     <w:p>
@@ -1851,7 +2352,23 @@
           <w:b/>
           <w:bCs/>
         </w:rPr>
-        <w:t>HU 5.1: Visualización del mapa interactivo (OpenStreetMap).</w:t>
+        <w:t>HU 5.1: Visualización del mapa interactivo (</w:t>
+      </w:r>
+      <w:proofErr w:type="spellStart"/>
+      <w:r>
+        <w:rPr>
+          <w:b/>
+          <w:bCs/>
+        </w:rPr>
+        <w:t>OpenStreetMap</w:t>
+      </w:r>
+      <w:proofErr w:type="spellEnd"/>
+      <w:r>
+        <w:rPr>
+          <w:b/>
+          <w:bCs/>
+        </w:rPr>
+        <w:t>).</w:t>
       </w:r>
     </w:p>
     <w:p>
@@ -1895,15 +2412,41 @@
       <w:r>
         <w:t xml:space="preserve">Librería tipo </w:t>
       </w:r>
+      <w:proofErr w:type="spellStart"/>
       <w:r>
         <w:rPr>
           <w:i/>
           <w:iCs/>
         </w:rPr>
-        <w:t>Leaflet/Mapbox</w:t>
-      </w:r>
-      <w:r>
-        <w:t xml:space="preserve"> integrada con tiles de OpenStreetMap (costo $0).</w:t>
+        <w:t>Leaflet</w:t>
+      </w:r>
+      <w:proofErr w:type="spellEnd"/>
+      <w:r>
+        <w:rPr>
+          <w:i/>
+          <w:iCs/>
+        </w:rPr>
+        <w:t>/</w:t>
+      </w:r>
+      <w:proofErr w:type="spellStart"/>
+      <w:r>
+        <w:rPr>
+          <w:i/>
+          <w:iCs/>
+        </w:rPr>
+        <w:t>Mapbox</w:t>
+      </w:r>
+      <w:proofErr w:type="spellEnd"/>
+      <w:r>
+        <w:t xml:space="preserve"> integrada con tiles de </w:t>
+      </w:r>
+      <w:proofErr w:type="spellStart"/>
+      <w:r>
+        <w:t>OpenStreetMap</w:t>
+      </w:r>
+      <w:proofErr w:type="spellEnd"/>
+      <w:r>
+        <w:t xml:space="preserve"> (costo $0).</w:t>
       </w:r>
     </w:p>
     <w:p>
@@ -1916,7 +2459,15 @@
         <w:spacing w:before="240" w:line="360" w:lineRule="auto"/>
       </w:pPr>
       <w:r>
-        <w:t>Renderizado de pines leyendo coordenadas desde el backend.</w:t>
+        <w:t xml:space="preserve">Renderizado de pines leyendo coordenadas desde el </w:t>
+      </w:r>
+      <w:proofErr w:type="spellStart"/>
+      <w:r>
+        <w:t>backend</w:t>
+      </w:r>
+      <w:proofErr w:type="spellEnd"/>
+      <w:r>
+        <w:t>.</w:t>
       </w:r>
     </w:p>
     <w:p>
@@ -1975,7 +2526,15 @@
         <w:spacing w:before="240" w:line="360" w:lineRule="auto"/>
       </w:pPr>
       <w:r>
-        <w:t>Guardado de la latitud y longitud en formato GEOMETRY(Point) en PostGIS.</w:t>
+        <w:t xml:space="preserve">Guardado de la latitud y longitud en formato GEOMETRY(Point) en </w:t>
+      </w:r>
+      <w:proofErr w:type="spellStart"/>
+      <w:r>
+        <w:t>PostGIS</w:t>
+      </w:r>
+      <w:proofErr w:type="spellEnd"/>
+      <w:r>
+        <w:t>.</w:t>
       </w:r>
     </w:p>
     <w:p>
@@ -2034,7 +2593,23 @@
         <w:spacing w:before="240" w:line="360" w:lineRule="auto"/>
       </w:pPr>
       <w:r>
-        <w:t>Query espacial utilizando la función ST_DWithin de PostGIS para devolver resultados por radio en metros.</w:t>
+        <w:t xml:space="preserve">Query espacial utilizando la función </w:t>
+      </w:r>
+      <w:proofErr w:type="spellStart"/>
+      <w:r>
+        <w:t>ST_DWithin</w:t>
+      </w:r>
+      <w:proofErr w:type="spellEnd"/>
+      <w:r>
+        <w:t xml:space="preserve"> de </w:t>
+      </w:r>
+      <w:proofErr w:type="spellStart"/>
+      <w:r>
+        <w:t>PostGIS</w:t>
+      </w:r>
+      <w:proofErr w:type="spellEnd"/>
+      <w:r>
+        <w:t xml:space="preserve"> para devolver resultados por radio en metros.</w:t>
       </w:r>
     </w:p>
     <w:p>
@@ -2101,7 +2676,23 @@
           <w:b/>
           <w:bCs/>
         </w:rPr>
-        <w:t>EP-06: Negociación y Cierre P2P (Frictionless)</w:t>
+        <w:t>EP-06: Negociación y Cierre P2P (</w:t>
+      </w:r>
+      <w:proofErr w:type="spellStart"/>
+      <w:r>
+        <w:rPr>
+          <w:b/>
+          <w:bCs/>
+        </w:rPr>
+        <w:t>Frictionless</w:t>
+      </w:r>
+      <w:proofErr w:type="spellEnd"/>
+      <w:r>
+        <w:rPr>
+          <w:b/>
+          <w:bCs/>
+        </w:rPr>
+        <w:t>)</w:t>
       </w:r>
     </w:p>
     <w:p>
@@ -2134,7 +2725,15 @@
         <w:t>Descripción:</w:t>
       </w:r>
       <w:r>
-        <w:t xml:space="preserve"> Como Usuario, quiero chatear con el vendedor dentro de la app, para negociar sin tener que darle mi número de WhatsApp.</w:t>
+        <w:t xml:space="preserve"> Como Usuario, quiero chatear con el vendedor dentro de la </w:t>
+      </w:r>
+      <w:proofErr w:type="gramStart"/>
+      <w:r>
+        <w:t>app</w:t>
+      </w:r>
+      <w:proofErr w:type="gramEnd"/>
+      <w:r>
+        <w:t>, para negociar sin tener que darle mi número de WhatsApp.</w:t>
       </w:r>
     </w:p>
     <w:p>
@@ -2160,7 +2759,31 @@
         <w:spacing w:before="240" w:line="360" w:lineRule="auto"/>
       </w:pPr>
       <w:r>
-        <w:t>Implementación usando WebSockets (FastAPI websockets / Socket.io).</w:t>
+        <w:t xml:space="preserve">Implementación usando </w:t>
+      </w:r>
+      <w:proofErr w:type="spellStart"/>
+      <w:r>
+        <w:t>WebSockets</w:t>
+      </w:r>
+      <w:proofErr w:type="spellEnd"/>
+      <w:r>
+        <w:t xml:space="preserve"> (</w:t>
+      </w:r>
+      <w:proofErr w:type="spellStart"/>
+      <w:r>
+        <w:t>FastAPI</w:t>
+      </w:r>
+      <w:proofErr w:type="spellEnd"/>
+      <w:r>
+        <w:t xml:space="preserve"> </w:t>
+      </w:r>
+      <w:proofErr w:type="spellStart"/>
+      <w:r>
+        <w:t>websockets</w:t>
+      </w:r>
+      <w:proofErr w:type="spellEnd"/>
+      <w:r>
+        <w:t xml:space="preserve"> / Socket.io).</w:t>
       </w:r>
     </w:p>
     <w:p>
@@ -2190,7 +2813,55 @@
           <w:b/>
           <w:bCs/>
         </w:rPr>
-        <w:t>HU 6.2 y 6.3: Integración de Deep Link para Nequi / DaviPlata.</w:t>
+        <w:t xml:space="preserve">HU 6.2 y 6.3: Integración de Deep </w:t>
+      </w:r>
+      <w:proofErr w:type="gramStart"/>
+      <w:r>
+        <w:rPr>
+          <w:b/>
+          <w:bCs/>
+        </w:rPr>
+        <w:t>Link</w:t>
+      </w:r>
+      <w:proofErr w:type="gramEnd"/>
+      <w:r>
+        <w:rPr>
+          <w:b/>
+          <w:bCs/>
+        </w:rPr>
+        <w:t xml:space="preserve"> para </w:t>
+      </w:r>
+      <w:proofErr w:type="spellStart"/>
+      <w:r>
+        <w:rPr>
+          <w:b/>
+          <w:bCs/>
+        </w:rPr>
+        <w:t>Nequi</w:t>
+      </w:r>
+      <w:proofErr w:type="spellEnd"/>
+      <w:r>
+        <w:rPr>
+          <w:b/>
+          <w:bCs/>
+        </w:rPr>
+        <w:t xml:space="preserve"> / </w:t>
+      </w:r>
+      <w:proofErr w:type="spellStart"/>
+      <w:r>
+        <w:rPr>
+          <w:b/>
+          <w:bCs/>
+        </w:rPr>
+        <w:t>DaviPlata</w:t>
+      </w:r>
+      <w:proofErr w:type="spellEnd"/>
+      <w:r>
+        <w:rPr>
+          <w:b/>
+          <w:bCs/>
+        </w:rPr>
+        <w:t>.</w:t>
       </w:r>
     </w:p>
     <w:p>
@@ -2206,7 +2877,31 @@
         <w:t>Descripción:</w:t>
       </w:r>
       <w:r>
-        <w:t xml:space="preserve"> Como Comprador, quiero un botón que me abra directamente mi app de Nequi o DaviPlata con el número del vendedor, para pagar rápido sin digitar.</w:t>
+        <w:t xml:space="preserve"> Como Comprador, quiero un botón que me abra directamente mi </w:t>
+      </w:r>
+      <w:proofErr w:type="gramStart"/>
+      <w:r>
+        <w:t>app</w:t>
+      </w:r>
+      <w:proofErr w:type="gramEnd"/>
+      <w:r>
+        <w:t xml:space="preserve"> de </w:t>
+      </w:r>
+      <w:proofErr w:type="spellStart"/>
+      <w:r>
+        <w:t>Nequi</w:t>
+      </w:r>
+      <w:proofErr w:type="spellEnd"/>
+      <w:r>
+        <w:t xml:space="preserve"> o </w:t>
+      </w:r>
+      <w:proofErr w:type="spellStart"/>
+      <w:r>
+        <w:t>DaviPlata</w:t>
+      </w:r>
+      <w:proofErr w:type="spellEnd"/>
+      <w:r>
+        <w:t xml:space="preserve"> con el número del vendedor, para pagar rápido sin digitar.</w:t>
       </w:r>
     </w:p>
     <w:p>
@@ -2235,27 +2930,69 @@
         <w:t>Restricción de Arquitectura:</w:t>
       </w:r>
       <w:r>
-        <w:t xml:space="preserve"> NO hay integración con APIs bancarias (está fuera del alcance del MVP). Solo se genera un </w:t>
+        <w:t xml:space="preserve"> NO hay integración con </w:t>
+      </w:r>
+      <w:proofErr w:type="spellStart"/>
+      <w:r>
+        <w:t>APIs</w:t>
+      </w:r>
+      <w:proofErr w:type="spellEnd"/>
+      <w:r>
+        <w:t xml:space="preserve"> bancarias (está fuera del alcance del MVP). Solo se genera un </w:t>
       </w:r>
       <w:r>
         <w:rPr>
           <w:i/>
           <w:iCs/>
         </w:rPr>
-        <w:t>Deep Link</w:t>
-      </w:r>
-      <w:r>
-        <w:t xml:space="preserve"> o </w:t>
-      </w:r>
+        <w:t xml:space="preserve">Deep </w:t>
+      </w:r>
+      <w:proofErr w:type="gramStart"/>
       <w:r>
         <w:rPr>
           <w:i/>
           <w:iCs/>
         </w:rPr>
-        <w:t>URI Scheme</w:t>
-      </w:r>
-      <w:r>
-        <w:t xml:space="preserve"> (ej. nequi://... o enlace web) que intenta abrir la app en el teléfono del usuario destino si el vendedor habilitó su número.</w:t>
+        <w:t>Link</w:t>
+      </w:r>
+      <w:proofErr w:type="gramEnd"/>
+      <w:r>
+        <w:t xml:space="preserve"> o </w:t>
+      </w:r>
+      <w:r>
+        <w:rPr>
+          <w:i/>
+          <w:iCs/>
+        </w:rPr>
+        <w:t xml:space="preserve">URI </w:t>
+      </w:r>
+      <w:proofErr w:type="spellStart"/>
+      <w:r>
+        <w:rPr>
+          <w:i/>
+          <w:iCs/>
+        </w:rPr>
+        <w:t>Scheme</w:t>
+      </w:r>
+      <w:proofErr w:type="spellEnd"/>
+      <w:r>
+        <w:t xml:space="preserve"> (ej. </w:t>
+      </w:r>
+      <w:proofErr w:type="spellStart"/>
+      <w:r>
+        <w:t>nequi</w:t>
+      </w:r>
+      <w:proofErr w:type="spellEnd"/>
+      <w:r>
+        <w:t xml:space="preserve">://... o enlace web) que intenta abrir la </w:t>
+      </w:r>
+      <w:proofErr w:type="gramStart"/>
+      <w:r>
+        <w:t>app</w:t>
+      </w:r>
+      <w:proofErr w:type="gramEnd"/>
+      <w:r>
+        <w:t xml:space="preserve"> en el teléfono del usuario destino si el vendedor habilitó su número.</w:t>
       </w:r>
     </w:p>
     <w:p>
@@ -2389,6 +3126,7 @@
         <w:lastRenderedPageBreak/>
         <w:t xml:space="preserve">Un </w:t>
       </w:r>
+      <w:proofErr w:type="spellStart"/>
       <w:r>
         <w:rPr>
           <w:i/>
@@ -2396,8 +3134,265 @@
         </w:rPr>
         <w:t>trigger</w:t>
       </w:r>
-      <w:r>
-        <w:t xml:space="preserve"> o función backend inserta el valor transaccional en COP en una tabla de métricas en el momento en que el estado cambia a "Completado".</w:t>
+      <w:proofErr w:type="spellEnd"/>
+      <w:r>
+        <w:t xml:space="preserve"> o función </w:t>
+      </w:r>
+      <w:proofErr w:type="spellStart"/>
+      <w:r>
+        <w:t>backend</w:t>
+      </w:r>
+      <w:proofErr w:type="spellEnd"/>
+      <w:r>
+        <w:t xml:space="preserve"> inserta el valor transaccional en COP en una tabla de métricas en el momento en que el estado cambia a "Completado".</w:t>
+      </w:r>
+    </w:p>
+    <w:p>
+      <w:pPr>
+        <w:pStyle w:val="ListParagraph"/>
+        <w:numPr>
+          <w:ilvl w:val="1"/>
+          <w:numId w:val="4"/>
+        </w:numPr>
+        <w:spacing w:before="240" w:line="360" w:lineRule="auto"/>
+      </w:pPr>
+      <w:r>
+        <w:rPr>
+          <w:b/>
+          <w:bCs/>
+        </w:rPr>
+        <w:t xml:space="preserve">HU </w:t>
+      </w:r>
+      <w:r>
+        <w:rPr>
+          <w:b/>
+          <w:bCs/>
+        </w:rPr>
+        <w:t>7.4</w:t>
+      </w:r>
+      <w:r>
+        <w:rPr>
+          <w:b/>
+          <w:bCs/>
+        </w:rPr>
+        <w:t>: Registro automático del valor (GMV).</w:t>
+      </w:r>
+    </w:p>
+    <w:p>
+      <w:pPr>
+        <w:pStyle w:val="ListParagraph"/>
+        <w:spacing w:before="240" w:line="360" w:lineRule="auto"/>
+      </w:pPr>
+      <w:r>
+        <w:rPr>
+          <w:b/>
+          <w:bCs/>
+        </w:rPr>
+        <w:t>Descripción:</w:t>
+      </w:r>
+      <w:r>
+        <w:t xml:space="preserve"> </w:t>
+      </w:r>
+      <w:r>
+        <w:t xml:space="preserve">Como desarrollador quiero que cada </w:t>
+      </w:r>
+      <w:proofErr w:type="spellStart"/>
+      <w:r>
+        <w:t>push</w:t>
+      </w:r>
+      <w:proofErr w:type="spellEnd"/>
+      <w:r>
+        <w:t xml:space="preserve"> o </w:t>
+      </w:r>
+      <w:proofErr w:type="spellStart"/>
+      <w:r>
+        <w:t>merge</w:t>
+      </w:r>
+      <w:proofErr w:type="spellEnd"/>
+      <w:r>
+        <w:t xml:space="preserve"> a la rama </w:t>
+      </w:r>
+      <w:proofErr w:type="spellStart"/>
+      <w:r>
+        <w:t>main</w:t>
+      </w:r>
+      <w:proofErr w:type="spellEnd"/>
+      <w:r>
+        <w:t xml:space="preserve"> dispare automáticamente la validación y el despliegue del sistema para </w:t>
+      </w:r>
+      <w:proofErr w:type="spellStart"/>
+      <w:r>
+        <w:t>segurar</w:t>
+      </w:r>
+      <w:proofErr w:type="spellEnd"/>
+      <w:r>
+        <w:t xml:space="preserve"> que la versión de producción siempre cuente con código limpio, funcional y actualizado, eliminando errores manuales en el proceso de entrega.</w:t>
+      </w:r>
+    </w:p>
+    <w:p>
+      <w:pPr>
+        <w:pStyle w:val="ListParagraph"/>
+        <w:spacing w:before="240" w:line="360" w:lineRule="auto"/>
+      </w:pPr>
+      <w:r>
+        <w:rPr>
+          <w:b/>
+          <w:bCs/>
+        </w:rPr>
+        <w:t>Criterios de Aceptación:</w:t>
+      </w:r>
+    </w:p>
+    <w:p>
+      <w:pPr>
+        <w:pStyle w:val="ListParagraph"/>
+        <w:numPr>
+          <w:ilvl w:val="2"/>
+          <w:numId w:val="4"/>
+        </w:numPr>
+        <w:spacing w:before="240" w:line="360" w:lineRule="auto"/>
+      </w:pPr>
+      <w:r>
+        <w:t xml:space="preserve">El proceso de despliegue debe abortarse si el </w:t>
+      </w:r>
+      <w:proofErr w:type="spellStart"/>
+      <w:r>
+        <w:t>linter</w:t>
+      </w:r>
+      <w:proofErr w:type="spellEnd"/>
+      <w:r>
+        <w:t xml:space="preserve"> de </w:t>
+      </w:r>
+      <w:proofErr w:type="spellStart"/>
+      <w:r>
+        <w:t>Backend</w:t>
+      </w:r>
+      <w:proofErr w:type="spellEnd"/>
+      <w:r>
+        <w:t xml:space="preserve"> (Ruff) o el de </w:t>
+      </w:r>
+      <w:proofErr w:type="spellStart"/>
+      <w:r>
+        <w:t>Frontend</w:t>
+      </w:r>
+      <w:proofErr w:type="spellEnd"/>
+      <w:r>
+        <w:t xml:space="preserve"> (</w:t>
+      </w:r>
+      <w:proofErr w:type="spellStart"/>
+      <w:r>
+        <w:t>ESLint</w:t>
+      </w:r>
+      <w:proofErr w:type="spellEnd"/>
+      <w:r>
+        <w:t>) encuentran errores de sintaxis, estilo o tipos.</w:t>
+      </w:r>
+    </w:p>
+    <w:p>
+      <w:pPr>
+        <w:pStyle w:val="ListParagraph"/>
+        <w:numPr>
+          <w:ilvl w:val="2"/>
+          <w:numId w:val="4"/>
+        </w:numPr>
+        <w:spacing w:before="240" w:line="360" w:lineRule="auto"/>
+      </w:pPr>
+      <w:r>
+        <w:t>Tras validar el código, el pipeline debe enviar una señal (</w:t>
+      </w:r>
+      <w:proofErr w:type="spellStart"/>
+      <w:r>
+        <w:t>Deploy</w:t>
+      </w:r>
+      <w:proofErr w:type="spellEnd"/>
+      <w:r>
+        <w:t xml:space="preserve"> Hook) a Render para reconstruir el contenedor de la API con los cambios más recientes.</w:t>
+      </w:r>
+    </w:p>
+    <w:p>
+      <w:pPr>
+        <w:pStyle w:val="ListParagraph"/>
+        <w:numPr>
+          <w:ilvl w:val="2"/>
+          <w:numId w:val="4"/>
+        </w:numPr>
+        <w:spacing w:before="240" w:line="360" w:lineRule="auto"/>
+      </w:pPr>
+      <w:r>
+        <w:t xml:space="preserve">El pipeline debe ejecutar el despliegue automático de la PWA en </w:t>
+      </w:r>
+      <w:proofErr w:type="spellStart"/>
+      <w:r>
+        <w:t>Vercel</w:t>
+      </w:r>
+      <w:proofErr w:type="spellEnd"/>
+      <w:r>
+        <w:t>, asegurando que las variables de entorno de producción sean inyectadas correctamente.</w:t>
+      </w:r>
+    </w:p>
+    <w:p>
+      <w:pPr>
+        <w:pStyle w:val="ListParagraph"/>
+        <w:numPr>
+          <w:ilvl w:val="2"/>
+          <w:numId w:val="4"/>
+        </w:numPr>
+        <w:spacing w:before="240" w:line="360" w:lineRule="auto"/>
+      </w:pPr>
+      <w:r>
+        <w:t xml:space="preserve">El despliegue a producción solo debe permitirse si los </w:t>
+      </w:r>
+      <w:proofErr w:type="spellStart"/>
+      <w:r>
+        <w:t>jobs</w:t>
+      </w:r>
+      <w:proofErr w:type="spellEnd"/>
+      <w:r>
+        <w:t xml:space="preserve"> de pruebas unitarias (</w:t>
+      </w:r>
+      <w:proofErr w:type="spellStart"/>
+      <w:r>
+        <w:t>backend-ci</w:t>
+      </w:r>
+      <w:proofErr w:type="spellEnd"/>
+      <w:r>
+        <w:t>) y construcción del paquete (</w:t>
+      </w:r>
+      <w:proofErr w:type="spellStart"/>
+      <w:r>
+        <w:t>frontend-ci</w:t>
+      </w:r>
+      <w:proofErr w:type="spellEnd"/>
+      <w:r>
+        <w:t>) finalizan con estado exitoso.</w:t>
+      </w:r>
+    </w:p>
+    <w:p>
+      <w:pPr>
+        <w:pStyle w:val="ListParagraph"/>
+        <w:numPr>
+          <w:ilvl w:val="2"/>
+          <w:numId w:val="4"/>
+        </w:numPr>
+        <w:spacing w:before="240" w:line="360" w:lineRule="auto"/>
+      </w:pPr>
+      <w:r>
+        <w:t> El estado del despliegue (en progreso, exitoso o fallido) debe ser visible visualmente mediante el "</w:t>
+      </w:r>
+      <w:proofErr w:type="spellStart"/>
+      <w:r>
+        <w:t>check</w:t>
+      </w:r>
+      <w:proofErr w:type="spellEnd"/>
+      <w:r>
+        <w:t xml:space="preserve">" verde o rojo en el historial de </w:t>
+      </w:r>
+      <w:proofErr w:type="spellStart"/>
+      <w:r>
+        <w:t>commits</w:t>
+      </w:r>
+      <w:proofErr w:type="spellEnd"/>
+      <w:r>
+        <w:t xml:space="preserve"> de GitHub.</w:t>
       </w:r>
     </w:p>
     <w:p>
@@ -2495,6 +3490,7 @@
           <w:b/>
           <w:bCs/>
         </w:rPr>
+        <w:lastRenderedPageBreak/>
         <w:t>Criterios de Aceptación:</w:t>
       </w:r>
     </w:p>
@@ -2639,7 +3635,15 @@
         <w:spacing w:before="240" w:line="360" w:lineRule="auto"/>
       </w:pPr>
       <w:r>
-        <w:t>Si un producto recibe X número de reportes (ej. 3), el sistema lo oculta automáticamente (cambia is_active=false) hasta que un administrador lo revise.</w:t>
+        <w:t xml:space="preserve">Si un producto recibe X número de reportes (ej. 3), el sistema lo oculta automáticamente (cambia </w:t>
+      </w:r>
+      <w:proofErr w:type="spellStart"/>
+      <w:r>
+        <w:t>is_active</w:t>
+      </w:r>
+      <w:proofErr w:type="spellEnd"/>
+      <w:r>
+        <w:t>=false) hasta que un administrador lo revise.</w:t>
       </w:r>
       <w:r>
         <w:rPr>
@@ -2687,7 +3691,23 @@
         <w:t>El sistema debe validar que los correos electrónicos ingresados en el registro pertenezcan</w:t>
       </w:r>
       <w:r>
-        <w:t xml:space="preserve"> a los registros dados por sinapsis uao (archivos .csv)</w:t>
+        <w:t xml:space="preserve"> a los registros dados por sinapsis </w:t>
+      </w:r>
+      <w:proofErr w:type="spellStart"/>
+      <w:r>
+        <w:t>uao</w:t>
+      </w:r>
+      <w:proofErr w:type="spellEnd"/>
+      <w:r>
+        <w:t xml:space="preserve"> (archivos .</w:t>
+      </w:r>
+      <w:proofErr w:type="spellStart"/>
+      <w:r>
+        <w:t>csv</w:t>
+      </w:r>
+      <w:proofErr w:type="spellEnd"/>
+      <w:r>
+        <w:t>)</w:t>
       </w:r>
     </w:p>
     <w:p>
@@ -2807,7 +3827,23 @@
         <w:t xml:space="preserve">RF-07 (Enlaces de Pago Externos): </w:t>
       </w:r>
       <w:r>
-        <w:t>El sistema debe generar botones que abran directamente las aplicaciones de billeteras digitales (Nequi/DaviPlata) instaladas en el dispositivo del usuario.</w:t>
+        <w:t>El sistema debe generar botones que abran directamente las aplicaciones de billeteras digitales (</w:t>
+      </w:r>
+      <w:proofErr w:type="spellStart"/>
+      <w:r>
+        <w:t>Nequi</w:t>
+      </w:r>
+      <w:proofErr w:type="spellEnd"/>
+      <w:r>
+        <w:t>/</w:t>
+      </w:r>
+      <w:proofErr w:type="spellStart"/>
+      <w:r>
+        <w:t>DaviPlata</w:t>
+      </w:r>
+      <w:proofErr w:type="spellEnd"/>
+      <w:r>
+        <w:t>) instaladas en el dispositivo del usuario.</w:t>
       </w:r>
     </w:p>
     <w:p>
@@ -2961,7 +3997,23 @@
         <w:spacing w:before="240" w:line="360" w:lineRule="auto"/>
       </w:pPr>
       <w:r>
-        <w:t>La arquitectura backend (FastAPI) debe soportar 500 usuarios concurrentes y picos de hasta 1,200 usuarios/hora sin degradación de servicio. La base de datos debe soportar un catálogo de 15,000 productos activos.</w:t>
+        <w:t xml:space="preserve">La arquitectura </w:t>
+      </w:r>
+      <w:proofErr w:type="spellStart"/>
+      <w:r>
+        <w:t>backend</w:t>
+      </w:r>
+      <w:proofErr w:type="spellEnd"/>
+      <w:r>
+        <w:t xml:space="preserve"> (</w:t>
+      </w:r>
+      <w:proofErr w:type="spellStart"/>
+      <w:r>
+        <w:t>FastAPI</w:t>
+      </w:r>
+      <w:proofErr w:type="spellEnd"/>
+      <w:r>
+        <w:t>) debe soportar 500 usuarios concurrentes y picos de hasta 1,200 usuarios/hora sin degradación de servicio. La base de datos debe soportar un catálogo de 15,000 productos activos.</w:t>
       </w:r>
     </w:p>
     <w:p>
@@ -2982,16 +4034,58 @@
           <w:b/>
           <w:bCs/>
         </w:rPr>
-        <w:t xml:space="preserve">RNF-03 (Instalabilidad PWA): </w:t>
-      </w:r>
-    </w:p>
-    <w:p>
-      <w:pPr>
-        <w:pStyle w:val="ListParagraph"/>
-        <w:spacing w:before="240" w:line="360" w:lineRule="auto"/>
-      </w:pPr>
-      <w:r>
-        <w:t>La interfaz frontend (Next.js) debe cumplir con los estándares de Progressive Web App (Service Worker base, manifest.json) para permitir su instalación en iOS y Android.</w:t>
+        <w:t>RNF-03 (</w:t>
+      </w:r>
+      <w:proofErr w:type="spellStart"/>
+      <w:r>
+        <w:rPr>
+          <w:b/>
+          <w:bCs/>
+        </w:rPr>
+        <w:t>Instalabilidad</w:t>
+      </w:r>
+      <w:proofErr w:type="spellEnd"/>
+      <w:r>
+        <w:rPr>
+          <w:b/>
+          <w:bCs/>
+        </w:rPr>
+        <w:t xml:space="preserve"> PWA): </w:t>
+      </w:r>
+    </w:p>
+    <w:p>
+      <w:pPr>
+        <w:pStyle w:val="ListParagraph"/>
+        <w:spacing w:before="240" w:line="360" w:lineRule="auto"/>
+      </w:pPr>
+      <w:r>
+        <w:t xml:space="preserve">La interfaz </w:t>
+      </w:r>
+      <w:proofErr w:type="spellStart"/>
+      <w:r>
+        <w:t>frontend</w:t>
+      </w:r>
+      <w:proofErr w:type="spellEnd"/>
+      <w:r>
+        <w:t xml:space="preserve"> (Next.js) debe cumplir con los estándares de </w:t>
+      </w:r>
+      <w:proofErr w:type="spellStart"/>
+      <w:r>
+        <w:t>Progressive</w:t>
+      </w:r>
+      <w:proofErr w:type="spellEnd"/>
+      <w:r>
+        <w:t xml:space="preserve"> Web App (Service Worker base, </w:t>
+      </w:r>
+      <w:proofErr w:type="spellStart"/>
+      <w:proofErr w:type="gramStart"/>
+      <w:r>
+        <w:t>manifest.json</w:t>
+      </w:r>
+      <w:proofErr w:type="spellEnd"/>
+      <w:proofErr w:type="gramEnd"/>
+      <w:r>
+        <w:t>) para permitir su instalación en iOS y Android.</w:t>
       </w:r>
     </w:p>
     <w:p>
@@ -3026,7 +4120,49 @@
         <w:rPr>
           <w:highlight w:val="yellow"/>
         </w:rPr>
-        <w:t>Durante una prueba de carga simulando 500 usuarios concurrentes enviando mensajes simultáneamente, el sistema de WebSockets debe procesar y entregar el 95% de los mensajes (percentil p95) en un tiempo de viaje de ida y vuelta (round-trip time) inferior a 500 milisegundos.</w:t>
+        <w:t xml:space="preserve">Durante una prueba de carga simulando 500 usuarios concurrentes enviando mensajes simultáneamente, el sistema de </w:t>
+      </w:r>
+      <w:proofErr w:type="spellStart"/>
+      <w:r>
+        <w:rPr>
+          <w:highlight w:val="yellow"/>
+        </w:rPr>
+        <w:t>WebSockets</w:t>
+      </w:r>
+      <w:proofErr w:type="spellEnd"/>
+      <w:r>
+        <w:rPr>
+          <w:highlight w:val="yellow"/>
+        </w:rPr>
+        <w:t xml:space="preserve"> debe procesar y entregar el 95% de los mensajes (percentil p95) en un tiempo de viaje de ida y vuelta (</w:t>
+      </w:r>
+      <w:proofErr w:type="gramStart"/>
+      <w:r>
+        <w:rPr>
+          <w:highlight w:val="yellow"/>
+        </w:rPr>
+        <w:t>round</w:t>
+      </w:r>
+      <w:proofErr w:type="gramEnd"/>
+      <w:r>
+        <w:rPr>
+          <w:highlight w:val="yellow"/>
+        </w:rPr>
+        <w:t>-</w:t>
+      </w:r>
+      <w:proofErr w:type="spellStart"/>
+      <w:r>
+        <w:rPr>
+          <w:highlight w:val="yellow"/>
+        </w:rPr>
+        <w:t>trip</w:t>
+      </w:r>
+      <w:proofErr w:type="spellEnd"/>
+      <w:r>
+        <w:rPr>
+          <w:highlight w:val="yellow"/>
+        </w:rPr>
+        <w:t xml:space="preserve"> time) inferior a 500 milisegundos.</w:t>
       </w:r>
     </w:p>
     <w:p>
@@ -3082,7 +4218,15 @@
         <w:spacing w:before="240" w:line="360" w:lineRule="auto"/>
       </w:pPr>
       <w:r>
-        <w:t>Si el usuario pierde la conexión a internet de la universidad, la app debe mostrar una advertencia de "Sin conexión" de forma controlada y no romper la interfaz gráfica de manera abrupta.</w:t>
+        <w:t xml:space="preserve">Si el usuario pierde la conexión a internet de la universidad, la </w:t>
+      </w:r>
+      <w:proofErr w:type="gramStart"/>
+      <w:r>
+        <w:t>app</w:t>
+      </w:r>
+      <w:proofErr w:type="gramEnd"/>
+      <w:r>
+        <w:t xml:space="preserve"> debe mostrar una advertencia de "Sin conexión" de forma controlada y no romper la interfaz gráfica de manera abrupta.</w:t>
       </w:r>
     </w:p>
     <w:p>
@@ -3116,7 +4260,21 @@
           <w:highlight w:val="yellow"/>
         </w:rPr>
         <w:lastRenderedPageBreak/>
-        <w:t>código hacia servicios pagos (AWS RDS, Vercel Pro) una vez se confirme la escalabilidad futura.</w:t>
+        <w:t xml:space="preserve">código hacia servicios pagos (AWS RDS, </w:t>
+      </w:r>
+      <w:proofErr w:type="spellStart"/>
+      <w:r>
+        <w:rPr>
+          <w:highlight w:val="yellow"/>
+        </w:rPr>
+        <w:t>Vercel</w:t>
+      </w:r>
+      <w:proofErr w:type="spellEnd"/>
+      <w:r>
+        <w:rPr>
+          <w:highlight w:val="yellow"/>
+        </w:rPr>
+        <w:t xml:space="preserve"> Pro) una vez se confirme la escalabilidad futura.</w:t>
       </w:r>
     </w:p>
     <w:p>
@@ -5990,7 +7148,6 @@
   <w:style w:type="character" w:default="1" w:styleId="DefaultParagraphFont">
     <w:name w:val="Default Paragraph Font"/>
     <w:uiPriority w:val="1"/>
-    <w:semiHidden/>
     <w:unhideWhenUsed/>
   </w:style>
   <w:style w:type="table" w:default="1" w:styleId="TableNormal">

</xml_diff>